<commit_message>
feat: conditional addition of weight percentage columm to reaction report if weight percentage scheme is true
</commit_message>
<xml_diff>
--- a/lib/template/Standard.docx
+++ b/lib/template/Standard.docx
@@ -1,10 +1,10 @@
 
 <file path=word/document.xml><?xml version="1.0" encoding="utf-8"?>
-<w:document xmlns:wpc="http://schemas.microsoft.com/office/word/2010/wordprocessingCanvas" xmlns:cx="http://schemas.microsoft.com/office/drawing/2014/chartex" xmlns:cx1="http://schemas.microsoft.com/office/drawing/2015/9/8/chartex" xmlns:cx2="http://schemas.microsoft.com/office/drawing/2015/10/21/chartex" xmlns:cx3="http://schemas.microsoft.com/office/drawing/2016/5/9/chartex" xmlns:cx4="http://schemas.microsoft.com/office/drawing/2016/5/10/chartex" xmlns:cx5="http://schemas.microsoft.com/office/drawing/2016/5/11/chartex" xmlns:cx6="http://schemas.microsoft.com/office/drawing/2016/5/12/chartex" xmlns:cx7="http://schemas.microsoft.com/office/drawing/2016/5/13/chartex" xmlns:cx8="http://schemas.microsoft.com/office/drawing/2016/5/14/chartex" xmlns:mc="http://schemas.openxmlformats.org/markup-compatibility/2006" xmlns:aink="http://schemas.microsoft.com/office/drawing/2016/ink" xmlns:am3d="http://schemas.microsoft.com/office/drawing/2017/model3d" xmlns:o="urn:schemas-microsoft-com:office:office" xmlns:oel="http://schemas.microsoft.com/office/2019/extlst" xmlns:r="http://schemas.openxmlformats.org/officeDocument/2006/relationships" xmlns:m="http://schemas.openxmlformats.org/officeDocument/2006/math" xmlns:v="urn:schemas-microsoft-com:vml" xmlns:wp14="http://schemas.microsoft.com/office/word/2010/wordprocessingDrawing" xmlns:wp="http://schemas.openxmlformats.org/drawingml/2006/wordprocessingDrawing" xmlns:w10="urn:schemas-microsoft-com:office:word" xmlns:w="http://schemas.openxmlformats.org/wordprocessingml/2006/main" xmlns:w14="http://schemas.microsoft.com/office/word/2010/wordml" xmlns:w15="http://schemas.microsoft.com/office/word/2012/wordml" xmlns:w16cex="http://schemas.microsoft.com/office/word/2018/wordml/cex" xmlns:w16cid="http://schemas.microsoft.com/office/word/2016/wordml/cid" xmlns:w16="http://schemas.microsoft.com/office/word/2018/wordml" xmlns:w16du="http://schemas.microsoft.com/office/word/2023/wordml/word16du" xmlns:w16sdtdh="http://schemas.microsoft.com/office/word/2020/wordml/sdtdatahash" xmlns:w16se="http://schemas.microsoft.com/office/word/2015/wordml/symex" xmlns:wpg="http://schemas.microsoft.com/office/word/2010/wordprocessingGroup" xmlns:wpi="http://schemas.microsoft.com/office/word/2010/wordprocessingInk" xmlns:wne="http://schemas.microsoft.com/office/word/2006/wordml" xmlns:wps="http://schemas.microsoft.com/office/word/2010/wordprocessingShape" mc:Ignorable="w14 w15 w16se w16cid w16 w16cex w16sdtdh w16du wp14">
+<w:document xmlns:wpc="http://schemas.microsoft.com/office/word/2010/wordprocessingCanvas" xmlns:cx="http://schemas.microsoft.com/office/drawing/2014/chartex" xmlns:cx1="http://schemas.microsoft.com/office/drawing/2015/9/8/chartex" xmlns:cx2="http://schemas.microsoft.com/office/drawing/2015/10/21/chartex" xmlns:cx3="http://schemas.microsoft.com/office/drawing/2016/5/9/chartex" xmlns:cx4="http://schemas.microsoft.com/office/drawing/2016/5/10/chartex" xmlns:cx5="http://schemas.microsoft.com/office/drawing/2016/5/11/chartex" xmlns:cx6="http://schemas.microsoft.com/office/drawing/2016/5/12/chartex" xmlns:cx7="http://schemas.microsoft.com/office/drawing/2016/5/13/chartex" xmlns:cx8="http://schemas.microsoft.com/office/drawing/2016/5/14/chartex" xmlns:mc="http://schemas.openxmlformats.org/markup-compatibility/2006" xmlns:aink="http://schemas.microsoft.com/office/drawing/2016/ink" xmlns:am3d="http://schemas.microsoft.com/office/drawing/2017/model3d" xmlns:o="urn:schemas-microsoft-com:office:office" xmlns:oel="http://schemas.microsoft.com/office/2019/extlst" xmlns:r="http://schemas.openxmlformats.org/officeDocument/2006/relationships" xmlns:m="http://schemas.openxmlformats.org/officeDocument/2006/math" xmlns:v="urn:schemas-microsoft-com:vml" xmlns:wp14="http://schemas.microsoft.com/office/word/2010/wordprocessingDrawing" xmlns:wp="http://schemas.openxmlformats.org/drawingml/2006/wordprocessingDrawing" xmlns:w10="urn:schemas-microsoft-com:office:word" xmlns:w="http://schemas.openxmlformats.org/wordprocessingml/2006/main" xmlns:w14="http://schemas.microsoft.com/office/word/2010/wordml" xmlns:w15="http://schemas.microsoft.com/office/word/2012/wordml" xmlns:w16cex="http://schemas.microsoft.com/office/word/2018/wordml/cex" xmlns:w16cid="http://schemas.microsoft.com/office/word/2016/wordml/cid" xmlns:w16="http://schemas.microsoft.com/office/word/2018/wordml" xmlns:w16du="http://schemas.microsoft.com/office/word/2023/wordml/word16du" xmlns:w16sdtdh="http://schemas.microsoft.com/office/word/2020/wordml/sdtdatahash" xmlns:w16sdtfl="http://schemas.microsoft.com/office/word/2024/wordml/sdtformatlock" xmlns:w16se="http://schemas.microsoft.com/office/word/2015/wordml/symex" xmlns:wpg="http://schemas.microsoft.com/office/word/2010/wordprocessingGroup" xmlns:wpi="http://schemas.microsoft.com/office/word/2010/wordprocessingInk" xmlns:wne="http://schemas.microsoft.com/office/word/2006/wordml" xmlns:wps="http://schemas.microsoft.com/office/word/2010/wordprocessingShape" mc:Ignorable="w14 w15 w16se w16cid w16 w16cex w16sdtdh w16sdtfl w16du wp14">
   <w:body>
     <w:p>
       <w:pPr>
-        <w:pStyle w:val="KeinLeerraum"/>
+        <w:pStyle w:val="NoSpacing"/>
       </w:pPr>
       <w:fldSimple w:instr=" MERGEFIELD  =s.mass_unit \* MERGEFORMAT ">
         <w:r>
@@ -617,10 +617,10 @@
             <v:path o:extrusionok="f" gradientshapeok="t" o:connecttype="rect"/>
             <o:lock v:ext="edit" aspectratio="t"/>
           </v:shapetype>
-          <v:shape id="_x0000_i1025" type="#_x0000_t75" alt="" style="width:453.5pt;height:129pt;mso-width-percent:0;mso-height-percent:0;mso-width-percent:0;mso-height-percent:0" o:ole="">
+          <v:shape id="_x0000_i1025" type="#_x0000_t75" alt="" style="width:453.65pt;height:129pt;mso-width-percent:0;mso-height-percent:0;mso-width-percent:0;mso-height-percent:0" o:ole="">
             <v:imagedata r:id="rId9" o:title=""/>
           </v:shape>
-          <o:OLEObject Type="Embed" ProgID="ChemDraw.Document.6.0" ShapeID="_x0000_i1025" DrawAspect="Content" ObjectID="_1779608507" r:id="rId10"/>
+          <o:OLEObject Type="Embed" ProgID="ChemDraw.Document.6.0" ShapeID="_x0000_i1025" DrawAspect="Content" ObjectID="_1821437800" r:id="rId10"/>
         </w:object>
       </w:r>
       <w:r>
@@ -784,10 +784,10 @@
           <w:noProof/>
         </w:rPr>
         <w:object w:dxaOrig="18787" w:dyaOrig="5510" w14:anchorId="40B4FE74">
-          <v:shape id="_x0000_i1026" type="#_x0000_t75" alt="" style="width:453.5pt;height:129pt;mso-width-percent:0;mso-height-percent:0;mso-width-percent:0;mso-height-percent:0" o:ole="">
+          <v:shape id="_x0000_i1031" type="#_x0000_t75" alt="" style="width:480.15pt;height:136.5pt;mso-width-percent:0;mso-height-percent:0;mso-width-percent:0;mso-height-percent:0" o:ole="">
             <v:imagedata r:id="rId9" o:title=""/>
           </v:shape>
-          <o:OLEObject Type="Embed" ProgID="ChemDraw.Document.6.0" ShapeID="_x0000_i1026" DrawAspect="Content" ObjectID="_1779608508" r:id="rId11"/>
+          <o:OLEObject Type="Embed" ProgID="ChemDraw.Document.6.0" ShapeID="_x0000_i1031" DrawAspect="Content" ObjectID="_1821437801" r:id="rId11"/>
         </w:object>
       </w:r>
       <w:r>
@@ -960,8 +960,8 @@
     </w:p>
     <w:tbl>
       <w:tblPr>
-        <w:tblStyle w:val="Tabellenraster"/>
-        <w:tblW w:w="0" w:type="auto"/>
+        <w:tblStyle w:val="TableGrid"/>
+        <w:tblW w:w="10149" w:type="dxa"/>
         <w:tblBorders>
           <w:top w:val="none" w:sz="0" w:space="0" w:color="auto"/>
           <w:left w:val="none" w:sz="0" w:space="0" w:color="auto"/>
@@ -982,6 +982,7 @@
         <w:gridCol w:w="1418"/>
         <w:gridCol w:w="1077"/>
         <w:gridCol w:w="1134"/>
+        <w:gridCol w:w="1134"/>
       </w:tblGrid>
       <w:tr>
         <w:trPr>
@@ -1135,75 +1136,6 @@
             </w:pPr>
             <w:r>
               <w:rPr>
-                <w:rFonts w:ascii="Arial" w:hAnsi="Arial" w:cs="Arial" w:hint="eastAsia"/>
-                <w:noProof/>
-                <w:lang w:eastAsia="en-US"/>
-              </w:rPr>
-              <mc:AlternateContent>
-                <mc:Choice Requires="wps">
-                  <w:drawing>
-                    <wp:anchor distT="0" distB="0" distL="114300" distR="114300" simplePos="0" relativeHeight="251663360" behindDoc="0" locked="0" layoutInCell="1" allowOverlap="1" wp14:anchorId="5894D0A3" wp14:editId="12BAC840">
-                      <wp:simplePos x="0" y="0"/>
-                      <wp:positionH relativeFrom="column">
-                        <wp:posOffset>-3458210</wp:posOffset>
-                      </wp:positionH>
-                      <wp:positionV relativeFrom="paragraph">
-                        <wp:posOffset>290195</wp:posOffset>
-                      </wp:positionV>
-                      <wp:extent cx="5760000" cy="0"/>
-                      <wp:effectExtent l="0" t="0" r="31750" b="25400"/>
-                      <wp:wrapNone/>
-                      <wp:docPr id="5" name="Straight Connector 5"/>
-                      <wp:cNvGraphicFramePr/>
-                      <a:graphic xmlns:a="http://schemas.openxmlformats.org/drawingml/2006/main">
-                        <a:graphicData uri="http://schemas.microsoft.com/office/word/2010/wordprocessingShape">
-                          <wps:wsp>
-                            <wps:cNvCnPr/>
-                            <wps:spPr>
-                              <a:xfrm>
-                                <a:off x="0" y="0"/>
-                                <a:ext cx="5760000" cy="0"/>
-                              </a:xfrm>
-                              <a:prstGeom prst="line">
-                                <a:avLst/>
-                              </a:prstGeom>
-                              <a:ln w="12700"/>
-                            </wps:spPr>
-                            <wps:style>
-                              <a:lnRef idx="1">
-                                <a:schemeClr val="accent1"/>
-                              </a:lnRef>
-                              <a:fillRef idx="0">
-                                <a:schemeClr val="accent1"/>
-                              </a:fillRef>
-                              <a:effectRef idx="0">
-                                <a:schemeClr val="accent1"/>
-                              </a:effectRef>
-                              <a:fontRef idx="minor">
-                                <a:schemeClr val="tx1"/>
-                              </a:fontRef>
-                            </wps:style>
-                            <wps:bodyPr/>
-                          </wps:wsp>
-                        </a:graphicData>
-                      </a:graphic>
-                      <wp14:sizeRelH relativeFrom="margin">
-                        <wp14:pctWidth>0</wp14:pctWidth>
-                      </wp14:sizeRelH>
-                    </wp:anchor>
-                  </w:drawing>
-                </mc:Choice>
-                <mc:Fallback>
-                  <w:pict>
-                    <v:line w14:anchorId="4095E87C" id="Straight Connector 5" o:spid="_x0000_s1026" style="position:absolute;z-index:251663360;visibility:visible;mso-wrap-style:square;mso-width-percent:0;mso-wrap-distance-left:9pt;mso-wrap-distance-top:0;mso-wrap-distance-right:9pt;mso-wrap-distance-bottom:0;mso-position-horizontal:absolute;mso-position-horizontal-relative:text;mso-position-vertical:absolute;mso-position-vertical-relative:text;mso-width-percent:0;mso-width-relative:margin" from="-272.3pt,22.85pt" to="181.25pt,22.85pt" o:gfxdata="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" strokecolor="#5b9bd5 [3204]" strokeweight="1pt">
-                      <v:stroke joinstyle="miter"/>
-                    </v:line>
-                  </w:pict>
-                </mc:Fallback>
-              </mc:AlternateContent>
-            </w:r>
-            <w:r>
-              <w:rPr>
                 <w:rFonts w:ascii="Arial" w:hAnsi="Arial" w:cs="Arial"/>
                 <w:noProof/>
                 <w:sz w:val="18"/>
@@ -1291,6 +1223,123 @@
             </w:r>
           </w:p>
         </w:tc>
+        <w:tc>
+          <w:tcPr>
+            <w:tcW w:w="1134" w:type="dxa"/>
+          </w:tcPr>
+          <w:p>
+            <w:pPr>
+              <w:tabs>
+                <w:tab w:val="left" w:pos="459"/>
+              </w:tabs>
+              <w:rPr>
+                <w:rFonts w:ascii="Arial" w:hAnsi="Arial" w:cs="Arial"/>
+                <w:noProof/>
+                <w:sz w:val="18"/>
+                <w:szCs w:val="18"/>
+              </w:rPr>
+            </w:pPr>
+            <w:r>
+              <w:rPr>
+                <w:rFonts w:ascii="Arial" w:hAnsi="Arial" w:cs="Arial"/>
+                <w:noProof/>
+                <w:sz w:val="18"/>
+                <w:szCs w:val="18"/>
+              </w:rPr>
+              <w:fldChar w:fldCharType="begin"/>
+            </w:r>
+            <w:r>
+              <w:rPr>
+                <w:rFonts w:ascii="Arial" w:hAnsi="Arial" w:cs="Arial"/>
+                <w:noProof/>
+                <w:sz w:val="18"/>
+                <w:szCs w:val="18"/>
+              </w:rPr>
+              <w:instrText xml:space="preserve"> MERGEFIELD  obj.show_weight_percentage:if  \* MERGEFORMAT </w:instrText>
+            </w:r>
+            <w:r>
+              <w:rPr>
+                <w:rFonts w:ascii="Arial" w:hAnsi="Arial" w:cs="Arial"/>
+                <w:noProof/>
+                <w:sz w:val="18"/>
+                <w:szCs w:val="18"/>
+              </w:rPr>
+              <w:fldChar w:fldCharType="separate"/>
+            </w:r>
+            <w:r>
+              <w:rPr>
+                <w:rFonts w:ascii="Arial" w:hAnsi="Arial" w:cs="Arial"/>
+                <w:noProof/>
+                <w:sz w:val="18"/>
+                <w:szCs w:val="18"/>
+              </w:rPr>
+              <w:t>«obj.show_weight_percentage:if»</w:t>
+            </w:r>
+            <w:r>
+              <w:rPr>
+                <w:rFonts w:ascii="Arial" w:hAnsi="Arial" w:cs="Arial"/>
+                <w:noProof/>
+                <w:sz w:val="18"/>
+                <w:szCs w:val="18"/>
+              </w:rPr>
+              <w:fldChar w:fldCharType="end"/>
+            </w:r>
+            <w:r>
+              <w:rPr>
+                <w:rFonts w:ascii="Arial" w:hAnsi="Arial" w:cs="Arial"/>
+                <w:noProof/>
+                <w:sz w:val="18"/>
+                <w:szCs w:val="18"/>
+              </w:rPr>
+              <w:t>Weight percentage</w:t>
+            </w:r>
+            <w:r>
+              <w:rPr>
+                <w:rFonts w:ascii="Arial" w:hAnsi="Arial" w:cs="Arial"/>
+                <w:noProof/>
+                <w:sz w:val="18"/>
+                <w:szCs w:val="18"/>
+              </w:rPr>
+              <w:fldChar w:fldCharType="begin"/>
+            </w:r>
+            <w:r>
+              <w:rPr>
+                <w:rFonts w:ascii="Arial" w:hAnsi="Arial" w:cs="Arial"/>
+                <w:noProof/>
+                <w:sz w:val="18"/>
+                <w:szCs w:val="18"/>
+              </w:rPr>
+              <w:instrText xml:space="preserve"> MERGEFIELD  obj.show_weight_percentage:endIf  \* MERGEFORMAT </w:instrText>
+            </w:r>
+            <w:r>
+              <w:rPr>
+                <w:rFonts w:ascii="Arial" w:hAnsi="Arial" w:cs="Arial"/>
+                <w:noProof/>
+                <w:sz w:val="18"/>
+                <w:szCs w:val="18"/>
+              </w:rPr>
+              <w:fldChar w:fldCharType="separate"/>
+            </w:r>
+            <w:r>
+              <w:rPr>
+                <w:rFonts w:ascii="Arial" w:hAnsi="Arial" w:cs="Arial"/>
+                <w:noProof/>
+                <w:sz w:val="18"/>
+                <w:szCs w:val="18"/>
+              </w:rPr>
+              <w:t>«obj.show_weight_percentage:endIf»</w:t>
+            </w:r>
+            <w:r>
+              <w:rPr>
+                <w:rFonts w:ascii="Arial" w:hAnsi="Arial" w:cs="Arial"/>
+                <w:noProof/>
+                <w:sz w:val="18"/>
+                <w:szCs w:val="18"/>
+              </w:rPr>
+              <w:fldChar w:fldCharType="end"/>
+            </w:r>
+          </w:p>
+        </w:tc>
       </w:tr>
     </w:tbl>
     <w:p>
@@ -1344,186 +1393,11 @@
         <w:fldChar w:fldCharType="end"/>
       </w:r>
     </w:p>
-    <w:p>
-      <w:pPr>
-        <w:rPr>
-          <w:rFonts w:ascii="Arial" w:hAnsi="Arial" w:cs="Arial"/>
-          <w:noProof/>
-          <w:color w:val="2E74B5" w:themeColor="accent1" w:themeShade="BF"/>
-          <w:sz w:val="18"/>
-          <w:szCs w:val="18"/>
-        </w:rPr>
-      </w:pPr>
-      <w:r>
-        <w:rPr>
-          <w:rFonts w:ascii="Arial" w:hAnsi="Arial" w:cs="Arial"/>
-          <w:noProof/>
-        </w:rPr>
-        <w:t xml:space="preserve">  </w:t>
-      </w:r>
-      <w:r>
-        <w:rPr>
-          <w:rFonts w:ascii="Arial" w:hAnsi="Arial" w:cs="Arial"/>
-          <w:noProof/>
-          <w:color w:val="000000"/>
-          <w:sz w:val="18"/>
-          <w:szCs w:val="18"/>
-        </w:rPr>
-        <w:fldChar w:fldCharType="begin"/>
-      </w:r>
-      <w:r>
-        <w:rPr>
-          <w:rFonts w:ascii="Arial" w:hAnsi="Arial" w:cs="Arial"/>
-          <w:noProof/>
-          <w:color w:val="000000"/>
-          <w:sz w:val="18"/>
-          <w:szCs w:val="18"/>
-        </w:rPr>
-        <w:instrText xml:space="preserve"> MERGEFIELD =s.</w:instrText>
-      </w:r>
-      <w:r>
-        <w:rPr>
-          <w:rFonts w:ascii="Arial" w:hAnsi="Arial" w:cs="Arial"/>
-          <w:noProof/>
-          <w:color w:val="000000"/>
-          <w:sz w:val="18"/>
-          <w:szCs w:val="18"/>
-        </w:rPr>
-        <w:instrText>iupac_</w:instrText>
-      </w:r>
-      <w:r>
-        <w:rPr>
-          <w:rFonts w:ascii="Arial" w:hAnsi="Arial" w:cs="Arial"/>
-          <w:noProof/>
-          <w:color w:val="000000"/>
-          <w:sz w:val="18"/>
-          <w:szCs w:val="18"/>
-        </w:rPr>
-        <w:instrText xml:space="preserve">name </w:instrText>
-      </w:r>
-      <w:r>
-        <w:rPr>
-          <w:rFonts w:ascii="Arial" w:hAnsi="Arial" w:cs="Arial"/>
-          <w:color w:val="000000"/>
-          <w:sz w:val="18"/>
-          <w:szCs w:val="18"/>
-        </w:rPr>
-        <w:instrText xml:space="preserve">\* MERGEFORMAT </w:instrText>
-      </w:r>
-      <w:r>
-        <w:rPr>
-          <w:rFonts w:ascii="Arial" w:hAnsi="Arial" w:cs="Arial"/>
-          <w:noProof/>
-          <w:color w:val="000000"/>
-          <w:sz w:val="18"/>
-          <w:szCs w:val="18"/>
-        </w:rPr>
-        <w:fldChar w:fldCharType="separate"/>
-      </w:r>
-      <w:r>
-        <w:rPr>
-          <w:rFonts w:ascii="Arial" w:hAnsi="Arial" w:cs="Arial"/>
-          <w:noProof/>
-          <w:color w:val="000000"/>
-          <w:sz w:val="18"/>
-          <w:szCs w:val="18"/>
-        </w:rPr>
-        <w:t>«=s.iupac_name»</w:t>
-      </w:r>
-      <w:r>
-        <w:rPr>
-          <w:rFonts w:ascii="Arial" w:hAnsi="Arial" w:cs="Arial"/>
-          <w:noProof/>
-          <w:color w:val="000000"/>
-          <w:sz w:val="18"/>
-          <w:szCs w:val="18"/>
-        </w:rPr>
-        <w:fldChar w:fldCharType="end"/>
-      </w:r>
-      <w:r>
-        <w:rPr>
-          <w:rFonts w:ascii="Arial" w:hAnsi="Arial" w:cs="Arial"/>
-          <w:noProof/>
-          <w:color w:val="000000"/>
-          <w:sz w:val="18"/>
-          <w:szCs w:val="18"/>
-        </w:rPr>
-        <w:t xml:space="preserve">  (</w:t>
-      </w:r>
-      <w:r>
-        <w:rPr>
-          <w:rFonts w:ascii="Arial" w:hAnsi="Arial" w:cs="Arial"/>
-          <w:noProof/>
-          <w:color w:val="000000"/>
-          <w:sz w:val="18"/>
-          <w:szCs w:val="18"/>
-        </w:rPr>
-        <w:fldChar w:fldCharType="begin"/>
-      </w:r>
-      <w:r>
-        <w:rPr>
-          <w:rFonts w:ascii="Arial" w:hAnsi="Arial" w:cs="Arial"/>
-          <w:noProof/>
-          <w:color w:val="000000"/>
-          <w:sz w:val="18"/>
-          <w:szCs w:val="18"/>
-        </w:rPr>
-        <w:instrText xml:space="preserve"> MERGEFIELD =s.short_label </w:instrText>
-      </w:r>
-      <w:r>
-        <w:rPr>
-          <w:rFonts w:ascii="Arial" w:hAnsi="Arial" w:cs="Arial"/>
-          <w:color w:val="000000"/>
-          <w:sz w:val="18"/>
-          <w:szCs w:val="18"/>
-        </w:rPr>
-        <w:instrText xml:space="preserve">\* MERGEFORMAT </w:instrText>
-      </w:r>
-      <w:r>
-        <w:rPr>
-          <w:rFonts w:ascii="Arial" w:hAnsi="Arial" w:cs="Arial"/>
-          <w:noProof/>
-          <w:color w:val="000000"/>
-          <w:sz w:val="18"/>
-          <w:szCs w:val="18"/>
-        </w:rPr>
-        <w:fldChar w:fldCharType="separate"/>
-      </w:r>
-      <w:r>
-        <w:rPr>
-          <w:rFonts w:ascii="Arial" w:hAnsi="Arial" w:cs="Arial"/>
-          <w:noProof/>
-          <w:color w:val="000000"/>
-          <w:sz w:val="18"/>
-          <w:szCs w:val="18"/>
-        </w:rPr>
-        <w:t>«=s.short_label»</w:t>
-      </w:r>
-      <w:r>
-        <w:rPr>
-          <w:rFonts w:ascii="Arial" w:hAnsi="Arial" w:cs="Arial"/>
-          <w:noProof/>
-          <w:color w:val="000000"/>
-          <w:sz w:val="18"/>
-          <w:szCs w:val="18"/>
-        </w:rPr>
-        <w:fldChar w:fldCharType="end"/>
-      </w:r>
-      <w:r>
-        <w:rPr>
-          <w:rFonts w:ascii="Arial" w:hAnsi="Arial" w:cs="Arial"/>
-          <w:noProof/>
-          <w:color w:val="000000"/>
-          <w:sz w:val="18"/>
-          <w:szCs w:val="18"/>
-        </w:rPr>
-        <w:t>)</w:t>
-      </w:r>
-    </w:p>
     <w:tbl>
       <w:tblPr>
-        <w:tblStyle w:val="Tabellenraster"/>
-        <w:tblW w:w="0" w:type="auto"/>
+        <w:tblStyle w:val="TableGrid"/>
+        <w:tblpPr w:leftFromText="141" w:rightFromText="141" w:vertAnchor="text" w:horzAnchor="margin" w:tblpY="214"/>
+        <w:tblW w:w="10171" w:type="dxa"/>
         <w:tblBorders>
           <w:top w:val="none" w:sz="0" w:space="0" w:color="auto"/>
           <w:left w:val="none" w:sz="0" w:space="0" w:color="auto"/>
@@ -1544,6 +1418,7 @@
         <w:gridCol w:w="1361"/>
         <w:gridCol w:w="1134"/>
         <w:gridCol w:w="1134"/>
+        <w:gridCol w:w="1134"/>
       </w:tblGrid>
       <w:tr>
         <w:trPr>
@@ -2239,6 +2114,67 @@
             </w:r>
           </w:p>
         </w:tc>
+        <w:tc>
+          <w:tcPr>
+            <w:tcW w:w="1134" w:type="dxa"/>
+          </w:tcPr>
+          <w:p>
+            <w:pPr>
+              <w:rPr>
+                <w:rFonts w:ascii="Arial" w:hAnsi="Arial" w:cs="Arial"/>
+                <w:noProof/>
+                <w:sz w:val="18"/>
+                <w:szCs w:val="18"/>
+                <w:lang w:val="de-DE"/>
+              </w:rPr>
+            </w:pPr>
+            <w:r>
+              <w:rPr>
+                <w:rFonts w:ascii="Arial" w:hAnsi="Arial" w:cs="Arial"/>
+                <w:noProof/>
+                <w:sz w:val="18"/>
+                <w:szCs w:val="18"/>
+              </w:rPr>
+              <w:fldChar w:fldCharType="begin"/>
+            </w:r>
+            <w:r>
+              <w:rPr>
+                <w:rFonts w:ascii="Arial" w:hAnsi="Arial" w:cs="Arial"/>
+                <w:noProof/>
+                <w:sz w:val="18"/>
+                <w:szCs w:val="18"/>
+              </w:rPr>
+              <w:instrText xml:space="preserve"> MERGEFIELD  =s.weight_percentage  \* MERGEFORMAT </w:instrText>
+            </w:r>
+            <w:r>
+              <w:rPr>
+                <w:rFonts w:ascii="Arial" w:hAnsi="Arial" w:cs="Arial"/>
+                <w:noProof/>
+                <w:sz w:val="18"/>
+                <w:szCs w:val="18"/>
+              </w:rPr>
+              <w:fldChar w:fldCharType="separate"/>
+            </w:r>
+            <w:r>
+              <w:rPr>
+                <w:rFonts w:ascii="Arial" w:hAnsi="Arial" w:cs="Arial"/>
+                <w:noProof/>
+                <w:sz w:val="18"/>
+                <w:szCs w:val="18"/>
+              </w:rPr>
+              <w:t>«=s.weight_percentage»</w:t>
+            </w:r>
+            <w:r>
+              <w:rPr>
+                <w:rFonts w:ascii="Arial" w:hAnsi="Arial" w:cs="Arial"/>
+                <w:noProof/>
+                <w:sz w:val="18"/>
+                <w:szCs w:val="18"/>
+              </w:rPr>
+              <w:fldChar w:fldCharType="end"/>
+            </w:r>
+          </w:p>
+        </w:tc>
       </w:tr>
     </w:tbl>
     <w:p>
@@ -2246,108 +2182,7 @@
         <w:rPr>
           <w:rFonts w:ascii="Arial" w:hAnsi="Arial" w:cs="Arial"/>
           <w:noProof/>
-          <w:sz w:val="18"/>
-          <w:szCs w:val="18"/>
-        </w:rPr>
-      </w:pPr>
-      <w:r>
-        <w:rPr>
-          <w:rFonts w:ascii="Arial" w:hAnsi="Arial" w:cs="Arial"/>
-          <w:sz w:val="18"/>
-          <w:szCs w:val="18"/>
-        </w:rPr>
-        <w:fldChar w:fldCharType="begin"/>
-      </w:r>
-      <w:r>
-        <w:rPr>
-          <w:rFonts w:ascii="Arial" w:hAnsi="Arial" w:cs="Arial"/>
-          <w:sz w:val="18"/>
-          <w:szCs w:val="18"/>
-        </w:rPr>
-        <w:instrText xml:space="preserve"> MERGEFIELD  obj.starting_materials:endEach  \* MERGEFORMAT </w:instrText>
-      </w:r>
-      <w:r>
-        <w:rPr>
-          <w:rFonts w:ascii="Arial" w:hAnsi="Arial" w:cs="Arial"/>
-          <w:sz w:val="18"/>
-          <w:szCs w:val="18"/>
-        </w:rPr>
-        <w:fldChar w:fldCharType="separate"/>
-      </w:r>
-      <w:r>
-        <w:rPr>
-          <w:rFonts w:ascii="Arial" w:hAnsi="Arial" w:cs="Arial"/>
-          <w:noProof/>
-          <w:sz w:val="18"/>
-          <w:szCs w:val="18"/>
-        </w:rPr>
-        <w:t>«obj.starting_materials:endEach»</w:t>
-      </w:r>
-      <w:r>
-        <w:rPr>
-          <w:rFonts w:ascii="Arial" w:hAnsi="Arial" w:cs="Arial"/>
-          <w:sz w:val="18"/>
-          <w:szCs w:val="18"/>
-        </w:rPr>
-        <w:fldChar w:fldCharType="end"/>
-      </w:r>
-    </w:p>
-    <w:p>
-      <w:pPr>
-        <w:rPr>
-          <w:rFonts w:ascii="Arial" w:hAnsi="Arial" w:cs="Arial"/>
-          <w:noProof/>
-          <w:sz w:val="18"/>
-          <w:szCs w:val="18"/>
-        </w:rPr>
-      </w:pPr>
-      <w:r>
-        <w:rPr>
-          <w:rFonts w:ascii="Arial" w:hAnsi="Arial" w:cs="Arial"/>
-          <w:sz w:val="18"/>
-          <w:szCs w:val="18"/>
-        </w:rPr>
-        <w:fldChar w:fldCharType="begin"/>
-      </w:r>
-      <w:r>
-        <w:rPr>
-          <w:rFonts w:ascii="Arial" w:hAnsi="Arial" w:cs="Arial"/>
-          <w:sz w:val="18"/>
-          <w:szCs w:val="18"/>
-        </w:rPr>
-        <w:instrText xml:space="preserve"> MERGEFIELD  obj.reactants:each(r)  \* MERGEFORMAT </w:instrText>
-      </w:r>
-      <w:r>
-        <w:rPr>
-          <w:rFonts w:ascii="Arial" w:hAnsi="Arial" w:cs="Arial"/>
-          <w:sz w:val="18"/>
-          <w:szCs w:val="18"/>
-        </w:rPr>
-        <w:fldChar w:fldCharType="separate"/>
-      </w:r>
-      <w:r>
-        <w:rPr>
-          <w:rFonts w:ascii="Arial" w:hAnsi="Arial" w:cs="Arial"/>
-          <w:noProof/>
-          <w:sz w:val="18"/>
-          <w:szCs w:val="18"/>
-        </w:rPr>
-        <w:t>«obj.reactants:each(r)»</w:t>
-      </w:r>
-      <w:r>
-        <w:rPr>
-          <w:rFonts w:ascii="Arial" w:hAnsi="Arial" w:cs="Arial"/>
-          <w:sz w:val="18"/>
-          <w:szCs w:val="18"/>
-        </w:rPr>
-        <w:fldChar w:fldCharType="end"/>
-      </w:r>
-    </w:p>
-    <w:p>
-      <w:pPr>
-        <w:rPr>
-          <w:rFonts w:ascii="Arial" w:hAnsi="Arial" w:cs="Arial"/>
-          <w:noProof/>
+          <w:color w:val="2E74B5" w:themeColor="accent1" w:themeShade="BF"/>
           <w:sz w:val="18"/>
           <w:szCs w:val="18"/>
         </w:rPr>
@@ -2377,7 +2212,7 @@
           <w:sz w:val="18"/>
           <w:szCs w:val="18"/>
         </w:rPr>
-        <w:instrText xml:space="preserve"> MERGEFIELD =</w:instrText>
+        <w:instrText xml:space="preserve"> MERGEFIELD =s.</w:instrText>
       </w:r>
       <w:r>
         <w:rPr>
@@ -2387,7 +2222,7 @@
           <w:sz w:val="18"/>
           <w:szCs w:val="18"/>
         </w:rPr>
-        <w:instrText>r</w:instrText>
+        <w:instrText>iupac_</w:instrText>
       </w:r>
       <w:r>
         <w:rPr>
@@ -2397,17 +2232,16 @@
           <w:sz w:val="18"/>
           <w:szCs w:val="18"/>
         </w:rPr>
-        <w:instrText>.</w:instrText>
-      </w:r>
-      <w:r>
-        <w:rPr>
-          <w:rFonts w:ascii="Arial" w:hAnsi="Arial" w:cs="Arial"/>
-          <w:noProof/>
+        <w:instrText xml:space="preserve">name </w:instrText>
+      </w:r>
+      <w:r>
+        <w:rPr>
+          <w:rFonts w:ascii="Arial" w:hAnsi="Arial" w:cs="Arial"/>
           <w:color w:val="000000"/>
           <w:sz w:val="18"/>
           <w:szCs w:val="18"/>
         </w:rPr>
-        <w:instrText>iupac_</w:instrText>
+        <w:instrText xml:space="preserve">\* MERGEFORMAT </w:instrText>
       </w:r>
       <w:r>
         <w:rPr>
@@ -2417,16 +2251,17 @@
           <w:sz w:val="18"/>
           <w:szCs w:val="18"/>
         </w:rPr>
-        <w:instrText xml:space="preserve">name </w:instrText>
-      </w:r>
-      <w:r>
-        <w:rPr>
-          <w:rFonts w:ascii="Arial" w:hAnsi="Arial" w:cs="Arial"/>
+        <w:fldChar w:fldCharType="separate"/>
+      </w:r>
+      <w:r>
+        <w:rPr>
+          <w:rFonts w:ascii="Arial" w:hAnsi="Arial" w:cs="Arial"/>
+          <w:noProof/>
           <w:color w:val="000000"/>
           <w:sz w:val="18"/>
           <w:szCs w:val="18"/>
         </w:rPr>
-        <w:instrText xml:space="preserve">\* MERGEFORMAT </w:instrText>
+        <w:t>«=s.iupac_name»</w:t>
       </w:r>
       <w:r>
         <w:rPr>
@@ -2436,7 +2271,7 @@
           <w:sz w:val="18"/>
           <w:szCs w:val="18"/>
         </w:rPr>
-        <w:fldChar w:fldCharType="separate"/>
+        <w:fldChar w:fldCharType="end"/>
       </w:r>
       <w:r>
         <w:rPr>
@@ -2446,7 +2281,7 @@
           <w:sz w:val="18"/>
           <w:szCs w:val="18"/>
         </w:rPr>
-        <w:t>«=r.iupac_name»</w:t>
+        <w:t xml:space="preserve">  (</w:t>
       </w:r>
       <w:r>
         <w:rPr>
@@ -2456,7 +2291,7 @@
           <w:sz w:val="18"/>
           <w:szCs w:val="18"/>
         </w:rPr>
-        <w:fldChar w:fldCharType="end"/>
+        <w:fldChar w:fldCharType="begin"/>
       </w:r>
       <w:r>
         <w:rPr>
@@ -2466,17 +2301,16 @@
           <w:sz w:val="18"/>
           <w:szCs w:val="18"/>
         </w:rPr>
-        <w:t xml:space="preserve">  (</w:t>
-      </w:r>
-      <w:r>
-        <w:rPr>
-          <w:rFonts w:ascii="Arial" w:hAnsi="Arial" w:cs="Arial"/>
-          <w:noProof/>
+        <w:instrText xml:space="preserve"> MERGEFIELD =s.short_label </w:instrText>
+      </w:r>
+      <w:r>
+        <w:rPr>
+          <w:rFonts w:ascii="Arial" w:hAnsi="Arial" w:cs="Arial"/>
           <w:color w:val="000000"/>
           <w:sz w:val="18"/>
           <w:szCs w:val="18"/>
         </w:rPr>
-        <w:fldChar w:fldCharType="begin"/>
+        <w:instrText xml:space="preserve">\* MERGEFORMAT </w:instrText>
       </w:r>
       <w:r>
         <w:rPr>
@@ -2486,16 +2320,17 @@
           <w:sz w:val="18"/>
           <w:szCs w:val="18"/>
         </w:rPr>
-        <w:instrText xml:space="preserve"> MERGEFIELD =r.short_label </w:instrText>
-      </w:r>
-      <w:r>
-        <w:rPr>
-          <w:rFonts w:ascii="Arial" w:hAnsi="Arial" w:cs="Arial"/>
+        <w:fldChar w:fldCharType="separate"/>
+      </w:r>
+      <w:r>
+        <w:rPr>
+          <w:rFonts w:ascii="Arial" w:hAnsi="Arial" w:cs="Arial"/>
+          <w:noProof/>
           <w:color w:val="000000"/>
           <w:sz w:val="18"/>
           <w:szCs w:val="18"/>
         </w:rPr>
-        <w:instrText xml:space="preserve">\* MERGEFORMAT </w:instrText>
+        <w:t>«=s.short_label»</w:t>
       </w:r>
       <w:r>
         <w:rPr>
@@ -2505,7 +2340,7 @@
           <w:sz w:val="18"/>
           <w:szCs w:val="18"/>
         </w:rPr>
-        <w:fldChar w:fldCharType="separate"/>
+        <w:fldChar w:fldCharType="end"/>
       </w:r>
       <w:r>
         <w:rPr>
@@ -2515,7 +2350,126 @@
           <w:sz w:val="18"/>
           <w:szCs w:val="18"/>
         </w:rPr>
-        <w:t>«=r.short_label»</w:t>
+        <w:t>)</w:t>
+      </w:r>
+    </w:p>
+    <w:p>
+      <w:pPr>
+        <w:rPr>
+          <w:rFonts w:ascii="Arial" w:hAnsi="Arial" w:cs="Arial"/>
+          <w:noProof/>
+          <w:sz w:val="18"/>
+          <w:szCs w:val="18"/>
+        </w:rPr>
+      </w:pPr>
+      <w:r>
+        <w:rPr>
+          <w:rFonts w:ascii="Arial" w:hAnsi="Arial" w:cs="Arial"/>
+          <w:sz w:val="18"/>
+          <w:szCs w:val="18"/>
+        </w:rPr>
+        <w:fldChar w:fldCharType="begin"/>
+      </w:r>
+      <w:r>
+        <w:rPr>
+          <w:rFonts w:ascii="Arial" w:hAnsi="Arial" w:cs="Arial"/>
+          <w:sz w:val="18"/>
+          <w:szCs w:val="18"/>
+        </w:rPr>
+        <w:instrText xml:space="preserve"> MERGEFIELD  obj.starting_materials:endEach  \* MERGEFORMAT </w:instrText>
+      </w:r>
+      <w:r>
+        <w:rPr>
+          <w:rFonts w:ascii="Arial" w:hAnsi="Arial" w:cs="Arial"/>
+          <w:sz w:val="18"/>
+          <w:szCs w:val="18"/>
+        </w:rPr>
+        <w:fldChar w:fldCharType="separate"/>
+      </w:r>
+      <w:r>
+        <w:rPr>
+          <w:rFonts w:ascii="Arial" w:hAnsi="Arial" w:cs="Arial"/>
+          <w:noProof/>
+          <w:sz w:val="18"/>
+          <w:szCs w:val="18"/>
+        </w:rPr>
+        <w:t>«obj.starting_materials:endEach»</w:t>
+      </w:r>
+      <w:r>
+        <w:rPr>
+          <w:rFonts w:ascii="Arial" w:hAnsi="Arial" w:cs="Arial"/>
+          <w:sz w:val="18"/>
+          <w:szCs w:val="18"/>
+        </w:rPr>
+        <w:fldChar w:fldCharType="end"/>
+      </w:r>
+    </w:p>
+    <w:p>
+      <w:pPr>
+        <w:rPr>
+          <w:rFonts w:ascii="Arial" w:hAnsi="Arial" w:cs="Arial"/>
+          <w:noProof/>
+          <w:sz w:val="18"/>
+          <w:szCs w:val="18"/>
+        </w:rPr>
+      </w:pPr>
+      <w:r>
+        <w:rPr>
+          <w:rFonts w:ascii="Arial" w:hAnsi="Arial" w:cs="Arial"/>
+          <w:sz w:val="18"/>
+          <w:szCs w:val="18"/>
+        </w:rPr>
+        <w:fldChar w:fldCharType="begin"/>
+      </w:r>
+      <w:r>
+        <w:rPr>
+          <w:rFonts w:ascii="Arial" w:hAnsi="Arial" w:cs="Arial"/>
+          <w:sz w:val="18"/>
+          <w:szCs w:val="18"/>
+        </w:rPr>
+        <w:instrText xml:space="preserve"> MERGEFIELD  obj.reactants:each(r)  \* MERGEFORMAT </w:instrText>
+      </w:r>
+      <w:r>
+        <w:rPr>
+          <w:rFonts w:ascii="Arial" w:hAnsi="Arial" w:cs="Arial"/>
+          <w:sz w:val="18"/>
+          <w:szCs w:val="18"/>
+        </w:rPr>
+        <w:fldChar w:fldCharType="separate"/>
+      </w:r>
+      <w:r>
+        <w:rPr>
+          <w:rFonts w:ascii="Arial" w:hAnsi="Arial" w:cs="Arial"/>
+          <w:noProof/>
+          <w:sz w:val="18"/>
+          <w:szCs w:val="18"/>
+        </w:rPr>
+        <w:t>«obj.reactants:each(r)»</w:t>
+      </w:r>
+      <w:r>
+        <w:rPr>
+          <w:rFonts w:ascii="Arial" w:hAnsi="Arial" w:cs="Arial"/>
+          <w:sz w:val="18"/>
+          <w:szCs w:val="18"/>
+        </w:rPr>
+        <w:fldChar w:fldCharType="end"/>
+      </w:r>
+    </w:p>
+    <w:p>
+      <w:pPr>
+        <w:rPr>
+          <w:rFonts w:ascii="Arial" w:hAnsi="Arial" w:cs="Arial"/>
+          <w:noProof/>
+          <w:sz w:val="18"/>
+          <w:szCs w:val="18"/>
+        </w:rPr>
+      </w:pPr>
+      <w:r>
+        <w:rPr>
+          <w:rFonts w:ascii="Arial" w:hAnsi="Arial" w:cs="Arial"/>
+          <w:noProof/>
+        </w:rPr>
+        <w:t xml:space="preserve">  </w:t>
       </w:r>
       <w:r>
         <w:rPr>
@@ -2525,7 +2479,7 @@
           <w:sz w:val="18"/>
           <w:szCs w:val="18"/>
         </w:rPr>
-        <w:fldChar w:fldCharType="end"/>
+        <w:fldChar w:fldCharType="begin"/>
       </w:r>
       <w:r>
         <w:rPr>
@@ -2535,13 +2489,171 @@
           <w:sz w:val="18"/>
           <w:szCs w:val="18"/>
         </w:rPr>
+        <w:instrText xml:space="preserve"> MERGEFIELD =</w:instrText>
+      </w:r>
+      <w:r>
+        <w:rPr>
+          <w:rFonts w:ascii="Arial" w:hAnsi="Arial" w:cs="Arial"/>
+          <w:noProof/>
+          <w:color w:val="000000"/>
+          <w:sz w:val="18"/>
+          <w:szCs w:val="18"/>
+        </w:rPr>
+        <w:instrText>r</w:instrText>
+      </w:r>
+      <w:r>
+        <w:rPr>
+          <w:rFonts w:ascii="Arial" w:hAnsi="Arial" w:cs="Arial"/>
+          <w:noProof/>
+          <w:color w:val="000000"/>
+          <w:sz w:val="18"/>
+          <w:szCs w:val="18"/>
+        </w:rPr>
+        <w:instrText>.</w:instrText>
+      </w:r>
+      <w:r>
+        <w:rPr>
+          <w:rFonts w:ascii="Arial" w:hAnsi="Arial" w:cs="Arial"/>
+          <w:noProof/>
+          <w:color w:val="000000"/>
+          <w:sz w:val="18"/>
+          <w:szCs w:val="18"/>
+        </w:rPr>
+        <w:instrText>iupac_</w:instrText>
+      </w:r>
+      <w:r>
+        <w:rPr>
+          <w:rFonts w:ascii="Arial" w:hAnsi="Arial" w:cs="Arial"/>
+          <w:noProof/>
+          <w:color w:val="000000"/>
+          <w:sz w:val="18"/>
+          <w:szCs w:val="18"/>
+        </w:rPr>
+        <w:instrText xml:space="preserve">name </w:instrText>
+      </w:r>
+      <w:r>
+        <w:rPr>
+          <w:rFonts w:ascii="Arial" w:hAnsi="Arial" w:cs="Arial"/>
+          <w:color w:val="000000"/>
+          <w:sz w:val="18"/>
+          <w:szCs w:val="18"/>
+        </w:rPr>
+        <w:instrText xml:space="preserve">\* MERGEFORMAT </w:instrText>
+      </w:r>
+      <w:r>
+        <w:rPr>
+          <w:rFonts w:ascii="Arial" w:hAnsi="Arial" w:cs="Arial"/>
+          <w:noProof/>
+          <w:color w:val="000000"/>
+          <w:sz w:val="18"/>
+          <w:szCs w:val="18"/>
+        </w:rPr>
+        <w:fldChar w:fldCharType="separate"/>
+      </w:r>
+      <w:r>
+        <w:rPr>
+          <w:rFonts w:ascii="Arial" w:hAnsi="Arial" w:cs="Arial"/>
+          <w:noProof/>
+          <w:color w:val="000000"/>
+          <w:sz w:val="18"/>
+          <w:szCs w:val="18"/>
+        </w:rPr>
+        <w:t>«=r.iupac_name»</w:t>
+      </w:r>
+      <w:r>
+        <w:rPr>
+          <w:rFonts w:ascii="Arial" w:hAnsi="Arial" w:cs="Arial"/>
+          <w:noProof/>
+          <w:color w:val="000000"/>
+          <w:sz w:val="18"/>
+          <w:szCs w:val="18"/>
+        </w:rPr>
+        <w:fldChar w:fldCharType="end"/>
+      </w:r>
+      <w:r>
+        <w:rPr>
+          <w:rFonts w:ascii="Arial" w:hAnsi="Arial" w:cs="Arial"/>
+          <w:noProof/>
+          <w:color w:val="000000"/>
+          <w:sz w:val="18"/>
+          <w:szCs w:val="18"/>
+        </w:rPr>
+        <w:t xml:space="preserve">  (</w:t>
+      </w:r>
+      <w:r>
+        <w:rPr>
+          <w:rFonts w:ascii="Arial" w:hAnsi="Arial" w:cs="Arial"/>
+          <w:noProof/>
+          <w:color w:val="000000"/>
+          <w:sz w:val="18"/>
+          <w:szCs w:val="18"/>
+        </w:rPr>
+        <w:fldChar w:fldCharType="begin"/>
+      </w:r>
+      <w:r>
+        <w:rPr>
+          <w:rFonts w:ascii="Arial" w:hAnsi="Arial" w:cs="Arial"/>
+          <w:noProof/>
+          <w:color w:val="000000"/>
+          <w:sz w:val="18"/>
+          <w:szCs w:val="18"/>
+        </w:rPr>
+        <w:instrText xml:space="preserve"> MERGEFIELD =r.short_label </w:instrText>
+      </w:r>
+      <w:r>
+        <w:rPr>
+          <w:rFonts w:ascii="Arial" w:hAnsi="Arial" w:cs="Arial"/>
+          <w:color w:val="000000"/>
+          <w:sz w:val="18"/>
+          <w:szCs w:val="18"/>
+        </w:rPr>
+        <w:instrText xml:space="preserve">\* MERGEFORMAT </w:instrText>
+      </w:r>
+      <w:r>
+        <w:rPr>
+          <w:rFonts w:ascii="Arial" w:hAnsi="Arial" w:cs="Arial"/>
+          <w:noProof/>
+          <w:color w:val="000000"/>
+          <w:sz w:val="18"/>
+          <w:szCs w:val="18"/>
+        </w:rPr>
+        <w:fldChar w:fldCharType="separate"/>
+      </w:r>
+      <w:r>
+        <w:rPr>
+          <w:rFonts w:ascii="Arial" w:hAnsi="Arial" w:cs="Arial"/>
+          <w:noProof/>
+          <w:color w:val="000000"/>
+          <w:sz w:val="18"/>
+          <w:szCs w:val="18"/>
+        </w:rPr>
+        <w:t>«=r.short_label»</w:t>
+      </w:r>
+      <w:r>
+        <w:rPr>
+          <w:rFonts w:ascii="Arial" w:hAnsi="Arial" w:cs="Arial"/>
+          <w:noProof/>
+          <w:color w:val="000000"/>
+          <w:sz w:val="18"/>
+          <w:szCs w:val="18"/>
+        </w:rPr>
+        <w:fldChar w:fldCharType="end"/>
+      </w:r>
+      <w:r>
+        <w:rPr>
+          <w:rFonts w:ascii="Arial" w:hAnsi="Arial" w:cs="Arial"/>
+          <w:noProof/>
+          <w:color w:val="000000"/>
+          <w:sz w:val="18"/>
+          <w:szCs w:val="18"/>
+        </w:rPr>
         <w:t>)</w:t>
       </w:r>
     </w:p>
     <w:tbl>
       <w:tblPr>
-        <w:tblStyle w:val="Tabellenraster"/>
-        <w:tblW w:w="0" w:type="auto"/>
+        <w:tblStyle w:val="TableGrid"/>
+        <w:tblW w:w="10174" w:type="dxa"/>
         <w:tblBorders>
           <w:top w:val="none" w:sz="0" w:space="0" w:color="auto"/>
           <w:left w:val="none" w:sz="0" w:space="0" w:color="auto"/>
@@ -2562,6 +2674,7 @@
         <w:gridCol w:w="1361"/>
         <w:gridCol w:w="1134"/>
         <w:gridCol w:w="1134"/>
+        <w:gridCol w:w="1134"/>
       </w:tblGrid>
       <w:tr>
         <w:trPr>
@@ -2589,6 +2702,7 @@
                 <w:sz w:val="18"/>
                 <w:szCs w:val="18"/>
               </w:rPr>
+              <w:lastRenderedPageBreak/>
               <w:t>R</w:t>
             </w:r>
           </w:p>
@@ -3273,6 +3387,76 @@
               </w:rPr>
               <w:fldChar w:fldCharType="end"/>
             </w:r>
+            <w:r>
+              <w:rPr>
+                <w:rFonts w:ascii="Arial" w:hAnsi="Arial" w:cs="Arial"/>
+                <w:noProof/>
+                <w:sz w:val="18"/>
+                <w:szCs w:val="18"/>
+              </w:rPr>
+              <w:t xml:space="preserve">  </w:t>
+            </w:r>
+          </w:p>
+        </w:tc>
+        <w:tc>
+          <w:tcPr>
+            <w:tcW w:w="1134" w:type="dxa"/>
+          </w:tcPr>
+          <w:p>
+            <w:pPr>
+              <w:jc w:val="center"/>
+              <w:rPr>
+                <w:rFonts w:ascii="Arial" w:hAnsi="Arial" w:cs="Arial"/>
+                <w:noProof/>
+                <w:sz w:val="18"/>
+                <w:szCs w:val="18"/>
+              </w:rPr>
+            </w:pPr>
+            <w:r>
+              <w:rPr>
+                <w:rFonts w:ascii="Arial" w:hAnsi="Arial" w:cs="Arial"/>
+                <w:noProof/>
+                <w:sz w:val="18"/>
+                <w:szCs w:val="18"/>
+              </w:rPr>
+              <w:fldChar w:fldCharType="begin"/>
+            </w:r>
+            <w:r>
+              <w:rPr>
+                <w:rFonts w:ascii="Arial" w:hAnsi="Arial" w:cs="Arial"/>
+                <w:noProof/>
+                <w:sz w:val="18"/>
+                <w:szCs w:val="18"/>
+              </w:rPr>
+              <w:instrText xml:space="preserve"> MERGEFIELD  =r.weight_percentage  \* MERGEFORMAT </w:instrText>
+            </w:r>
+            <w:r>
+              <w:rPr>
+                <w:rFonts w:ascii="Arial" w:hAnsi="Arial" w:cs="Arial"/>
+                <w:noProof/>
+                <w:sz w:val="18"/>
+                <w:szCs w:val="18"/>
+              </w:rPr>
+              <w:fldChar w:fldCharType="separate"/>
+            </w:r>
+            <w:r>
+              <w:rPr>
+                <w:rFonts w:ascii="Arial" w:hAnsi="Arial" w:cs="Arial"/>
+                <w:noProof/>
+                <w:sz w:val="18"/>
+                <w:szCs w:val="18"/>
+              </w:rPr>
+              <w:t>«=r.weight_percentage»</w:t>
+            </w:r>
+            <w:r>
+              <w:rPr>
+                <w:rFonts w:ascii="Arial" w:hAnsi="Arial" w:cs="Arial"/>
+                <w:noProof/>
+                <w:sz w:val="18"/>
+                <w:szCs w:val="18"/>
+              </w:rPr>
+              <w:fldChar w:fldCharType="end"/>
+            </w:r>
           </w:p>
         </w:tc>
       </w:tr>
@@ -3520,8 +3704,8 @@
     </w:p>
     <w:tbl>
       <w:tblPr>
-        <w:tblStyle w:val="Tabellenraster"/>
-        <w:tblW w:w="0" w:type="auto"/>
+        <w:tblStyle w:val="TableGrid"/>
+        <w:tblW w:w="10161" w:type="dxa"/>
         <w:tblBorders>
           <w:top w:val="none" w:sz="0" w:space="0" w:color="auto"/>
           <w:left w:val="none" w:sz="0" w:space="0" w:color="auto"/>
@@ -3542,6 +3726,7 @@
         <w:gridCol w:w="1361"/>
         <w:gridCol w:w="1134"/>
         <w:gridCol w:w="1134"/>
+        <w:gridCol w:w="1134"/>
       </w:tblGrid>
       <w:tr>
         <w:trPr>
@@ -3569,7 +3754,6 @@
                 <w:sz w:val="18"/>
                 <w:szCs w:val="18"/>
               </w:rPr>
-              <w:lastRenderedPageBreak/>
               <w:t>P</w:t>
             </w:r>
           </w:p>
@@ -4190,6 +4374,23 @@
             </w:r>
           </w:p>
         </w:tc>
+        <w:tc>
+          <w:tcPr>
+            <w:tcW w:w="1134" w:type="dxa"/>
+          </w:tcPr>
+          <w:p>
+            <w:pPr>
+              <w:jc w:val="center"/>
+              <w:rPr>
+                <w:rFonts w:ascii="Arial" w:hAnsi="Arial" w:cs="Arial"/>
+                <w:noProof/>
+                <w:color w:val="FF0000"/>
+                <w:sz w:val="18"/>
+                <w:szCs w:val="18"/>
+              </w:rPr>
+            </w:pPr>
+          </w:p>
+        </w:tc>
       </w:tr>
     </w:tbl>
     <w:p>
@@ -4199,55 +4400,6 @@
           <w:noProof/>
           <w:sz w:val="18"/>
           <w:szCs w:val="18"/>
-        </w:rPr>
-      </w:pPr>
-      <w:r>
-        <w:rPr>
-          <w:rFonts w:ascii="Arial" w:hAnsi="Arial" w:cs="Arial"/>
-          <w:sz w:val="18"/>
-          <w:szCs w:val="18"/>
-        </w:rPr>
-        <w:fldChar w:fldCharType="begin"/>
-      </w:r>
-      <w:r>
-        <w:rPr>
-          <w:rFonts w:ascii="Arial" w:hAnsi="Arial" w:cs="Arial"/>
-          <w:sz w:val="18"/>
-          <w:szCs w:val="18"/>
-        </w:rPr>
-        <w:instrText xml:space="preserve"> MERGEFIELD  obj.products:endEach  \* MERGEFORMAT </w:instrText>
-      </w:r>
-      <w:r>
-        <w:rPr>
-          <w:rFonts w:ascii="Arial" w:hAnsi="Arial" w:cs="Arial"/>
-          <w:sz w:val="18"/>
-          <w:szCs w:val="18"/>
-        </w:rPr>
-        <w:fldChar w:fldCharType="separate"/>
-      </w:r>
-      <w:r>
-        <w:rPr>
-          <w:rFonts w:ascii="Arial" w:hAnsi="Arial" w:cs="Arial"/>
-          <w:noProof/>
-          <w:sz w:val="18"/>
-          <w:szCs w:val="18"/>
-        </w:rPr>
-        <w:t>«obj.products:endEach»</w:t>
-      </w:r>
-      <w:r>
-        <w:rPr>
-          <w:rFonts w:ascii="Arial" w:hAnsi="Arial" w:cs="Arial"/>
-          <w:sz w:val="18"/>
-          <w:szCs w:val="18"/>
-        </w:rPr>
-        <w:fldChar w:fldCharType="end"/>
-      </w:r>
-    </w:p>
-    <w:p>
-      <w:pPr>
-        <w:rPr>
-          <w:rFonts w:ascii="Arial" w:hAnsi="Arial" w:cs="Arial"/>
-          <w:noProof/>
         </w:rPr>
       </w:pPr>
       <w:r>
@@ -4259,32 +4411,32 @@
         <mc:AlternateContent>
           <mc:Choice Requires="wps">
             <w:drawing>
-              <wp:anchor distT="0" distB="0" distL="114300" distR="114300" simplePos="0" relativeHeight="251661312" behindDoc="0" locked="0" layoutInCell="1" allowOverlap="1" wp14:anchorId="37C4E298" wp14:editId="4F954875">
+              <wp:anchor distT="0" distB="0" distL="114300" distR="114300" simplePos="0" relativeHeight="251671552" behindDoc="0" locked="0" layoutInCell="1" allowOverlap="1" wp14:anchorId="7D90DED1" wp14:editId="03493654">
                 <wp:simplePos x="0" y="0"/>
                 <wp:positionH relativeFrom="column">
-                  <wp:posOffset>47044</wp:posOffset>
+                  <wp:posOffset>-391886</wp:posOffset>
                 </wp:positionH>
                 <wp:positionV relativeFrom="paragraph">
-                  <wp:posOffset>56420</wp:posOffset>
+                  <wp:posOffset>159136</wp:posOffset>
                 </wp:positionV>
-                <wp:extent cx="5760000" cy="0"/>
-                <wp:effectExtent l="0" t="0" r="31750" b="25400"/>
+                <wp:extent cx="6760514" cy="35305"/>
+                <wp:effectExtent l="0" t="0" r="21590" b="22225"/>
                 <wp:wrapNone/>
-                <wp:docPr id="6" name="Straight Connector 6"/>
+                <wp:docPr id="1259754381" name="Straight Connector 1259754381"/>
                 <wp:cNvGraphicFramePr/>
                 <a:graphic xmlns:a="http://schemas.openxmlformats.org/drawingml/2006/main">
                   <a:graphicData uri="http://schemas.microsoft.com/office/word/2010/wordprocessingShape">
                     <wps:wsp>
                       <wps:cNvCnPr/>
                       <wps:spPr>
-                        <a:xfrm>
+                        <a:xfrm flipV="1">
                           <a:off x="0" y="0"/>
-                          <a:ext cx="5760000" cy="0"/>
+                          <a:ext cx="6760514" cy="35305"/>
                         </a:xfrm>
                         <a:prstGeom prst="line">
                           <a:avLst/>
                         </a:prstGeom>
-                        <a:ln w="9525"/>
+                        <a:ln w="12700"/>
                       </wps:spPr>
                       <wps:style>
                         <a:lnRef idx="1">
@@ -4307,18 +4459,70 @@
                 <wp14:sizeRelH relativeFrom="margin">
                   <wp14:pctWidth>0</wp14:pctWidth>
                 </wp14:sizeRelH>
+                <wp14:sizeRelV relativeFrom="margin">
+                  <wp14:pctHeight>0</wp14:pctHeight>
+                </wp14:sizeRelV>
               </wp:anchor>
             </w:drawing>
           </mc:Choice>
-          <mc:Fallback xmlns:mo="http://schemas.microsoft.com/office/mac/office/2008/main" xmlns:mv="urn:schemas-microsoft-com:mac:vml">
+          <mc:Fallback>
             <w:pict>
-              <v:line w14:anchorId="5F90D66D" id="Straight Connector 6" o:spid="_x0000_s1026" style="position:absolute;z-index:251661312;visibility:visible;mso-wrap-style:square;mso-width-percent:0;mso-wrap-distance-left:9pt;mso-wrap-distance-top:0;mso-wrap-distance-right:9pt;mso-wrap-distance-bottom:0;mso-position-horizontal:absolute;mso-position-horizontal-relative:text;mso-position-vertical:absolute;mso-position-vertical-relative:text;mso-width-percent:0;mso-width-relative:margin" from="3.7pt,4.45pt" to="457.25pt,4.45pt" o:gfxdata="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" strokecolor="#5b9bd5 [3204]">
+              <v:line w14:anchorId="4DD761C0" id="Straight Connector 1259754381" o:spid="_x0000_s1026" style="position:absolute;flip:y;z-index:251671552;visibility:visible;mso-wrap-style:square;mso-width-percent:0;mso-height-percent:0;mso-wrap-distance-left:9pt;mso-wrap-distance-top:0;mso-wrap-distance-right:9pt;mso-wrap-distance-bottom:0;mso-position-horizontal:absolute;mso-position-horizontal-relative:text;mso-position-vertical:absolute;mso-position-vertical-relative:text;mso-width-percent:0;mso-height-percent:0;mso-width-relative:margin;mso-height-relative:margin" from="-30.85pt,12.55pt" to="501.45pt,15.35pt" o:gfxdata="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" strokecolor="#5b9bd5 [3204]" strokeweight="1pt">
                 <v:stroke joinstyle="miter"/>
               </v:line>
             </w:pict>
           </mc:Fallback>
         </mc:AlternateContent>
       </w:r>
+      <w:r>
+        <w:rPr>
+          <w:rFonts w:ascii="Arial" w:hAnsi="Arial" w:cs="Arial"/>
+          <w:sz w:val="18"/>
+          <w:szCs w:val="18"/>
+        </w:rPr>
+        <w:fldChar w:fldCharType="begin"/>
+      </w:r>
+      <w:r>
+        <w:rPr>
+          <w:rFonts w:ascii="Arial" w:hAnsi="Arial" w:cs="Arial"/>
+          <w:sz w:val="18"/>
+          <w:szCs w:val="18"/>
+        </w:rPr>
+        <w:instrText xml:space="preserve"> MERGEFIELD  obj.products:endEach  \* MERGEFORMAT </w:instrText>
+      </w:r>
+      <w:r>
+        <w:rPr>
+          <w:rFonts w:ascii="Arial" w:hAnsi="Arial" w:cs="Arial"/>
+          <w:sz w:val="18"/>
+          <w:szCs w:val="18"/>
+        </w:rPr>
+        <w:fldChar w:fldCharType="separate"/>
+      </w:r>
+      <w:r>
+        <w:rPr>
+          <w:rFonts w:ascii="Arial" w:hAnsi="Arial" w:cs="Arial"/>
+          <w:noProof/>
+          <w:sz w:val="18"/>
+          <w:szCs w:val="18"/>
+        </w:rPr>
+        <w:t>«obj.products:endEach»</w:t>
+      </w:r>
+      <w:r>
+        <w:rPr>
+          <w:rFonts w:ascii="Arial" w:hAnsi="Arial" w:cs="Arial"/>
+          <w:sz w:val="18"/>
+          <w:szCs w:val="18"/>
+        </w:rPr>
+        <w:fldChar w:fldCharType="end"/>
+      </w:r>
+    </w:p>
+    <w:p>
+      <w:pPr>
+        <w:rPr>
+          <w:rFonts w:ascii="Arial" w:hAnsi="Arial" w:cs="Arial"/>
+          <w:noProof/>
+        </w:rPr>
+      </w:pPr>
     </w:p>
     <w:p>
       <w:pPr>
@@ -4761,7 +4965,7 @@
     </w:p>
     <w:tbl>
       <w:tblPr>
-        <w:tblStyle w:val="Tabellenraster"/>
+        <w:tblStyle w:val="TableGrid"/>
         <w:tblW w:w="5000" w:type="pct"/>
         <w:tblBorders>
           <w:top w:val="none" w:sz="0" w:space="0" w:color="auto"/>
@@ -5026,7 +5230,7 @@
     </w:p>
     <w:tbl>
       <w:tblPr>
-        <w:tblStyle w:val="Tabellenraster"/>
+        <w:tblStyle w:val="TableGrid"/>
         <w:tblW w:w="5000" w:type="pct"/>
         <w:tblBorders>
           <w:top w:val="none" w:sz="0" w:space="0" w:color="auto"/>
@@ -7383,6 +7587,7 @@
           <w:sz w:val="20"/>
           <w:szCs w:val="20"/>
         </w:rPr>
+        <w:lastRenderedPageBreak/>
         <w:t>TLC control:</w:t>
       </w:r>
       <w:r>
@@ -7919,7 +8124,6 @@
           <w:sz w:val="20"/>
           <w:szCs w:val="20"/>
         </w:rPr>
-        <w:lastRenderedPageBreak/>
         <w:fldChar w:fldCharType="begin"/>
       </w:r>
       <w:r>
@@ -10235,10 +10439,10 @@
           <w:noProof/>
         </w:rPr>
         <w:object w:dxaOrig="18787" w:dyaOrig="5510" w14:anchorId="4964B097">
-          <v:shape id="_x0000_i1027" type="#_x0000_t75" alt="" style="width:453.5pt;height:129pt;mso-width-percent:0;mso-height-percent:0;mso-width-percent:0;mso-height-percent:0" o:ole="">
+          <v:shape id="_x0000_i1027" type="#_x0000_t75" alt="" style="width:453.65pt;height:129pt;mso-width-percent:0;mso-height-percent:0;mso-width-percent:0;mso-height-percent:0" o:ole="">
             <v:imagedata r:id="rId9" o:title=""/>
           </v:shape>
-          <o:OLEObject Type="Embed" ProgID="ChemDraw.Document.6.0" ShapeID="_x0000_i1027" DrawAspect="Content" ObjectID="_1779608509" r:id="rId12"/>
+          <o:OLEObject Type="Embed" ProgID="ChemDraw.Document.6.0" ShapeID="_x0000_i1027" DrawAspect="Content" ObjectID="_1821437802" r:id="rId12"/>
         </w:object>
       </w:r>
       <w:r>
@@ -11674,7 +11878,7 @@
 </file>
 
 <file path=word/endnotes.xml><?xml version="1.0" encoding="utf-8"?>
-<w:endnotes xmlns:wpc="http://schemas.microsoft.com/office/word/2010/wordprocessingCanvas" xmlns:cx="http://schemas.microsoft.com/office/drawing/2014/chartex" xmlns:cx1="http://schemas.microsoft.com/office/drawing/2015/9/8/chartex" xmlns:cx2="http://schemas.microsoft.com/office/drawing/2015/10/21/chartex" xmlns:cx3="http://schemas.microsoft.com/office/drawing/2016/5/9/chartex" xmlns:cx4="http://schemas.microsoft.com/office/drawing/2016/5/10/chartex" xmlns:cx5="http://schemas.microsoft.com/office/drawing/2016/5/11/chartex" xmlns:cx6="http://schemas.microsoft.com/office/drawing/2016/5/12/chartex" xmlns:cx7="http://schemas.microsoft.com/office/drawing/2016/5/13/chartex" xmlns:cx8="http://schemas.microsoft.com/office/drawing/2016/5/14/chartex" xmlns:mc="http://schemas.openxmlformats.org/markup-compatibility/2006" xmlns:aink="http://schemas.microsoft.com/office/drawing/2016/ink" xmlns:am3d="http://schemas.microsoft.com/office/drawing/2017/model3d" xmlns:o="urn:schemas-microsoft-com:office:office" xmlns:oel="http://schemas.microsoft.com/office/2019/extlst" xmlns:r="http://schemas.openxmlformats.org/officeDocument/2006/relationships" xmlns:m="http://schemas.openxmlformats.org/officeDocument/2006/math" xmlns:v="urn:schemas-microsoft-com:vml" xmlns:wp14="http://schemas.microsoft.com/office/word/2010/wordprocessingDrawing" xmlns:wp="http://schemas.openxmlformats.org/drawingml/2006/wordprocessingDrawing" xmlns:w10="urn:schemas-microsoft-com:office:word" xmlns:w="http://schemas.openxmlformats.org/wordprocessingml/2006/main" xmlns:w14="http://schemas.microsoft.com/office/word/2010/wordml" xmlns:w15="http://schemas.microsoft.com/office/word/2012/wordml" xmlns:w16cex="http://schemas.microsoft.com/office/word/2018/wordml/cex" xmlns:w16cid="http://schemas.microsoft.com/office/word/2016/wordml/cid" xmlns:w16="http://schemas.microsoft.com/office/word/2018/wordml" xmlns:w16du="http://schemas.microsoft.com/office/word/2023/wordml/word16du" xmlns:w16sdtdh="http://schemas.microsoft.com/office/word/2020/wordml/sdtdatahash" xmlns:w16se="http://schemas.microsoft.com/office/word/2015/wordml/symex" xmlns:wpg="http://schemas.microsoft.com/office/word/2010/wordprocessingGroup" xmlns:wpi="http://schemas.microsoft.com/office/word/2010/wordprocessingInk" xmlns:wne="http://schemas.microsoft.com/office/word/2006/wordml" xmlns:wps="http://schemas.microsoft.com/office/word/2010/wordprocessingShape" mc:Ignorable="w14 w15 w16se w16cid w16 w16cex w16sdtdh w16du wp14">
+<w:endnotes xmlns:wpc="http://schemas.microsoft.com/office/word/2010/wordprocessingCanvas" xmlns:cx="http://schemas.microsoft.com/office/drawing/2014/chartex" xmlns:cx1="http://schemas.microsoft.com/office/drawing/2015/9/8/chartex" xmlns:cx2="http://schemas.microsoft.com/office/drawing/2015/10/21/chartex" xmlns:cx3="http://schemas.microsoft.com/office/drawing/2016/5/9/chartex" xmlns:cx4="http://schemas.microsoft.com/office/drawing/2016/5/10/chartex" xmlns:cx5="http://schemas.microsoft.com/office/drawing/2016/5/11/chartex" xmlns:cx6="http://schemas.microsoft.com/office/drawing/2016/5/12/chartex" xmlns:cx7="http://schemas.microsoft.com/office/drawing/2016/5/13/chartex" xmlns:cx8="http://schemas.microsoft.com/office/drawing/2016/5/14/chartex" xmlns:mc="http://schemas.openxmlformats.org/markup-compatibility/2006" xmlns:aink="http://schemas.microsoft.com/office/drawing/2016/ink" xmlns:am3d="http://schemas.microsoft.com/office/drawing/2017/model3d" xmlns:o="urn:schemas-microsoft-com:office:office" xmlns:oel="http://schemas.microsoft.com/office/2019/extlst" xmlns:r="http://schemas.openxmlformats.org/officeDocument/2006/relationships" xmlns:m="http://schemas.openxmlformats.org/officeDocument/2006/math" xmlns:v="urn:schemas-microsoft-com:vml" xmlns:wp14="http://schemas.microsoft.com/office/word/2010/wordprocessingDrawing" xmlns:wp="http://schemas.openxmlformats.org/drawingml/2006/wordprocessingDrawing" xmlns:w10="urn:schemas-microsoft-com:office:word" xmlns:w="http://schemas.openxmlformats.org/wordprocessingml/2006/main" xmlns:w14="http://schemas.microsoft.com/office/word/2010/wordml" xmlns:w15="http://schemas.microsoft.com/office/word/2012/wordml" xmlns:w16cex="http://schemas.microsoft.com/office/word/2018/wordml/cex" xmlns:w16cid="http://schemas.microsoft.com/office/word/2016/wordml/cid" xmlns:w16="http://schemas.microsoft.com/office/word/2018/wordml" xmlns:w16du="http://schemas.microsoft.com/office/word/2023/wordml/word16du" xmlns:w16sdtdh="http://schemas.microsoft.com/office/word/2020/wordml/sdtdatahash" xmlns:w16sdtfl="http://schemas.microsoft.com/office/word/2024/wordml/sdtformatlock" xmlns:w16se="http://schemas.microsoft.com/office/word/2015/wordml/symex" xmlns:wpg="http://schemas.microsoft.com/office/word/2010/wordprocessingGroup" xmlns:wpi="http://schemas.microsoft.com/office/word/2010/wordprocessingInk" xmlns:wne="http://schemas.microsoft.com/office/word/2006/wordml" xmlns:wps="http://schemas.microsoft.com/office/word/2010/wordprocessingShape" mc:Ignorable="w14 w15 w16se w16cid w16 w16cex w16sdtdh w16sdtfl w16du wp14">
   <w:endnote w:type="separator" w:id="-1">
     <w:p>
       <w:r>
@@ -11693,37 +11897,37 @@
 </file>
 
 <file path=word/footer1.xml><?xml version="1.0" encoding="utf-8"?>
-<w:ftr xmlns:wpc="http://schemas.microsoft.com/office/word/2010/wordprocessingCanvas" xmlns:cx="http://schemas.microsoft.com/office/drawing/2014/chartex" xmlns:cx1="http://schemas.microsoft.com/office/drawing/2015/9/8/chartex" xmlns:cx2="http://schemas.microsoft.com/office/drawing/2015/10/21/chartex" xmlns:cx3="http://schemas.microsoft.com/office/drawing/2016/5/9/chartex" xmlns:cx4="http://schemas.microsoft.com/office/drawing/2016/5/10/chartex" xmlns:cx5="http://schemas.microsoft.com/office/drawing/2016/5/11/chartex" xmlns:cx6="http://schemas.microsoft.com/office/drawing/2016/5/12/chartex" xmlns:cx7="http://schemas.microsoft.com/office/drawing/2016/5/13/chartex" xmlns:cx8="http://schemas.microsoft.com/office/drawing/2016/5/14/chartex" xmlns:mc="http://schemas.openxmlformats.org/markup-compatibility/2006" xmlns:aink="http://schemas.microsoft.com/office/drawing/2016/ink" xmlns:am3d="http://schemas.microsoft.com/office/drawing/2017/model3d" xmlns:o="urn:schemas-microsoft-com:office:office" xmlns:oel="http://schemas.microsoft.com/office/2019/extlst" xmlns:r="http://schemas.openxmlformats.org/officeDocument/2006/relationships" xmlns:m="http://schemas.openxmlformats.org/officeDocument/2006/math" xmlns:v="urn:schemas-microsoft-com:vml" xmlns:wp14="http://schemas.microsoft.com/office/word/2010/wordprocessingDrawing" xmlns:wp="http://schemas.openxmlformats.org/drawingml/2006/wordprocessingDrawing" xmlns:w10="urn:schemas-microsoft-com:office:word" xmlns:w="http://schemas.openxmlformats.org/wordprocessingml/2006/main" xmlns:w14="http://schemas.microsoft.com/office/word/2010/wordml" xmlns:w15="http://schemas.microsoft.com/office/word/2012/wordml" xmlns:w16cex="http://schemas.microsoft.com/office/word/2018/wordml/cex" xmlns:w16cid="http://schemas.microsoft.com/office/word/2016/wordml/cid" xmlns:w16="http://schemas.microsoft.com/office/word/2018/wordml" xmlns:w16du="http://schemas.microsoft.com/office/word/2023/wordml/word16du" xmlns:w16sdtdh="http://schemas.microsoft.com/office/word/2020/wordml/sdtdatahash" xmlns:w16se="http://schemas.microsoft.com/office/word/2015/wordml/symex" xmlns:wpg="http://schemas.microsoft.com/office/word/2010/wordprocessingGroup" xmlns:wpi="http://schemas.microsoft.com/office/word/2010/wordprocessingInk" xmlns:wne="http://schemas.microsoft.com/office/word/2006/wordml" xmlns:wps="http://schemas.microsoft.com/office/word/2010/wordprocessingShape" mc:Ignorable="w14 w15 w16se w16cid w16 w16cex w16sdtdh w16du wp14">
+<w:ftr xmlns:wpc="http://schemas.microsoft.com/office/word/2010/wordprocessingCanvas" xmlns:cx="http://schemas.microsoft.com/office/drawing/2014/chartex" xmlns:cx1="http://schemas.microsoft.com/office/drawing/2015/9/8/chartex" xmlns:cx2="http://schemas.microsoft.com/office/drawing/2015/10/21/chartex" xmlns:cx3="http://schemas.microsoft.com/office/drawing/2016/5/9/chartex" xmlns:cx4="http://schemas.microsoft.com/office/drawing/2016/5/10/chartex" xmlns:cx5="http://schemas.microsoft.com/office/drawing/2016/5/11/chartex" xmlns:cx6="http://schemas.microsoft.com/office/drawing/2016/5/12/chartex" xmlns:cx7="http://schemas.microsoft.com/office/drawing/2016/5/13/chartex" xmlns:cx8="http://schemas.microsoft.com/office/drawing/2016/5/14/chartex" xmlns:mc="http://schemas.openxmlformats.org/markup-compatibility/2006" xmlns:aink="http://schemas.microsoft.com/office/drawing/2016/ink" xmlns:am3d="http://schemas.microsoft.com/office/drawing/2017/model3d" xmlns:o="urn:schemas-microsoft-com:office:office" xmlns:oel="http://schemas.microsoft.com/office/2019/extlst" xmlns:r="http://schemas.openxmlformats.org/officeDocument/2006/relationships" xmlns:m="http://schemas.openxmlformats.org/officeDocument/2006/math" xmlns:v="urn:schemas-microsoft-com:vml" xmlns:wp14="http://schemas.microsoft.com/office/word/2010/wordprocessingDrawing" xmlns:wp="http://schemas.openxmlformats.org/drawingml/2006/wordprocessingDrawing" xmlns:w10="urn:schemas-microsoft-com:office:word" xmlns:w="http://schemas.openxmlformats.org/wordprocessingml/2006/main" xmlns:w14="http://schemas.microsoft.com/office/word/2010/wordml" xmlns:w15="http://schemas.microsoft.com/office/word/2012/wordml" xmlns:w16cex="http://schemas.microsoft.com/office/word/2018/wordml/cex" xmlns:w16cid="http://schemas.microsoft.com/office/word/2016/wordml/cid" xmlns:w16="http://schemas.microsoft.com/office/word/2018/wordml" xmlns:w16du="http://schemas.microsoft.com/office/word/2023/wordml/word16du" xmlns:w16sdtdh="http://schemas.microsoft.com/office/word/2020/wordml/sdtdatahash" xmlns:w16sdtfl="http://schemas.microsoft.com/office/word/2024/wordml/sdtformatlock" xmlns:w16se="http://schemas.microsoft.com/office/word/2015/wordml/symex" xmlns:wpg="http://schemas.microsoft.com/office/word/2010/wordprocessingGroup" xmlns:wpi="http://schemas.microsoft.com/office/word/2010/wordprocessingInk" xmlns:wne="http://schemas.microsoft.com/office/word/2006/wordml" xmlns:wps="http://schemas.microsoft.com/office/word/2010/wordprocessingShape" mc:Ignorable="w14 w15 w16se w16cid w16 w16cex w16sdtdh w16sdtfl w16du wp14">
   <w:p>
     <w:pPr>
-      <w:pStyle w:val="Fuzeile"/>
+      <w:pStyle w:val="Footer"/>
       <w:framePr w:wrap="none" w:vAnchor="text" w:hAnchor="margin" w:xAlign="right" w:y="1"/>
       <w:rPr>
-        <w:rStyle w:val="Seitenzahl"/>
+        <w:rStyle w:val="PageNumber"/>
       </w:rPr>
     </w:pPr>
     <w:r>
       <w:rPr>
-        <w:rStyle w:val="Seitenzahl"/>
+        <w:rStyle w:val="PageNumber"/>
       </w:rPr>
       <w:fldChar w:fldCharType="begin"/>
     </w:r>
     <w:r>
       <w:rPr>
-        <w:rStyle w:val="Seitenzahl"/>
+        <w:rStyle w:val="PageNumber"/>
       </w:rPr>
       <w:instrText xml:space="preserve">PAGE  </w:instrText>
     </w:r>
     <w:r>
       <w:rPr>
-        <w:rStyle w:val="Seitenzahl"/>
+        <w:rStyle w:val="PageNumber"/>
       </w:rPr>
       <w:fldChar w:fldCharType="end"/>
     </w:r>
   </w:p>
   <w:p>
     <w:pPr>
-      <w:pStyle w:val="Fuzeile"/>
+      <w:pStyle w:val="Footer"/>
       <w:ind w:right="360"/>
     </w:pPr>
   </w:p>
@@ -11731,7 +11935,7 @@
 </file>
 
 <file path=word/footer2.xml><?xml version="1.0" encoding="utf-8"?>
-<w:ftr xmlns:wpc="http://schemas.microsoft.com/office/word/2010/wordprocessingCanvas" xmlns:cx="http://schemas.microsoft.com/office/drawing/2014/chartex" xmlns:cx1="http://schemas.microsoft.com/office/drawing/2015/9/8/chartex" xmlns:cx2="http://schemas.microsoft.com/office/drawing/2015/10/21/chartex" xmlns:cx3="http://schemas.microsoft.com/office/drawing/2016/5/9/chartex" xmlns:cx4="http://schemas.microsoft.com/office/drawing/2016/5/10/chartex" xmlns:cx5="http://schemas.microsoft.com/office/drawing/2016/5/11/chartex" xmlns:cx6="http://schemas.microsoft.com/office/drawing/2016/5/12/chartex" xmlns:cx7="http://schemas.microsoft.com/office/drawing/2016/5/13/chartex" xmlns:cx8="http://schemas.microsoft.com/office/drawing/2016/5/14/chartex" xmlns:mc="http://schemas.openxmlformats.org/markup-compatibility/2006" xmlns:aink="http://schemas.microsoft.com/office/drawing/2016/ink" xmlns:am3d="http://schemas.microsoft.com/office/drawing/2017/model3d" xmlns:o="urn:schemas-microsoft-com:office:office" xmlns:oel="http://schemas.microsoft.com/office/2019/extlst" xmlns:r="http://schemas.openxmlformats.org/officeDocument/2006/relationships" xmlns:m="http://schemas.openxmlformats.org/officeDocument/2006/math" xmlns:v="urn:schemas-microsoft-com:vml" xmlns:wp14="http://schemas.microsoft.com/office/word/2010/wordprocessingDrawing" xmlns:wp="http://schemas.openxmlformats.org/drawingml/2006/wordprocessingDrawing" xmlns:w10="urn:schemas-microsoft-com:office:word" xmlns:w="http://schemas.openxmlformats.org/wordprocessingml/2006/main" xmlns:w14="http://schemas.microsoft.com/office/word/2010/wordml" xmlns:w15="http://schemas.microsoft.com/office/word/2012/wordml" xmlns:w16cex="http://schemas.microsoft.com/office/word/2018/wordml/cex" xmlns:w16cid="http://schemas.microsoft.com/office/word/2016/wordml/cid" xmlns:w16="http://schemas.microsoft.com/office/word/2018/wordml" xmlns:w16du="http://schemas.microsoft.com/office/word/2023/wordml/word16du" xmlns:w16sdtdh="http://schemas.microsoft.com/office/word/2020/wordml/sdtdatahash" xmlns:w16se="http://schemas.microsoft.com/office/word/2015/wordml/symex" xmlns:wpg="http://schemas.microsoft.com/office/word/2010/wordprocessingGroup" xmlns:wpi="http://schemas.microsoft.com/office/word/2010/wordprocessingInk" xmlns:wne="http://schemas.microsoft.com/office/word/2006/wordml" xmlns:wps="http://schemas.microsoft.com/office/word/2010/wordprocessingShape" mc:Ignorable="w14 w15 w16se w16cid w16 w16cex w16sdtdh w16du wp14">
+<w:ftr xmlns:wpc="http://schemas.microsoft.com/office/word/2010/wordprocessingCanvas" xmlns:cx="http://schemas.microsoft.com/office/drawing/2014/chartex" xmlns:cx1="http://schemas.microsoft.com/office/drawing/2015/9/8/chartex" xmlns:cx2="http://schemas.microsoft.com/office/drawing/2015/10/21/chartex" xmlns:cx3="http://schemas.microsoft.com/office/drawing/2016/5/9/chartex" xmlns:cx4="http://schemas.microsoft.com/office/drawing/2016/5/10/chartex" xmlns:cx5="http://schemas.microsoft.com/office/drawing/2016/5/11/chartex" xmlns:cx6="http://schemas.microsoft.com/office/drawing/2016/5/12/chartex" xmlns:cx7="http://schemas.microsoft.com/office/drawing/2016/5/13/chartex" xmlns:cx8="http://schemas.microsoft.com/office/drawing/2016/5/14/chartex" xmlns:mc="http://schemas.openxmlformats.org/markup-compatibility/2006" xmlns:aink="http://schemas.microsoft.com/office/drawing/2016/ink" xmlns:am3d="http://schemas.microsoft.com/office/drawing/2017/model3d" xmlns:o="urn:schemas-microsoft-com:office:office" xmlns:oel="http://schemas.microsoft.com/office/2019/extlst" xmlns:r="http://schemas.openxmlformats.org/officeDocument/2006/relationships" xmlns:m="http://schemas.openxmlformats.org/officeDocument/2006/math" xmlns:v="urn:schemas-microsoft-com:vml" xmlns:wp14="http://schemas.microsoft.com/office/word/2010/wordprocessingDrawing" xmlns:wp="http://schemas.openxmlformats.org/drawingml/2006/wordprocessingDrawing" xmlns:w10="urn:schemas-microsoft-com:office:word" xmlns:w="http://schemas.openxmlformats.org/wordprocessingml/2006/main" xmlns:w14="http://schemas.microsoft.com/office/word/2010/wordml" xmlns:w15="http://schemas.microsoft.com/office/word/2012/wordml" xmlns:w16cex="http://schemas.microsoft.com/office/word/2018/wordml/cex" xmlns:w16cid="http://schemas.microsoft.com/office/word/2016/wordml/cid" xmlns:w16="http://schemas.microsoft.com/office/word/2018/wordml" xmlns:w16du="http://schemas.microsoft.com/office/word/2023/wordml/word16du" xmlns:w16sdtdh="http://schemas.microsoft.com/office/word/2020/wordml/sdtdatahash" xmlns:w16sdtfl="http://schemas.microsoft.com/office/word/2024/wordml/sdtformatlock" xmlns:w16se="http://schemas.microsoft.com/office/word/2015/wordml/symex" xmlns:wpg="http://schemas.microsoft.com/office/word/2010/wordprocessingGroup" xmlns:wpi="http://schemas.microsoft.com/office/word/2010/wordprocessingInk" xmlns:wne="http://schemas.microsoft.com/office/word/2006/wordml" xmlns:wps="http://schemas.microsoft.com/office/word/2010/wordprocessingShape" mc:Ignorable="w14 w15 w16se w16cid w16 w16cex w16sdtdh w16sdtfl w16du wp14">
   <w:p>
     <w:pPr>
       <w:rPr>
@@ -11830,7 +12034,7 @@
 </file>
 
 <file path=word/footnotes.xml><?xml version="1.0" encoding="utf-8"?>
-<w:footnotes xmlns:wpc="http://schemas.microsoft.com/office/word/2010/wordprocessingCanvas" xmlns:cx="http://schemas.microsoft.com/office/drawing/2014/chartex" xmlns:cx1="http://schemas.microsoft.com/office/drawing/2015/9/8/chartex" xmlns:cx2="http://schemas.microsoft.com/office/drawing/2015/10/21/chartex" xmlns:cx3="http://schemas.microsoft.com/office/drawing/2016/5/9/chartex" xmlns:cx4="http://schemas.microsoft.com/office/drawing/2016/5/10/chartex" xmlns:cx5="http://schemas.microsoft.com/office/drawing/2016/5/11/chartex" xmlns:cx6="http://schemas.microsoft.com/office/drawing/2016/5/12/chartex" xmlns:cx7="http://schemas.microsoft.com/office/drawing/2016/5/13/chartex" xmlns:cx8="http://schemas.microsoft.com/office/drawing/2016/5/14/chartex" xmlns:mc="http://schemas.openxmlformats.org/markup-compatibility/2006" xmlns:aink="http://schemas.microsoft.com/office/drawing/2016/ink" xmlns:am3d="http://schemas.microsoft.com/office/drawing/2017/model3d" xmlns:o="urn:schemas-microsoft-com:office:office" xmlns:oel="http://schemas.microsoft.com/office/2019/extlst" xmlns:r="http://schemas.openxmlformats.org/officeDocument/2006/relationships" xmlns:m="http://schemas.openxmlformats.org/officeDocument/2006/math" xmlns:v="urn:schemas-microsoft-com:vml" xmlns:wp14="http://schemas.microsoft.com/office/word/2010/wordprocessingDrawing" xmlns:wp="http://schemas.openxmlformats.org/drawingml/2006/wordprocessingDrawing" xmlns:w10="urn:schemas-microsoft-com:office:word" xmlns:w="http://schemas.openxmlformats.org/wordprocessingml/2006/main" xmlns:w14="http://schemas.microsoft.com/office/word/2010/wordml" xmlns:w15="http://schemas.microsoft.com/office/word/2012/wordml" xmlns:w16cex="http://schemas.microsoft.com/office/word/2018/wordml/cex" xmlns:w16cid="http://schemas.microsoft.com/office/word/2016/wordml/cid" xmlns:w16="http://schemas.microsoft.com/office/word/2018/wordml" xmlns:w16du="http://schemas.microsoft.com/office/word/2023/wordml/word16du" xmlns:w16sdtdh="http://schemas.microsoft.com/office/word/2020/wordml/sdtdatahash" xmlns:w16se="http://schemas.microsoft.com/office/word/2015/wordml/symex" xmlns:wpg="http://schemas.microsoft.com/office/word/2010/wordprocessingGroup" xmlns:wpi="http://schemas.microsoft.com/office/word/2010/wordprocessingInk" xmlns:wne="http://schemas.microsoft.com/office/word/2006/wordml" xmlns:wps="http://schemas.microsoft.com/office/word/2010/wordprocessingShape" mc:Ignorable="w14 w15 w16se w16cid w16 w16cex w16sdtdh w16du wp14">
+<w:footnotes xmlns:wpc="http://schemas.microsoft.com/office/word/2010/wordprocessingCanvas" xmlns:cx="http://schemas.microsoft.com/office/drawing/2014/chartex" xmlns:cx1="http://schemas.microsoft.com/office/drawing/2015/9/8/chartex" xmlns:cx2="http://schemas.microsoft.com/office/drawing/2015/10/21/chartex" xmlns:cx3="http://schemas.microsoft.com/office/drawing/2016/5/9/chartex" xmlns:cx4="http://schemas.microsoft.com/office/drawing/2016/5/10/chartex" xmlns:cx5="http://schemas.microsoft.com/office/drawing/2016/5/11/chartex" xmlns:cx6="http://schemas.microsoft.com/office/drawing/2016/5/12/chartex" xmlns:cx7="http://schemas.microsoft.com/office/drawing/2016/5/13/chartex" xmlns:cx8="http://schemas.microsoft.com/office/drawing/2016/5/14/chartex" xmlns:mc="http://schemas.openxmlformats.org/markup-compatibility/2006" xmlns:aink="http://schemas.microsoft.com/office/drawing/2016/ink" xmlns:am3d="http://schemas.microsoft.com/office/drawing/2017/model3d" xmlns:o="urn:schemas-microsoft-com:office:office" xmlns:oel="http://schemas.microsoft.com/office/2019/extlst" xmlns:r="http://schemas.openxmlformats.org/officeDocument/2006/relationships" xmlns:m="http://schemas.openxmlformats.org/officeDocument/2006/math" xmlns:v="urn:schemas-microsoft-com:vml" xmlns:wp14="http://schemas.microsoft.com/office/word/2010/wordprocessingDrawing" xmlns:wp="http://schemas.openxmlformats.org/drawingml/2006/wordprocessingDrawing" xmlns:w10="urn:schemas-microsoft-com:office:word" xmlns:w="http://schemas.openxmlformats.org/wordprocessingml/2006/main" xmlns:w14="http://schemas.microsoft.com/office/word/2010/wordml" xmlns:w15="http://schemas.microsoft.com/office/word/2012/wordml" xmlns:w16cex="http://schemas.microsoft.com/office/word/2018/wordml/cex" xmlns:w16cid="http://schemas.microsoft.com/office/word/2016/wordml/cid" xmlns:w16="http://schemas.microsoft.com/office/word/2018/wordml" xmlns:w16du="http://schemas.microsoft.com/office/word/2023/wordml/word16du" xmlns:w16sdtdh="http://schemas.microsoft.com/office/word/2020/wordml/sdtdatahash" xmlns:w16sdtfl="http://schemas.microsoft.com/office/word/2024/wordml/sdtformatlock" xmlns:w16se="http://schemas.microsoft.com/office/word/2015/wordml/symex" xmlns:wpg="http://schemas.microsoft.com/office/word/2010/wordprocessingGroup" xmlns:wpi="http://schemas.microsoft.com/office/word/2010/wordprocessingInk" xmlns:wne="http://schemas.microsoft.com/office/word/2006/wordml" xmlns:wps="http://schemas.microsoft.com/office/word/2010/wordprocessingShape" mc:Ignorable="w14 w15 w16se w16cid w16 w16cex w16sdtdh w16sdtfl w16du wp14">
   <w:footnote w:type="separator" w:id="-1">
     <w:p>
       <w:r>
@@ -11849,7 +12053,7 @@
 </file>
 
 <file path=word/header1.xml><?xml version="1.0" encoding="utf-8"?>
-<w:hdr xmlns:wpc="http://schemas.microsoft.com/office/word/2010/wordprocessingCanvas" xmlns:cx="http://schemas.microsoft.com/office/drawing/2014/chartex" xmlns:cx1="http://schemas.microsoft.com/office/drawing/2015/9/8/chartex" xmlns:cx2="http://schemas.microsoft.com/office/drawing/2015/10/21/chartex" xmlns:cx3="http://schemas.microsoft.com/office/drawing/2016/5/9/chartex" xmlns:cx4="http://schemas.microsoft.com/office/drawing/2016/5/10/chartex" xmlns:cx5="http://schemas.microsoft.com/office/drawing/2016/5/11/chartex" xmlns:cx6="http://schemas.microsoft.com/office/drawing/2016/5/12/chartex" xmlns:cx7="http://schemas.microsoft.com/office/drawing/2016/5/13/chartex" xmlns:cx8="http://schemas.microsoft.com/office/drawing/2016/5/14/chartex" xmlns:mc="http://schemas.openxmlformats.org/markup-compatibility/2006" xmlns:aink="http://schemas.microsoft.com/office/drawing/2016/ink" xmlns:am3d="http://schemas.microsoft.com/office/drawing/2017/model3d" xmlns:o="urn:schemas-microsoft-com:office:office" xmlns:oel="http://schemas.microsoft.com/office/2019/extlst" xmlns:r="http://schemas.openxmlformats.org/officeDocument/2006/relationships" xmlns:m="http://schemas.openxmlformats.org/officeDocument/2006/math" xmlns:v="urn:schemas-microsoft-com:vml" xmlns:wp14="http://schemas.microsoft.com/office/word/2010/wordprocessingDrawing" xmlns:wp="http://schemas.openxmlformats.org/drawingml/2006/wordprocessingDrawing" xmlns:w10="urn:schemas-microsoft-com:office:word" xmlns:w="http://schemas.openxmlformats.org/wordprocessingml/2006/main" xmlns:w14="http://schemas.microsoft.com/office/word/2010/wordml" xmlns:w15="http://schemas.microsoft.com/office/word/2012/wordml" xmlns:w16cex="http://schemas.microsoft.com/office/word/2018/wordml/cex" xmlns:w16cid="http://schemas.microsoft.com/office/word/2016/wordml/cid" xmlns:w16="http://schemas.microsoft.com/office/word/2018/wordml" xmlns:w16du="http://schemas.microsoft.com/office/word/2023/wordml/word16du" xmlns:w16sdtdh="http://schemas.microsoft.com/office/word/2020/wordml/sdtdatahash" xmlns:w16se="http://schemas.microsoft.com/office/word/2015/wordml/symex" xmlns:wpg="http://schemas.microsoft.com/office/word/2010/wordprocessingGroup" xmlns:wpi="http://schemas.microsoft.com/office/word/2010/wordprocessingInk" xmlns:wne="http://schemas.microsoft.com/office/word/2006/wordml" xmlns:wps="http://schemas.microsoft.com/office/word/2010/wordprocessingShape" mc:Ignorable="w14 w15 w16se w16cid w16 w16cex w16sdtdh w16du wp14">
+<w:hdr xmlns:wpc="http://schemas.microsoft.com/office/word/2010/wordprocessingCanvas" xmlns:cx="http://schemas.microsoft.com/office/drawing/2014/chartex" xmlns:cx1="http://schemas.microsoft.com/office/drawing/2015/9/8/chartex" xmlns:cx2="http://schemas.microsoft.com/office/drawing/2015/10/21/chartex" xmlns:cx3="http://schemas.microsoft.com/office/drawing/2016/5/9/chartex" xmlns:cx4="http://schemas.microsoft.com/office/drawing/2016/5/10/chartex" xmlns:cx5="http://schemas.microsoft.com/office/drawing/2016/5/11/chartex" xmlns:cx6="http://schemas.microsoft.com/office/drawing/2016/5/12/chartex" xmlns:cx7="http://schemas.microsoft.com/office/drawing/2016/5/13/chartex" xmlns:cx8="http://schemas.microsoft.com/office/drawing/2016/5/14/chartex" xmlns:mc="http://schemas.openxmlformats.org/markup-compatibility/2006" xmlns:aink="http://schemas.microsoft.com/office/drawing/2016/ink" xmlns:am3d="http://schemas.microsoft.com/office/drawing/2017/model3d" xmlns:o="urn:schemas-microsoft-com:office:office" xmlns:oel="http://schemas.microsoft.com/office/2019/extlst" xmlns:r="http://schemas.openxmlformats.org/officeDocument/2006/relationships" xmlns:m="http://schemas.openxmlformats.org/officeDocument/2006/math" xmlns:v="urn:schemas-microsoft-com:vml" xmlns:wp14="http://schemas.microsoft.com/office/word/2010/wordprocessingDrawing" xmlns:wp="http://schemas.openxmlformats.org/drawingml/2006/wordprocessingDrawing" xmlns:w10="urn:schemas-microsoft-com:office:word" xmlns:w="http://schemas.openxmlformats.org/wordprocessingml/2006/main" xmlns:w14="http://schemas.microsoft.com/office/word/2010/wordml" xmlns:w15="http://schemas.microsoft.com/office/word/2012/wordml" xmlns:w16cex="http://schemas.microsoft.com/office/word/2018/wordml/cex" xmlns:w16cid="http://schemas.microsoft.com/office/word/2016/wordml/cid" xmlns:w16="http://schemas.microsoft.com/office/word/2018/wordml" xmlns:w16du="http://schemas.microsoft.com/office/word/2023/wordml/word16du" xmlns:w16sdtdh="http://schemas.microsoft.com/office/word/2020/wordml/sdtdatahash" xmlns:w16sdtfl="http://schemas.microsoft.com/office/word/2024/wordml/sdtformatlock" xmlns:w16se="http://schemas.microsoft.com/office/word/2015/wordml/symex" xmlns:wpg="http://schemas.microsoft.com/office/word/2010/wordprocessingGroup" xmlns:wpi="http://schemas.microsoft.com/office/word/2010/wordprocessingInk" xmlns:wne="http://schemas.microsoft.com/office/word/2006/wordml" xmlns:wps="http://schemas.microsoft.com/office/word/2010/wordprocessingShape" mc:Ignorable="w14 w15 w16se w16cid w16 w16cex w16sdtdh w16sdtfl w16du wp14">
   <w:p>
     <w:pPr>
       <w:jc w:val="right"/>
@@ -11868,14 +12072,14 @@
   </w:p>
   <w:p>
     <w:pPr>
-      <w:pStyle w:val="Kopfzeile"/>
+      <w:pStyle w:val="Header"/>
     </w:pPr>
   </w:p>
 </w:hdr>
 </file>
 
 <file path=word/numbering.xml><?xml version="1.0" encoding="utf-8"?>
-<w:numbering xmlns:wpc="http://schemas.microsoft.com/office/word/2010/wordprocessingCanvas" xmlns:cx="http://schemas.microsoft.com/office/drawing/2014/chartex" xmlns:cx1="http://schemas.microsoft.com/office/drawing/2015/9/8/chartex" xmlns:cx2="http://schemas.microsoft.com/office/drawing/2015/10/21/chartex" xmlns:cx3="http://schemas.microsoft.com/office/drawing/2016/5/9/chartex" xmlns:cx4="http://schemas.microsoft.com/office/drawing/2016/5/10/chartex" xmlns:cx5="http://schemas.microsoft.com/office/drawing/2016/5/11/chartex" xmlns:cx6="http://schemas.microsoft.com/office/drawing/2016/5/12/chartex" xmlns:cx7="http://schemas.microsoft.com/office/drawing/2016/5/13/chartex" xmlns:cx8="http://schemas.microsoft.com/office/drawing/2016/5/14/chartex" xmlns:mc="http://schemas.openxmlformats.org/markup-compatibility/2006" xmlns:aink="http://schemas.microsoft.com/office/drawing/2016/ink" xmlns:am3d="http://schemas.microsoft.com/office/drawing/2017/model3d" xmlns:o="urn:schemas-microsoft-com:office:office" xmlns:oel="http://schemas.microsoft.com/office/2019/extlst" xmlns:r="http://schemas.openxmlformats.org/officeDocument/2006/relationships" xmlns:m="http://schemas.openxmlformats.org/officeDocument/2006/math" xmlns:v="urn:schemas-microsoft-com:vml" xmlns:wp14="http://schemas.microsoft.com/office/word/2010/wordprocessingDrawing" xmlns:wp="http://schemas.openxmlformats.org/drawingml/2006/wordprocessingDrawing" xmlns:w10="urn:schemas-microsoft-com:office:word" xmlns:w="http://schemas.openxmlformats.org/wordprocessingml/2006/main" xmlns:w14="http://schemas.microsoft.com/office/word/2010/wordml" xmlns:w15="http://schemas.microsoft.com/office/word/2012/wordml" xmlns:w16cex="http://schemas.microsoft.com/office/word/2018/wordml/cex" xmlns:w16cid="http://schemas.microsoft.com/office/word/2016/wordml/cid" xmlns:w16="http://schemas.microsoft.com/office/word/2018/wordml" xmlns:w16du="http://schemas.microsoft.com/office/word/2023/wordml/word16du" xmlns:w16sdtdh="http://schemas.microsoft.com/office/word/2020/wordml/sdtdatahash" xmlns:w16se="http://schemas.microsoft.com/office/word/2015/wordml/symex" xmlns:wpg="http://schemas.microsoft.com/office/word/2010/wordprocessingGroup" xmlns:wpi="http://schemas.microsoft.com/office/word/2010/wordprocessingInk" xmlns:wne="http://schemas.microsoft.com/office/word/2006/wordml" xmlns:wps="http://schemas.microsoft.com/office/word/2010/wordprocessingShape" mc:Ignorable="w14 w15 w16se w16cid w16 w16cex w16sdtdh w16du wp14">
+<w:numbering xmlns:wpc="http://schemas.microsoft.com/office/word/2010/wordprocessingCanvas" xmlns:cx="http://schemas.microsoft.com/office/drawing/2014/chartex" xmlns:cx1="http://schemas.microsoft.com/office/drawing/2015/9/8/chartex" xmlns:cx2="http://schemas.microsoft.com/office/drawing/2015/10/21/chartex" xmlns:cx3="http://schemas.microsoft.com/office/drawing/2016/5/9/chartex" xmlns:cx4="http://schemas.microsoft.com/office/drawing/2016/5/10/chartex" xmlns:cx5="http://schemas.microsoft.com/office/drawing/2016/5/11/chartex" xmlns:cx6="http://schemas.microsoft.com/office/drawing/2016/5/12/chartex" xmlns:cx7="http://schemas.microsoft.com/office/drawing/2016/5/13/chartex" xmlns:cx8="http://schemas.microsoft.com/office/drawing/2016/5/14/chartex" xmlns:mc="http://schemas.openxmlformats.org/markup-compatibility/2006" xmlns:aink="http://schemas.microsoft.com/office/drawing/2016/ink" xmlns:am3d="http://schemas.microsoft.com/office/drawing/2017/model3d" xmlns:o="urn:schemas-microsoft-com:office:office" xmlns:oel="http://schemas.microsoft.com/office/2019/extlst" xmlns:r="http://schemas.openxmlformats.org/officeDocument/2006/relationships" xmlns:m="http://schemas.openxmlformats.org/officeDocument/2006/math" xmlns:v="urn:schemas-microsoft-com:vml" xmlns:wp14="http://schemas.microsoft.com/office/word/2010/wordprocessingDrawing" xmlns:wp="http://schemas.openxmlformats.org/drawingml/2006/wordprocessingDrawing" xmlns:w10="urn:schemas-microsoft-com:office:word" xmlns:w="http://schemas.openxmlformats.org/wordprocessingml/2006/main" xmlns:w14="http://schemas.microsoft.com/office/word/2010/wordml" xmlns:w15="http://schemas.microsoft.com/office/word/2012/wordml" xmlns:w16cex="http://schemas.microsoft.com/office/word/2018/wordml/cex" xmlns:w16cid="http://schemas.microsoft.com/office/word/2016/wordml/cid" xmlns:w16="http://schemas.microsoft.com/office/word/2018/wordml" xmlns:w16du="http://schemas.microsoft.com/office/word/2023/wordml/word16du" xmlns:w16sdtdh="http://schemas.microsoft.com/office/word/2020/wordml/sdtdatahash" xmlns:w16sdtfl="http://schemas.microsoft.com/office/word/2024/wordml/sdtformatlock" xmlns:w16se="http://schemas.microsoft.com/office/word/2015/wordml/symex" xmlns:wpg="http://schemas.microsoft.com/office/word/2010/wordprocessingGroup" xmlns:wpi="http://schemas.microsoft.com/office/word/2010/wordprocessingInk" xmlns:wne="http://schemas.microsoft.com/office/word/2006/wordml" xmlns:wps="http://schemas.microsoft.com/office/word/2010/wordprocessingShape" mc:Ignorable="w14 w15 w16se w16cid w16 w16cex w16sdtdh w16sdtfl w16du wp14">
   <w:abstractNum w:abstractNumId="0" w15:restartNumberingAfterBreak="0">
     <w:nsid w:val="1B1649E7"/>
     <w:multiLevelType w:val="hybridMultilevel"/>
@@ -12085,7 +12289,7 @@
 </file>
 
 <file path=word/styles.xml><?xml version="1.0" encoding="utf-8"?>
-<w:styles xmlns:mc="http://schemas.openxmlformats.org/markup-compatibility/2006" xmlns:r="http://schemas.openxmlformats.org/officeDocument/2006/relationships" xmlns:w="http://schemas.openxmlformats.org/wordprocessingml/2006/main" xmlns:w14="http://schemas.microsoft.com/office/word/2010/wordml" xmlns:w15="http://schemas.microsoft.com/office/word/2012/wordml" xmlns:w16cex="http://schemas.microsoft.com/office/word/2018/wordml/cex" xmlns:w16cid="http://schemas.microsoft.com/office/word/2016/wordml/cid" xmlns:w16="http://schemas.microsoft.com/office/word/2018/wordml" xmlns:w16du="http://schemas.microsoft.com/office/word/2023/wordml/word16du" xmlns:w16sdtdh="http://schemas.microsoft.com/office/word/2020/wordml/sdtdatahash" xmlns:w16se="http://schemas.microsoft.com/office/word/2015/wordml/symex" mc:Ignorable="w14 w15 w16se w16cid w16 w16cex w16sdtdh w16du">
+<w:styles xmlns:mc="http://schemas.openxmlformats.org/markup-compatibility/2006" xmlns:r="http://schemas.openxmlformats.org/officeDocument/2006/relationships" xmlns:w="http://schemas.openxmlformats.org/wordprocessingml/2006/main" xmlns:w14="http://schemas.microsoft.com/office/word/2010/wordml" xmlns:w15="http://schemas.microsoft.com/office/word/2012/wordml" xmlns:w16cex="http://schemas.microsoft.com/office/word/2018/wordml/cex" xmlns:w16cid="http://schemas.microsoft.com/office/word/2016/wordml/cid" xmlns:w16="http://schemas.microsoft.com/office/word/2018/wordml" xmlns:w16du="http://schemas.microsoft.com/office/word/2023/wordml/word16du" xmlns:w16sdtdh="http://schemas.microsoft.com/office/word/2020/wordml/sdtdatahash" xmlns:w16sdtfl="http://schemas.microsoft.com/office/word/2024/wordml/sdtformatlock" xmlns:w16se="http://schemas.microsoft.com/office/word/2015/wordml/symex" mc:Ignorable="w14 w15 w16se w16cid w16 w16cex w16sdtdh w16sdtfl w16du">
   <w:docDefaults>
     <w:rPrDefault>
       <w:rPr>
@@ -12471,18 +12675,17 @@
     <w:lsdException w:name="List Table 7 Colorful Accent 6" w:uiPriority="52"/>
     <w:lsdException w:name="Smart Link" w:semiHidden="1" w:unhideWhenUsed="1"/>
   </w:latentStyles>
-  <w:style w:type="paragraph" w:default="1" w:styleId="Standard">
+  <w:style w:type="paragraph" w:default="1" w:styleId="Normal">
     <w:name w:val="Normal"/>
     <w:qFormat/>
     <w:rsid w:val="00461742"/>
   </w:style>
-  <w:style w:type="character" w:default="1" w:styleId="Absatz-Standardschriftart">
+  <w:style w:type="character" w:default="1" w:styleId="DefaultParagraphFont">
     <w:name w:val="Default Paragraph Font"/>
     <w:uiPriority w:val="1"/>
-    <w:semiHidden/>
     <w:unhideWhenUsed/>
   </w:style>
-  <w:style w:type="table" w:default="1" w:styleId="NormaleTabelle">
+  <w:style w:type="table" w:default="1" w:styleId="TableNormal">
     <w:name w:val="Normal Table"/>
     <w:uiPriority w:val="99"/>
     <w:semiHidden/>
@@ -12497,16 +12700,16 @@
       </w:tblCellMar>
     </w:tblPr>
   </w:style>
-  <w:style w:type="numbering" w:default="1" w:styleId="KeineListe">
+  <w:style w:type="numbering" w:default="1" w:styleId="NoList">
     <w:name w:val="No List"/>
     <w:uiPriority w:val="99"/>
     <w:semiHidden/>
     <w:unhideWhenUsed/>
   </w:style>
-  <w:style w:type="paragraph" w:styleId="Kopfzeile">
+  <w:style w:type="paragraph" w:styleId="Header">
     <w:name w:val="header"/>
-    <w:basedOn w:val="Standard"/>
-    <w:link w:val="KopfzeileZchn"/>
+    <w:basedOn w:val="Normal"/>
+    <w:link w:val="HeaderChar"/>
     <w:uiPriority w:val="99"/>
     <w:unhideWhenUsed/>
     <w:rsid w:val="00581DDA"/>
@@ -12517,17 +12720,17 @@
       </w:tabs>
     </w:pPr>
   </w:style>
-  <w:style w:type="character" w:customStyle="1" w:styleId="KopfzeileZchn">
-    <w:name w:val="Kopfzeile Zchn"/>
-    <w:basedOn w:val="Absatz-Standardschriftart"/>
-    <w:link w:val="Kopfzeile"/>
+  <w:style w:type="character" w:customStyle="1" w:styleId="HeaderChar">
+    <w:name w:val="Header Char"/>
+    <w:basedOn w:val="DefaultParagraphFont"/>
+    <w:link w:val="Header"/>
     <w:uiPriority w:val="99"/>
     <w:rsid w:val="00581DDA"/>
   </w:style>
-  <w:style w:type="paragraph" w:styleId="Fuzeile">
+  <w:style w:type="paragraph" w:styleId="Footer">
     <w:name w:val="footer"/>
-    <w:basedOn w:val="Standard"/>
-    <w:link w:val="FuzeileZchn"/>
+    <w:basedOn w:val="Normal"/>
+    <w:link w:val="FooterChar"/>
     <w:uiPriority w:val="99"/>
     <w:unhideWhenUsed/>
     <w:rsid w:val="00581DDA"/>
@@ -12538,24 +12741,24 @@
       </w:tabs>
     </w:pPr>
   </w:style>
-  <w:style w:type="character" w:customStyle="1" w:styleId="FuzeileZchn">
-    <w:name w:val="Fußzeile Zchn"/>
-    <w:basedOn w:val="Absatz-Standardschriftart"/>
-    <w:link w:val="Fuzeile"/>
+  <w:style w:type="character" w:customStyle="1" w:styleId="FooterChar">
+    <w:name w:val="Footer Char"/>
+    <w:basedOn w:val="DefaultParagraphFont"/>
+    <w:link w:val="Footer"/>
     <w:uiPriority w:val="99"/>
     <w:rsid w:val="00581DDA"/>
   </w:style>
-  <w:style w:type="character" w:styleId="Seitenzahl">
+  <w:style w:type="character" w:styleId="PageNumber">
     <w:name w:val="page number"/>
-    <w:basedOn w:val="Absatz-Standardschriftart"/>
+    <w:basedOn w:val="DefaultParagraphFont"/>
     <w:uiPriority w:val="99"/>
     <w:semiHidden/>
     <w:unhideWhenUsed/>
     <w:rsid w:val="00581DDA"/>
   </w:style>
-  <w:style w:type="table" w:styleId="Tabellenraster">
+  <w:style w:type="table" w:styleId="TableGrid">
     <w:name w:val="Table Grid"/>
-    <w:basedOn w:val="NormaleTabelle"/>
+    <w:basedOn w:val="TableNormal"/>
     <w:uiPriority w:val="39"/>
     <w:rsid w:val="00BE3CA1"/>
     <w:tblPr>
@@ -12569,10 +12772,10 @@
       </w:tblBorders>
     </w:tblPr>
   </w:style>
-  <w:style w:type="paragraph" w:styleId="Dokumentstruktur">
+  <w:style w:type="paragraph" w:styleId="DocumentMap">
     <w:name w:val="Document Map"/>
-    <w:basedOn w:val="Standard"/>
-    <w:link w:val="DokumentstrukturZchn"/>
+    <w:basedOn w:val="Normal"/>
+    <w:link w:val="DocumentMapChar"/>
     <w:uiPriority w:val="99"/>
     <w:semiHidden/>
     <w:unhideWhenUsed/>
@@ -12581,10 +12784,10 @@
       <w:rFonts w:ascii="Times New Roman" w:hAnsi="Times New Roman" w:cs="Times New Roman"/>
     </w:rPr>
   </w:style>
-  <w:style w:type="character" w:customStyle="1" w:styleId="DokumentstrukturZchn">
-    <w:name w:val="Dokumentstruktur Zchn"/>
-    <w:basedOn w:val="Absatz-Standardschriftart"/>
-    <w:link w:val="Dokumentstruktur"/>
+  <w:style w:type="character" w:customStyle="1" w:styleId="DocumentMapChar">
+    <w:name w:val="Document Map Char"/>
+    <w:basedOn w:val="DefaultParagraphFont"/>
+    <w:link w:val="DocumentMap"/>
     <w:uiPriority w:val="99"/>
     <w:semiHidden/>
     <w:rsid w:val="0081088A"/>
@@ -12592,9 +12795,9 @@
       <w:rFonts w:ascii="Times New Roman" w:hAnsi="Times New Roman" w:cs="Times New Roman"/>
     </w:rPr>
   </w:style>
-  <w:style w:type="paragraph" w:styleId="Listenabsatz">
+  <w:style w:type="paragraph" w:styleId="ListParagraph">
     <w:name w:val="List Paragraph"/>
-    <w:basedOn w:val="Standard"/>
+    <w:basedOn w:val="Normal"/>
     <w:uiPriority w:val="34"/>
     <w:qFormat/>
     <w:rsid w:val="00043A4C"/>
@@ -12603,10 +12806,10 @@
       <w:contextualSpacing/>
     </w:pPr>
   </w:style>
-  <w:style w:type="paragraph" w:styleId="Sprechblasentext">
+  <w:style w:type="paragraph" w:styleId="BalloonText">
     <w:name w:val="Balloon Text"/>
-    <w:basedOn w:val="Standard"/>
-    <w:link w:val="SprechblasentextZchn"/>
+    <w:basedOn w:val="Normal"/>
+    <w:link w:val="BalloonTextChar"/>
     <w:uiPriority w:val="99"/>
     <w:semiHidden/>
     <w:unhideWhenUsed/>
@@ -12617,10 +12820,10 @@
       <w:szCs w:val="16"/>
     </w:rPr>
   </w:style>
-  <w:style w:type="character" w:customStyle="1" w:styleId="SprechblasentextZchn">
-    <w:name w:val="Sprechblasentext Zchn"/>
-    <w:basedOn w:val="Absatz-Standardschriftart"/>
-    <w:link w:val="Sprechblasentext"/>
+  <w:style w:type="character" w:customStyle="1" w:styleId="BalloonTextChar">
+    <w:name w:val="Balloon Text Char"/>
+    <w:basedOn w:val="DefaultParagraphFont"/>
+    <w:link w:val="BalloonText"/>
     <w:uiPriority w:val="99"/>
     <w:semiHidden/>
     <w:rsid w:val="002233C4"/>
@@ -12630,7 +12833,7 @@
       <w:szCs w:val="16"/>
     </w:rPr>
   </w:style>
-  <w:style w:type="paragraph" w:styleId="KeinLeerraum">
+  <w:style w:type="paragraph" w:styleId="NoSpacing">
     <w:name w:val="No Spacing"/>
     <w:uiPriority w:val="1"/>
     <w:qFormat/>

</xml_diff>

<commit_message>
feat: Weight percentage reaction scheme #2588
</commit_message>
<xml_diff>
--- a/lib/template/Standard.docx
+++ b/lib/template/Standard.docx
@@ -1,10 +1,10 @@
 
 <file path=word/document.xml><?xml version="1.0" encoding="utf-8"?>
-<w:document xmlns:wpc="http://schemas.microsoft.com/office/word/2010/wordprocessingCanvas" xmlns:cx="http://schemas.microsoft.com/office/drawing/2014/chartex" xmlns:cx1="http://schemas.microsoft.com/office/drawing/2015/9/8/chartex" xmlns:cx2="http://schemas.microsoft.com/office/drawing/2015/10/21/chartex" xmlns:cx3="http://schemas.microsoft.com/office/drawing/2016/5/9/chartex" xmlns:cx4="http://schemas.microsoft.com/office/drawing/2016/5/10/chartex" xmlns:cx5="http://schemas.microsoft.com/office/drawing/2016/5/11/chartex" xmlns:cx6="http://schemas.microsoft.com/office/drawing/2016/5/12/chartex" xmlns:cx7="http://schemas.microsoft.com/office/drawing/2016/5/13/chartex" xmlns:cx8="http://schemas.microsoft.com/office/drawing/2016/5/14/chartex" xmlns:mc="http://schemas.openxmlformats.org/markup-compatibility/2006" xmlns:aink="http://schemas.microsoft.com/office/drawing/2016/ink" xmlns:am3d="http://schemas.microsoft.com/office/drawing/2017/model3d" xmlns:o="urn:schemas-microsoft-com:office:office" xmlns:oel="http://schemas.microsoft.com/office/2019/extlst" xmlns:r="http://schemas.openxmlformats.org/officeDocument/2006/relationships" xmlns:m="http://schemas.openxmlformats.org/officeDocument/2006/math" xmlns:v="urn:schemas-microsoft-com:vml" xmlns:wp14="http://schemas.microsoft.com/office/word/2010/wordprocessingDrawing" xmlns:wp="http://schemas.openxmlformats.org/drawingml/2006/wordprocessingDrawing" xmlns:w10="urn:schemas-microsoft-com:office:word" xmlns:w="http://schemas.openxmlformats.org/wordprocessingml/2006/main" xmlns:w14="http://schemas.microsoft.com/office/word/2010/wordml" xmlns:w15="http://schemas.microsoft.com/office/word/2012/wordml" xmlns:w16cex="http://schemas.microsoft.com/office/word/2018/wordml/cex" xmlns:w16cid="http://schemas.microsoft.com/office/word/2016/wordml/cid" xmlns:w16="http://schemas.microsoft.com/office/word/2018/wordml" xmlns:w16du="http://schemas.microsoft.com/office/word/2023/wordml/word16du" xmlns:w16sdtdh="http://schemas.microsoft.com/office/word/2020/wordml/sdtdatahash" xmlns:w16se="http://schemas.microsoft.com/office/word/2015/wordml/symex" xmlns:wpg="http://schemas.microsoft.com/office/word/2010/wordprocessingGroup" xmlns:wpi="http://schemas.microsoft.com/office/word/2010/wordprocessingInk" xmlns:wne="http://schemas.microsoft.com/office/word/2006/wordml" xmlns:wps="http://schemas.microsoft.com/office/word/2010/wordprocessingShape" mc:Ignorable="w14 w15 w16se w16cid w16 w16cex w16sdtdh w16du wp14">
+<w:document xmlns:wpc="http://schemas.microsoft.com/office/word/2010/wordprocessingCanvas" xmlns:cx="http://schemas.microsoft.com/office/drawing/2014/chartex" xmlns:cx1="http://schemas.microsoft.com/office/drawing/2015/9/8/chartex" xmlns:cx2="http://schemas.microsoft.com/office/drawing/2015/10/21/chartex" xmlns:cx3="http://schemas.microsoft.com/office/drawing/2016/5/9/chartex" xmlns:cx4="http://schemas.microsoft.com/office/drawing/2016/5/10/chartex" xmlns:cx5="http://schemas.microsoft.com/office/drawing/2016/5/11/chartex" xmlns:cx6="http://schemas.microsoft.com/office/drawing/2016/5/12/chartex" xmlns:cx7="http://schemas.microsoft.com/office/drawing/2016/5/13/chartex" xmlns:cx8="http://schemas.microsoft.com/office/drawing/2016/5/14/chartex" xmlns:mc="http://schemas.openxmlformats.org/markup-compatibility/2006" xmlns:aink="http://schemas.microsoft.com/office/drawing/2016/ink" xmlns:am3d="http://schemas.microsoft.com/office/drawing/2017/model3d" xmlns:o="urn:schemas-microsoft-com:office:office" xmlns:oel="http://schemas.microsoft.com/office/2019/extlst" xmlns:r="http://schemas.openxmlformats.org/officeDocument/2006/relationships" xmlns:m="http://schemas.openxmlformats.org/officeDocument/2006/math" xmlns:v="urn:schemas-microsoft-com:vml" xmlns:wp14="http://schemas.microsoft.com/office/word/2010/wordprocessingDrawing" xmlns:wp="http://schemas.openxmlformats.org/drawingml/2006/wordprocessingDrawing" xmlns:w10="urn:schemas-microsoft-com:office:word" xmlns:w="http://schemas.openxmlformats.org/wordprocessingml/2006/main" xmlns:w14="http://schemas.microsoft.com/office/word/2010/wordml" xmlns:w15="http://schemas.microsoft.com/office/word/2012/wordml" xmlns:w16cex="http://schemas.microsoft.com/office/word/2018/wordml/cex" xmlns:w16cid="http://schemas.microsoft.com/office/word/2016/wordml/cid" xmlns:w16="http://schemas.microsoft.com/office/word/2018/wordml" xmlns:w16du="http://schemas.microsoft.com/office/word/2023/wordml/word16du" xmlns:w16sdtdh="http://schemas.microsoft.com/office/word/2020/wordml/sdtdatahash" xmlns:w16sdtfl="http://schemas.microsoft.com/office/word/2024/wordml/sdtformatlock" xmlns:w16se="http://schemas.microsoft.com/office/word/2015/wordml/symex" xmlns:wpg="http://schemas.microsoft.com/office/word/2010/wordprocessingGroup" xmlns:wpi="http://schemas.microsoft.com/office/word/2010/wordprocessingInk" xmlns:wne="http://schemas.microsoft.com/office/word/2006/wordml" xmlns:wps="http://schemas.microsoft.com/office/word/2010/wordprocessingShape" mc:Ignorable="w14 w15 w16se w16cid w16 w16cex w16sdtdh w16sdtfl w16du wp14">
   <w:body>
     <w:p>
       <w:pPr>
-        <w:pStyle w:val="KeinLeerraum"/>
+        <w:pStyle w:val="NoSpacing"/>
       </w:pPr>
       <w:fldSimple w:instr=" MERGEFIELD  =s.mass_unit \* MERGEFORMAT ">
         <w:r>
@@ -617,10 +617,10 @@
             <v:path o:extrusionok="f" gradientshapeok="t" o:connecttype="rect"/>
             <o:lock v:ext="edit" aspectratio="t"/>
           </v:shapetype>
-          <v:shape id="_x0000_i1025" type="#_x0000_t75" alt="" style="width:453.5pt;height:129pt;mso-width-percent:0;mso-height-percent:0;mso-width-percent:0;mso-height-percent:0" o:ole="">
+          <v:shape id="_x0000_i1025" type="#_x0000_t75" alt="" style="width:453.65pt;height:129pt;mso-width-percent:0;mso-height-percent:0;mso-width-percent:0;mso-height-percent:0" o:ole="">
             <v:imagedata r:id="rId9" o:title=""/>
           </v:shape>
-          <o:OLEObject Type="Embed" ProgID="ChemDraw.Document.6.0" ShapeID="_x0000_i1025" DrawAspect="Content" ObjectID="_1779608507" r:id="rId10"/>
+          <o:OLEObject Type="Embed" ProgID="ChemDraw.Document.6.0" ShapeID="_x0000_i1025" DrawAspect="Content" ObjectID="_1821437800" r:id="rId10"/>
         </w:object>
       </w:r>
       <w:r>
@@ -784,10 +784,10 @@
           <w:noProof/>
         </w:rPr>
         <w:object w:dxaOrig="18787" w:dyaOrig="5510" w14:anchorId="40B4FE74">
-          <v:shape id="_x0000_i1026" type="#_x0000_t75" alt="" style="width:453.5pt;height:129pt;mso-width-percent:0;mso-height-percent:0;mso-width-percent:0;mso-height-percent:0" o:ole="">
+          <v:shape id="_x0000_i1031" type="#_x0000_t75" alt="" style="width:480.15pt;height:136.5pt;mso-width-percent:0;mso-height-percent:0;mso-width-percent:0;mso-height-percent:0" o:ole="">
             <v:imagedata r:id="rId9" o:title=""/>
           </v:shape>
-          <o:OLEObject Type="Embed" ProgID="ChemDraw.Document.6.0" ShapeID="_x0000_i1026" DrawAspect="Content" ObjectID="_1779608508" r:id="rId11"/>
+          <o:OLEObject Type="Embed" ProgID="ChemDraw.Document.6.0" ShapeID="_x0000_i1031" DrawAspect="Content" ObjectID="_1821437801" r:id="rId11"/>
         </w:object>
       </w:r>
       <w:r>
@@ -960,8 +960,8 @@
     </w:p>
     <w:tbl>
       <w:tblPr>
-        <w:tblStyle w:val="Tabellenraster"/>
-        <w:tblW w:w="0" w:type="auto"/>
+        <w:tblStyle w:val="TableGrid"/>
+        <w:tblW w:w="10149" w:type="dxa"/>
         <w:tblBorders>
           <w:top w:val="none" w:sz="0" w:space="0" w:color="auto"/>
           <w:left w:val="none" w:sz="0" w:space="0" w:color="auto"/>
@@ -982,6 +982,7 @@
         <w:gridCol w:w="1418"/>
         <w:gridCol w:w="1077"/>
         <w:gridCol w:w="1134"/>
+        <w:gridCol w:w="1134"/>
       </w:tblGrid>
       <w:tr>
         <w:trPr>
@@ -1135,75 +1136,6 @@
             </w:pPr>
             <w:r>
               <w:rPr>
-                <w:rFonts w:ascii="Arial" w:hAnsi="Arial" w:cs="Arial" w:hint="eastAsia"/>
-                <w:noProof/>
-                <w:lang w:eastAsia="en-US"/>
-              </w:rPr>
-              <mc:AlternateContent>
-                <mc:Choice Requires="wps">
-                  <w:drawing>
-                    <wp:anchor distT="0" distB="0" distL="114300" distR="114300" simplePos="0" relativeHeight="251663360" behindDoc="0" locked="0" layoutInCell="1" allowOverlap="1" wp14:anchorId="5894D0A3" wp14:editId="12BAC840">
-                      <wp:simplePos x="0" y="0"/>
-                      <wp:positionH relativeFrom="column">
-                        <wp:posOffset>-3458210</wp:posOffset>
-                      </wp:positionH>
-                      <wp:positionV relativeFrom="paragraph">
-                        <wp:posOffset>290195</wp:posOffset>
-                      </wp:positionV>
-                      <wp:extent cx="5760000" cy="0"/>
-                      <wp:effectExtent l="0" t="0" r="31750" b="25400"/>
-                      <wp:wrapNone/>
-                      <wp:docPr id="5" name="Straight Connector 5"/>
-                      <wp:cNvGraphicFramePr/>
-                      <a:graphic xmlns:a="http://schemas.openxmlformats.org/drawingml/2006/main">
-                        <a:graphicData uri="http://schemas.microsoft.com/office/word/2010/wordprocessingShape">
-                          <wps:wsp>
-                            <wps:cNvCnPr/>
-                            <wps:spPr>
-                              <a:xfrm>
-                                <a:off x="0" y="0"/>
-                                <a:ext cx="5760000" cy="0"/>
-                              </a:xfrm>
-                              <a:prstGeom prst="line">
-                                <a:avLst/>
-                              </a:prstGeom>
-                              <a:ln w="12700"/>
-                            </wps:spPr>
-                            <wps:style>
-                              <a:lnRef idx="1">
-                                <a:schemeClr val="accent1"/>
-                              </a:lnRef>
-                              <a:fillRef idx="0">
-                                <a:schemeClr val="accent1"/>
-                              </a:fillRef>
-                              <a:effectRef idx="0">
-                                <a:schemeClr val="accent1"/>
-                              </a:effectRef>
-                              <a:fontRef idx="minor">
-                                <a:schemeClr val="tx1"/>
-                              </a:fontRef>
-                            </wps:style>
-                            <wps:bodyPr/>
-                          </wps:wsp>
-                        </a:graphicData>
-                      </a:graphic>
-                      <wp14:sizeRelH relativeFrom="margin">
-                        <wp14:pctWidth>0</wp14:pctWidth>
-                      </wp14:sizeRelH>
-                    </wp:anchor>
-                  </w:drawing>
-                </mc:Choice>
-                <mc:Fallback>
-                  <w:pict>
-                    <v:line w14:anchorId="4095E87C" id="Straight Connector 5" o:spid="_x0000_s1026" style="position:absolute;z-index:251663360;visibility:visible;mso-wrap-style:square;mso-width-percent:0;mso-wrap-distance-left:9pt;mso-wrap-distance-top:0;mso-wrap-distance-right:9pt;mso-wrap-distance-bottom:0;mso-position-horizontal:absolute;mso-position-horizontal-relative:text;mso-position-vertical:absolute;mso-position-vertical-relative:text;mso-width-percent:0;mso-width-relative:margin" from="-272.3pt,22.85pt" to="181.25pt,22.85pt" o:gfxdata="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" strokecolor="#5b9bd5 [3204]" strokeweight="1pt">
-                      <v:stroke joinstyle="miter"/>
-                    </v:line>
-                  </w:pict>
-                </mc:Fallback>
-              </mc:AlternateContent>
-            </w:r>
-            <w:r>
-              <w:rPr>
                 <w:rFonts w:ascii="Arial" w:hAnsi="Arial" w:cs="Arial"/>
                 <w:noProof/>
                 <w:sz w:val="18"/>
@@ -1291,6 +1223,123 @@
             </w:r>
           </w:p>
         </w:tc>
+        <w:tc>
+          <w:tcPr>
+            <w:tcW w:w="1134" w:type="dxa"/>
+          </w:tcPr>
+          <w:p>
+            <w:pPr>
+              <w:tabs>
+                <w:tab w:val="left" w:pos="459"/>
+              </w:tabs>
+              <w:rPr>
+                <w:rFonts w:ascii="Arial" w:hAnsi="Arial" w:cs="Arial"/>
+                <w:noProof/>
+                <w:sz w:val="18"/>
+                <w:szCs w:val="18"/>
+              </w:rPr>
+            </w:pPr>
+            <w:r>
+              <w:rPr>
+                <w:rFonts w:ascii="Arial" w:hAnsi="Arial" w:cs="Arial"/>
+                <w:noProof/>
+                <w:sz w:val="18"/>
+                <w:szCs w:val="18"/>
+              </w:rPr>
+              <w:fldChar w:fldCharType="begin"/>
+            </w:r>
+            <w:r>
+              <w:rPr>
+                <w:rFonts w:ascii="Arial" w:hAnsi="Arial" w:cs="Arial"/>
+                <w:noProof/>
+                <w:sz w:val="18"/>
+                <w:szCs w:val="18"/>
+              </w:rPr>
+              <w:instrText xml:space="preserve"> MERGEFIELD  obj.show_weight_percentage:if  \* MERGEFORMAT </w:instrText>
+            </w:r>
+            <w:r>
+              <w:rPr>
+                <w:rFonts w:ascii="Arial" w:hAnsi="Arial" w:cs="Arial"/>
+                <w:noProof/>
+                <w:sz w:val="18"/>
+                <w:szCs w:val="18"/>
+              </w:rPr>
+              <w:fldChar w:fldCharType="separate"/>
+            </w:r>
+            <w:r>
+              <w:rPr>
+                <w:rFonts w:ascii="Arial" w:hAnsi="Arial" w:cs="Arial"/>
+                <w:noProof/>
+                <w:sz w:val="18"/>
+                <w:szCs w:val="18"/>
+              </w:rPr>
+              <w:t>«obj.show_weight_percentage:if»</w:t>
+            </w:r>
+            <w:r>
+              <w:rPr>
+                <w:rFonts w:ascii="Arial" w:hAnsi="Arial" w:cs="Arial"/>
+                <w:noProof/>
+                <w:sz w:val="18"/>
+                <w:szCs w:val="18"/>
+              </w:rPr>
+              <w:fldChar w:fldCharType="end"/>
+            </w:r>
+            <w:r>
+              <w:rPr>
+                <w:rFonts w:ascii="Arial" w:hAnsi="Arial" w:cs="Arial"/>
+                <w:noProof/>
+                <w:sz w:val="18"/>
+                <w:szCs w:val="18"/>
+              </w:rPr>
+              <w:t>Weight percentage</w:t>
+            </w:r>
+            <w:r>
+              <w:rPr>
+                <w:rFonts w:ascii="Arial" w:hAnsi="Arial" w:cs="Arial"/>
+                <w:noProof/>
+                <w:sz w:val="18"/>
+                <w:szCs w:val="18"/>
+              </w:rPr>
+              <w:fldChar w:fldCharType="begin"/>
+            </w:r>
+            <w:r>
+              <w:rPr>
+                <w:rFonts w:ascii="Arial" w:hAnsi="Arial" w:cs="Arial"/>
+                <w:noProof/>
+                <w:sz w:val="18"/>
+                <w:szCs w:val="18"/>
+              </w:rPr>
+              <w:instrText xml:space="preserve"> MERGEFIELD  obj.show_weight_percentage:endIf  \* MERGEFORMAT </w:instrText>
+            </w:r>
+            <w:r>
+              <w:rPr>
+                <w:rFonts w:ascii="Arial" w:hAnsi="Arial" w:cs="Arial"/>
+                <w:noProof/>
+                <w:sz w:val="18"/>
+                <w:szCs w:val="18"/>
+              </w:rPr>
+              <w:fldChar w:fldCharType="separate"/>
+            </w:r>
+            <w:r>
+              <w:rPr>
+                <w:rFonts w:ascii="Arial" w:hAnsi="Arial" w:cs="Arial"/>
+                <w:noProof/>
+                <w:sz w:val="18"/>
+                <w:szCs w:val="18"/>
+              </w:rPr>
+              <w:t>«obj.show_weight_percentage:endIf»</w:t>
+            </w:r>
+            <w:r>
+              <w:rPr>
+                <w:rFonts w:ascii="Arial" w:hAnsi="Arial" w:cs="Arial"/>
+                <w:noProof/>
+                <w:sz w:val="18"/>
+                <w:szCs w:val="18"/>
+              </w:rPr>
+              <w:fldChar w:fldCharType="end"/>
+            </w:r>
+          </w:p>
+        </w:tc>
       </w:tr>
     </w:tbl>
     <w:p>
@@ -1344,186 +1393,11 @@
         <w:fldChar w:fldCharType="end"/>
       </w:r>
     </w:p>
-    <w:p>
-      <w:pPr>
-        <w:rPr>
-          <w:rFonts w:ascii="Arial" w:hAnsi="Arial" w:cs="Arial"/>
-          <w:noProof/>
-          <w:color w:val="2E74B5" w:themeColor="accent1" w:themeShade="BF"/>
-          <w:sz w:val="18"/>
-          <w:szCs w:val="18"/>
-        </w:rPr>
-      </w:pPr>
-      <w:r>
-        <w:rPr>
-          <w:rFonts w:ascii="Arial" w:hAnsi="Arial" w:cs="Arial"/>
-          <w:noProof/>
-        </w:rPr>
-        <w:t xml:space="preserve">  </w:t>
-      </w:r>
-      <w:r>
-        <w:rPr>
-          <w:rFonts w:ascii="Arial" w:hAnsi="Arial" w:cs="Arial"/>
-          <w:noProof/>
-          <w:color w:val="000000"/>
-          <w:sz w:val="18"/>
-          <w:szCs w:val="18"/>
-        </w:rPr>
-        <w:fldChar w:fldCharType="begin"/>
-      </w:r>
-      <w:r>
-        <w:rPr>
-          <w:rFonts w:ascii="Arial" w:hAnsi="Arial" w:cs="Arial"/>
-          <w:noProof/>
-          <w:color w:val="000000"/>
-          <w:sz w:val="18"/>
-          <w:szCs w:val="18"/>
-        </w:rPr>
-        <w:instrText xml:space="preserve"> MERGEFIELD =s.</w:instrText>
-      </w:r>
-      <w:r>
-        <w:rPr>
-          <w:rFonts w:ascii="Arial" w:hAnsi="Arial" w:cs="Arial"/>
-          <w:noProof/>
-          <w:color w:val="000000"/>
-          <w:sz w:val="18"/>
-          <w:szCs w:val="18"/>
-        </w:rPr>
-        <w:instrText>iupac_</w:instrText>
-      </w:r>
-      <w:r>
-        <w:rPr>
-          <w:rFonts w:ascii="Arial" w:hAnsi="Arial" w:cs="Arial"/>
-          <w:noProof/>
-          <w:color w:val="000000"/>
-          <w:sz w:val="18"/>
-          <w:szCs w:val="18"/>
-        </w:rPr>
-        <w:instrText xml:space="preserve">name </w:instrText>
-      </w:r>
-      <w:r>
-        <w:rPr>
-          <w:rFonts w:ascii="Arial" w:hAnsi="Arial" w:cs="Arial"/>
-          <w:color w:val="000000"/>
-          <w:sz w:val="18"/>
-          <w:szCs w:val="18"/>
-        </w:rPr>
-        <w:instrText xml:space="preserve">\* MERGEFORMAT </w:instrText>
-      </w:r>
-      <w:r>
-        <w:rPr>
-          <w:rFonts w:ascii="Arial" w:hAnsi="Arial" w:cs="Arial"/>
-          <w:noProof/>
-          <w:color w:val="000000"/>
-          <w:sz w:val="18"/>
-          <w:szCs w:val="18"/>
-        </w:rPr>
-        <w:fldChar w:fldCharType="separate"/>
-      </w:r>
-      <w:r>
-        <w:rPr>
-          <w:rFonts w:ascii="Arial" w:hAnsi="Arial" w:cs="Arial"/>
-          <w:noProof/>
-          <w:color w:val="000000"/>
-          <w:sz w:val="18"/>
-          <w:szCs w:val="18"/>
-        </w:rPr>
-        <w:t>«=s.iupac_name»</w:t>
-      </w:r>
-      <w:r>
-        <w:rPr>
-          <w:rFonts w:ascii="Arial" w:hAnsi="Arial" w:cs="Arial"/>
-          <w:noProof/>
-          <w:color w:val="000000"/>
-          <w:sz w:val="18"/>
-          <w:szCs w:val="18"/>
-        </w:rPr>
-        <w:fldChar w:fldCharType="end"/>
-      </w:r>
-      <w:r>
-        <w:rPr>
-          <w:rFonts w:ascii="Arial" w:hAnsi="Arial" w:cs="Arial"/>
-          <w:noProof/>
-          <w:color w:val="000000"/>
-          <w:sz w:val="18"/>
-          <w:szCs w:val="18"/>
-        </w:rPr>
-        <w:t xml:space="preserve">  (</w:t>
-      </w:r>
-      <w:r>
-        <w:rPr>
-          <w:rFonts w:ascii="Arial" w:hAnsi="Arial" w:cs="Arial"/>
-          <w:noProof/>
-          <w:color w:val="000000"/>
-          <w:sz w:val="18"/>
-          <w:szCs w:val="18"/>
-        </w:rPr>
-        <w:fldChar w:fldCharType="begin"/>
-      </w:r>
-      <w:r>
-        <w:rPr>
-          <w:rFonts w:ascii="Arial" w:hAnsi="Arial" w:cs="Arial"/>
-          <w:noProof/>
-          <w:color w:val="000000"/>
-          <w:sz w:val="18"/>
-          <w:szCs w:val="18"/>
-        </w:rPr>
-        <w:instrText xml:space="preserve"> MERGEFIELD =s.short_label </w:instrText>
-      </w:r>
-      <w:r>
-        <w:rPr>
-          <w:rFonts w:ascii="Arial" w:hAnsi="Arial" w:cs="Arial"/>
-          <w:color w:val="000000"/>
-          <w:sz w:val="18"/>
-          <w:szCs w:val="18"/>
-        </w:rPr>
-        <w:instrText xml:space="preserve">\* MERGEFORMAT </w:instrText>
-      </w:r>
-      <w:r>
-        <w:rPr>
-          <w:rFonts w:ascii="Arial" w:hAnsi="Arial" w:cs="Arial"/>
-          <w:noProof/>
-          <w:color w:val="000000"/>
-          <w:sz w:val="18"/>
-          <w:szCs w:val="18"/>
-        </w:rPr>
-        <w:fldChar w:fldCharType="separate"/>
-      </w:r>
-      <w:r>
-        <w:rPr>
-          <w:rFonts w:ascii="Arial" w:hAnsi="Arial" w:cs="Arial"/>
-          <w:noProof/>
-          <w:color w:val="000000"/>
-          <w:sz w:val="18"/>
-          <w:szCs w:val="18"/>
-        </w:rPr>
-        <w:t>«=s.short_label»</w:t>
-      </w:r>
-      <w:r>
-        <w:rPr>
-          <w:rFonts w:ascii="Arial" w:hAnsi="Arial" w:cs="Arial"/>
-          <w:noProof/>
-          <w:color w:val="000000"/>
-          <w:sz w:val="18"/>
-          <w:szCs w:val="18"/>
-        </w:rPr>
-        <w:fldChar w:fldCharType="end"/>
-      </w:r>
-      <w:r>
-        <w:rPr>
-          <w:rFonts w:ascii="Arial" w:hAnsi="Arial" w:cs="Arial"/>
-          <w:noProof/>
-          <w:color w:val="000000"/>
-          <w:sz w:val="18"/>
-          <w:szCs w:val="18"/>
-        </w:rPr>
-        <w:t>)</w:t>
-      </w:r>
-    </w:p>
     <w:tbl>
       <w:tblPr>
-        <w:tblStyle w:val="Tabellenraster"/>
-        <w:tblW w:w="0" w:type="auto"/>
+        <w:tblStyle w:val="TableGrid"/>
+        <w:tblpPr w:leftFromText="141" w:rightFromText="141" w:vertAnchor="text" w:horzAnchor="margin" w:tblpY="214"/>
+        <w:tblW w:w="10171" w:type="dxa"/>
         <w:tblBorders>
           <w:top w:val="none" w:sz="0" w:space="0" w:color="auto"/>
           <w:left w:val="none" w:sz="0" w:space="0" w:color="auto"/>
@@ -1544,6 +1418,7 @@
         <w:gridCol w:w="1361"/>
         <w:gridCol w:w="1134"/>
         <w:gridCol w:w="1134"/>
+        <w:gridCol w:w="1134"/>
       </w:tblGrid>
       <w:tr>
         <w:trPr>
@@ -2239,6 +2114,67 @@
             </w:r>
           </w:p>
         </w:tc>
+        <w:tc>
+          <w:tcPr>
+            <w:tcW w:w="1134" w:type="dxa"/>
+          </w:tcPr>
+          <w:p>
+            <w:pPr>
+              <w:rPr>
+                <w:rFonts w:ascii="Arial" w:hAnsi="Arial" w:cs="Arial"/>
+                <w:noProof/>
+                <w:sz w:val="18"/>
+                <w:szCs w:val="18"/>
+                <w:lang w:val="de-DE"/>
+              </w:rPr>
+            </w:pPr>
+            <w:r>
+              <w:rPr>
+                <w:rFonts w:ascii="Arial" w:hAnsi="Arial" w:cs="Arial"/>
+                <w:noProof/>
+                <w:sz w:val="18"/>
+                <w:szCs w:val="18"/>
+              </w:rPr>
+              <w:fldChar w:fldCharType="begin"/>
+            </w:r>
+            <w:r>
+              <w:rPr>
+                <w:rFonts w:ascii="Arial" w:hAnsi="Arial" w:cs="Arial"/>
+                <w:noProof/>
+                <w:sz w:val="18"/>
+                <w:szCs w:val="18"/>
+              </w:rPr>
+              <w:instrText xml:space="preserve"> MERGEFIELD  =s.weight_percentage  \* MERGEFORMAT </w:instrText>
+            </w:r>
+            <w:r>
+              <w:rPr>
+                <w:rFonts w:ascii="Arial" w:hAnsi="Arial" w:cs="Arial"/>
+                <w:noProof/>
+                <w:sz w:val="18"/>
+                <w:szCs w:val="18"/>
+              </w:rPr>
+              <w:fldChar w:fldCharType="separate"/>
+            </w:r>
+            <w:r>
+              <w:rPr>
+                <w:rFonts w:ascii="Arial" w:hAnsi="Arial" w:cs="Arial"/>
+                <w:noProof/>
+                <w:sz w:val="18"/>
+                <w:szCs w:val="18"/>
+              </w:rPr>
+              <w:t>«=s.weight_percentage»</w:t>
+            </w:r>
+            <w:r>
+              <w:rPr>
+                <w:rFonts w:ascii="Arial" w:hAnsi="Arial" w:cs="Arial"/>
+                <w:noProof/>
+                <w:sz w:val="18"/>
+                <w:szCs w:val="18"/>
+              </w:rPr>
+              <w:fldChar w:fldCharType="end"/>
+            </w:r>
+          </w:p>
+        </w:tc>
       </w:tr>
     </w:tbl>
     <w:p>
@@ -2246,108 +2182,7 @@
         <w:rPr>
           <w:rFonts w:ascii="Arial" w:hAnsi="Arial" w:cs="Arial"/>
           <w:noProof/>
-          <w:sz w:val="18"/>
-          <w:szCs w:val="18"/>
-        </w:rPr>
-      </w:pPr>
-      <w:r>
-        <w:rPr>
-          <w:rFonts w:ascii="Arial" w:hAnsi="Arial" w:cs="Arial"/>
-          <w:sz w:val="18"/>
-          <w:szCs w:val="18"/>
-        </w:rPr>
-        <w:fldChar w:fldCharType="begin"/>
-      </w:r>
-      <w:r>
-        <w:rPr>
-          <w:rFonts w:ascii="Arial" w:hAnsi="Arial" w:cs="Arial"/>
-          <w:sz w:val="18"/>
-          <w:szCs w:val="18"/>
-        </w:rPr>
-        <w:instrText xml:space="preserve"> MERGEFIELD  obj.starting_materials:endEach  \* MERGEFORMAT </w:instrText>
-      </w:r>
-      <w:r>
-        <w:rPr>
-          <w:rFonts w:ascii="Arial" w:hAnsi="Arial" w:cs="Arial"/>
-          <w:sz w:val="18"/>
-          <w:szCs w:val="18"/>
-        </w:rPr>
-        <w:fldChar w:fldCharType="separate"/>
-      </w:r>
-      <w:r>
-        <w:rPr>
-          <w:rFonts w:ascii="Arial" w:hAnsi="Arial" w:cs="Arial"/>
-          <w:noProof/>
-          <w:sz w:val="18"/>
-          <w:szCs w:val="18"/>
-        </w:rPr>
-        <w:t>«obj.starting_materials:endEach»</w:t>
-      </w:r>
-      <w:r>
-        <w:rPr>
-          <w:rFonts w:ascii="Arial" w:hAnsi="Arial" w:cs="Arial"/>
-          <w:sz w:val="18"/>
-          <w:szCs w:val="18"/>
-        </w:rPr>
-        <w:fldChar w:fldCharType="end"/>
-      </w:r>
-    </w:p>
-    <w:p>
-      <w:pPr>
-        <w:rPr>
-          <w:rFonts w:ascii="Arial" w:hAnsi="Arial" w:cs="Arial"/>
-          <w:noProof/>
-          <w:sz w:val="18"/>
-          <w:szCs w:val="18"/>
-        </w:rPr>
-      </w:pPr>
-      <w:r>
-        <w:rPr>
-          <w:rFonts w:ascii="Arial" w:hAnsi="Arial" w:cs="Arial"/>
-          <w:sz w:val="18"/>
-          <w:szCs w:val="18"/>
-        </w:rPr>
-        <w:fldChar w:fldCharType="begin"/>
-      </w:r>
-      <w:r>
-        <w:rPr>
-          <w:rFonts w:ascii="Arial" w:hAnsi="Arial" w:cs="Arial"/>
-          <w:sz w:val="18"/>
-          <w:szCs w:val="18"/>
-        </w:rPr>
-        <w:instrText xml:space="preserve"> MERGEFIELD  obj.reactants:each(r)  \* MERGEFORMAT </w:instrText>
-      </w:r>
-      <w:r>
-        <w:rPr>
-          <w:rFonts w:ascii="Arial" w:hAnsi="Arial" w:cs="Arial"/>
-          <w:sz w:val="18"/>
-          <w:szCs w:val="18"/>
-        </w:rPr>
-        <w:fldChar w:fldCharType="separate"/>
-      </w:r>
-      <w:r>
-        <w:rPr>
-          <w:rFonts w:ascii="Arial" w:hAnsi="Arial" w:cs="Arial"/>
-          <w:noProof/>
-          <w:sz w:val="18"/>
-          <w:szCs w:val="18"/>
-        </w:rPr>
-        <w:t>«obj.reactants:each(r)»</w:t>
-      </w:r>
-      <w:r>
-        <w:rPr>
-          <w:rFonts w:ascii="Arial" w:hAnsi="Arial" w:cs="Arial"/>
-          <w:sz w:val="18"/>
-          <w:szCs w:val="18"/>
-        </w:rPr>
-        <w:fldChar w:fldCharType="end"/>
-      </w:r>
-    </w:p>
-    <w:p>
-      <w:pPr>
-        <w:rPr>
-          <w:rFonts w:ascii="Arial" w:hAnsi="Arial" w:cs="Arial"/>
-          <w:noProof/>
+          <w:color w:val="2E74B5" w:themeColor="accent1" w:themeShade="BF"/>
           <w:sz w:val="18"/>
           <w:szCs w:val="18"/>
         </w:rPr>
@@ -2377,7 +2212,7 @@
           <w:sz w:val="18"/>
           <w:szCs w:val="18"/>
         </w:rPr>
-        <w:instrText xml:space="preserve"> MERGEFIELD =</w:instrText>
+        <w:instrText xml:space="preserve"> MERGEFIELD =s.</w:instrText>
       </w:r>
       <w:r>
         <w:rPr>
@@ -2387,7 +2222,7 @@
           <w:sz w:val="18"/>
           <w:szCs w:val="18"/>
         </w:rPr>
-        <w:instrText>r</w:instrText>
+        <w:instrText>iupac_</w:instrText>
       </w:r>
       <w:r>
         <w:rPr>
@@ -2397,17 +2232,16 @@
           <w:sz w:val="18"/>
           <w:szCs w:val="18"/>
         </w:rPr>
-        <w:instrText>.</w:instrText>
-      </w:r>
-      <w:r>
-        <w:rPr>
-          <w:rFonts w:ascii="Arial" w:hAnsi="Arial" w:cs="Arial"/>
-          <w:noProof/>
+        <w:instrText xml:space="preserve">name </w:instrText>
+      </w:r>
+      <w:r>
+        <w:rPr>
+          <w:rFonts w:ascii="Arial" w:hAnsi="Arial" w:cs="Arial"/>
           <w:color w:val="000000"/>
           <w:sz w:val="18"/>
           <w:szCs w:val="18"/>
         </w:rPr>
-        <w:instrText>iupac_</w:instrText>
+        <w:instrText xml:space="preserve">\* MERGEFORMAT </w:instrText>
       </w:r>
       <w:r>
         <w:rPr>
@@ -2417,16 +2251,17 @@
           <w:sz w:val="18"/>
           <w:szCs w:val="18"/>
         </w:rPr>
-        <w:instrText xml:space="preserve">name </w:instrText>
-      </w:r>
-      <w:r>
-        <w:rPr>
-          <w:rFonts w:ascii="Arial" w:hAnsi="Arial" w:cs="Arial"/>
+        <w:fldChar w:fldCharType="separate"/>
+      </w:r>
+      <w:r>
+        <w:rPr>
+          <w:rFonts w:ascii="Arial" w:hAnsi="Arial" w:cs="Arial"/>
+          <w:noProof/>
           <w:color w:val="000000"/>
           <w:sz w:val="18"/>
           <w:szCs w:val="18"/>
         </w:rPr>
-        <w:instrText xml:space="preserve">\* MERGEFORMAT </w:instrText>
+        <w:t>«=s.iupac_name»</w:t>
       </w:r>
       <w:r>
         <w:rPr>
@@ -2436,7 +2271,7 @@
           <w:sz w:val="18"/>
           <w:szCs w:val="18"/>
         </w:rPr>
-        <w:fldChar w:fldCharType="separate"/>
+        <w:fldChar w:fldCharType="end"/>
       </w:r>
       <w:r>
         <w:rPr>
@@ -2446,7 +2281,7 @@
           <w:sz w:val="18"/>
           <w:szCs w:val="18"/>
         </w:rPr>
-        <w:t>«=r.iupac_name»</w:t>
+        <w:t xml:space="preserve">  (</w:t>
       </w:r>
       <w:r>
         <w:rPr>
@@ -2456,7 +2291,7 @@
           <w:sz w:val="18"/>
           <w:szCs w:val="18"/>
         </w:rPr>
-        <w:fldChar w:fldCharType="end"/>
+        <w:fldChar w:fldCharType="begin"/>
       </w:r>
       <w:r>
         <w:rPr>
@@ -2466,17 +2301,16 @@
           <w:sz w:val="18"/>
           <w:szCs w:val="18"/>
         </w:rPr>
-        <w:t xml:space="preserve">  (</w:t>
-      </w:r>
-      <w:r>
-        <w:rPr>
-          <w:rFonts w:ascii="Arial" w:hAnsi="Arial" w:cs="Arial"/>
-          <w:noProof/>
+        <w:instrText xml:space="preserve"> MERGEFIELD =s.short_label </w:instrText>
+      </w:r>
+      <w:r>
+        <w:rPr>
+          <w:rFonts w:ascii="Arial" w:hAnsi="Arial" w:cs="Arial"/>
           <w:color w:val="000000"/>
           <w:sz w:val="18"/>
           <w:szCs w:val="18"/>
         </w:rPr>
-        <w:fldChar w:fldCharType="begin"/>
+        <w:instrText xml:space="preserve">\* MERGEFORMAT </w:instrText>
       </w:r>
       <w:r>
         <w:rPr>
@@ -2486,16 +2320,17 @@
           <w:sz w:val="18"/>
           <w:szCs w:val="18"/>
         </w:rPr>
-        <w:instrText xml:space="preserve"> MERGEFIELD =r.short_label </w:instrText>
-      </w:r>
-      <w:r>
-        <w:rPr>
-          <w:rFonts w:ascii="Arial" w:hAnsi="Arial" w:cs="Arial"/>
+        <w:fldChar w:fldCharType="separate"/>
+      </w:r>
+      <w:r>
+        <w:rPr>
+          <w:rFonts w:ascii="Arial" w:hAnsi="Arial" w:cs="Arial"/>
+          <w:noProof/>
           <w:color w:val="000000"/>
           <w:sz w:val="18"/>
           <w:szCs w:val="18"/>
         </w:rPr>
-        <w:instrText xml:space="preserve">\* MERGEFORMAT </w:instrText>
+        <w:t>«=s.short_label»</w:t>
       </w:r>
       <w:r>
         <w:rPr>
@@ -2505,7 +2340,7 @@
           <w:sz w:val="18"/>
           <w:szCs w:val="18"/>
         </w:rPr>
-        <w:fldChar w:fldCharType="separate"/>
+        <w:fldChar w:fldCharType="end"/>
       </w:r>
       <w:r>
         <w:rPr>
@@ -2515,7 +2350,126 @@
           <w:sz w:val="18"/>
           <w:szCs w:val="18"/>
         </w:rPr>
-        <w:t>«=r.short_label»</w:t>
+        <w:t>)</w:t>
+      </w:r>
+    </w:p>
+    <w:p>
+      <w:pPr>
+        <w:rPr>
+          <w:rFonts w:ascii="Arial" w:hAnsi="Arial" w:cs="Arial"/>
+          <w:noProof/>
+          <w:sz w:val="18"/>
+          <w:szCs w:val="18"/>
+        </w:rPr>
+      </w:pPr>
+      <w:r>
+        <w:rPr>
+          <w:rFonts w:ascii="Arial" w:hAnsi="Arial" w:cs="Arial"/>
+          <w:sz w:val="18"/>
+          <w:szCs w:val="18"/>
+        </w:rPr>
+        <w:fldChar w:fldCharType="begin"/>
+      </w:r>
+      <w:r>
+        <w:rPr>
+          <w:rFonts w:ascii="Arial" w:hAnsi="Arial" w:cs="Arial"/>
+          <w:sz w:val="18"/>
+          <w:szCs w:val="18"/>
+        </w:rPr>
+        <w:instrText xml:space="preserve"> MERGEFIELD  obj.starting_materials:endEach  \* MERGEFORMAT </w:instrText>
+      </w:r>
+      <w:r>
+        <w:rPr>
+          <w:rFonts w:ascii="Arial" w:hAnsi="Arial" w:cs="Arial"/>
+          <w:sz w:val="18"/>
+          <w:szCs w:val="18"/>
+        </w:rPr>
+        <w:fldChar w:fldCharType="separate"/>
+      </w:r>
+      <w:r>
+        <w:rPr>
+          <w:rFonts w:ascii="Arial" w:hAnsi="Arial" w:cs="Arial"/>
+          <w:noProof/>
+          <w:sz w:val="18"/>
+          <w:szCs w:val="18"/>
+        </w:rPr>
+        <w:t>«obj.starting_materials:endEach»</w:t>
+      </w:r>
+      <w:r>
+        <w:rPr>
+          <w:rFonts w:ascii="Arial" w:hAnsi="Arial" w:cs="Arial"/>
+          <w:sz w:val="18"/>
+          <w:szCs w:val="18"/>
+        </w:rPr>
+        <w:fldChar w:fldCharType="end"/>
+      </w:r>
+    </w:p>
+    <w:p>
+      <w:pPr>
+        <w:rPr>
+          <w:rFonts w:ascii="Arial" w:hAnsi="Arial" w:cs="Arial"/>
+          <w:noProof/>
+          <w:sz w:val="18"/>
+          <w:szCs w:val="18"/>
+        </w:rPr>
+      </w:pPr>
+      <w:r>
+        <w:rPr>
+          <w:rFonts w:ascii="Arial" w:hAnsi="Arial" w:cs="Arial"/>
+          <w:sz w:val="18"/>
+          <w:szCs w:val="18"/>
+        </w:rPr>
+        <w:fldChar w:fldCharType="begin"/>
+      </w:r>
+      <w:r>
+        <w:rPr>
+          <w:rFonts w:ascii="Arial" w:hAnsi="Arial" w:cs="Arial"/>
+          <w:sz w:val="18"/>
+          <w:szCs w:val="18"/>
+        </w:rPr>
+        <w:instrText xml:space="preserve"> MERGEFIELD  obj.reactants:each(r)  \* MERGEFORMAT </w:instrText>
+      </w:r>
+      <w:r>
+        <w:rPr>
+          <w:rFonts w:ascii="Arial" w:hAnsi="Arial" w:cs="Arial"/>
+          <w:sz w:val="18"/>
+          <w:szCs w:val="18"/>
+        </w:rPr>
+        <w:fldChar w:fldCharType="separate"/>
+      </w:r>
+      <w:r>
+        <w:rPr>
+          <w:rFonts w:ascii="Arial" w:hAnsi="Arial" w:cs="Arial"/>
+          <w:noProof/>
+          <w:sz w:val="18"/>
+          <w:szCs w:val="18"/>
+        </w:rPr>
+        <w:t>«obj.reactants:each(r)»</w:t>
+      </w:r>
+      <w:r>
+        <w:rPr>
+          <w:rFonts w:ascii="Arial" w:hAnsi="Arial" w:cs="Arial"/>
+          <w:sz w:val="18"/>
+          <w:szCs w:val="18"/>
+        </w:rPr>
+        <w:fldChar w:fldCharType="end"/>
+      </w:r>
+    </w:p>
+    <w:p>
+      <w:pPr>
+        <w:rPr>
+          <w:rFonts w:ascii="Arial" w:hAnsi="Arial" w:cs="Arial"/>
+          <w:noProof/>
+          <w:sz w:val="18"/>
+          <w:szCs w:val="18"/>
+        </w:rPr>
+      </w:pPr>
+      <w:r>
+        <w:rPr>
+          <w:rFonts w:ascii="Arial" w:hAnsi="Arial" w:cs="Arial"/>
+          <w:noProof/>
+        </w:rPr>
+        <w:t xml:space="preserve">  </w:t>
       </w:r>
       <w:r>
         <w:rPr>
@@ -2525,7 +2479,7 @@
           <w:sz w:val="18"/>
           <w:szCs w:val="18"/>
         </w:rPr>
-        <w:fldChar w:fldCharType="end"/>
+        <w:fldChar w:fldCharType="begin"/>
       </w:r>
       <w:r>
         <w:rPr>
@@ -2535,13 +2489,171 @@
           <w:sz w:val="18"/>
           <w:szCs w:val="18"/>
         </w:rPr>
+        <w:instrText xml:space="preserve"> MERGEFIELD =</w:instrText>
+      </w:r>
+      <w:r>
+        <w:rPr>
+          <w:rFonts w:ascii="Arial" w:hAnsi="Arial" w:cs="Arial"/>
+          <w:noProof/>
+          <w:color w:val="000000"/>
+          <w:sz w:val="18"/>
+          <w:szCs w:val="18"/>
+        </w:rPr>
+        <w:instrText>r</w:instrText>
+      </w:r>
+      <w:r>
+        <w:rPr>
+          <w:rFonts w:ascii="Arial" w:hAnsi="Arial" w:cs="Arial"/>
+          <w:noProof/>
+          <w:color w:val="000000"/>
+          <w:sz w:val="18"/>
+          <w:szCs w:val="18"/>
+        </w:rPr>
+        <w:instrText>.</w:instrText>
+      </w:r>
+      <w:r>
+        <w:rPr>
+          <w:rFonts w:ascii="Arial" w:hAnsi="Arial" w:cs="Arial"/>
+          <w:noProof/>
+          <w:color w:val="000000"/>
+          <w:sz w:val="18"/>
+          <w:szCs w:val="18"/>
+        </w:rPr>
+        <w:instrText>iupac_</w:instrText>
+      </w:r>
+      <w:r>
+        <w:rPr>
+          <w:rFonts w:ascii="Arial" w:hAnsi="Arial" w:cs="Arial"/>
+          <w:noProof/>
+          <w:color w:val="000000"/>
+          <w:sz w:val="18"/>
+          <w:szCs w:val="18"/>
+        </w:rPr>
+        <w:instrText xml:space="preserve">name </w:instrText>
+      </w:r>
+      <w:r>
+        <w:rPr>
+          <w:rFonts w:ascii="Arial" w:hAnsi="Arial" w:cs="Arial"/>
+          <w:color w:val="000000"/>
+          <w:sz w:val="18"/>
+          <w:szCs w:val="18"/>
+        </w:rPr>
+        <w:instrText xml:space="preserve">\* MERGEFORMAT </w:instrText>
+      </w:r>
+      <w:r>
+        <w:rPr>
+          <w:rFonts w:ascii="Arial" w:hAnsi="Arial" w:cs="Arial"/>
+          <w:noProof/>
+          <w:color w:val="000000"/>
+          <w:sz w:val="18"/>
+          <w:szCs w:val="18"/>
+        </w:rPr>
+        <w:fldChar w:fldCharType="separate"/>
+      </w:r>
+      <w:r>
+        <w:rPr>
+          <w:rFonts w:ascii="Arial" w:hAnsi="Arial" w:cs="Arial"/>
+          <w:noProof/>
+          <w:color w:val="000000"/>
+          <w:sz w:val="18"/>
+          <w:szCs w:val="18"/>
+        </w:rPr>
+        <w:t>«=r.iupac_name»</w:t>
+      </w:r>
+      <w:r>
+        <w:rPr>
+          <w:rFonts w:ascii="Arial" w:hAnsi="Arial" w:cs="Arial"/>
+          <w:noProof/>
+          <w:color w:val="000000"/>
+          <w:sz w:val="18"/>
+          <w:szCs w:val="18"/>
+        </w:rPr>
+        <w:fldChar w:fldCharType="end"/>
+      </w:r>
+      <w:r>
+        <w:rPr>
+          <w:rFonts w:ascii="Arial" w:hAnsi="Arial" w:cs="Arial"/>
+          <w:noProof/>
+          <w:color w:val="000000"/>
+          <w:sz w:val="18"/>
+          <w:szCs w:val="18"/>
+        </w:rPr>
+        <w:t xml:space="preserve">  (</w:t>
+      </w:r>
+      <w:r>
+        <w:rPr>
+          <w:rFonts w:ascii="Arial" w:hAnsi="Arial" w:cs="Arial"/>
+          <w:noProof/>
+          <w:color w:val="000000"/>
+          <w:sz w:val="18"/>
+          <w:szCs w:val="18"/>
+        </w:rPr>
+        <w:fldChar w:fldCharType="begin"/>
+      </w:r>
+      <w:r>
+        <w:rPr>
+          <w:rFonts w:ascii="Arial" w:hAnsi="Arial" w:cs="Arial"/>
+          <w:noProof/>
+          <w:color w:val="000000"/>
+          <w:sz w:val="18"/>
+          <w:szCs w:val="18"/>
+        </w:rPr>
+        <w:instrText xml:space="preserve"> MERGEFIELD =r.short_label </w:instrText>
+      </w:r>
+      <w:r>
+        <w:rPr>
+          <w:rFonts w:ascii="Arial" w:hAnsi="Arial" w:cs="Arial"/>
+          <w:color w:val="000000"/>
+          <w:sz w:val="18"/>
+          <w:szCs w:val="18"/>
+        </w:rPr>
+        <w:instrText xml:space="preserve">\* MERGEFORMAT </w:instrText>
+      </w:r>
+      <w:r>
+        <w:rPr>
+          <w:rFonts w:ascii="Arial" w:hAnsi="Arial" w:cs="Arial"/>
+          <w:noProof/>
+          <w:color w:val="000000"/>
+          <w:sz w:val="18"/>
+          <w:szCs w:val="18"/>
+        </w:rPr>
+        <w:fldChar w:fldCharType="separate"/>
+      </w:r>
+      <w:r>
+        <w:rPr>
+          <w:rFonts w:ascii="Arial" w:hAnsi="Arial" w:cs="Arial"/>
+          <w:noProof/>
+          <w:color w:val="000000"/>
+          <w:sz w:val="18"/>
+          <w:szCs w:val="18"/>
+        </w:rPr>
+        <w:t>«=r.short_label»</w:t>
+      </w:r>
+      <w:r>
+        <w:rPr>
+          <w:rFonts w:ascii="Arial" w:hAnsi="Arial" w:cs="Arial"/>
+          <w:noProof/>
+          <w:color w:val="000000"/>
+          <w:sz w:val="18"/>
+          <w:szCs w:val="18"/>
+        </w:rPr>
+        <w:fldChar w:fldCharType="end"/>
+      </w:r>
+      <w:r>
+        <w:rPr>
+          <w:rFonts w:ascii="Arial" w:hAnsi="Arial" w:cs="Arial"/>
+          <w:noProof/>
+          <w:color w:val="000000"/>
+          <w:sz w:val="18"/>
+          <w:szCs w:val="18"/>
+        </w:rPr>
         <w:t>)</w:t>
       </w:r>
     </w:p>
     <w:tbl>
       <w:tblPr>
-        <w:tblStyle w:val="Tabellenraster"/>
-        <w:tblW w:w="0" w:type="auto"/>
+        <w:tblStyle w:val="TableGrid"/>
+        <w:tblW w:w="10174" w:type="dxa"/>
         <w:tblBorders>
           <w:top w:val="none" w:sz="0" w:space="0" w:color="auto"/>
           <w:left w:val="none" w:sz="0" w:space="0" w:color="auto"/>
@@ -2562,6 +2674,7 @@
         <w:gridCol w:w="1361"/>
         <w:gridCol w:w="1134"/>
         <w:gridCol w:w="1134"/>
+        <w:gridCol w:w="1134"/>
       </w:tblGrid>
       <w:tr>
         <w:trPr>
@@ -2589,6 +2702,7 @@
                 <w:sz w:val="18"/>
                 <w:szCs w:val="18"/>
               </w:rPr>
+              <w:lastRenderedPageBreak/>
               <w:t>R</w:t>
             </w:r>
           </w:p>
@@ -3273,6 +3387,76 @@
               </w:rPr>
               <w:fldChar w:fldCharType="end"/>
             </w:r>
+            <w:r>
+              <w:rPr>
+                <w:rFonts w:ascii="Arial" w:hAnsi="Arial" w:cs="Arial"/>
+                <w:noProof/>
+                <w:sz w:val="18"/>
+                <w:szCs w:val="18"/>
+              </w:rPr>
+              <w:t xml:space="preserve">  </w:t>
+            </w:r>
+          </w:p>
+        </w:tc>
+        <w:tc>
+          <w:tcPr>
+            <w:tcW w:w="1134" w:type="dxa"/>
+          </w:tcPr>
+          <w:p>
+            <w:pPr>
+              <w:jc w:val="center"/>
+              <w:rPr>
+                <w:rFonts w:ascii="Arial" w:hAnsi="Arial" w:cs="Arial"/>
+                <w:noProof/>
+                <w:sz w:val="18"/>
+                <w:szCs w:val="18"/>
+              </w:rPr>
+            </w:pPr>
+            <w:r>
+              <w:rPr>
+                <w:rFonts w:ascii="Arial" w:hAnsi="Arial" w:cs="Arial"/>
+                <w:noProof/>
+                <w:sz w:val="18"/>
+                <w:szCs w:val="18"/>
+              </w:rPr>
+              <w:fldChar w:fldCharType="begin"/>
+            </w:r>
+            <w:r>
+              <w:rPr>
+                <w:rFonts w:ascii="Arial" w:hAnsi="Arial" w:cs="Arial"/>
+                <w:noProof/>
+                <w:sz w:val="18"/>
+                <w:szCs w:val="18"/>
+              </w:rPr>
+              <w:instrText xml:space="preserve"> MERGEFIELD  =r.weight_percentage  \* MERGEFORMAT </w:instrText>
+            </w:r>
+            <w:r>
+              <w:rPr>
+                <w:rFonts w:ascii="Arial" w:hAnsi="Arial" w:cs="Arial"/>
+                <w:noProof/>
+                <w:sz w:val="18"/>
+                <w:szCs w:val="18"/>
+              </w:rPr>
+              <w:fldChar w:fldCharType="separate"/>
+            </w:r>
+            <w:r>
+              <w:rPr>
+                <w:rFonts w:ascii="Arial" w:hAnsi="Arial" w:cs="Arial"/>
+                <w:noProof/>
+                <w:sz w:val="18"/>
+                <w:szCs w:val="18"/>
+              </w:rPr>
+              <w:t>«=r.weight_percentage»</w:t>
+            </w:r>
+            <w:r>
+              <w:rPr>
+                <w:rFonts w:ascii="Arial" w:hAnsi="Arial" w:cs="Arial"/>
+                <w:noProof/>
+                <w:sz w:val="18"/>
+                <w:szCs w:val="18"/>
+              </w:rPr>
+              <w:fldChar w:fldCharType="end"/>
+            </w:r>
           </w:p>
         </w:tc>
       </w:tr>
@@ -3520,8 +3704,8 @@
     </w:p>
     <w:tbl>
       <w:tblPr>
-        <w:tblStyle w:val="Tabellenraster"/>
-        <w:tblW w:w="0" w:type="auto"/>
+        <w:tblStyle w:val="TableGrid"/>
+        <w:tblW w:w="10161" w:type="dxa"/>
         <w:tblBorders>
           <w:top w:val="none" w:sz="0" w:space="0" w:color="auto"/>
           <w:left w:val="none" w:sz="0" w:space="0" w:color="auto"/>
@@ -3542,6 +3726,7 @@
         <w:gridCol w:w="1361"/>
         <w:gridCol w:w="1134"/>
         <w:gridCol w:w="1134"/>
+        <w:gridCol w:w="1134"/>
       </w:tblGrid>
       <w:tr>
         <w:trPr>
@@ -3569,7 +3754,6 @@
                 <w:sz w:val="18"/>
                 <w:szCs w:val="18"/>
               </w:rPr>
-              <w:lastRenderedPageBreak/>
               <w:t>P</w:t>
             </w:r>
           </w:p>
@@ -4190,6 +4374,23 @@
             </w:r>
           </w:p>
         </w:tc>
+        <w:tc>
+          <w:tcPr>
+            <w:tcW w:w="1134" w:type="dxa"/>
+          </w:tcPr>
+          <w:p>
+            <w:pPr>
+              <w:jc w:val="center"/>
+              <w:rPr>
+                <w:rFonts w:ascii="Arial" w:hAnsi="Arial" w:cs="Arial"/>
+                <w:noProof/>
+                <w:color w:val="FF0000"/>
+                <w:sz w:val="18"/>
+                <w:szCs w:val="18"/>
+              </w:rPr>
+            </w:pPr>
+          </w:p>
+        </w:tc>
       </w:tr>
     </w:tbl>
     <w:p>
@@ -4199,55 +4400,6 @@
           <w:noProof/>
           <w:sz w:val="18"/>
           <w:szCs w:val="18"/>
-        </w:rPr>
-      </w:pPr>
-      <w:r>
-        <w:rPr>
-          <w:rFonts w:ascii="Arial" w:hAnsi="Arial" w:cs="Arial"/>
-          <w:sz w:val="18"/>
-          <w:szCs w:val="18"/>
-        </w:rPr>
-        <w:fldChar w:fldCharType="begin"/>
-      </w:r>
-      <w:r>
-        <w:rPr>
-          <w:rFonts w:ascii="Arial" w:hAnsi="Arial" w:cs="Arial"/>
-          <w:sz w:val="18"/>
-          <w:szCs w:val="18"/>
-        </w:rPr>
-        <w:instrText xml:space="preserve"> MERGEFIELD  obj.products:endEach  \* MERGEFORMAT </w:instrText>
-      </w:r>
-      <w:r>
-        <w:rPr>
-          <w:rFonts w:ascii="Arial" w:hAnsi="Arial" w:cs="Arial"/>
-          <w:sz w:val="18"/>
-          <w:szCs w:val="18"/>
-        </w:rPr>
-        <w:fldChar w:fldCharType="separate"/>
-      </w:r>
-      <w:r>
-        <w:rPr>
-          <w:rFonts w:ascii="Arial" w:hAnsi="Arial" w:cs="Arial"/>
-          <w:noProof/>
-          <w:sz w:val="18"/>
-          <w:szCs w:val="18"/>
-        </w:rPr>
-        <w:t>«obj.products:endEach»</w:t>
-      </w:r>
-      <w:r>
-        <w:rPr>
-          <w:rFonts w:ascii="Arial" w:hAnsi="Arial" w:cs="Arial"/>
-          <w:sz w:val="18"/>
-          <w:szCs w:val="18"/>
-        </w:rPr>
-        <w:fldChar w:fldCharType="end"/>
-      </w:r>
-    </w:p>
-    <w:p>
-      <w:pPr>
-        <w:rPr>
-          <w:rFonts w:ascii="Arial" w:hAnsi="Arial" w:cs="Arial"/>
-          <w:noProof/>
         </w:rPr>
       </w:pPr>
       <w:r>
@@ -4259,32 +4411,32 @@
         <mc:AlternateContent>
           <mc:Choice Requires="wps">
             <w:drawing>
-              <wp:anchor distT="0" distB="0" distL="114300" distR="114300" simplePos="0" relativeHeight="251661312" behindDoc="0" locked="0" layoutInCell="1" allowOverlap="1" wp14:anchorId="37C4E298" wp14:editId="4F954875">
+              <wp:anchor distT="0" distB="0" distL="114300" distR="114300" simplePos="0" relativeHeight="251671552" behindDoc="0" locked="0" layoutInCell="1" allowOverlap="1" wp14:anchorId="7D90DED1" wp14:editId="03493654">
                 <wp:simplePos x="0" y="0"/>
                 <wp:positionH relativeFrom="column">
-                  <wp:posOffset>47044</wp:posOffset>
+                  <wp:posOffset>-391886</wp:posOffset>
                 </wp:positionH>
                 <wp:positionV relativeFrom="paragraph">
-                  <wp:posOffset>56420</wp:posOffset>
+                  <wp:posOffset>159136</wp:posOffset>
                 </wp:positionV>
-                <wp:extent cx="5760000" cy="0"/>
-                <wp:effectExtent l="0" t="0" r="31750" b="25400"/>
+                <wp:extent cx="6760514" cy="35305"/>
+                <wp:effectExtent l="0" t="0" r="21590" b="22225"/>
                 <wp:wrapNone/>
-                <wp:docPr id="6" name="Straight Connector 6"/>
+                <wp:docPr id="1259754381" name="Straight Connector 1259754381"/>
                 <wp:cNvGraphicFramePr/>
                 <a:graphic xmlns:a="http://schemas.openxmlformats.org/drawingml/2006/main">
                   <a:graphicData uri="http://schemas.microsoft.com/office/word/2010/wordprocessingShape">
                     <wps:wsp>
                       <wps:cNvCnPr/>
                       <wps:spPr>
-                        <a:xfrm>
+                        <a:xfrm flipV="1">
                           <a:off x="0" y="0"/>
-                          <a:ext cx="5760000" cy="0"/>
+                          <a:ext cx="6760514" cy="35305"/>
                         </a:xfrm>
                         <a:prstGeom prst="line">
                           <a:avLst/>
                         </a:prstGeom>
-                        <a:ln w="9525"/>
+                        <a:ln w="12700"/>
                       </wps:spPr>
                       <wps:style>
                         <a:lnRef idx="1">
@@ -4307,18 +4459,70 @@
                 <wp14:sizeRelH relativeFrom="margin">
                   <wp14:pctWidth>0</wp14:pctWidth>
                 </wp14:sizeRelH>
+                <wp14:sizeRelV relativeFrom="margin">
+                  <wp14:pctHeight>0</wp14:pctHeight>
+                </wp14:sizeRelV>
               </wp:anchor>
             </w:drawing>
           </mc:Choice>
-          <mc:Fallback xmlns:mo="http://schemas.microsoft.com/office/mac/office/2008/main" xmlns:mv="urn:schemas-microsoft-com:mac:vml">
+          <mc:Fallback>
             <w:pict>
-              <v:line w14:anchorId="5F90D66D" id="Straight Connector 6" o:spid="_x0000_s1026" style="position:absolute;z-index:251661312;visibility:visible;mso-wrap-style:square;mso-width-percent:0;mso-wrap-distance-left:9pt;mso-wrap-distance-top:0;mso-wrap-distance-right:9pt;mso-wrap-distance-bottom:0;mso-position-horizontal:absolute;mso-position-horizontal-relative:text;mso-position-vertical:absolute;mso-position-vertical-relative:text;mso-width-percent:0;mso-width-relative:margin" from="3.7pt,4.45pt" to="457.25pt,4.45pt" o:gfxdata="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" strokecolor="#5b9bd5 [3204]">
+              <v:line w14:anchorId="4DD761C0" id="Straight Connector 1259754381" o:spid="_x0000_s1026" style="position:absolute;flip:y;z-index:251671552;visibility:visible;mso-wrap-style:square;mso-width-percent:0;mso-height-percent:0;mso-wrap-distance-left:9pt;mso-wrap-distance-top:0;mso-wrap-distance-right:9pt;mso-wrap-distance-bottom:0;mso-position-horizontal:absolute;mso-position-horizontal-relative:text;mso-position-vertical:absolute;mso-position-vertical-relative:text;mso-width-percent:0;mso-height-percent:0;mso-width-relative:margin;mso-height-relative:margin" from="-30.85pt,12.55pt" to="501.45pt,15.35pt" o:gfxdata="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" strokecolor="#5b9bd5 [3204]" strokeweight="1pt">
                 <v:stroke joinstyle="miter"/>
               </v:line>
             </w:pict>
           </mc:Fallback>
         </mc:AlternateContent>
       </w:r>
+      <w:r>
+        <w:rPr>
+          <w:rFonts w:ascii="Arial" w:hAnsi="Arial" w:cs="Arial"/>
+          <w:sz w:val="18"/>
+          <w:szCs w:val="18"/>
+        </w:rPr>
+        <w:fldChar w:fldCharType="begin"/>
+      </w:r>
+      <w:r>
+        <w:rPr>
+          <w:rFonts w:ascii="Arial" w:hAnsi="Arial" w:cs="Arial"/>
+          <w:sz w:val="18"/>
+          <w:szCs w:val="18"/>
+        </w:rPr>
+        <w:instrText xml:space="preserve"> MERGEFIELD  obj.products:endEach  \* MERGEFORMAT </w:instrText>
+      </w:r>
+      <w:r>
+        <w:rPr>
+          <w:rFonts w:ascii="Arial" w:hAnsi="Arial" w:cs="Arial"/>
+          <w:sz w:val="18"/>
+          <w:szCs w:val="18"/>
+        </w:rPr>
+        <w:fldChar w:fldCharType="separate"/>
+      </w:r>
+      <w:r>
+        <w:rPr>
+          <w:rFonts w:ascii="Arial" w:hAnsi="Arial" w:cs="Arial"/>
+          <w:noProof/>
+          <w:sz w:val="18"/>
+          <w:szCs w:val="18"/>
+        </w:rPr>
+        <w:t>«obj.products:endEach»</w:t>
+      </w:r>
+      <w:r>
+        <w:rPr>
+          <w:rFonts w:ascii="Arial" w:hAnsi="Arial" w:cs="Arial"/>
+          <w:sz w:val="18"/>
+          <w:szCs w:val="18"/>
+        </w:rPr>
+        <w:fldChar w:fldCharType="end"/>
+      </w:r>
+    </w:p>
+    <w:p>
+      <w:pPr>
+        <w:rPr>
+          <w:rFonts w:ascii="Arial" w:hAnsi="Arial" w:cs="Arial"/>
+          <w:noProof/>
+        </w:rPr>
+      </w:pPr>
     </w:p>
     <w:p>
       <w:pPr>
@@ -4761,7 +4965,7 @@
     </w:p>
     <w:tbl>
       <w:tblPr>
-        <w:tblStyle w:val="Tabellenraster"/>
+        <w:tblStyle w:val="TableGrid"/>
         <w:tblW w:w="5000" w:type="pct"/>
         <w:tblBorders>
           <w:top w:val="none" w:sz="0" w:space="0" w:color="auto"/>
@@ -5026,7 +5230,7 @@
     </w:p>
     <w:tbl>
       <w:tblPr>
-        <w:tblStyle w:val="Tabellenraster"/>
+        <w:tblStyle w:val="TableGrid"/>
         <w:tblW w:w="5000" w:type="pct"/>
         <w:tblBorders>
           <w:top w:val="none" w:sz="0" w:space="0" w:color="auto"/>
@@ -7383,6 +7587,7 @@
           <w:sz w:val="20"/>
           <w:szCs w:val="20"/>
         </w:rPr>
+        <w:lastRenderedPageBreak/>
         <w:t>TLC control:</w:t>
       </w:r>
       <w:r>
@@ -7919,7 +8124,6 @@
           <w:sz w:val="20"/>
           <w:szCs w:val="20"/>
         </w:rPr>
-        <w:lastRenderedPageBreak/>
         <w:fldChar w:fldCharType="begin"/>
       </w:r>
       <w:r>
@@ -10235,10 +10439,10 @@
           <w:noProof/>
         </w:rPr>
         <w:object w:dxaOrig="18787" w:dyaOrig="5510" w14:anchorId="4964B097">
-          <v:shape id="_x0000_i1027" type="#_x0000_t75" alt="" style="width:453.5pt;height:129pt;mso-width-percent:0;mso-height-percent:0;mso-width-percent:0;mso-height-percent:0" o:ole="">
+          <v:shape id="_x0000_i1027" type="#_x0000_t75" alt="" style="width:453.65pt;height:129pt;mso-width-percent:0;mso-height-percent:0;mso-width-percent:0;mso-height-percent:0" o:ole="">
             <v:imagedata r:id="rId9" o:title=""/>
           </v:shape>
-          <o:OLEObject Type="Embed" ProgID="ChemDraw.Document.6.0" ShapeID="_x0000_i1027" DrawAspect="Content" ObjectID="_1779608509" r:id="rId12"/>
+          <o:OLEObject Type="Embed" ProgID="ChemDraw.Document.6.0" ShapeID="_x0000_i1027" DrawAspect="Content" ObjectID="_1821437802" r:id="rId12"/>
         </w:object>
       </w:r>
       <w:r>
@@ -11674,7 +11878,7 @@
 </file>
 
 <file path=word/endnotes.xml><?xml version="1.0" encoding="utf-8"?>
-<w:endnotes xmlns:wpc="http://schemas.microsoft.com/office/word/2010/wordprocessingCanvas" xmlns:cx="http://schemas.microsoft.com/office/drawing/2014/chartex" xmlns:cx1="http://schemas.microsoft.com/office/drawing/2015/9/8/chartex" xmlns:cx2="http://schemas.microsoft.com/office/drawing/2015/10/21/chartex" xmlns:cx3="http://schemas.microsoft.com/office/drawing/2016/5/9/chartex" xmlns:cx4="http://schemas.microsoft.com/office/drawing/2016/5/10/chartex" xmlns:cx5="http://schemas.microsoft.com/office/drawing/2016/5/11/chartex" xmlns:cx6="http://schemas.microsoft.com/office/drawing/2016/5/12/chartex" xmlns:cx7="http://schemas.microsoft.com/office/drawing/2016/5/13/chartex" xmlns:cx8="http://schemas.microsoft.com/office/drawing/2016/5/14/chartex" xmlns:mc="http://schemas.openxmlformats.org/markup-compatibility/2006" xmlns:aink="http://schemas.microsoft.com/office/drawing/2016/ink" xmlns:am3d="http://schemas.microsoft.com/office/drawing/2017/model3d" xmlns:o="urn:schemas-microsoft-com:office:office" xmlns:oel="http://schemas.microsoft.com/office/2019/extlst" xmlns:r="http://schemas.openxmlformats.org/officeDocument/2006/relationships" xmlns:m="http://schemas.openxmlformats.org/officeDocument/2006/math" xmlns:v="urn:schemas-microsoft-com:vml" xmlns:wp14="http://schemas.microsoft.com/office/word/2010/wordprocessingDrawing" xmlns:wp="http://schemas.openxmlformats.org/drawingml/2006/wordprocessingDrawing" xmlns:w10="urn:schemas-microsoft-com:office:word" xmlns:w="http://schemas.openxmlformats.org/wordprocessingml/2006/main" xmlns:w14="http://schemas.microsoft.com/office/word/2010/wordml" xmlns:w15="http://schemas.microsoft.com/office/word/2012/wordml" xmlns:w16cex="http://schemas.microsoft.com/office/word/2018/wordml/cex" xmlns:w16cid="http://schemas.microsoft.com/office/word/2016/wordml/cid" xmlns:w16="http://schemas.microsoft.com/office/word/2018/wordml" xmlns:w16du="http://schemas.microsoft.com/office/word/2023/wordml/word16du" xmlns:w16sdtdh="http://schemas.microsoft.com/office/word/2020/wordml/sdtdatahash" xmlns:w16se="http://schemas.microsoft.com/office/word/2015/wordml/symex" xmlns:wpg="http://schemas.microsoft.com/office/word/2010/wordprocessingGroup" xmlns:wpi="http://schemas.microsoft.com/office/word/2010/wordprocessingInk" xmlns:wne="http://schemas.microsoft.com/office/word/2006/wordml" xmlns:wps="http://schemas.microsoft.com/office/word/2010/wordprocessingShape" mc:Ignorable="w14 w15 w16se w16cid w16 w16cex w16sdtdh w16du wp14">
+<w:endnotes xmlns:wpc="http://schemas.microsoft.com/office/word/2010/wordprocessingCanvas" xmlns:cx="http://schemas.microsoft.com/office/drawing/2014/chartex" xmlns:cx1="http://schemas.microsoft.com/office/drawing/2015/9/8/chartex" xmlns:cx2="http://schemas.microsoft.com/office/drawing/2015/10/21/chartex" xmlns:cx3="http://schemas.microsoft.com/office/drawing/2016/5/9/chartex" xmlns:cx4="http://schemas.microsoft.com/office/drawing/2016/5/10/chartex" xmlns:cx5="http://schemas.microsoft.com/office/drawing/2016/5/11/chartex" xmlns:cx6="http://schemas.microsoft.com/office/drawing/2016/5/12/chartex" xmlns:cx7="http://schemas.microsoft.com/office/drawing/2016/5/13/chartex" xmlns:cx8="http://schemas.microsoft.com/office/drawing/2016/5/14/chartex" xmlns:mc="http://schemas.openxmlformats.org/markup-compatibility/2006" xmlns:aink="http://schemas.microsoft.com/office/drawing/2016/ink" xmlns:am3d="http://schemas.microsoft.com/office/drawing/2017/model3d" xmlns:o="urn:schemas-microsoft-com:office:office" xmlns:oel="http://schemas.microsoft.com/office/2019/extlst" xmlns:r="http://schemas.openxmlformats.org/officeDocument/2006/relationships" xmlns:m="http://schemas.openxmlformats.org/officeDocument/2006/math" xmlns:v="urn:schemas-microsoft-com:vml" xmlns:wp14="http://schemas.microsoft.com/office/word/2010/wordprocessingDrawing" xmlns:wp="http://schemas.openxmlformats.org/drawingml/2006/wordprocessingDrawing" xmlns:w10="urn:schemas-microsoft-com:office:word" xmlns:w="http://schemas.openxmlformats.org/wordprocessingml/2006/main" xmlns:w14="http://schemas.microsoft.com/office/word/2010/wordml" xmlns:w15="http://schemas.microsoft.com/office/word/2012/wordml" xmlns:w16cex="http://schemas.microsoft.com/office/word/2018/wordml/cex" xmlns:w16cid="http://schemas.microsoft.com/office/word/2016/wordml/cid" xmlns:w16="http://schemas.microsoft.com/office/word/2018/wordml" xmlns:w16du="http://schemas.microsoft.com/office/word/2023/wordml/word16du" xmlns:w16sdtdh="http://schemas.microsoft.com/office/word/2020/wordml/sdtdatahash" xmlns:w16sdtfl="http://schemas.microsoft.com/office/word/2024/wordml/sdtformatlock" xmlns:w16se="http://schemas.microsoft.com/office/word/2015/wordml/symex" xmlns:wpg="http://schemas.microsoft.com/office/word/2010/wordprocessingGroup" xmlns:wpi="http://schemas.microsoft.com/office/word/2010/wordprocessingInk" xmlns:wne="http://schemas.microsoft.com/office/word/2006/wordml" xmlns:wps="http://schemas.microsoft.com/office/word/2010/wordprocessingShape" mc:Ignorable="w14 w15 w16se w16cid w16 w16cex w16sdtdh w16sdtfl w16du wp14">
   <w:endnote w:type="separator" w:id="-1">
     <w:p>
       <w:r>
@@ -11693,37 +11897,37 @@
 </file>
 
 <file path=word/footer1.xml><?xml version="1.0" encoding="utf-8"?>
-<w:ftr xmlns:wpc="http://schemas.microsoft.com/office/word/2010/wordprocessingCanvas" xmlns:cx="http://schemas.microsoft.com/office/drawing/2014/chartex" xmlns:cx1="http://schemas.microsoft.com/office/drawing/2015/9/8/chartex" xmlns:cx2="http://schemas.microsoft.com/office/drawing/2015/10/21/chartex" xmlns:cx3="http://schemas.microsoft.com/office/drawing/2016/5/9/chartex" xmlns:cx4="http://schemas.microsoft.com/office/drawing/2016/5/10/chartex" xmlns:cx5="http://schemas.microsoft.com/office/drawing/2016/5/11/chartex" xmlns:cx6="http://schemas.microsoft.com/office/drawing/2016/5/12/chartex" xmlns:cx7="http://schemas.microsoft.com/office/drawing/2016/5/13/chartex" xmlns:cx8="http://schemas.microsoft.com/office/drawing/2016/5/14/chartex" xmlns:mc="http://schemas.openxmlformats.org/markup-compatibility/2006" xmlns:aink="http://schemas.microsoft.com/office/drawing/2016/ink" xmlns:am3d="http://schemas.microsoft.com/office/drawing/2017/model3d" xmlns:o="urn:schemas-microsoft-com:office:office" xmlns:oel="http://schemas.microsoft.com/office/2019/extlst" xmlns:r="http://schemas.openxmlformats.org/officeDocument/2006/relationships" xmlns:m="http://schemas.openxmlformats.org/officeDocument/2006/math" xmlns:v="urn:schemas-microsoft-com:vml" xmlns:wp14="http://schemas.microsoft.com/office/word/2010/wordprocessingDrawing" xmlns:wp="http://schemas.openxmlformats.org/drawingml/2006/wordprocessingDrawing" xmlns:w10="urn:schemas-microsoft-com:office:word" xmlns:w="http://schemas.openxmlformats.org/wordprocessingml/2006/main" xmlns:w14="http://schemas.microsoft.com/office/word/2010/wordml" xmlns:w15="http://schemas.microsoft.com/office/word/2012/wordml" xmlns:w16cex="http://schemas.microsoft.com/office/word/2018/wordml/cex" xmlns:w16cid="http://schemas.microsoft.com/office/word/2016/wordml/cid" xmlns:w16="http://schemas.microsoft.com/office/word/2018/wordml" xmlns:w16du="http://schemas.microsoft.com/office/word/2023/wordml/word16du" xmlns:w16sdtdh="http://schemas.microsoft.com/office/word/2020/wordml/sdtdatahash" xmlns:w16se="http://schemas.microsoft.com/office/word/2015/wordml/symex" xmlns:wpg="http://schemas.microsoft.com/office/word/2010/wordprocessingGroup" xmlns:wpi="http://schemas.microsoft.com/office/word/2010/wordprocessingInk" xmlns:wne="http://schemas.microsoft.com/office/word/2006/wordml" xmlns:wps="http://schemas.microsoft.com/office/word/2010/wordprocessingShape" mc:Ignorable="w14 w15 w16se w16cid w16 w16cex w16sdtdh w16du wp14">
+<w:ftr xmlns:wpc="http://schemas.microsoft.com/office/word/2010/wordprocessingCanvas" xmlns:cx="http://schemas.microsoft.com/office/drawing/2014/chartex" xmlns:cx1="http://schemas.microsoft.com/office/drawing/2015/9/8/chartex" xmlns:cx2="http://schemas.microsoft.com/office/drawing/2015/10/21/chartex" xmlns:cx3="http://schemas.microsoft.com/office/drawing/2016/5/9/chartex" xmlns:cx4="http://schemas.microsoft.com/office/drawing/2016/5/10/chartex" xmlns:cx5="http://schemas.microsoft.com/office/drawing/2016/5/11/chartex" xmlns:cx6="http://schemas.microsoft.com/office/drawing/2016/5/12/chartex" xmlns:cx7="http://schemas.microsoft.com/office/drawing/2016/5/13/chartex" xmlns:cx8="http://schemas.microsoft.com/office/drawing/2016/5/14/chartex" xmlns:mc="http://schemas.openxmlformats.org/markup-compatibility/2006" xmlns:aink="http://schemas.microsoft.com/office/drawing/2016/ink" xmlns:am3d="http://schemas.microsoft.com/office/drawing/2017/model3d" xmlns:o="urn:schemas-microsoft-com:office:office" xmlns:oel="http://schemas.microsoft.com/office/2019/extlst" xmlns:r="http://schemas.openxmlformats.org/officeDocument/2006/relationships" xmlns:m="http://schemas.openxmlformats.org/officeDocument/2006/math" xmlns:v="urn:schemas-microsoft-com:vml" xmlns:wp14="http://schemas.microsoft.com/office/word/2010/wordprocessingDrawing" xmlns:wp="http://schemas.openxmlformats.org/drawingml/2006/wordprocessingDrawing" xmlns:w10="urn:schemas-microsoft-com:office:word" xmlns:w="http://schemas.openxmlformats.org/wordprocessingml/2006/main" xmlns:w14="http://schemas.microsoft.com/office/word/2010/wordml" xmlns:w15="http://schemas.microsoft.com/office/word/2012/wordml" xmlns:w16cex="http://schemas.microsoft.com/office/word/2018/wordml/cex" xmlns:w16cid="http://schemas.microsoft.com/office/word/2016/wordml/cid" xmlns:w16="http://schemas.microsoft.com/office/word/2018/wordml" xmlns:w16du="http://schemas.microsoft.com/office/word/2023/wordml/word16du" xmlns:w16sdtdh="http://schemas.microsoft.com/office/word/2020/wordml/sdtdatahash" xmlns:w16sdtfl="http://schemas.microsoft.com/office/word/2024/wordml/sdtformatlock" xmlns:w16se="http://schemas.microsoft.com/office/word/2015/wordml/symex" xmlns:wpg="http://schemas.microsoft.com/office/word/2010/wordprocessingGroup" xmlns:wpi="http://schemas.microsoft.com/office/word/2010/wordprocessingInk" xmlns:wne="http://schemas.microsoft.com/office/word/2006/wordml" xmlns:wps="http://schemas.microsoft.com/office/word/2010/wordprocessingShape" mc:Ignorable="w14 w15 w16se w16cid w16 w16cex w16sdtdh w16sdtfl w16du wp14">
   <w:p>
     <w:pPr>
-      <w:pStyle w:val="Fuzeile"/>
+      <w:pStyle w:val="Footer"/>
       <w:framePr w:wrap="none" w:vAnchor="text" w:hAnchor="margin" w:xAlign="right" w:y="1"/>
       <w:rPr>
-        <w:rStyle w:val="Seitenzahl"/>
+        <w:rStyle w:val="PageNumber"/>
       </w:rPr>
     </w:pPr>
     <w:r>
       <w:rPr>
-        <w:rStyle w:val="Seitenzahl"/>
+        <w:rStyle w:val="PageNumber"/>
       </w:rPr>
       <w:fldChar w:fldCharType="begin"/>
     </w:r>
     <w:r>
       <w:rPr>
-        <w:rStyle w:val="Seitenzahl"/>
+        <w:rStyle w:val="PageNumber"/>
       </w:rPr>
       <w:instrText xml:space="preserve">PAGE  </w:instrText>
     </w:r>
     <w:r>
       <w:rPr>
-        <w:rStyle w:val="Seitenzahl"/>
+        <w:rStyle w:val="PageNumber"/>
       </w:rPr>
       <w:fldChar w:fldCharType="end"/>
     </w:r>
   </w:p>
   <w:p>
     <w:pPr>
-      <w:pStyle w:val="Fuzeile"/>
+      <w:pStyle w:val="Footer"/>
       <w:ind w:right="360"/>
     </w:pPr>
   </w:p>
@@ -11731,7 +11935,7 @@
 </file>
 
 <file path=word/footer2.xml><?xml version="1.0" encoding="utf-8"?>
-<w:ftr xmlns:wpc="http://schemas.microsoft.com/office/word/2010/wordprocessingCanvas" xmlns:cx="http://schemas.microsoft.com/office/drawing/2014/chartex" xmlns:cx1="http://schemas.microsoft.com/office/drawing/2015/9/8/chartex" xmlns:cx2="http://schemas.microsoft.com/office/drawing/2015/10/21/chartex" xmlns:cx3="http://schemas.microsoft.com/office/drawing/2016/5/9/chartex" xmlns:cx4="http://schemas.microsoft.com/office/drawing/2016/5/10/chartex" xmlns:cx5="http://schemas.microsoft.com/office/drawing/2016/5/11/chartex" xmlns:cx6="http://schemas.microsoft.com/office/drawing/2016/5/12/chartex" xmlns:cx7="http://schemas.microsoft.com/office/drawing/2016/5/13/chartex" xmlns:cx8="http://schemas.microsoft.com/office/drawing/2016/5/14/chartex" xmlns:mc="http://schemas.openxmlformats.org/markup-compatibility/2006" xmlns:aink="http://schemas.microsoft.com/office/drawing/2016/ink" xmlns:am3d="http://schemas.microsoft.com/office/drawing/2017/model3d" xmlns:o="urn:schemas-microsoft-com:office:office" xmlns:oel="http://schemas.microsoft.com/office/2019/extlst" xmlns:r="http://schemas.openxmlformats.org/officeDocument/2006/relationships" xmlns:m="http://schemas.openxmlformats.org/officeDocument/2006/math" xmlns:v="urn:schemas-microsoft-com:vml" xmlns:wp14="http://schemas.microsoft.com/office/word/2010/wordprocessingDrawing" xmlns:wp="http://schemas.openxmlformats.org/drawingml/2006/wordprocessingDrawing" xmlns:w10="urn:schemas-microsoft-com:office:word" xmlns:w="http://schemas.openxmlformats.org/wordprocessingml/2006/main" xmlns:w14="http://schemas.microsoft.com/office/word/2010/wordml" xmlns:w15="http://schemas.microsoft.com/office/word/2012/wordml" xmlns:w16cex="http://schemas.microsoft.com/office/word/2018/wordml/cex" xmlns:w16cid="http://schemas.microsoft.com/office/word/2016/wordml/cid" xmlns:w16="http://schemas.microsoft.com/office/word/2018/wordml" xmlns:w16du="http://schemas.microsoft.com/office/word/2023/wordml/word16du" xmlns:w16sdtdh="http://schemas.microsoft.com/office/word/2020/wordml/sdtdatahash" xmlns:w16se="http://schemas.microsoft.com/office/word/2015/wordml/symex" xmlns:wpg="http://schemas.microsoft.com/office/word/2010/wordprocessingGroup" xmlns:wpi="http://schemas.microsoft.com/office/word/2010/wordprocessingInk" xmlns:wne="http://schemas.microsoft.com/office/word/2006/wordml" xmlns:wps="http://schemas.microsoft.com/office/word/2010/wordprocessingShape" mc:Ignorable="w14 w15 w16se w16cid w16 w16cex w16sdtdh w16du wp14">
+<w:ftr xmlns:wpc="http://schemas.microsoft.com/office/word/2010/wordprocessingCanvas" xmlns:cx="http://schemas.microsoft.com/office/drawing/2014/chartex" xmlns:cx1="http://schemas.microsoft.com/office/drawing/2015/9/8/chartex" xmlns:cx2="http://schemas.microsoft.com/office/drawing/2015/10/21/chartex" xmlns:cx3="http://schemas.microsoft.com/office/drawing/2016/5/9/chartex" xmlns:cx4="http://schemas.microsoft.com/office/drawing/2016/5/10/chartex" xmlns:cx5="http://schemas.microsoft.com/office/drawing/2016/5/11/chartex" xmlns:cx6="http://schemas.microsoft.com/office/drawing/2016/5/12/chartex" xmlns:cx7="http://schemas.microsoft.com/office/drawing/2016/5/13/chartex" xmlns:cx8="http://schemas.microsoft.com/office/drawing/2016/5/14/chartex" xmlns:mc="http://schemas.openxmlformats.org/markup-compatibility/2006" xmlns:aink="http://schemas.microsoft.com/office/drawing/2016/ink" xmlns:am3d="http://schemas.microsoft.com/office/drawing/2017/model3d" xmlns:o="urn:schemas-microsoft-com:office:office" xmlns:oel="http://schemas.microsoft.com/office/2019/extlst" xmlns:r="http://schemas.openxmlformats.org/officeDocument/2006/relationships" xmlns:m="http://schemas.openxmlformats.org/officeDocument/2006/math" xmlns:v="urn:schemas-microsoft-com:vml" xmlns:wp14="http://schemas.microsoft.com/office/word/2010/wordprocessingDrawing" xmlns:wp="http://schemas.openxmlformats.org/drawingml/2006/wordprocessingDrawing" xmlns:w10="urn:schemas-microsoft-com:office:word" xmlns:w="http://schemas.openxmlformats.org/wordprocessingml/2006/main" xmlns:w14="http://schemas.microsoft.com/office/word/2010/wordml" xmlns:w15="http://schemas.microsoft.com/office/word/2012/wordml" xmlns:w16cex="http://schemas.microsoft.com/office/word/2018/wordml/cex" xmlns:w16cid="http://schemas.microsoft.com/office/word/2016/wordml/cid" xmlns:w16="http://schemas.microsoft.com/office/word/2018/wordml" xmlns:w16du="http://schemas.microsoft.com/office/word/2023/wordml/word16du" xmlns:w16sdtdh="http://schemas.microsoft.com/office/word/2020/wordml/sdtdatahash" xmlns:w16sdtfl="http://schemas.microsoft.com/office/word/2024/wordml/sdtformatlock" xmlns:w16se="http://schemas.microsoft.com/office/word/2015/wordml/symex" xmlns:wpg="http://schemas.microsoft.com/office/word/2010/wordprocessingGroup" xmlns:wpi="http://schemas.microsoft.com/office/word/2010/wordprocessingInk" xmlns:wne="http://schemas.microsoft.com/office/word/2006/wordml" xmlns:wps="http://schemas.microsoft.com/office/word/2010/wordprocessingShape" mc:Ignorable="w14 w15 w16se w16cid w16 w16cex w16sdtdh w16sdtfl w16du wp14">
   <w:p>
     <w:pPr>
       <w:rPr>
@@ -11830,7 +12034,7 @@
 </file>
 
 <file path=word/footnotes.xml><?xml version="1.0" encoding="utf-8"?>
-<w:footnotes xmlns:wpc="http://schemas.microsoft.com/office/word/2010/wordprocessingCanvas" xmlns:cx="http://schemas.microsoft.com/office/drawing/2014/chartex" xmlns:cx1="http://schemas.microsoft.com/office/drawing/2015/9/8/chartex" xmlns:cx2="http://schemas.microsoft.com/office/drawing/2015/10/21/chartex" xmlns:cx3="http://schemas.microsoft.com/office/drawing/2016/5/9/chartex" xmlns:cx4="http://schemas.microsoft.com/office/drawing/2016/5/10/chartex" xmlns:cx5="http://schemas.microsoft.com/office/drawing/2016/5/11/chartex" xmlns:cx6="http://schemas.microsoft.com/office/drawing/2016/5/12/chartex" xmlns:cx7="http://schemas.microsoft.com/office/drawing/2016/5/13/chartex" xmlns:cx8="http://schemas.microsoft.com/office/drawing/2016/5/14/chartex" xmlns:mc="http://schemas.openxmlformats.org/markup-compatibility/2006" xmlns:aink="http://schemas.microsoft.com/office/drawing/2016/ink" xmlns:am3d="http://schemas.microsoft.com/office/drawing/2017/model3d" xmlns:o="urn:schemas-microsoft-com:office:office" xmlns:oel="http://schemas.microsoft.com/office/2019/extlst" xmlns:r="http://schemas.openxmlformats.org/officeDocument/2006/relationships" xmlns:m="http://schemas.openxmlformats.org/officeDocument/2006/math" xmlns:v="urn:schemas-microsoft-com:vml" xmlns:wp14="http://schemas.microsoft.com/office/word/2010/wordprocessingDrawing" xmlns:wp="http://schemas.openxmlformats.org/drawingml/2006/wordprocessingDrawing" xmlns:w10="urn:schemas-microsoft-com:office:word" xmlns:w="http://schemas.openxmlformats.org/wordprocessingml/2006/main" xmlns:w14="http://schemas.microsoft.com/office/word/2010/wordml" xmlns:w15="http://schemas.microsoft.com/office/word/2012/wordml" xmlns:w16cex="http://schemas.microsoft.com/office/word/2018/wordml/cex" xmlns:w16cid="http://schemas.microsoft.com/office/word/2016/wordml/cid" xmlns:w16="http://schemas.microsoft.com/office/word/2018/wordml" xmlns:w16du="http://schemas.microsoft.com/office/word/2023/wordml/word16du" xmlns:w16sdtdh="http://schemas.microsoft.com/office/word/2020/wordml/sdtdatahash" xmlns:w16se="http://schemas.microsoft.com/office/word/2015/wordml/symex" xmlns:wpg="http://schemas.microsoft.com/office/word/2010/wordprocessingGroup" xmlns:wpi="http://schemas.microsoft.com/office/word/2010/wordprocessingInk" xmlns:wne="http://schemas.microsoft.com/office/word/2006/wordml" xmlns:wps="http://schemas.microsoft.com/office/word/2010/wordprocessingShape" mc:Ignorable="w14 w15 w16se w16cid w16 w16cex w16sdtdh w16du wp14">
+<w:footnotes xmlns:wpc="http://schemas.microsoft.com/office/word/2010/wordprocessingCanvas" xmlns:cx="http://schemas.microsoft.com/office/drawing/2014/chartex" xmlns:cx1="http://schemas.microsoft.com/office/drawing/2015/9/8/chartex" xmlns:cx2="http://schemas.microsoft.com/office/drawing/2015/10/21/chartex" xmlns:cx3="http://schemas.microsoft.com/office/drawing/2016/5/9/chartex" xmlns:cx4="http://schemas.microsoft.com/office/drawing/2016/5/10/chartex" xmlns:cx5="http://schemas.microsoft.com/office/drawing/2016/5/11/chartex" xmlns:cx6="http://schemas.microsoft.com/office/drawing/2016/5/12/chartex" xmlns:cx7="http://schemas.microsoft.com/office/drawing/2016/5/13/chartex" xmlns:cx8="http://schemas.microsoft.com/office/drawing/2016/5/14/chartex" xmlns:mc="http://schemas.openxmlformats.org/markup-compatibility/2006" xmlns:aink="http://schemas.microsoft.com/office/drawing/2016/ink" xmlns:am3d="http://schemas.microsoft.com/office/drawing/2017/model3d" xmlns:o="urn:schemas-microsoft-com:office:office" xmlns:oel="http://schemas.microsoft.com/office/2019/extlst" xmlns:r="http://schemas.openxmlformats.org/officeDocument/2006/relationships" xmlns:m="http://schemas.openxmlformats.org/officeDocument/2006/math" xmlns:v="urn:schemas-microsoft-com:vml" xmlns:wp14="http://schemas.microsoft.com/office/word/2010/wordprocessingDrawing" xmlns:wp="http://schemas.openxmlformats.org/drawingml/2006/wordprocessingDrawing" xmlns:w10="urn:schemas-microsoft-com:office:word" xmlns:w="http://schemas.openxmlformats.org/wordprocessingml/2006/main" xmlns:w14="http://schemas.microsoft.com/office/word/2010/wordml" xmlns:w15="http://schemas.microsoft.com/office/word/2012/wordml" xmlns:w16cex="http://schemas.microsoft.com/office/word/2018/wordml/cex" xmlns:w16cid="http://schemas.microsoft.com/office/word/2016/wordml/cid" xmlns:w16="http://schemas.microsoft.com/office/word/2018/wordml" xmlns:w16du="http://schemas.microsoft.com/office/word/2023/wordml/word16du" xmlns:w16sdtdh="http://schemas.microsoft.com/office/word/2020/wordml/sdtdatahash" xmlns:w16sdtfl="http://schemas.microsoft.com/office/word/2024/wordml/sdtformatlock" xmlns:w16se="http://schemas.microsoft.com/office/word/2015/wordml/symex" xmlns:wpg="http://schemas.microsoft.com/office/word/2010/wordprocessingGroup" xmlns:wpi="http://schemas.microsoft.com/office/word/2010/wordprocessingInk" xmlns:wne="http://schemas.microsoft.com/office/word/2006/wordml" xmlns:wps="http://schemas.microsoft.com/office/word/2010/wordprocessingShape" mc:Ignorable="w14 w15 w16se w16cid w16 w16cex w16sdtdh w16sdtfl w16du wp14">
   <w:footnote w:type="separator" w:id="-1">
     <w:p>
       <w:r>
@@ -11849,7 +12053,7 @@
 </file>
 
 <file path=word/header1.xml><?xml version="1.0" encoding="utf-8"?>
-<w:hdr xmlns:wpc="http://schemas.microsoft.com/office/word/2010/wordprocessingCanvas" xmlns:cx="http://schemas.microsoft.com/office/drawing/2014/chartex" xmlns:cx1="http://schemas.microsoft.com/office/drawing/2015/9/8/chartex" xmlns:cx2="http://schemas.microsoft.com/office/drawing/2015/10/21/chartex" xmlns:cx3="http://schemas.microsoft.com/office/drawing/2016/5/9/chartex" xmlns:cx4="http://schemas.microsoft.com/office/drawing/2016/5/10/chartex" xmlns:cx5="http://schemas.microsoft.com/office/drawing/2016/5/11/chartex" xmlns:cx6="http://schemas.microsoft.com/office/drawing/2016/5/12/chartex" xmlns:cx7="http://schemas.microsoft.com/office/drawing/2016/5/13/chartex" xmlns:cx8="http://schemas.microsoft.com/office/drawing/2016/5/14/chartex" xmlns:mc="http://schemas.openxmlformats.org/markup-compatibility/2006" xmlns:aink="http://schemas.microsoft.com/office/drawing/2016/ink" xmlns:am3d="http://schemas.microsoft.com/office/drawing/2017/model3d" xmlns:o="urn:schemas-microsoft-com:office:office" xmlns:oel="http://schemas.microsoft.com/office/2019/extlst" xmlns:r="http://schemas.openxmlformats.org/officeDocument/2006/relationships" xmlns:m="http://schemas.openxmlformats.org/officeDocument/2006/math" xmlns:v="urn:schemas-microsoft-com:vml" xmlns:wp14="http://schemas.microsoft.com/office/word/2010/wordprocessingDrawing" xmlns:wp="http://schemas.openxmlformats.org/drawingml/2006/wordprocessingDrawing" xmlns:w10="urn:schemas-microsoft-com:office:word" xmlns:w="http://schemas.openxmlformats.org/wordprocessingml/2006/main" xmlns:w14="http://schemas.microsoft.com/office/word/2010/wordml" xmlns:w15="http://schemas.microsoft.com/office/word/2012/wordml" xmlns:w16cex="http://schemas.microsoft.com/office/word/2018/wordml/cex" xmlns:w16cid="http://schemas.microsoft.com/office/word/2016/wordml/cid" xmlns:w16="http://schemas.microsoft.com/office/word/2018/wordml" xmlns:w16du="http://schemas.microsoft.com/office/word/2023/wordml/word16du" xmlns:w16sdtdh="http://schemas.microsoft.com/office/word/2020/wordml/sdtdatahash" xmlns:w16se="http://schemas.microsoft.com/office/word/2015/wordml/symex" xmlns:wpg="http://schemas.microsoft.com/office/word/2010/wordprocessingGroup" xmlns:wpi="http://schemas.microsoft.com/office/word/2010/wordprocessingInk" xmlns:wne="http://schemas.microsoft.com/office/word/2006/wordml" xmlns:wps="http://schemas.microsoft.com/office/word/2010/wordprocessingShape" mc:Ignorable="w14 w15 w16se w16cid w16 w16cex w16sdtdh w16du wp14">
+<w:hdr xmlns:wpc="http://schemas.microsoft.com/office/word/2010/wordprocessingCanvas" xmlns:cx="http://schemas.microsoft.com/office/drawing/2014/chartex" xmlns:cx1="http://schemas.microsoft.com/office/drawing/2015/9/8/chartex" xmlns:cx2="http://schemas.microsoft.com/office/drawing/2015/10/21/chartex" xmlns:cx3="http://schemas.microsoft.com/office/drawing/2016/5/9/chartex" xmlns:cx4="http://schemas.microsoft.com/office/drawing/2016/5/10/chartex" xmlns:cx5="http://schemas.microsoft.com/office/drawing/2016/5/11/chartex" xmlns:cx6="http://schemas.microsoft.com/office/drawing/2016/5/12/chartex" xmlns:cx7="http://schemas.microsoft.com/office/drawing/2016/5/13/chartex" xmlns:cx8="http://schemas.microsoft.com/office/drawing/2016/5/14/chartex" xmlns:mc="http://schemas.openxmlformats.org/markup-compatibility/2006" xmlns:aink="http://schemas.microsoft.com/office/drawing/2016/ink" xmlns:am3d="http://schemas.microsoft.com/office/drawing/2017/model3d" xmlns:o="urn:schemas-microsoft-com:office:office" xmlns:oel="http://schemas.microsoft.com/office/2019/extlst" xmlns:r="http://schemas.openxmlformats.org/officeDocument/2006/relationships" xmlns:m="http://schemas.openxmlformats.org/officeDocument/2006/math" xmlns:v="urn:schemas-microsoft-com:vml" xmlns:wp14="http://schemas.microsoft.com/office/word/2010/wordprocessingDrawing" xmlns:wp="http://schemas.openxmlformats.org/drawingml/2006/wordprocessingDrawing" xmlns:w10="urn:schemas-microsoft-com:office:word" xmlns:w="http://schemas.openxmlformats.org/wordprocessingml/2006/main" xmlns:w14="http://schemas.microsoft.com/office/word/2010/wordml" xmlns:w15="http://schemas.microsoft.com/office/word/2012/wordml" xmlns:w16cex="http://schemas.microsoft.com/office/word/2018/wordml/cex" xmlns:w16cid="http://schemas.microsoft.com/office/word/2016/wordml/cid" xmlns:w16="http://schemas.microsoft.com/office/word/2018/wordml" xmlns:w16du="http://schemas.microsoft.com/office/word/2023/wordml/word16du" xmlns:w16sdtdh="http://schemas.microsoft.com/office/word/2020/wordml/sdtdatahash" xmlns:w16sdtfl="http://schemas.microsoft.com/office/word/2024/wordml/sdtformatlock" xmlns:w16se="http://schemas.microsoft.com/office/word/2015/wordml/symex" xmlns:wpg="http://schemas.microsoft.com/office/word/2010/wordprocessingGroup" xmlns:wpi="http://schemas.microsoft.com/office/word/2010/wordprocessingInk" xmlns:wne="http://schemas.microsoft.com/office/word/2006/wordml" xmlns:wps="http://schemas.microsoft.com/office/word/2010/wordprocessingShape" mc:Ignorable="w14 w15 w16se w16cid w16 w16cex w16sdtdh w16sdtfl w16du wp14">
   <w:p>
     <w:pPr>
       <w:jc w:val="right"/>
@@ -11868,14 +12072,14 @@
   </w:p>
   <w:p>
     <w:pPr>
-      <w:pStyle w:val="Kopfzeile"/>
+      <w:pStyle w:val="Header"/>
     </w:pPr>
   </w:p>
 </w:hdr>
 </file>
 
 <file path=word/numbering.xml><?xml version="1.0" encoding="utf-8"?>
-<w:numbering xmlns:wpc="http://schemas.microsoft.com/office/word/2010/wordprocessingCanvas" xmlns:cx="http://schemas.microsoft.com/office/drawing/2014/chartex" xmlns:cx1="http://schemas.microsoft.com/office/drawing/2015/9/8/chartex" xmlns:cx2="http://schemas.microsoft.com/office/drawing/2015/10/21/chartex" xmlns:cx3="http://schemas.microsoft.com/office/drawing/2016/5/9/chartex" xmlns:cx4="http://schemas.microsoft.com/office/drawing/2016/5/10/chartex" xmlns:cx5="http://schemas.microsoft.com/office/drawing/2016/5/11/chartex" xmlns:cx6="http://schemas.microsoft.com/office/drawing/2016/5/12/chartex" xmlns:cx7="http://schemas.microsoft.com/office/drawing/2016/5/13/chartex" xmlns:cx8="http://schemas.microsoft.com/office/drawing/2016/5/14/chartex" xmlns:mc="http://schemas.openxmlformats.org/markup-compatibility/2006" xmlns:aink="http://schemas.microsoft.com/office/drawing/2016/ink" xmlns:am3d="http://schemas.microsoft.com/office/drawing/2017/model3d" xmlns:o="urn:schemas-microsoft-com:office:office" xmlns:oel="http://schemas.microsoft.com/office/2019/extlst" xmlns:r="http://schemas.openxmlformats.org/officeDocument/2006/relationships" xmlns:m="http://schemas.openxmlformats.org/officeDocument/2006/math" xmlns:v="urn:schemas-microsoft-com:vml" xmlns:wp14="http://schemas.microsoft.com/office/word/2010/wordprocessingDrawing" xmlns:wp="http://schemas.openxmlformats.org/drawingml/2006/wordprocessingDrawing" xmlns:w10="urn:schemas-microsoft-com:office:word" xmlns:w="http://schemas.openxmlformats.org/wordprocessingml/2006/main" xmlns:w14="http://schemas.microsoft.com/office/word/2010/wordml" xmlns:w15="http://schemas.microsoft.com/office/word/2012/wordml" xmlns:w16cex="http://schemas.microsoft.com/office/word/2018/wordml/cex" xmlns:w16cid="http://schemas.microsoft.com/office/word/2016/wordml/cid" xmlns:w16="http://schemas.microsoft.com/office/word/2018/wordml" xmlns:w16du="http://schemas.microsoft.com/office/word/2023/wordml/word16du" xmlns:w16sdtdh="http://schemas.microsoft.com/office/word/2020/wordml/sdtdatahash" xmlns:w16se="http://schemas.microsoft.com/office/word/2015/wordml/symex" xmlns:wpg="http://schemas.microsoft.com/office/word/2010/wordprocessingGroup" xmlns:wpi="http://schemas.microsoft.com/office/word/2010/wordprocessingInk" xmlns:wne="http://schemas.microsoft.com/office/word/2006/wordml" xmlns:wps="http://schemas.microsoft.com/office/word/2010/wordprocessingShape" mc:Ignorable="w14 w15 w16se w16cid w16 w16cex w16sdtdh w16du wp14">
+<w:numbering xmlns:wpc="http://schemas.microsoft.com/office/word/2010/wordprocessingCanvas" xmlns:cx="http://schemas.microsoft.com/office/drawing/2014/chartex" xmlns:cx1="http://schemas.microsoft.com/office/drawing/2015/9/8/chartex" xmlns:cx2="http://schemas.microsoft.com/office/drawing/2015/10/21/chartex" xmlns:cx3="http://schemas.microsoft.com/office/drawing/2016/5/9/chartex" xmlns:cx4="http://schemas.microsoft.com/office/drawing/2016/5/10/chartex" xmlns:cx5="http://schemas.microsoft.com/office/drawing/2016/5/11/chartex" xmlns:cx6="http://schemas.microsoft.com/office/drawing/2016/5/12/chartex" xmlns:cx7="http://schemas.microsoft.com/office/drawing/2016/5/13/chartex" xmlns:cx8="http://schemas.microsoft.com/office/drawing/2016/5/14/chartex" xmlns:mc="http://schemas.openxmlformats.org/markup-compatibility/2006" xmlns:aink="http://schemas.microsoft.com/office/drawing/2016/ink" xmlns:am3d="http://schemas.microsoft.com/office/drawing/2017/model3d" xmlns:o="urn:schemas-microsoft-com:office:office" xmlns:oel="http://schemas.microsoft.com/office/2019/extlst" xmlns:r="http://schemas.openxmlformats.org/officeDocument/2006/relationships" xmlns:m="http://schemas.openxmlformats.org/officeDocument/2006/math" xmlns:v="urn:schemas-microsoft-com:vml" xmlns:wp14="http://schemas.microsoft.com/office/word/2010/wordprocessingDrawing" xmlns:wp="http://schemas.openxmlformats.org/drawingml/2006/wordprocessingDrawing" xmlns:w10="urn:schemas-microsoft-com:office:word" xmlns:w="http://schemas.openxmlformats.org/wordprocessingml/2006/main" xmlns:w14="http://schemas.microsoft.com/office/word/2010/wordml" xmlns:w15="http://schemas.microsoft.com/office/word/2012/wordml" xmlns:w16cex="http://schemas.microsoft.com/office/word/2018/wordml/cex" xmlns:w16cid="http://schemas.microsoft.com/office/word/2016/wordml/cid" xmlns:w16="http://schemas.microsoft.com/office/word/2018/wordml" xmlns:w16du="http://schemas.microsoft.com/office/word/2023/wordml/word16du" xmlns:w16sdtdh="http://schemas.microsoft.com/office/word/2020/wordml/sdtdatahash" xmlns:w16sdtfl="http://schemas.microsoft.com/office/word/2024/wordml/sdtformatlock" xmlns:w16se="http://schemas.microsoft.com/office/word/2015/wordml/symex" xmlns:wpg="http://schemas.microsoft.com/office/word/2010/wordprocessingGroup" xmlns:wpi="http://schemas.microsoft.com/office/word/2010/wordprocessingInk" xmlns:wne="http://schemas.microsoft.com/office/word/2006/wordml" xmlns:wps="http://schemas.microsoft.com/office/word/2010/wordprocessingShape" mc:Ignorable="w14 w15 w16se w16cid w16 w16cex w16sdtdh w16sdtfl w16du wp14">
   <w:abstractNum w:abstractNumId="0" w15:restartNumberingAfterBreak="0">
     <w:nsid w:val="1B1649E7"/>
     <w:multiLevelType w:val="hybridMultilevel"/>
@@ -12085,7 +12289,7 @@
 </file>
 
 <file path=word/styles.xml><?xml version="1.0" encoding="utf-8"?>
-<w:styles xmlns:mc="http://schemas.openxmlformats.org/markup-compatibility/2006" xmlns:r="http://schemas.openxmlformats.org/officeDocument/2006/relationships" xmlns:w="http://schemas.openxmlformats.org/wordprocessingml/2006/main" xmlns:w14="http://schemas.microsoft.com/office/word/2010/wordml" xmlns:w15="http://schemas.microsoft.com/office/word/2012/wordml" xmlns:w16cex="http://schemas.microsoft.com/office/word/2018/wordml/cex" xmlns:w16cid="http://schemas.microsoft.com/office/word/2016/wordml/cid" xmlns:w16="http://schemas.microsoft.com/office/word/2018/wordml" xmlns:w16du="http://schemas.microsoft.com/office/word/2023/wordml/word16du" xmlns:w16sdtdh="http://schemas.microsoft.com/office/word/2020/wordml/sdtdatahash" xmlns:w16se="http://schemas.microsoft.com/office/word/2015/wordml/symex" mc:Ignorable="w14 w15 w16se w16cid w16 w16cex w16sdtdh w16du">
+<w:styles xmlns:mc="http://schemas.openxmlformats.org/markup-compatibility/2006" xmlns:r="http://schemas.openxmlformats.org/officeDocument/2006/relationships" xmlns:w="http://schemas.openxmlformats.org/wordprocessingml/2006/main" xmlns:w14="http://schemas.microsoft.com/office/word/2010/wordml" xmlns:w15="http://schemas.microsoft.com/office/word/2012/wordml" xmlns:w16cex="http://schemas.microsoft.com/office/word/2018/wordml/cex" xmlns:w16cid="http://schemas.microsoft.com/office/word/2016/wordml/cid" xmlns:w16="http://schemas.microsoft.com/office/word/2018/wordml" xmlns:w16du="http://schemas.microsoft.com/office/word/2023/wordml/word16du" xmlns:w16sdtdh="http://schemas.microsoft.com/office/word/2020/wordml/sdtdatahash" xmlns:w16sdtfl="http://schemas.microsoft.com/office/word/2024/wordml/sdtformatlock" xmlns:w16se="http://schemas.microsoft.com/office/word/2015/wordml/symex" mc:Ignorable="w14 w15 w16se w16cid w16 w16cex w16sdtdh w16sdtfl w16du">
   <w:docDefaults>
     <w:rPrDefault>
       <w:rPr>
@@ -12471,18 +12675,17 @@
     <w:lsdException w:name="List Table 7 Colorful Accent 6" w:uiPriority="52"/>
     <w:lsdException w:name="Smart Link" w:semiHidden="1" w:unhideWhenUsed="1"/>
   </w:latentStyles>
-  <w:style w:type="paragraph" w:default="1" w:styleId="Standard">
+  <w:style w:type="paragraph" w:default="1" w:styleId="Normal">
     <w:name w:val="Normal"/>
     <w:qFormat/>
     <w:rsid w:val="00461742"/>
   </w:style>
-  <w:style w:type="character" w:default="1" w:styleId="Absatz-Standardschriftart">
+  <w:style w:type="character" w:default="1" w:styleId="DefaultParagraphFont">
     <w:name w:val="Default Paragraph Font"/>
     <w:uiPriority w:val="1"/>
-    <w:semiHidden/>
     <w:unhideWhenUsed/>
   </w:style>
-  <w:style w:type="table" w:default="1" w:styleId="NormaleTabelle">
+  <w:style w:type="table" w:default="1" w:styleId="TableNormal">
     <w:name w:val="Normal Table"/>
     <w:uiPriority w:val="99"/>
     <w:semiHidden/>
@@ -12497,16 +12700,16 @@
       </w:tblCellMar>
     </w:tblPr>
   </w:style>
-  <w:style w:type="numbering" w:default="1" w:styleId="KeineListe">
+  <w:style w:type="numbering" w:default="1" w:styleId="NoList">
     <w:name w:val="No List"/>
     <w:uiPriority w:val="99"/>
     <w:semiHidden/>
     <w:unhideWhenUsed/>
   </w:style>
-  <w:style w:type="paragraph" w:styleId="Kopfzeile">
+  <w:style w:type="paragraph" w:styleId="Header">
     <w:name w:val="header"/>
-    <w:basedOn w:val="Standard"/>
-    <w:link w:val="KopfzeileZchn"/>
+    <w:basedOn w:val="Normal"/>
+    <w:link w:val="HeaderChar"/>
     <w:uiPriority w:val="99"/>
     <w:unhideWhenUsed/>
     <w:rsid w:val="00581DDA"/>
@@ -12517,17 +12720,17 @@
       </w:tabs>
     </w:pPr>
   </w:style>
-  <w:style w:type="character" w:customStyle="1" w:styleId="KopfzeileZchn">
-    <w:name w:val="Kopfzeile Zchn"/>
-    <w:basedOn w:val="Absatz-Standardschriftart"/>
-    <w:link w:val="Kopfzeile"/>
+  <w:style w:type="character" w:customStyle="1" w:styleId="HeaderChar">
+    <w:name w:val="Header Char"/>
+    <w:basedOn w:val="DefaultParagraphFont"/>
+    <w:link w:val="Header"/>
     <w:uiPriority w:val="99"/>
     <w:rsid w:val="00581DDA"/>
   </w:style>
-  <w:style w:type="paragraph" w:styleId="Fuzeile">
+  <w:style w:type="paragraph" w:styleId="Footer">
     <w:name w:val="footer"/>
-    <w:basedOn w:val="Standard"/>
-    <w:link w:val="FuzeileZchn"/>
+    <w:basedOn w:val="Normal"/>
+    <w:link w:val="FooterChar"/>
     <w:uiPriority w:val="99"/>
     <w:unhideWhenUsed/>
     <w:rsid w:val="00581DDA"/>
@@ -12538,24 +12741,24 @@
       </w:tabs>
     </w:pPr>
   </w:style>
-  <w:style w:type="character" w:customStyle="1" w:styleId="FuzeileZchn">
-    <w:name w:val="Fußzeile Zchn"/>
-    <w:basedOn w:val="Absatz-Standardschriftart"/>
-    <w:link w:val="Fuzeile"/>
+  <w:style w:type="character" w:customStyle="1" w:styleId="FooterChar">
+    <w:name w:val="Footer Char"/>
+    <w:basedOn w:val="DefaultParagraphFont"/>
+    <w:link w:val="Footer"/>
     <w:uiPriority w:val="99"/>
     <w:rsid w:val="00581DDA"/>
   </w:style>
-  <w:style w:type="character" w:styleId="Seitenzahl">
+  <w:style w:type="character" w:styleId="PageNumber">
     <w:name w:val="page number"/>
-    <w:basedOn w:val="Absatz-Standardschriftart"/>
+    <w:basedOn w:val="DefaultParagraphFont"/>
     <w:uiPriority w:val="99"/>
     <w:semiHidden/>
     <w:unhideWhenUsed/>
     <w:rsid w:val="00581DDA"/>
   </w:style>
-  <w:style w:type="table" w:styleId="Tabellenraster">
+  <w:style w:type="table" w:styleId="TableGrid">
     <w:name w:val="Table Grid"/>
-    <w:basedOn w:val="NormaleTabelle"/>
+    <w:basedOn w:val="TableNormal"/>
     <w:uiPriority w:val="39"/>
     <w:rsid w:val="00BE3CA1"/>
     <w:tblPr>
@@ -12569,10 +12772,10 @@
       </w:tblBorders>
     </w:tblPr>
   </w:style>
-  <w:style w:type="paragraph" w:styleId="Dokumentstruktur">
+  <w:style w:type="paragraph" w:styleId="DocumentMap">
     <w:name w:val="Document Map"/>
-    <w:basedOn w:val="Standard"/>
-    <w:link w:val="DokumentstrukturZchn"/>
+    <w:basedOn w:val="Normal"/>
+    <w:link w:val="DocumentMapChar"/>
     <w:uiPriority w:val="99"/>
     <w:semiHidden/>
     <w:unhideWhenUsed/>
@@ -12581,10 +12784,10 @@
       <w:rFonts w:ascii="Times New Roman" w:hAnsi="Times New Roman" w:cs="Times New Roman"/>
     </w:rPr>
   </w:style>
-  <w:style w:type="character" w:customStyle="1" w:styleId="DokumentstrukturZchn">
-    <w:name w:val="Dokumentstruktur Zchn"/>
-    <w:basedOn w:val="Absatz-Standardschriftart"/>
-    <w:link w:val="Dokumentstruktur"/>
+  <w:style w:type="character" w:customStyle="1" w:styleId="DocumentMapChar">
+    <w:name w:val="Document Map Char"/>
+    <w:basedOn w:val="DefaultParagraphFont"/>
+    <w:link w:val="DocumentMap"/>
     <w:uiPriority w:val="99"/>
     <w:semiHidden/>
     <w:rsid w:val="0081088A"/>
@@ -12592,9 +12795,9 @@
       <w:rFonts w:ascii="Times New Roman" w:hAnsi="Times New Roman" w:cs="Times New Roman"/>
     </w:rPr>
   </w:style>
-  <w:style w:type="paragraph" w:styleId="Listenabsatz">
+  <w:style w:type="paragraph" w:styleId="ListParagraph">
     <w:name w:val="List Paragraph"/>
-    <w:basedOn w:val="Standard"/>
+    <w:basedOn w:val="Normal"/>
     <w:uiPriority w:val="34"/>
     <w:qFormat/>
     <w:rsid w:val="00043A4C"/>
@@ -12603,10 +12806,10 @@
       <w:contextualSpacing/>
     </w:pPr>
   </w:style>
-  <w:style w:type="paragraph" w:styleId="Sprechblasentext">
+  <w:style w:type="paragraph" w:styleId="BalloonText">
     <w:name w:val="Balloon Text"/>
-    <w:basedOn w:val="Standard"/>
-    <w:link w:val="SprechblasentextZchn"/>
+    <w:basedOn w:val="Normal"/>
+    <w:link w:val="BalloonTextChar"/>
     <w:uiPriority w:val="99"/>
     <w:semiHidden/>
     <w:unhideWhenUsed/>
@@ -12617,10 +12820,10 @@
       <w:szCs w:val="16"/>
     </w:rPr>
   </w:style>
-  <w:style w:type="character" w:customStyle="1" w:styleId="SprechblasentextZchn">
-    <w:name w:val="Sprechblasentext Zchn"/>
-    <w:basedOn w:val="Absatz-Standardschriftart"/>
-    <w:link w:val="Sprechblasentext"/>
+  <w:style w:type="character" w:customStyle="1" w:styleId="BalloonTextChar">
+    <w:name w:val="Balloon Text Char"/>
+    <w:basedOn w:val="DefaultParagraphFont"/>
+    <w:link w:val="BalloonText"/>
     <w:uiPriority w:val="99"/>
     <w:semiHidden/>
     <w:rsid w:val="002233C4"/>
@@ -12630,7 +12833,7 @@
       <w:szCs w:val="16"/>
     </w:rPr>
   </w:style>
-  <w:style w:type="paragraph" w:styleId="KeinLeerraum">
+  <w:style w:type="paragraph" w:styleId="NoSpacing">
     <w:name w:val="No Spacing"/>
     <w:uiPriority w:val="1"/>
     <w:qFormat/>

</xml_diff>

<commit_message>
feat: enhance mixture component processing in detail_reaction.rb
- Added `process_mixture_components` method to handle the extraction and formatting of component data for mixtures.
- Ensured components are always initialized as an empty array to prevent nil errors in templates.
- Updated logic to set the `is_mixture` flag based on sample type and presence of components.
- Improved handling of component properties for better flexibility in data extraction.
</commit_message>
<xml_diff>
--- a/lib/template/Standard.docx
+++ b/lib/template/Standard.docx
@@ -1,10 +1,10 @@
 
 <file path=word/document.xml><?xml version="1.0" encoding="utf-8"?>
-<w:document xmlns:wpc="http://schemas.microsoft.com/office/word/2010/wordprocessingCanvas" xmlns:cx="http://schemas.microsoft.com/office/drawing/2014/chartex" xmlns:cx1="http://schemas.microsoft.com/office/drawing/2015/9/8/chartex" xmlns:cx2="http://schemas.microsoft.com/office/drawing/2015/10/21/chartex" xmlns:cx3="http://schemas.microsoft.com/office/drawing/2016/5/9/chartex" xmlns:cx4="http://schemas.microsoft.com/office/drawing/2016/5/10/chartex" xmlns:cx5="http://schemas.microsoft.com/office/drawing/2016/5/11/chartex" xmlns:cx6="http://schemas.microsoft.com/office/drawing/2016/5/12/chartex" xmlns:cx7="http://schemas.microsoft.com/office/drawing/2016/5/13/chartex" xmlns:cx8="http://schemas.microsoft.com/office/drawing/2016/5/14/chartex" xmlns:mc="http://schemas.openxmlformats.org/markup-compatibility/2006" xmlns:aink="http://schemas.microsoft.com/office/drawing/2016/ink" xmlns:am3d="http://schemas.microsoft.com/office/drawing/2017/model3d" xmlns:o="urn:schemas-microsoft-com:office:office" xmlns:oel="http://schemas.microsoft.com/office/2019/extlst" xmlns:r="http://schemas.openxmlformats.org/officeDocument/2006/relationships" xmlns:m="http://schemas.openxmlformats.org/officeDocument/2006/math" xmlns:v="urn:schemas-microsoft-com:vml" xmlns:wp14="http://schemas.microsoft.com/office/word/2010/wordprocessingDrawing" xmlns:wp="http://schemas.openxmlformats.org/drawingml/2006/wordprocessingDrawing" xmlns:w10="urn:schemas-microsoft-com:office:word" xmlns:w="http://schemas.openxmlformats.org/wordprocessingml/2006/main" xmlns:w14="http://schemas.microsoft.com/office/word/2010/wordml" xmlns:w15="http://schemas.microsoft.com/office/word/2012/wordml" xmlns:w16cex="http://schemas.microsoft.com/office/word/2018/wordml/cex" xmlns:w16cid="http://schemas.microsoft.com/office/word/2016/wordml/cid" xmlns:w16="http://schemas.microsoft.com/office/word/2018/wordml" xmlns:w16du="http://schemas.microsoft.com/office/word/2023/wordml/word16du" xmlns:w16sdtdh="http://schemas.microsoft.com/office/word/2020/wordml/sdtdatahash" xmlns:w16se="http://schemas.microsoft.com/office/word/2015/wordml/symex" xmlns:wpg="http://schemas.microsoft.com/office/word/2010/wordprocessingGroup" xmlns:wpi="http://schemas.microsoft.com/office/word/2010/wordprocessingInk" xmlns:wne="http://schemas.microsoft.com/office/word/2006/wordml" xmlns:wps="http://schemas.microsoft.com/office/word/2010/wordprocessingShape" mc:Ignorable="w14 w15 w16se w16cid w16 w16cex w16sdtdh w16du wp14">
+<w:document xmlns:wpc="http://schemas.microsoft.com/office/word/2010/wordprocessingCanvas" xmlns:cx="http://schemas.microsoft.com/office/drawing/2014/chartex" xmlns:cx1="http://schemas.microsoft.com/office/drawing/2015/9/8/chartex" xmlns:cx2="http://schemas.microsoft.com/office/drawing/2015/10/21/chartex" xmlns:cx3="http://schemas.microsoft.com/office/drawing/2016/5/9/chartex" xmlns:cx4="http://schemas.microsoft.com/office/drawing/2016/5/10/chartex" xmlns:cx5="http://schemas.microsoft.com/office/drawing/2016/5/11/chartex" xmlns:cx6="http://schemas.microsoft.com/office/drawing/2016/5/12/chartex" xmlns:cx7="http://schemas.microsoft.com/office/drawing/2016/5/13/chartex" xmlns:cx8="http://schemas.microsoft.com/office/drawing/2016/5/14/chartex" xmlns:mc="http://schemas.openxmlformats.org/markup-compatibility/2006" xmlns:aink="http://schemas.microsoft.com/office/drawing/2016/ink" xmlns:am3d="http://schemas.microsoft.com/office/drawing/2017/model3d" xmlns:o="urn:schemas-microsoft-com:office:office" xmlns:oel="http://schemas.microsoft.com/office/2019/extlst" xmlns:r="http://schemas.openxmlformats.org/officeDocument/2006/relationships" xmlns:m="http://schemas.openxmlformats.org/officeDocument/2006/math" xmlns:v="urn:schemas-microsoft-com:vml" xmlns:wp14="http://schemas.microsoft.com/office/word/2010/wordprocessingDrawing" xmlns:wp="http://schemas.openxmlformats.org/drawingml/2006/wordprocessingDrawing" xmlns:w10="urn:schemas-microsoft-com:office:word" xmlns:w="http://schemas.openxmlformats.org/wordprocessingml/2006/main" xmlns:w14="http://schemas.microsoft.com/office/word/2010/wordml" xmlns:w15="http://schemas.microsoft.com/office/word/2012/wordml" xmlns:w16cex="http://schemas.microsoft.com/office/word/2018/wordml/cex" xmlns:w16cid="http://schemas.microsoft.com/office/word/2016/wordml/cid" xmlns:w16="http://schemas.microsoft.com/office/word/2018/wordml" xmlns:w16du="http://schemas.microsoft.com/office/word/2023/wordml/word16du" xmlns:w16sdtdh="http://schemas.microsoft.com/office/word/2020/wordml/sdtdatahash" xmlns:w16sdtfl="http://schemas.microsoft.com/office/word/2024/wordml/sdtformatlock" xmlns:w16se="http://schemas.microsoft.com/office/word/2015/wordml/symex" xmlns:wpg="http://schemas.microsoft.com/office/word/2010/wordprocessingGroup" xmlns:wpi="http://schemas.microsoft.com/office/word/2010/wordprocessingInk" xmlns:wne="http://schemas.microsoft.com/office/word/2006/wordml" xmlns:wps="http://schemas.microsoft.com/office/word/2010/wordprocessingShape" mc:Ignorable="w14 w15 w16se w16cid w16 w16cex w16sdtdh w16sdtfl w16du wp14">
   <w:body>
     <w:p>
       <w:pPr>
-        <w:pStyle w:val="KeinLeerraum"/>
+        <w:pStyle w:val="NoSpacing"/>
       </w:pPr>
       <w:fldSimple w:instr=" MERGEFIELD  =s.mass_unit \* MERGEFORMAT ">
         <w:r>
@@ -617,10 +617,10 @@
             <v:path o:extrusionok="f" gradientshapeok="t" o:connecttype="rect"/>
             <o:lock v:ext="edit" aspectratio="t"/>
           </v:shapetype>
-          <v:shape id="_x0000_i1025" type="#_x0000_t75" alt="" style="width:453.5pt;height:129pt;mso-width-percent:0;mso-height-percent:0;mso-width-percent:0;mso-height-percent:0" o:ole="">
+          <v:shape id="_x0000_i1025" type="#_x0000_t75" alt="" style="width:453.5pt;height:128.95pt;mso-width-percent:0;mso-height-percent:0;mso-width-percent:0;mso-height-percent:0" o:ole="">
             <v:imagedata r:id="rId9" o:title=""/>
           </v:shape>
-          <o:OLEObject Type="Embed" ProgID="ChemDraw.Document.6.0" ShapeID="_x0000_i1025" DrawAspect="Content" ObjectID="_1779608507" r:id="rId10"/>
+          <o:OLEObject Type="Embed" ProgID="ChemDraw.Document.6.0" ShapeID="_x0000_i1025" DrawAspect="Content" ObjectID="_1826458121" r:id="rId10"/>
         </w:object>
       </w:r>
       <w:r>
@@ -784,10 +784,10 @@
           <w:noProof/>
         </w:rPr>
         <w:object w:dxaOrig="18787" w:dyaOrig="5510" w14:anchorId="40B4FE74">
-          <v:shape id="_x0000_i1026" type="#_x0000_t75" alt="" style="width:453.5pt;height:129pt;mso-width-percent:0;mso-height-percent:0;mso-width-percent:0;mso-height-percent:0" o:ole="">
+          <v:shape id="_x0000_i1026" type="#_x0000_t75" alt="" style="width:453.5pt;height:128.95pt;mso-width-percent:0;mso-height-percent:0;mso-width-percent:0;mso-height-percent:0" o:ole="">
             <v:imagedata r:id="rId9" o:title=""/>
           </v:shape>
-          <o:OLEObject Type="Embed" ProgID="ChemDraw.Document.6.0" ShapeID="_x0000_i1026" DrawAspect="Content" ObjectID="_1779608508" r:id="rId11"/>
+          <o:OLEObject Type="Embed" ProgID="ChemDraw.Document.6.0" ShapeID="_x0000_i1026" DrawAspect="Content" ObjectID="_1826458122" r:id="rId11"/>
         </w:object>
       </w:r>
       <w:r>
@@ -960,7 +960,7 @@
     </w:p>
     <w:tbl>
       <w:tblPr>
-        <w:tblStyle w:val="Tabellenraster"/>
+        <w:tblStyle w:val="TableGrid"/>
         <w:tblW w:w="0" w:type="auto"/>
         <w:tblBorders>
           <w:top w:val="none" w:sz="0" w:space="0" w:color="auto"/>
@@ -1519,11 +1519,21 @@
         </w:rPr>
         <w:t>)</w:t>
       </w:r>
+      <w:r>
+        <w:rPr>
+          <w:rFonts w:ascii="Arial" w:hAnsi="Arial" w:cs="Arial"/>
+          <w:noProof/>
+          <w:color w:val="000000"/>
+          <w:sz w:val="18"/>
+          <w:szCs w:val="18"/>
+        </w:rPr>
+        <w:t xml:space="preserve"> </w:t>
+      </w:r>
     </w:p>
     <w:tbl>
       <w:tblPr>
-        <w:tblStyle w:val="Tabellenraster"/>
-        <w:tblW w:w="0" w:type="auto"/>
+        <w:tblStyle w:val="TableGrid"/>
+        <w:tblW w:w="10398" w:type="dxa"/>
         <w:tblBorders>
           <w:top w:val="none" w:sz="0" w:space="0" w:color="auto"/>
           <w:left w:val="none" w:sz="0" w:space="0" w:color="auto"/>
@@ -1537,12 +1547,18 @@
       </w:tblPr>
       <w:tblGrid>
         <w:gridCol w:w="337"/>
-        <w:gridCol w:w="1543"/>
+        <w:gridCol w:w="1470"/>
+        <w:gridCol w:w="73"/>
         <w:gridCol w:w="1191"/>
-        <w:gridCol w:w="1134"/>
+        <w:gridCol w:w="543"/>
+        <w:gridCol w:w="591"/>
         <w:gridCol w:w="1203"/>
-        <w:gridCol w:w="1361"/>
-        <w:gridCol w:w="1134"/>
+        <w:gridCol w:w="14"/>
+        <w:gridCol w:w="1347"/>
+        <w:gridCol w:w="460"/>
+        <w:gridCol w:w="901"/>
+        <w:gridCol w:w="907"/>
+        <w:gridCol w:w="227"/>
         <w:gridCol w:w="1134"/>
       </w:tblGrid>
       <w:tr>
@@ -1578,6 +1594,7 @@
         <w:tc>
           <w:tcPr>
             <w:tcW w:w="1543" w:type="dxa"/>
+            <w:gridSpan w:val="2"/>
           </w:tcPr>
           <w:p>
             <w:pPr>
@@ -1722,6 +1739,7 @@
         <w:tc>
           <w:tcPr>
             <w:tcW w:w="1134" w:type="dxa"/>
+            <w:gridSpan w:val="2"/>
           </w:tcPr>
           <w:p>
             <w:pPr>
@@ -1981,6 +1999,7 @@
         <w:tc>
           <w:tcPr>
             <w:tcW w:w="1361" w:type="dxa"/>
+            <w:gridSpan w:val="2"/>
           </w:tcPr>
           <w:p>
             <w:pPr>
@@ -1992,6 +2011,23 @@
                 <w:szCs w:val="18"/>
               </w:rPr>
             </w:pPr>
+          </w:p>
+        </w:tc>
+        <w:tc>
+          <w:tcPr>
+            <w:tcW w:w="1361" w:type="dxa"/>
+            <w:gridSpan w:val="2"/>
+          </w:tcPr>
+          <w:p>
+            <w:pPr>
+              <w:jc w:val="center"/>
+              <w:rPr>
+                <w:rFonts w:ascii="Arial" w:hAnsi="Arial" w:cs="Arial"/>
+                <w:noProof/>
+                <w:sz w:val="18"/>
+                <w:szCs w:val="18"/>
+              </w:rPr>
+            </w:pPr>
             <w:r>
               <w:rPr>
                 <w:rFonts w:ascii="Arial" w:hAnsi="Arial" w:cs="Arial"/>
@@ -2035,6 +2071,130 @@
                 <w:szCs w:val="18"/>
               </w:rPr>
               <w:t>«=s.density»</w:t>
+            </w:r>
+            <w:r>
+              <w:rPr>
+                <w:rFonts w:ascii="Arial" w:hAnsi="Arial" w:cs="Arial"/>
+                <w:noProof/>
+                <w:sz w:val="18"/>
+                <w:szCs w:val="18"/>
+              </w:rPr>
+              <w:fldChar w:fldCharType="end"/>
+            </w:r>
+          </w:p>
+        </w:tc>
+        <w:tc>
+          <w:tcPr>
+            <w:tcW w:w="1134" w:type="dxa"/>
+            <w:gridSpan w:val="2"/>
+          </w:tcPr>
+          <w:p>
+            <w:pPr>
+              <w:jc w:val="center"/>
+              <w:rPr>
+                <w:rFonts w:ascii="Arial" w:hAnsi="Arial" w:cs="Arial"/>
+                <w:noProof/>
+                <w:sz w:val="18"/>
+                <w:szCs w:val="18"/>
+              </w:rPr>
+            </w:pPr>
+            <w:r>
+              <w:rPr>
+                <w:rFonts w:ascii="Arial" w:hAnsi="Arial" w:cs="Arial"/>
+                <w:noProof/>
+                <w:sz w:val="18"/>
+                <w:szCs w:val="18"/>
+              </w:rPr>
+              <w:fldChar w:fldCharType="begin"/>
+            </w:r>
+            <w:r>
+              <w:rPr>
+                <w:rFonts w:ascii="Arial" w:hAnsi="Arial" w:cs="Arial"/>
+                <w:noProof/>
+                <w:sz w:val="18"/>
+                <w:szCs w:val="18"/>
+              </w:rPr>
+              <w:instrText xml:space="preserve"> MERGEFIELD =s.mol </w:instrText>
+            </w:r>
+            <w:r>
+              <w:rPr>
+                <w:rFonts w:ascii="Arial" w:hAnsi="Arial" w:cs="Arial"/>
+                <w:sz w:val="18"/>
+                <w:szCs w:val="18"/>
+              </w:rPr>
+              <w:instrText xml:space="preserve">\* MERGEFORMAT </w:instrText>
+            </w:r>
+            <w:r>
+              <w:rPr>
+                <w:rFonts w:ascii="Arial" w:hAnsi="Arial" w:cs="Arial"/>
+                <w:noProof/>
+                <w:sz w:val="18"/>
+                <w:szCs w:val="18"/>
+              </w:rPr>
+              <w:fldChar w:fldCharType="separate"/>
+            </w:r>
+            <w:r>
+              <w:rPr>
+                <w:rFonts w:ascii="Arial" w:hAnsi="Arial" w:cs="Arial"/>
+                <w:noProof/>
+                <w:sz w:val="18"/>
+                <w:szCs w:val="18"/>
+              </w:rPr>
+              <w:t>«=s.mol»</w:t>
+            </w:r>
+            <w:r>
+              <w:rPr>
+                <w:rFonts w:ascii="Arial" w:hAnsi="Arial" w:cs="Arial"/>
+                <w:noProof/>
+                <w:sz w:val="18"/>
+                <w:szCs w:val="18"/>
+              </w:rPr>
+              <w:fldChar w:fldCharType="end"/>
+            </w:r>
+            <w:r>
+              <w:rPr>
+                <w:rFonts w:ascii="Arial" w:hAnsi="Arial" w:cs="Arial"/>
+                <w:noProof/>
+                <w:sz w:val="18"/>
+                <w:szCs w:val="18"/>
+              </w:rPr>
+              <w:t xml:space="preserve"> </w:t>
+            </w:r>
+            <w:r>
+              <w:rPr>
+                <w:rFonts w:ascii="Arial" w:hAnsi="Arial" w:cs="Arial"/>
+                <w:noProof/>
+                <w:sz w:val="18"/>
+                <w:szCs w:val="18"/>
+              </w:rPr>
+              <w:fldChar w:fldCharType="begin"/>
+            </w:r>
+            <w:r>
+              <w:rPr>
+                <w:rFonts w:ascii="Arial" w:hAnsi="Arial" w:cs="Arial"/>
+                <w:noProof/>
+                <w:sz w:val="18"/>
+                <w:szCs w:val="18"/>
+              </w:rPr>
+              <w:instrText xml:space="preserve"> MERGEFIELD  =s.mmol_unit  \* MERGEFORMAT </w:instrText>
+            </w:r>
+            <w:r>
+              <w:rPr>
+                <w:rFonts w:ascii="Arial" w:hAnsi="Arial" w:cs="Arial"/>
+                <w:noProof/>
+                <w:sz w:val="18"/>
+                <w:szCs w:val="18"/>
+              </w:rPr>
+              <w:fldChar w:fldCharType="separate"/>
+            </w:r>
+            <w:r>
+              <w:rPr>
+                <w:rFonts w:ascii="Arial" w:hAnsi="Arial" w:cs="Arial"/>
+                <w:noProof/>
+                <w:sz w:val="18"/>
+                <w:szCs w:val="18"/>
+              </w:rPr>
+              <w:t>«=s.mmol_unit»</w:t>
             </w:r>
             <w:r>
               <w:rPr>
@@ -2077,7 +2237,7 @@
                 <w:sz w:val="18"/>
                 <w:szCs w:val="18"/>
               </w:rPr>
-              <w:instrText xml:space="preserve"> MERGEFIELD =s.mol </w:instrText>
+              <w:instrText xml:space="preserve"> MERGEFIELD =s.equiv </w:instrText>
             </w:r>
             <w:r>
               <w:rPr>
@@ -2103,7 +2263,7 @@
                 <w:sz w:val="18"/>
                 <w:szCs w:val="18"/>
               </w:rPr>
-              <w:t>«=s.mol»</w:t>
+              <w:t>«=s.equiv»</w:t>
             </w:r>
             <w:r>
               <w:rPr>
@@ -2114,19 +2274,30 @@
               </w:rPr>
               <w:fldChar w:fldCharType="end"/>
             </w:r>
-            <w:r>
-              <w:rPr>
-                <w:rFonts w:ascii="Arial" w:hAnsi="Arial" w:cs="Arial"/>
-                <w:noProof/>
-                <w:sz w:val="18"/>
-                <w:szCs w:val="18"/>
-              </w:rPr>
-              <w:t xml:space="preserve"> </w:t>
-            </w:r>
-            <w:r>
-              <w:rPr>
-                <w:rFonts w:ascii="Arial" w:hAnsi="Arial" w:cs="Arial"/>
-                <w:noProof/>
+          </w:p>
+        </w:tc>
+      </w:tr>
+      <w:tr>
+        <w:trPr>
+          <w:trHeight w:val="255"/>
+        </w:trPr>
+        <w:tc>
+          <w:tcPr>
+            <w:tcW w:w="10398" w:type="dxa"/>
+            <w:gridSpan w:val="14"/>
+          </w:tcPr>
+          <w:p>
+            <w:pPr>
+              <w:rPr>
+                <w:rFonts w:ascii="Arial" w:hAnsi="Arial" w:cs="Arial"/>
+                <w:noProof/>
+                <w:sz w:val="18"/>
+                <w:szCs w:val="18"/>
+              </w:rPr>
+            </w:pPr>
+            <w:r>
+              <w:rPr>
+                <w:rFonts w:ascii="Arial" w:hAnsi="Arial" w:cs="Arial"/>
                 <w:sz w:val="18"/>
                 <w:szCs w:val="18"/>
               </w:rPr>
@@ -2135,16 +2306,14 @@
             <w:r>
               <w:rPr>
                 <w:rFonts w:ascii="Arial" w:hAnsi="Arial" w:cs="Arial"/>
-                <w:noProof/>
-                <w:sz w:val="18"/>
-                <w:szCs w:val="18"/>
-              </w:rPr>
-              <w:instrText xml:space="preserve"> MERGEFIELD  =s.mmol_unit  \* MERGEFORMAT </w:instrText>
-            </w:r>
-            <w:r>
-              <w:rPr>
-                <w:rFonts w:ascii="Arial" w:hAnsi="Arial" w:cs="Arial"/>
-                <w:noProof/>
+                <w:sz w:val="18"/>
+                <w:szCs w:val="18"/>
+              </w:rPr>
+              <w:instrText xml:space="preserve"> MERGEFIELD  s.components:if  \* MERGEFORMAT </w:instrText>
+            </w:r>
+            <w:r>
+              <w:rPr>
+                <w:rFonts w:ascii="Arial" w:hAnsi="Arial" w:cs="Arial"/>
                 <w:sz w:val="18"/>
                 <w:szCs w:val="18"/>
               </w:rPr>
@@ -2157,29 +2326,65 @@
                 <w:sz w:val="18"/>
                 <w:szCs w:val="18"/>
               </w:rPr>
-              <w:t>«=s.mmol_unit»</w:t>
-            </w:r>
-            <w:r>
-              <w:rPr>
-                <w:rFonts w:ascii="Arial" w:hAnsi="Arial" w:cs="Arial"/>
-                <w:noProof/>
+              <w:t>«s.components:if»</w:t>
+            </w:r>
+            <w:r>
+              <w:rPr>
+                <w:rFonts w:ascii="Arial" w:hAnsi="Arial" w:cs="Arial"/>
                 <w:sz w:val="18"/>
                 <w:szCs w:val="18"/>
               </w:rPr>
               <w:fldChar w:fldCharType="end"/>
+            </w:r>
+          </w:p>
+        </w:tc>
+      </w:tr>
+      <w:tr>
+        <w:trPr>
+          <w:gridAfter w:val="2"/>
+          <w:wAfter w:w="1361" w:type="dxa"/>
+          <w:trHeight w:val="255"/>
+        </w:trPr>
+        <w:tc>
+          <w:tcPr>
+            <w:tcW w:w="1807" w:type="dxa"/>
+            <w:gridSpan w:val="2"/>
+          </w:tcPr>
+          <w:p>
+            <w:pPr>
+              <w:jc w:val="center"/>
+              <w:rPr>
+                <w:rFonts w:ascii="Arial" w:hAnsi="Arial" w:cs="Arial"/>
+                <w:b/>
+                <w:bCs/>
+                <w:sz w:val="18"/>
+                <w:szCs w:val="18"/>
+              </w:rPr>
+            </w:pPr>
+            <w:r>
+              <w:rPr>
+                <w:rFonts w:ascii="Arial" w:hAnsi="Arial" w:cs="Arial"/>
+                <w:b/>
+                <w:bCs/>
+                <w:sz w:val="18"/>
+                <w:szCs w:val="18"/>
+              </w:rPr>
+              <w:t>Component</w:t>
             </w:r>
           </w:p>
         </w:tc>
         <w:tc>
           <w:tcPr>
-            <w:tcW w:w="1134" w:type="dxa"/>
+            <w:tcW w:w="1807" w:type="dxa"/>
+            <w:gridSpan w:val="3"/>
           </w:tcPr>
           <w:p>
             <w:pPr>
               <w:jc w:val="center"/>
               <w:rPr>
                 <w:rFonts w:ascii="Arial" w:hAnsi="Arial" w:cs="Arial"/>
-                <w:noProof/>
+                <w:b/>
+                <w:bCs/>
                 <w:sz w:val="18"/>
                 <w:szCs w:val="18"/>
               </w:rPr>
@@ -2187,7 +2392,120 @@
             <w:r>
               <w:rPr>
                 <w:rFonts w:ascii="Arial" w:hAnsi="Arial" w:cs="Arial"/>
-                <w:noProof/>
+                <w:b/>
+                <w:bCs/>
+                <w:sz w:val="18"/>
+                <w:szCs w:val="18"/>
+              </w:rPr>
+              <w:t>Amount</w:t>
+            </w:r>
+          </w:p>
+        </w:tc>
+        <w:tc>
+          <w:tcPr>
+            <w:tcW w:w="1808" w:type="dxa"/>
+            <w:gridSpan w:val="3"/>
+          </w:tcPr>
+          <w:p>
+            <w:pPr>
+              <w:jc w:val="center"/>
+              <w:rPr>
+                <w:rFonts w:ascii="Arial" w:hAnsi="Arial" w:cs="Arial"/>
+                <w:b/>
+                <w:bCs/>
+                <w:sz w:val="18"/>
+                <w:szCs w:val="18"/>
+              </w:rPr>
+            </w:pPr>
+            <w:r>
+              <w:rPr>
+                <w:rFonts w:ascii="Arial" w:hAnsi="Arial" w:cs="Arial"/>
+                <w:b/>
+                <w:bCs/>
+                <w:sz w:val="18"/>
+                <w:szCs w:val="18"/>
+              </w:rPr>
+              <w:t>Rel. MW [g/mol]</w:t>
+            </w:r>
+          </w:p>
+        </w:tc>
+        <w:tc>
+          <w:tcPr>
+            <w:tcW w:w="1807" w:type="dxa"/>
+            <w:gridSpan w:val="2"/>
+          </w:tcPr>
+          <w:p>
+            <w:pPr>
+              <w:jc w:val="center"/>
+              <w:rPr>
+                <w:rFonts w:ascii="Arial" w:hAnsi="Arial" w:cs="Arial"/>
+                <w:b/>
+                <w:bCs/>
+                <w:sz w:val="18"/>
+                <w:szCs w:val="18"/>
+              </w:rPr>
+            </w:pPr>
+            <w:r>
+              <w:rPr>
+                <w:rFonts w:ascii="Arial" w:hAnsi="Arial" w:cs="Arial"/>
+                <w:b/>
+                <w:bCs/>
+                <w:sz w:val="18"/>
+                <w:szCs w:val="18"/>
+              </w:rPr>
+              <w:t>Conc</w:t>
+            </w:r>
+          </w:p>
+        </w:tc>
+        <w:tc>
+          <w:tcPr>
+            <w:tcW w:w="1808" w:type="dxa"/>
+            <w:gridSpan w:val="2"/>
+          </w:tcPr>
+          <w:p>
+            <w:pPr>
+              <w:jc w:val="center"/>
+              <w:rPr>
+                <w:rFonts w:ascii="Arial" w:hAnsi="Arial" w:cs="Arial"/>
+                <w:b/>
+                <w:bCs/>
+                <w:sz w:val="18"/>
+                <w:szCs w:val="18"/>
+              </w:rPr>
+            </w:pPr>
+            <w:r>
+              <w:rPr>
+                <w:rFonts w:ascii="Arial" w:hAnsi="Arial" w:cs="Arial"/>
+                <w:b/>
+                <w:bCs/>
+                <w:sz w:val="18"/>
+                <w:szCs w:val="18"/>
+              </w:rPr>
+              <w:t>Ratio</w:t>
+            </w:r>
+          </w:p>
+        </w:tc>
+      </w:tr>
+      <w:tr>
+        <w:trPr>
+          <w:trHeight w:val="255"/>
+        </w:trPr>
+        <w:tc>
+          <w:tcPr>
+            <w:tcW w:w="10398" w:type="dxa"/>
+            <w:gridSpan w:val="14"/>
+          </w:tcPr>
+          <w:p>
+            <w:pPr>
+              <w:rPr>
+                <w:rFonts w:ascii="Arial" w:hAnsi="Arial" w:cs="Arial"/>
+                <w:sz w:val="18"/>
+                <w:szCs w:val="18"/>
+              </w:rPr>
+            </w:pPr>
+            <w:r>
+              <w:rPr>
+                <w:rFonts w:ascii="Arial" w:hAnsi="Arial" w:cs="Arial"/>
                 <w:sz w:val="18"/>
                 <w:szCs w:val="18"/>
               </w:rPr>
@@ -2196,24 +2514,14 @@
             <w:r>
               <w:rPr>
                 <w:rFonts w:ascii="Arial" w:hAnsi="Arial" w:cs="Arial"/>
-                <w:noProof/>
-                <w:sz w:val="18"/>
-                <w:szCs w:val="18"/>
-              </w:rPr>
-              <w:instrText xml:space="preserve"> MERGEFIELD =s.equiv </w:instrText>
-            </w:r>
-            <w:r>
-              <w:rPr>
-                <w:rFonts w:ascii="Arial" w:hAnsi="Arial" w:cs="Arial"/>
-                <w:sz w:val="18"/>
-                <w:szCs w:val="18"/>
-              </w:rPr>
-              <w:instrText xml:space="preserve">\* MERGEFORMAT </w:instrText>
-            </w:r>
-            <w:r>
-              <w:rPr>
-                <w:rFonts w:ascii="Arial" w:hAnsi="Arial" w:cs="Arial"/>
-                <w:noProof/>
+                <w:sz w:val="18"/>
+                <w:szCs w:val="18"/>
+              </w:rPr>
+              <w:instrText xml:space="preserve"> MERGEFIELD  s.components:each(comp)  \* MERGEFORMAT </w:instrText>
+            </w:r>
+            <w:r>
+              <w:rPr>
+                <w:rFonts w:ascii="Arial" w:hAnsi="Arial" w:cs="Arial"/>
                 <w:sz w:val="18"/>
                 <w:szCs w:val="18"/>
               </w:rPr>
@@ -2226,12 +2534,531 @@
                 <w:sz w:val="18"/>
                 <w:szCs w:val="18"/>
               </w:rPr>
-              <w:t>«=s.equiv»</w:t>
-            </w:r>
-            <w:r>
-              <w:rPr>
-                <w:rFonts w:ascii="Arial" w:hAnsi="Arial" w:cs="Arial"/>
-                <w:noProof/>
+              <w:t>«s.components:each(comp)»</w:t>
+            </w:r>
+            <w:r>
+              <w:rPr>
+                <w:rFonts w:ascii="Arial" w:hAnsi="Arial" w:cs="Arial"/>
+                <w:sz w:val="18"/>
+                <w:szCs w:val="18"/>
+              </w:rPr>
+              <w:fldChar w:fldCharType="end"/>
+            </w:r>
+          </w:p>
+        </w:tc>
+      </w:tr>
+      <w:tr>
+        <w:trPr>
+          <w:gridAfter w:val="2"/>
+          <w:wAfter w:w="1361" w:type="dxa"/>
+          <w:trHeight w:val="255"/>
+        </w:trPr>
+        <w:tc>
+          <w:tcPr>
+            <w:tcW w:w="1807" w:type="dxa"/>
+            <w:gridSpan w:val="2"/>
+          </w:tcPr>
+          <w:p>
+            <w:pPr>
+              <w:rPr>
+                <w:rFonts w:ascii="Arial" w:hAnsi="Arial" w:cs="Arial"/>
+                <w:sz w:val="18"/>
+                <w:szCs w:val="18"/>
+              </w:rPr>
+            </w:pPr>
+            <w:r>
+              <w:rPr>
+                <w:rFonts w:ascii="Arial" w:hAnsi="Arial" w:cs="Arial"/>
+                <w:noProof/>
+                <w:color w:val="000000"/>
+                <w:sz w:val="18"/>
+                <w:szCs w:val="18"/>
+              </w:rPr>
+              <w:fldChar w:fldCharType="begin"/>
+            </w:r>
+            <w:r>
+              <w:rPr>
+                <w:rFonts w:ascii="Arial" w:hAnsi="Arial" w:cs="Arial"/>
+                <w:noProof/>
+                <w:color w:val="000000"/>
+                <w:sz w:val="18"/>
+                <w:szCs w:val="18"/>
+              </w:rPr>
+              <w:instrText xml:space="preserve"> MERGEFIELD  =comp.name  \* MERGEFORMAT </w:instrText>
+            </w:r>
+            <w:r>
+              <w:rPr>
+                <w:rFonts w:ascii="Arial" w:hAnsi="Arial" w:cs="Arial"/>
+                <w:noProof/>
+                <w:color w:val="000000"/>
+                <w:sz w:val="18"/>
+                <w:szCs w:val="18"/>
+              </w:rPr>
+              <w:fldChar w:fldCharType="separate"/>
+            </w:r>
+            <w:r>
+              <w:rPr>
+                <w:rFonts w:ascii="Arial" w:hAnsi="Arial" w:cs="Arial"/>
+                <w:noProof/>
+                <w:color w:val="000000"/>
+                <w:sz w:val="18"/>
+                <w:szCs w:val="18"/>
+              </w:rPr>
+              <w:t>«=comp.name»</w:t>
+            </w:r>
+            <w:r>
+              <w:rPr>
+                <w:rFonts w:ascii="Arial" w:hAnsi="Arial" w:cs="Arial"/>
+                <w:noProof/>
+                <w:color w:val="000000"/>
+                <w:sz w:val="18"/>
+                <w:szCs w:val="18"/>
+              </w:rPr>
+              <w:fldChar w:fldCharType="end"/>
+            </w:r>
+          </w:p>
+        </w:tc>
+        <w:tc>
+          <w:tcPr>
+            <w:tcW w:w="1807" w:type="dxa"/>
+            <w:gridSpan w:val="3"/>
+          </w:tcPr>
+          <w:p>
+            <w:pPr>
+              <w:jc w:val="center"/>
+              <w:rPr>
+                <w:rFonts w:ascii="Arial" w:hAnsi="Arial" w:cs="Arial"/>
+                <w:sz w:val="18"/>
+                <w:szCs w:val="18"/>
+              </w:rPr>
+            </w:pPr>
+            <w:r>
+              <w:rPr>
+                <w:rFonts w:ascii="Arial" w:hAnsi="Arial" w:cs="Arial"/>
+                <w:noProof/>
+                <w:color w:val="000000"/>
+                <w:sz w:val="18"/>
+                <w:szCs w:val="18"/>
+              </w:rPr>
+              <w:fldChar w:fldCharType="begin"/>
+            </w:r>
+            <w:r>
+              <w:rPr>
+                <w:rFonts w:ascii="Arial" w:hAnsi="Arial" w:cs="Arial"/>
+                <w:noProof/>
+                <w:color w:val="000000"/>
+                <w:sz w:val="18"/>
+                <w:szCs w:val="18"/>
+              </w:rPr>
+              <w:instrText xml:space="preserve"> MERGEFIELD  =comp.amount_mol  \* MERGEFORMAT </w:instrText>
+            </w:r>
+            <w:r>
+              <w:rPr>
+                <w:rFonts w:ascii="Arial" w:hAnsi="Arial" w:cs="Arial"/>
+                <w:noProof/>
+                <w:color w:val="000000"/>
+                <w:sz w:val="18"/>
+                <w:szCs w:val="18"/>
+              </w:rPr>
+              <w:fldChar w:fldCharType="separate"/>
+            </w:r>
+            <w:r>
+              <w:rPr>
+                <w:rFonts w:ascii="Arial" w:hAnsi="Arial" w:cs="Arial"/>
+                <w:noProof/>
+                <w:color w:val="000000"/>
+                <w:sz w:val="18"/>
+                <w:szCs w:val="18"/>
+              </w:rPr>
+              <w:t>«=comp.amount_mol»</w:t>
+            </w:r>
+            <w:r>
+              <w:rPr>
+                <w:rFonts w:ascii="Arial" w:hAnsi="Arial" w:cs="Arial"/>
+                <w:noProof/>
+                <w:color w:val="000000"/>
+                <w:sz w:val="18"/>
+                <w:szCs w:val="18"/>
+              </w:rPr>
+              <w:fldChar w:fldCharType="end"/>
+            </w:r>
+            <w:r>
+              <w:rPr>
+                <w:rFonts w:ascii="Arial" w:hAnsi="Arial" w:cs="Arial"/>
+                <w:noProof/>
+                <w:color w:val="000000"/>
+                <w:sz w:val="18"/>
+                <w:szCs w:val="18"/>
+              </w:rPr>
+              <w:t xml:space="preserve"> </w:t>
+            </w:r>
+            <w:r>
+              <w:rPr>
+                <w:rFonts w:ascii="Arial" w:hAnsi="Arial" w:cs="Arial"/>
+                <w:noProof/>
+                <w:color w:val="000000"/>
+                <w:sz w:val="18"/>
+                <w:szCs w:val="18"/>
+              </w:rPr>
+              <w:fldChar w:fldCharType="begin"/>
+            </w:r>
+            <w:r>
+              <w:rPr>
+                <w:rFonts w:ascii="Arial" w:hAnsi="Arial" w:cs="Arial"/>
+                <w:noProof/>
+                <w:color w:val="000000"/>
+                <w:sz w:val="18"/>
+                <w:szCs w:val="18"/>
+              </w:rPr>
+              <w:instrText xml:space="preserve"> MERGEFIELD  =comp.amount_mol_unit  \* MERGEFORMAT </w:instrText>
+            </w:r>
+            <w:r>
+              <w:rPr>
+                <w:rFonts w:ascii="Arial" w:hAnsi="Arial" w:cs="Arial"/>
+                <w:noProof/>
+                <w:color w:val="000000"/>
+                <w:sz w:val="18"/>
+                <w:szCs w:val="18"/>
+              </w:rPr>
+              <w:fldChar w:fldCharType="separate"/>
+            </w:r>
+            <w:r>
+              <w:rPr>
+                <w:rFonts w:ascii="Arial" w:hAnsi="Arial" w:cs="Arial"/>
+                <w:noProof/>
+                <w:color w:val="000000"/>
+                <w:sz w:val="18"/>
+                <w:szCs w:val="18"/>
+              </w:rPr>
+              <w:t>«=comp.amount_mol_unit»</w:t>
+            </w:r>
+            <w:r>
+              <w:rPr>
+                <w:rFonts w:ascii="Arial" w:hAnsi="Arial" w:cs="Arial"/>
+                <w:noProof/>
+                <w:color w:val="000000"/>
+                <w:sz w:val="18"/>
+                <w:szCs w:val="18"/>
+              </w:rPr>
+              <w:fldChar w:fldCharType="end"/>
+            </w:r>
+          </w:p>
+        </w:tc>
+        <w:tc>
+          <w:tcPr>
+            <w:tcW w:w="1808" w:type="dxa"/>
+            <w:gridSpan w:val="3"/>
+          </w:tcPr>
+          <w:p>
+            <w:pPr>
+              <w:jc w:val="center"/>
+              <w:rPr>
+                <w:rFonts w:ascii="Arial" w:hAnsi="Arial" w:cs="Arial"/>
+                <w:sz w:val="18"/>
+                <w:szCs w:val="18"/>
+              </w:rPr>
+            </w:pPr>
+            <w:r>
+              <w:rPr>
+                <w:rFonts w:ascii="Arial" w:hAnsi="Arial" w:cs="Arial"/>
+                <w:noProof/>
+                <w:color w:val="000000"/>
+                <w:sz w:val="18"/>
+                <w:szCs w:val="18"/>
+              </w:rPr>
+              <w:fldChar w:fldCharType="begin"/>
+            </w:r>
+            <w:r>
+              <w:rPr>
+                <w:rFonts w:ascii="Arial" w:hAnsi="Arial" w:cs="Arial"/>
+                <w:noProof/>
+                <w:color w:val="000000"/>
+                <w:sz w:val="18"/>
+                <w:szCs w:val="18"/>
+              </w:rPr>
+              <w:instrText xml:space="preserve"> MERGEFIELD  =comp.relative_molecular_weight  \* MERGEFORMAT </w:instrText>
+            </w:r>
+            <w:r>
+              <w:rPr>
+                <w:rFonts w:ascii="Arial" w:hAnsi="Arial" w:cs="Arial"/>
+                <w:noProof/>
+                <w:color w:val="000000"/>
+                <w:sz w:val="18"/>
+                <w:szCs w:val="18"/>
+              </w:rPr>
+              <w:fldChar w:fldCharType="separate"/>
+            </w:r>
+            <w:r>
+              <w:rPr>
+                <w:rFonts w:ascii="Arial" w:hAnsi="Arial" w:cs="Arial"/>
+                <w:noProof/>
+                <w:color w:val="000000"/>
+                <w:sz w:val="18"/>
+                <w:szCs w:val="18"/>
+              </w:rPr>
+              <w:t>«=comp.relative_molecular_weight»</w:t>
+            </w:r>
+            <w:r>
+              <w:rPr>
+                <w:rFonts w:ascii="Arial" w:hAnsi="Arial" w:cs="Arial"/>
+                <w:noProof/>
+                <w:color w:val="000000"/>
+                <w:sz w:val="18"/>
+                <w:szCs w:val="18"/>
+              </w:rPr>
+              <w:fldChar w:fldCharType="end"/>
+            </w:r>
+          </w:p>
+        </w:tc>
+        <w:tc>
+          <w:tcPr>
+            <w:tcW w:w="1807" w:type="dxa"/>
+            <w:gridSpan w:val="2"/>
+          </w:tcPr>
+          <w:p>
+            <w:pPr>
+              <w:jc w:val="center"/>
+              <w:rPr>
+                <w:rFonts w:ascii="Arial" w:hAnsi="Arial" w:cs="Arial"/>
+                <w:sz w:val="18"/>
+                <w:szCs w:val="18"/>
+              </w:rPr>
+            </w:pPr>
+            <w:r>
+              <w:rPr>
+                <w:rFonts w:ascii="Arial" w:hAnsi="Arial" w:cs="Arial"/>
+                <w:noProof/>
+                <w:color w:val="000000"/>
+                <w:sz w:val="18"/>
+                <w:szCs w:val="18"/>
+              </w:rPr>
+              <w:fldChar w:fldCharType="begin"/>
+            </w:r>
+            <w:r>
+              <w:rPr>
+                <w:rFonts w:ascii="Arial" w:hAnsi="Arial" w:cs="Arial"/>
+                <w:noProof/>
+                <w:color w:val="000000"/>
+                <w:sz w:val="18"/>
+                <w:szCs w:val="18"/>
+              </w:rPr>
+              <w:instrText xml:space="preserve"> MERGEFIELD  =comp.concn  \* MERGEFORMAT </w:instrText>
+            </w:r>
+            <w:r>
+              <w:rPr>
+                <w:rFonts w:ascii="Arial" w:hAnsi="Arial" w:cs="Arial"/>
+                <w:noProof/>
+                <w:color w:val="000000"/>
+                <w:sz w:val="18"/>
+                <w:szCs w:val="18"/>
+              </w:rPr>
+              <w:fldChar w:fldCharType="separate"/>
+            </w:r>
+            <w:r>
+              <w:rPr>
+                <w:rFonts w:ascii="Arial" w:hAnsi="Arial" w:cs="Arial"/>
+                <w:noProof/>
+                <w:color w:val="000000"/>
+                <w:sz w:val="18"/>
+                <w:szCs w:val="18"/>
+              </w:rPr>
+              <w:t>«=comp.concn»</w:t>
+            </w:r>
+            <w:r>
+              <w:rPr>
+                <w:rFonts w:ascii="Arial" w:hAnsi="Arial" w:cs="Arial"/>
+                <w:noProof/>
+                <w:color w:val="000000"/>
+                <w:sz w:val="18"/>
+                <w:szCs w:val="18"/>
+              </w:rPr>
+              <w:fldChar w:fldCharType="end"/>
+            </w:r>
+          </w:p>
+        </w:tc>
+        <w:tc>
+          <w:tcPr>
+            <w:tcW w:w="1808" w:type="dxa"/>
+            <w:gridSpan w:val="2"/>
+          </w:tcPr>
+          <w:p>
+            <w:pPr>
+              <w:jc w:val="center"/>
+              <w:rPr>
+                <w:rFonts w:ascii="Arial" w:hAnsi="Arial" w:cs="Arial"/>
+                <w:sz w:val="18"/>
+                <w:szCs w:val="18"/>
+              </w:rPr>
+            </w:pPr>
+            <w:r>
+              <w:rPr>
+                <w:rFonts w:ascii="Arial" w:hAnsi="Arial" w:cs="Arial"/>
+                <w:noProof/>
+                <w:color w:val="000000"/>
+                <w:sz w:val="18"/>
+                <w:szCs w:val="18"/>
+              </w:rPr>
+              <w:fldChar w:fldCharType="begin"/>
+            </w:r>
+            <w:r>
+              <w:rPr>
+                <w:rFonts w:ascii="Arial" w:hAnsi="Arial" w:cs="Arial"/>
+                <w:noProof/>
+                <w:color w:val="000000"/>
+                <w:sz w:val="18"/>
+                <w:szCs w:val="18"/>
+              </w:rPr>
+              <w:instrText xml:space="preserve"> MERGEFIELD  =comp.equivalent  \* MERGEFORMAT </w:instrText>
+            </w:r>
+            <w:r>
+              <w:rPr>
+                <w:rFonts w:ascii="Arial" w:hAnsi="Arial" w:cs="Arial"/>
+                <w:noProof/>
+                <w:color w:val="000000"/>
+                <w:sz w:val="18"/>
+                <w:szCs w:val="18"/>
+              </w:rPr>
+              <w:fldChar w:fldCharType="separate"/>
+            </w:r>
+            <w:r>
+              <w:rPr>
+                <w:rFonts w:ascii="Arial" w:hAnsi="Arial" w:cs="Arial"/>
+                <w:noProof/>
+                <w:color w:val="000000"/>
+                <w:sz w:val="18"/>
+                <w:szCs w:val="18"/>
+              </w:rPr>
+              <w:t>«=comp.equivalent»</w:t>
+            </w:r>
+            <w:r>
+              <w:rPr>
+                <w:rFonts w:ascii="Arial" w:hAnsi="Arial" w:cs="Arial"/>
+                <w:noProof/>
+                <w:color w:val="000000"/>
+                <w:sz w:val="18"/>
+                <w:szCs w:val="18"/>
+              </w:rPr>
+              <w:fldChar w:fldCharType="end"/>
+            </w:r>
+          </w:p>
+        </w:tc>
+      </w:tr>
+      <w:tr>
+        <w:trPr>
+          <w:trHeight w:val="255"/>
+        </w:trPr>
+        <w:tc>
+          <w:tcPr>
+            <w:tcW w:w="10398" w:type="dxa"/>
+            <w:gridSpan w:val="14"/>
+          </w:tcPr>
+          <w:p>
+            <w:pPr>
+              <w:rPr>
+                <w:rFonts w:ascii="Arial" w:hAnsi="Arial" w:cs="Arial"/>
+                <w:noProof/>
+                <w:color w:val="000000"/>
+                <w:sz w:val="18"/>
+                <w:szCs w:val="18"/>
+              </w:rPr>
+            </w:pPr>
+            <w:r>
+              <w:rPr>
+                <w:rFonts w:ascii="Arial" w:hAnsi="Arial" w:cs="Arial"/>
+                <w:sz w:val="18"/>
+                <w:szCs w:val="18"/>
+              </w:rPr>
+              <w:fldChar w:fldCharType="begin"/>
+            </w:r>
+            <w:r>
+              <w:rPr>
+                <w:rFonts w:ascii="Arial" w:hAnsi="Arial" w:cs="Arial"/>
+                <w:sz w:val="18"/>
+                <w:szCs w:val="18"/>
+              </w:rPr>
+              <w:instrText xml:space="preserve"> MERGEFIELD  s.components:endEach  \* MERGEFORMAT </w:instrText>
+            </w:r>
+            <w:r>
+              <w:rPr>
+                <w:rFonts w:ascii="Arial" w:hAnsi="Arial" w:cs="Arial"/>
+                <w:sz w:val="18"/>
+                <w:szCs w:val="18"/>
+              </w:rPr>
+              <w:fldChar w:fldCharType="separate"/>
+            </w:r>
+            <w:r>
+              <w:rPr>
+                <w:rFonts w:ascii="Arial" w:hAnsi="Arial" w:cs="Arial"/>
+                <w:noProof/>
+                <w:sz w:val="18"/>
+                <w:szCs w:val="18"/>
+              </w:rPr>
+              <w:t>«s.components:endEach»</w:t>
+            </w:r>
+            <w:r>
+              <w:rPr>
+                <w:rFonts w:ascii="Arial" w:hAnsi="Arial" w:cs="Arial"/>
+                <w:sz w:val="18"/>
+                <w:szCs w:val="18"/>
+              </w:rPr>
+              <w:fldChar w:fldCharType="end"/>
+            </w:r>
+          </w:p>
+        </w:tc>
+      </w:tr>
+      <w:tr>
+        <w:trPr>
+          <w:trHeight w:val="255"/>
+        </w:trPr>
+        <w:tc>
+          <w:tcPr>
+            <w:tcW w:w="10398" w:type="dxa"/>
+            <w:gridSpan w:val="14"/>
+          </w:tcPr>
+          <w:p>
+            <w:pPr>
+              <w:rPr>
+                <w:rFonts w:ascii="Arial" w:hAnsi="Arial" w:cs="Arial"/>
+                <w:sz w:val="18"/>
+                <w:szCs w:val="18"/>
+              </w:rPr>
+            </w:pPr>
+            <w:r>
+              <w:rPr>
+                <w:rFonts w:ascii="Arial" w:hAnsi="Arial" w:cs="Arial"/>
+                <w:sz w:val="18"/>
+                <w:szCs w:val="18"/>
+              </w:rPr>
+              <w:fldChar w:fldCharType="begin"/>
+            </w:r>
+            <w:r>
+              <w:rPr>
+                <w:rFonts w:ascii="Arial" w:hAnsi="Arial" w:cs="Arial"/>
+                <w:sz w:val="18"/>
+                <w:szCs w:val="18"/>
+              </w:rPr>
+              <w:instrText xml:space="preserve"> MERGEFIELD  s.components:endIf  \* MERGEFORMAT </w:instrText>
+            </w:r>
+            <w:r>
+              <w:rPr>
+                <w:rFonts w:ascii="Arial" w:hAnsi="Arial" w:cs="Arial"/>
+                <w:sz w:val="18"/>
+                <w:szCs w:val="18"/>
+              </w:rPr>
+              <w:fldChar w:fldCharType="separate"/>
+            </w:r>
+            <w:r>
+              <w:rPr>
+                <w:rFonts w:ascii="Arial" w:hAnsi="Arial" w:cs="Arial"/>
+                <w:noProof/>
+                <w:sz w:val="18"/>
+                <w:szCs w:val="18"/>
+              </w:rPr>
+              <w:t>«s.components:endIf»</w:t>
+            </w:r>
+            <w:r>
+              <w:rPr>
+                <w:rFonts w:ascii="Arial" w:hAnsi="Arial" w:cs="Arial"/>
                 <w:sz w:val="18"/>
                 <w:szCs w:val="18"/>
               </w:rPr>
@@ -2307,6 +3134,7 @@
           <w:sz w:val="18"/>
           <w:szCs w:val="18"/>
         </w:rPr>
+        <w:lastRenderedPageBreak/>
         <w:fldChar w:fldCharType="begin"/>
       </w:r>
       <w:r>
@@ -2540,8 +3368,9 @@
     </w:p>
     <w:tbl>
       <w:tblPr>
-        <w:tblStyle w:val="Tabellenraster"/>
-        <w:tblW w:w="0" w:type="auto"/>
+        <w:tblStyle w:val="TableGrid"/>
+        <w:tblW w:w="10506" w:type="dxa"/>
+        <w:tblInd w:w="-108" w:type="dxa"/>
         <w:tblBorders>
           <w:top w:val="none" w:sz="0" w:space="0" w:color="auto"/>
           <w:left w:val="none" w:sz="0" w:space="0" w:color="auto"/>
@@ -2554,17 +3383,27 @@
         <w:tblLook w:val="04A0" w:firstRow="1" w:lastRow="0" w:firstColumn="1" w:lastColumn="0" w:noHBand="0" w:noVBand="1"/>
       </w:tblPr>
       <w:tblGrid>
-        <w:gridCol w:w="346"/>
-        <w:gridCol w:w="1524"/>
+        <w:gridCol w:w="107"/>
+        <w:gridCol w:w="345"/>
+        <w:gridCol w:w="1460"/>
+        <w:gridCol w:w="63"/>
         <w:gridCol w:w="1191"/>
+        <w:gridCol w:w="553"/>
+        <w:gridCol w:w="581"/>
+        <w:gridCol w:w="1216"/>
+        <w:gridCol w:w="11"/>
+        <w:gridCol w:w="1350"/>
+        <w:gridCol w:w="457"/>
+        <w:gridCol w:w="677"/>
         <w:gridCol w:w="1134"/>
-        <w:gridCol w:w="1216"/>
         <w:gridCol w:w="1361"/>
-        <w:gridCol w:w="1134"/>
-        <w:gridCol w:w="1134"/>
       </w:tblGrid>
       <w:tr>
         <w:trPr>
+          <w:gridBefore w:val="1"/>
+          <w:gridAfter w:val="1"/>
+          <w:wBefore w:w="108" w:type="dxa"/>
+          <w:wAfter w:w="1358" w:type="dxa"/>
           <w:trHeight w:val="255"/>
         </w:trPr>
         <w:tc>
@@ -2596,6 +3435,7 @@
         <w:tc>
           <w:tcPr>
             <w:tcW w:w="1524" w:type="dxa"/>
+            <w:gridSpan w:val="2"/>
           </w:tcPr>
           <w:p>
             <w:pPr>
@@ -2749,6 +3589,7 @@
         <w:tc>
           <w:tcPr>
             <w:tcW w:w="1134" w:type="dxa"/>
+            <w:gridSpan w:val="2"/>
           </w:tcPr>
           <w:p>
             <w:pPr>
@@ -3017,6 +3858,7 @@
         <w:tc>
           <w:tcPr>
             <w:tcW w:w="1361" w:type="dxa"/>
+            <w:gridSpan w:val="2"/>
           </w:tcPr>
           <w:p>
             <w:pPr>
@@ -3071,6 +3913,130 @@
                 <w:szCs w:val="18"/>
               </w:rPr>
               <w:t>«=r.density»</w:t>
+            </w:r>
+            <w:r>
+              <w:rPr>
+                <w:rFonts w:ascii="Arial" w:hAnsi="Arial" w:cs="Arial"/>
+                <w:noProof/>
+                <w:sz w:val="18"/>
+                <w:szCs w:val="18"/>
+              </w:rPr>
+              <w:fldChar w:fldCharType="end"/>
+            </w:r>
+          </w:p>
+        </w:tc>
+        <w:tc>
+          <w:tcPr>
+            <w:tcW w:w="1134" w:type="dxa"/>
+            <w:gridSpan w:val="2"/>
+          </w:tcPr>
+          <w:p>
+            <w:pPr>
+              <w:jc w:val="center"/>
+              <w:rPr>
+                <w:rFonts w:ascii="Arial" w:hAnsi="Arial" w:cs="Arial"/>
+                <w:noProof/>
+                <w:sz w:val="18"/>
+                <w:szCs w:val="18"/>
+              </w:rPr>
+            </w:pPr>
+            <w:r>
+              <w:rPr>
+                <w:rFonts w:ascii="Arial" w:hAnsi="Arial" w:cs="Arial"/>
+                <w:noProof/>
+                <w:sz w:val="18"/>
+                <w:szCs w:val="18"/>
+              </w:rPr>
+              <w:fldChar w:fldCharType="begin"/>
+            </w:r>
+            <w:r>
+              <w:rPr>
+                <w:rFonts w:ascii="Arial" w:hAnsi="Arial" w:cs="Arial"/>
+                <w:noProof/>
+                <w:sz w:val="18"/>
+                <w:szCs w:val="18"/>
+              </w:rPr>
+              <w:instrText xml:space="preserve"> MERGEFIELD =r.mol </w:instrText>
+            </w:r>
+            <w:r>
+              <w:rPr>
+                <w:rFonts w:ascii="Arial" w:hAnsi="Arial" w:cs="Arial"/>
+                <w:sz w:val="18"/>
+                <w:szCs w:val="18"/>
+              </w:rPr>
+              <w:instrText xml:space="preserve">\* MERGEFORMAT </w:instrText>
+            </w:r>
+            <w:r>
+              <w:rPr>
+                <w:rFonts w:ascii="Arial" w:hAnsi="Arial" w:cs="Arial"/>
+                <w:noProof/>
+                <w:sz w:val="18"/>
+                <w:szCs w:val="18"/>
+              </w:rPr>
+              <w:fldChar w:fldCharType="separate"/>
+            </w:r>
+            <w:r>
+              <w:rPr>
+                <w:rFonts w:ascii="Arial" w:hAnsi="Arial" w:cs="Arial"/>
+                <w:noProof/>
+                <w:sz w:val="18"/>
+                <w:szCs w:val="18"/>
+              </w:rPr>
+              <w:t>«=r.mol»</w:t>
+            </w:r>
+            <w:r>
+              <w:rPr>
+                <w:rFonts w:ascii="Arial" w:hAnsi="Arial" w:cs="Arial"/>
+                <w:noProof/>
+                <w:sz w:val="18"/>
+                <w:szCs w:val="18"/>
+              </w:rPr>
+              <w:fldChar w:fldCharType="end"/>
+            </w:r>
+            <w:r>
+              <w:rPr>
+                <w:rFonts w:ascii="Arial" w:hAnsi="Arial" w:cs="Arial"/>
+                <w:noProof/>
+                <w:sz w:val="18"/>
+                <w:szCs w:val="18"/>
+              </w:rPr>
+              <w:t xml:space="preserve"> </w:t>
+            </w:r>
+            <w:r>
+              <w:rPr>
+                <w:rFonts w:ascii="Arial" w:hAnsi="Arial" w:cs="Arial"/>
+                <w:noProof/>
+                <w:sz w:val="18"/>
+                <w:szCs w:val="18"/>
+              </w:rPr>
+              <w:fldChar w:fldCharType="begin"/>
+            </w:r>
+            <w:r>
+              <w:rPr>
+                <w:rFonts w:ascii="Arial" w:hAnsi="Arial" w:cs="Arial"/>
+                <w:noProof/>
+                <w:sz w:val="18"/>
+                <w:szCs w:val="18"/>
+              </w:rPr>
+              <w:instrText xml:space="preserve"> MERGEFIELD  =r.mmol_unit  \* MERGEFORMAT </w:instrText>
+            </w:r>
+            <w:r>
+              <w:rPr>
+                <w:rFonts w:ascii="Arial" w:hAnsi="Arial" w:cs="Arial"/>
+                <w:noProof/>
+                <w:sz w:val="18"/>
+                <w:szCs w:val="18"/>
+              </w:rPr>
+              <w:fldChar w:fldCharType="separate"/>
+            </w:r>
+            <w:r>
+              <w:rPr>
+                <w:rFonts w:ascii="Arial" w:hAnsi="Arial" w:cs="Arial"/>
+                <w:noProof/>
+                <w:sz w:val="18"/>
+                <w:szCs w:val="18"/>
+              </w:rPr>
+              <w:t>«=r.mmol_unit»</w:t>
             </w:r>
             <w:r>
               <w:rPr>
@@ -3113,7 +4079,7 @@
                 <w:sz w:val="18"/>
                 <w:szCs w:val="18"/>
               </w:rPr>
-              <w:instrText xml:space="preserve"> MERGEFIELD =r.mol </w:instrText>
+              <w:instrText xml:space="preserve"> MERGEFIELD =r.equiv </w:instrText>
             </w:r>
             <w:r>
               <w:rPr>
@@ -3139,7 +4105,7 @@
                 <w:sz w:val="18"/>
                 <w:szCs w:val="18"/>
               </w:rPr>
-              <w:t>«=r.mol»</w:t>
+              <w:t>«=r.equiv»</w:t>
             </w:r>
             <w:r>
               <w:rPr>
@@ -3150,19 +4116,30 @@
               </w:rPr>
               <w:fldChar w:fldCharType="end"/>
             </w:r>
-            <w:r>
-              <w:rPr>
-                <w:rFonts w:ascii="Arial" w:hAnsi="Arial" w:cs="Arial"/>
-                <w:noProof/>
-                <w:sz w:val="18"/>
-                <w:szCs w:val="18"/>
-              </w:rPr>
-              <w:t xml:space="preserve"> </w:t>
-            </w:r>
-            <w:r>
-              <w:rPr>
-                <w:rFonts w:ascii="Arial" w:hAnsi="Arial" w:cs="Arial"/>
-                <w:noProof/>
+          </w:p>
+        </w:tc>
+      </w:tr>
+      <w:tr>
+        <w:trPr>
+          <w:trHeight w:val="255"/>
+        </w:trPr>
+        <w:tc>
+          <w:tcPr>
+            <w:tcW w:w="10506" w:type="dxa"/>
+            <w:gridSpan w:val="14"/>
+          </w:tcPr>
+          <w:p>
+            <w:pPr>
+              <w:rPr>
+                <w:rFonts w:ascii="Arial" w:hAnsi="Arial" w:cs="Arial"/>
+                <w:noProof/>
+                <w:sz w:val="18"/>
+                <w:szCs w:val="18"/>
+              </w:rPr>
+            </w:pPr>
+            <w:r>
+              <w:rPr>
+                <w:rFonts w:ascii="Arial" w:hAnsi="Arial" w:cs="Arial"/>
                 <w:sz w:val="18"/>
                 <w:szCs w:val="18"/>
               </w:rPr>
@@ -3171,16 +4148,14 @@
             <w:r>
               <w:rPr>
                 <w:rFonts w:ascii="Arial" w:hAnsi="Arial" w:cs="Arial"/>
-                <w:noProof/>
-                <w:sz w:val="18"/>
-                <w:szCs w:val="18"/>
-              </w:rPr>
-              <w:instrText xml:space="preserve"> MERGEFIELD  =r.mmol_unit  \* MERGEFORMAT </w:instrText>
-            </w:r>
-            <w:r>
-              <w:rPr>
-                <w:rFonts w:ascii="Arial" w:hAnsi="Arial" w:cs="Arial"/>
-                <w:noProof/>
+                <w:sz w:val="18"/>
+                <w:szCs w:val="18"/>
+              </w:rPr>
+              <w:instrText xml:space="preserve"> MERGEFIELD  r.components:if  \* MERGEFORMAT </w:instrText>
+            </w:r>
+            <w:r>
+              <w:rPr>
+                <w:rFonts w:ascii="Arial" w:hAnsi="Arial" w:cs="Arial"/>
                 <w:sz w:val="18"/>
                 <w:szCs w:val="18"/>
               </w:rPr>
@@ -3193,29 +4168,65 @@
                 <w:sz w:val="18"/>
                 <w:szCs w:val="18"/>
               </w:rPr>
-              <w:t>«=r.mmol_unit»</w:t>
-            </w:r>
-            <w:r>
-              <w:rPr>
-                <w:rFonts w:ascii="Arial" w:hAnsi="Arial" w:cs="Arial"/>
-                <w:noProof/>
+              <w:t>«r.components:if»</w:t>
+            </w:r>
+            <w:r>
+              <w:rPr>
+                <w:rFonts w:ascii="Arial" w:hAnsi="Arial" w:cs="Arial"/>
                 <w:sz w:val="18"/>
                 <w:szCs w:val="18"/>
               </w:rPr>
               <w:fldChar w:fldCharType="end"/>
+            </w:r>
+          </w:p>
+        </w:tc>
+      </w:tr>
+      <w:tr>
+        <w:trPr>
+          <w:gridAfter w:val="1"/>
+          <w:wAfter w:w="1361" w:type="dxa"/>
+          <w:trHeight w:val="255"/>
+        </w:trPr>
+        <w:tc>
+          <w:tcPr>
+            <w:tcW w:w="1915" w:type="dxa"/>
+            <w:gridSpan w:val="3"/>
+          </w:tcPr>
+          <w:p>
+            <w:pPr>
+              <w:jc w:val="center"/>
+              <w:rPr>
+                <w:rFonts w:ascii="Arial" w:hAnsi="Arial" w:cs="Arial"/>
+                <w:b/>
+                <w:bCs/>
+                <w:sz w:val="18"/>
+                <w:szCs w:val="18"/>
+              </w:rPr>
+            </w:pPr>
+            <w:r>
+              <w:rPr>
+                <w:rFonts w:ascii="Arial" w:hAnsi="Arial" w:cs="Arial"/>
+                <w:b/>
+                <w:bCs/>
+                <w:sz w:val="18"/>
+                <w:szCs w:val="18"/>
+              </w:rPr>
+              <w:t>Component</w:t>
             </w:r>
           </w:p>
         </w:tc>
         <w:tc>
           <w:tcPr>
-            <w:tcW w:w="1134" w:type="dxa"/>
+            <w:tcW w:w="1807" w:type="dxa"/>
+            <w:gridSpan w:val="3"/>
           </w:tcPr>
           <w:p>
             <w:pPr>
               <w:jc w:val="center"/>
               <w:rPr>
                 <w:rFonts w:ascii="Arial" w:hAnsi="Arial" w:cs="Arial"/>
-                <w:noProof/>
+                <w:b/>
+                <w:bCs/>
                 <w:sz w:val="18"/>
                 <w:szCs w:val="18"/>
               </w:rPr>
@@ -3223,7 +4234,120 @@
             <w:r>
               <w:rPr>
                 <w:rFonts w:ascii="Arial" w:hAnsi="Arial" w:cs="Arial"/>
-                <w:noProof/>
+                <w:b/>
+                <w:bCs/>
+                <w:sz w:val="18"/>
+                <w:szCs w:val="18"/>
+              </w:rPr>
+              <w:t>Amount</w:t>
+            </w:r>
+          </w:p>
+        </w:tc>
+        <w:tc>
+          <w:tcPr>
+            <w:tcW w:w="1808" w:type="dxa"/>
+            <w:gridSpan w:val="3"/>
+          </w:tcPr>
+          <w:p>
+            <w:pPr>
+              <w:jc w:val="center"/>
+              <w:rPr>
+                <w:rFonts w:ascii="Arial" w:hAnsi="Arial" w:cs="Arial"/>
+                <w:b/>
+                <w:bCs/>
+                <w:sz w:val="18"/>
+                <w:szCs w:val="18"/>
+              </w:rPr>
+            </w:pPr>
+            <w:r>
+              <w:rPr>
+                <w:rFonts w:ascii="Arial" w:hAnsi="Arial" w:cs="Arial"/>
+                <w:b/>
+                <w:bCs/>
+                <w:sz w:val="18"/>
+                <w:szCs w:val="18"/>
+              </w:rPr>
+              <w:t>Rel. MW [g/mol]</w:t>
+            </w:r>
+          </w:p>
+        </w:tc>
+        <w:tc>
+          <w:tcPr>
+            <w:tcW w:w="1807" w:type="dxa"/>
+            <w:gridSpan w:val="2"/>
+          </w:tcPr>
+          <w:p>
+            <w:pPr>
+              <w:jc w:val="center"/>
+              <w:rPr>
+                <w:rFonts w:ascii="Arial" w:hAnsi="Arial" w:cs="Arial"/>
+                <w:b/>
+                <w:bCs/>
+                <w:sz w:val="18"/>
+                <w:szCs w:val="18"/>
+              </w:rPr>
+            </w:pPr>
+            <w:r>
+              <w:rPr>
+                <w:rFonts w:ascii="Arial" w:hAnsi="Arial" w:cs="Arial"/>
+                <w:b/>
+                <w:bCs/>
+                <w:sz w:val="18"/>
+                <w:szCs w:val="18"/>
+              </w:rPr>
+              <w:t>Conc</w:t>
+            </w:r>
+          </w:p>
+        </w:tc>
+        <w:tc>
+          <w:tcPr>
+            <w:tcW w:w="1808" w:type="dxa"/>
+            <w:gridSpan w:val="2"/>
+          </w:tcPr>
+          <w:p>
+            <w:pPr>
+              <w:jc w:val="center"/>
+              <w:rPr>
+                <w:rFonts w:ascii="Arial" w:hAnsi="Arial" w:cs="Arial"/>
+                <w:b/>
+                <w:bCs/>
+                <w:sz w:val="18"/>
+                <w:szCs w:val="18"/>
+              </w:rPr>
+            </w:pPr>
+            <w:r>
+              <w:rPr>
+                <w:rFonts w:ascii="Arial" w:hAnsi="Arial" w:cs="Arial"/>
+                <w:b/>
+                <w:bCs/>
+                <w:sz w:val="18"/>
+                <w:szCs w:val="18"/>
+              </w:rPr>
+              <w:t>Ratio</w:t>
+            </w:r>
+          </w:p>
+        </w:tc>
+      </w:tr>
+      <w:tr>
+        <w:trPr>
+          <w:trHeight w:val="255"/>
+        </w:trPr>
+        <w:tc>
+          <w:tcPr>
+            <w:tcW w:w="10506" w:type="dxa"/>
+            <w:gridSpan w:val="14"/>
+          </w:tcPr>
+          <w:p>
+            <w:pPr>
+              <w:rPr>
+                <w:rFonts w:ascii="Arial" w:hAnsi="Arial" w:cs="Arial"/>
+                <w:sz w:val="18"/>
+                <w:szCs w:val="18"/>
+              </w:rPr>
+            </w:pPr>
+            <w:r>
+              <w:rPr>
+                <w:rFonts w:ascii="Arial" w:hAnsi="Arial" w:cs="Arial"/>
                 <w:sz w:val="18"/>
                 <w:szCs w:val="18"/>
               </w:rPr>
@@ -3232,24 +4356,14 @@
             <w:r>
               <w:rPr>
                 <w:rFonts w:ascii="Arial" w:hAnsi="Arial" w:cs="Arial"/>
-                <w:noProof/>
-                <w:sz w:val="18"/>
-                <w:szCs w:val="18"/>
-              </w:rPr>
-              <w:instrText xml:space="preserve"> MERGEFIELD =r.equiv </w:instrText>
-            </w:r>
-            <w:r>
-              <w:rPr>
-                <w:rFonts w:ascii="Arial" w:hAnsi="Arial" w:cs="Arial"/>
-                <w:sz w:val="18"/>
-                <w:szCs w:val="18"/>
-              </w:rPr>
-              <w:instrText xml:space="preserve">\* MERGEFORMAT </w:instrText>
-            </w:r>
-            <w:r>
-              <w:rPr>
-                <w:rFonts w:ascii="Arial" w:hAnsi="Arial" w:cs="Arial"/>
-                <w:noProof/>
+                <w:sz w:val="18"/>
+                <w:szCs w:val="18"/>
+              </w:rPr>
+              <w:instrText xml:space="preserve"> MERGEFIELD  r.components:each(comp)  \* MERGEFORMAT </w:instrText>
+            </w:r>
+            <w:r>
+              <w:rPr>
+                <w:rFonts w:ascii="Arial" w:hAnsi="Arial" w:cs="Arial"/>
                 <w:sz w:val="18"/>
                 <w:szCs w:val="18"/>
               </w:rPr>
@@ -3262,12 +4376,531 @@
                 <w:sz w:val="18"/>
                 <w:szCs w:val="18"/>
               </w:rPr>
-              <w:t>«=r.equiv»</w:t>
-            </w:r>
-            <w:r>
-              <w:rPr>
-                <w:rFonts w:ascii="Arial" w:hAnsi="Arial" w:cs="Arial"/>
-                <w:noProof/>
+              <w:t>«r.components:each(comp)»</w:t>
+            </w:r>
+            <w:r>
+              <w:rPr>
+                <w:rFonts w:ascii="Arial" w:hAnsi="Arial" w:cs="Arial"/>
+                <w:sz w:val="18"/>
+                <w:szCs w:val="18"/>
+              </w:rPr>
+              <w:fldChar w:fldCharType="end"/>
+            </w:r>
+          </w:p>
+        </w:tc>
+      </w:tr>
+      <w:tr>
+        <w:trPr>
+          <w:gridAfter w:val="1"/>
+          <w:wAfter w:w="1361" w:type="dxa"/>
+          <w:trHeight w:val="255"/>
+        </w:trPr>
+        <w:tc>
+          <w:tcPr>
+            <w:tcW w:w="1915" w:type="dxa"/>
+            <w:gridSpan w:val="3"/>
+          </w:tcPr>
+          <w:p>
+            <w:pPr>
+              <w:rPr>
+                <w:rFonts w:ascii="Arial" w:hAnsi="Arial" w:cs="Arial"/>
+                <w:sz w:val="18"/>
+                <w:szCs w:val="18"/>
+              </w:rPr>
+            </w:pPr>
+            <w:r>
+              <w:rPr>
+                <w:rFonts w:ascii="Arial" w:hAnsi="Arial" w:cs="Arial"/>
+                <w:noProof/>
+                <w:color w:val="000000"/>
+                <w:sz w:val="18"/>
+                <w:szCs w:val="18"/>
+              </w:rPr>
+              <w:fldChar w:fldCharType="begin"/>
+            </w:r>
+            <w:r>
+              <w:rPr>
+                <w:rFonts w:ascii="Arial" w:hAnsi="Arial" w:cs="Arial"/>
+                <w:noProof/>
+                <w:color w:val="000000"/>
+                <w:sz w:val="18"/>
+                <w:szCs w:val="18"/>
+              </w:rPr>
+              <w:instrText xml:space="preserve"> MERGEFIELD  =comp.name  \* MERGEFORMAT </w:instrText>
+            </w:r>
+            <w:r>
+              <w:rPr>
+                <w:rFonts w:ascii="Arial" w:hAnsi="Arial" w:cs="Arial"/>
+                <w:noProof/>
+                <w:color w:val="000000"/>
+                <w:sz w:val="18"/>
+                <w:szCs w:val="18"/>
+              </w:rPr>
+              <w:fldChar w:fldCharType="separate"/>
+            </w:r>
+            <w:r>
+              <w:rPr>
+                <w:rFonts w:ascii="Arial" w:hAnsi="Arial" w:cs="Arial"/>
+                <w:noProof/>
+                <w:color w:val="000000"/>
+                <w:sz w:val="18"/>
+                <w:szCs w:val="18"/>
+              </w:rPr>
+              <w:t>«=comp.name»</w:t>
+            </w:r>
+            <w:r>
+              <w:rPr>
+                <w:rFonts w:ascii="Arial" w:hAnsi="Arial" w:cs="Arial"/>
+                <w:noProof/>
+                <w:color w:val="000000"/>
+                <w:sz w:val="18"/>
+                <w:szCs w:val="18"/>
+              </w:rPr>
+              <w:fldChar w:fldCharType="end"/>
+            </w:r>
+          </w:p>
+        </w:tc>
+        <w:tc>
+          <w:tcPr>
+            <w:tcW w:w="1807" w:type="dxa"/>
+            <w:gridSpan w:val="3"/>
+          </w:tcPr>
+          <w:p>
+            <w:pPr>
+              <w:jc w:val="center"/>
+              <w:rPr>
+                <w:rFonts w:ascii="Arial" w:hAnsi="Arial" w:cs="Arial"/>
+                <w:sz w:val="18"/>
+                <w:szCs w:val="18"/>
+              </w:rPr>
+            </w:pPr>
+            <w:r>
+              <w:rPr>
+                <w:rFonts w:ascii="Arial" w:hAnsi="Arial" w:cs="Arial"/>
+                <w:noProof/>
+                <w:color w:val="000000"/>
+                <w:sz w:val="18"/>
+                <w:szCs w:val="18"/>
+              </w:rPr>
+              <w:fldChar w:fldCharType="begin"/>
+            </w:r>
+            <w:r>
+              <w:rPr>
+                <w:rFonts w:ascii="Arial" w:hAnsi="Arial" w:cs="Arial"/>
+                <w:noProof/>
+                <w:color w:val="000000"/>
+                <w:sz w:val="18"/>
+                <w:szCs w:val="18"/>
+              </w:rPr>
+              <w:instrText xml:space="preserve"> MERGEFIELD  =comp.amount_mol  \* MERGEFORMAT </w:instrText>
+            </w:r>
+            <w:r>
+              <w:rPr>
+                <w:rFonts w:ascii="Arial" w:hAnsi="Arial" w:cs="Arial"/>
+                <w:noProof/>
+                <w:color w:val="000000"/>
+                <w:sz w:val="18"/>
+                <w:szCs w:val="18"/>
+              </w:rPr>
+              <w:fldChar w:fldCharType="separate"/>
+            </w:r>
+            <w:r>
+              <w:rPr>
+                <w:rFonts w:ascii="Arial" w:hAnsi="Arial" w:cs="Arial"/>
+                <w:noProof/>
+                <w:color w:val="000000"/>
+                <w:sz w:val="18"/>
+                <w:szCs w:val="18"/>
+              </w:rPr>
+              <w:t>«=comp.amount_mol»</w:t>
+            </w:r>
+            <w:r>
+              <w:rPr>
+                <w:rFonts w:ascii="Arial" w:hAnsi="Arial" w:cs="Arial"/>
+                <w:noProof/>
+                <w:color w:val="000000"/>
+                <w:sz w:val="18"/>
+                <w:szCs w:val="18"/>
+              </w:rPr>
+              <w:fldChar w:fldCharType="end"/>
+            </w:r>
+            <w:r>
+              <w:rPr>
+                <w:rFonts w:ascii="Arial" w:hAnsi="Arial" w:cs="Arial"/>
+                <w:noProof/>
+                <w:color w:val="000000"/>
+                <w:sz w:val="18"/>
+                <w:szCs w:val="18"/>
+              </w:rPr>
+              <w:t xml:space="preserve"> </w:t>
+            </w:r>
+            <w:r>
+              <w:rPr>
+                <w:rFonts w:ascii="Arial" w:hAnsi="Arial" w:cs="Arial"/>
+                <w:noProof/>
+                <w:color w:val="000000"/>
+                <w:sz w:val="18"/>
+                <w:szCs w:val="18"/>
+              </w:rPr>
+              <w:fldChar w:fldCharType="begin"/>
+            </w:r>
+            <w:r>
+              <w:rPr>
+                <w:rFonts w:ascii="Arial" w:hAnsi="Arial" w:cs="Arial"/>
+                <w:noProof/>
+                <w:color w:val="000000"/>
+                <w:sz w:val="18"/>
+                <w:szCs w:val="18"/>
+              </w:rPr>
+              <w:instrText xml:space="preserve"> MERGEFIELD  =comp.amount_mol_unit  \* MERGEFORMAT </w:instrText>
+            </w:r>
+            <w:r>
+              <w:rPr>
+                <w:rFonts w:ascii="Arial" w:hAnsi="Arial" w:cs="Arial"/>
+                <w:noProof/>
+                <w:color w:val="000000"/>
+                <w:sz w:val="18"/>
+                <w:szCs w:val="18"/>
+              </w:rPr>
+              <w:fldChar w:fldCharType="separate"/>
+            </w:r>
+            <w:r>
+              <w:rPr>
+                <w:rFonts w:ascii="Arial" w:hAnsi="Arial" w:cs="Arial"/>
+                <w:noProof/>
+                <w:color w:val="000000"/>
+                <w:sz w:val="18"/>
+                <w:szCs w:val="18"/>
+              </w:rPr>
+              <w:t>«=comp.amount_mol_unit»</w:t>
+            </w:r>
+            <w:r>
+              <w:rPr>
+                <w:rFonts w:ascii="Arial" w:hAnsi="Arial" w:cs="Arial"/>
+                <w:noProof/>
+                <w:color w:val="000000"/>
+                <w:sz w:val="18"/>
+                <w:szCs w:val="18"/>
+              </w:rPr>
+              <w:fldChar w:fldCharType="end"/>
+            </w:r>
+          </w:p>
+        </w:tc>
+        <w:tc>
+          <w:tcPr>
+            <w:tcW w:w="1808" w:type="dxa"/>
+            <w:gridSpan w:val="3"/>
+          </w:tcPr>
+          <w:p>
+            <w:pPr>
+              <w:jc w:val="center"/>
+              <w:rPr>
+                <w:rFonts w:ascii="Arial" w:hAnsi="Arial" w:cs="Arial"/>
+                <w:sz w:val="18"/>
+                <w:szCs w:val="18"/>
+              </w:rPr>
+            </w:pPr>
+            <w:r>
+              <w:rPr>
+                <w:rFonts w:ascii="Arial" w:hAnsi="Arial" w:cs="Arial"/>
+                <w:noProof/>
+                <w:color w:val="000000"/>
+                <w:sz w:val="18"/>
+                <w:szCs w:val="18"/>
+              </w:rPr>
+              <w:fldChar w:fldCharType="begin"/>
+            </w:r>
+            <w:r>
+              <w:rPr>
+                <w:rFonts w:ascii="Arial" w:hAnsi="Arial" w:cs="Arial"/>
+                <w:noProof/>
+                <w:color w:val="000000"/>
+                <w:sz w:val="18"/>
+                <w:szCs w:val="18"/>
+              </w:rPr>
+              <w:instrText xml:space="preserve"> MERGEFIELD  =comp.relative_molecular_weight  \* MERGEFORMAT </w:instrText>
+            </w:r>
+            <w:r>
+              <w:rPr>
+                <w:rFonts w:ascii="Arial" w:hAnsi="Arial" w:cs="Arial"/>
+                <w:noProof/>
+                <w:color w:val="000000"/>
+                <w:sz w:val="18"/>
+                <w:szCs w:val="18"/>
+              </w:rPr>
+              <w:fldChar w:fldCharType="separate"/>
+            </w:r>
+            <w:r>
+              <w:rPr>
+                <w:rFonts w:ascii="Arial" w:hAnsi="Arial" w:cs="Arial"/>
+                <w:noProof/>
+                <w:color w:val="000000"/>
+                <w:sz w:val="18"/>
+                <w:szCs w:val="18"/>
+              </w:rPr>
+              <w:t>«=comp.relative_molecular_weight»</w:t>
+            </w:r>
+            <w:r>
+              <w:rPr>
+                <w:rFonts w:ascii="Arial" w:hAnsi="Arial" w:cs="Arial"/>
+                <w:noProof/>
+                <w:color w:val="000000"/>
+                <w:sz w:val="18"/>
+                <w:szCs w:val="18"/>
+              </w:rPr>
+              <w:fldChar w:fldCharType="end"/>
+            </w:r>
+          </w:p>
+        </w:tc>
+        <w:tc>
+          <w:tcPr>
+            <w:tcW w:w="1807" w:type="dxa"/>
+            <w:gridSpan w:val="2"/>
+          </w:tcPr>
+          <w:p>
+            <w:pPr>
+              <w:jc w:val="center"/>
+              <w:rPr>
+                <w:rFonts w:ascii="Arial" w:hAnsi="Arial" w:cs="Arial"/>
+                <w:sz w:val="18"/>
+                <w:szCs w:val="18"/>
+              </w:rPr>
+            </w:pPr>
+            <w:r>
+              <w:rPr>
+                <w:rFonts w:ascii="Arial" w:hAnsi="Arial" w:cs="Arial"/>
+                <w:noProof/>
+                <w:color w:val="000000"/>
+                <w:sz w:val="18"/>
+                <w:szCs w:val="18"/>
+              </w:rPr>
+              <w:fldChar w:fldCharType="begin"/>
+            </w:r>
+            <w:r>
+              <w:rPr>
+                <w:rFonts w:ascii="Arial" w:hAnsi="Arial" w:cs="Arial"/>
+                <w:noProof/>
+                <w:color w:val="000000"/>
+                <w:sz w:val="18"/>
+                <w:szCs w:val="18"/>
+              </w:rPr>
+              <w:instrText xml:space="preserve"> MERGEFIELD  =comp.concn  \* MERGEFORMAT </w:instrText>
+            </w:r>
+            <w:r>
+              <w:rPr>
+                <w:rFonts w:ascii="Arial" w:hAnsi="Arial" w:cs="Arial"/>
+                <w:noProof/>
+                <w:color w:val="000000"/>
+                <w:sz w:val="18"/>
+                <w:szCs w:val="18"/>
+              </w:rPr>
+              <w:fldChar w:fldCharType="separate"/>
+            </w:r>
+            <w:r>
+              <w:rPr>
+                <w:rFonts w:ascii="Arial" w:hAnsi="Arial" w:cs="Arial"/>
+                <w:noProof/>
+                <w:color w:val="000000"/>
+                <w:sz w:val="18"/>
+                <w:szCs w:val="18"/>
+              </w:rPr>
+              <w:t>«=comp.concn»</w:t>
+            </w:r>
+            <w:r>
+              <w:rPr>
+                <w:rFonts w:ascii="Arial" w:hAnsi="Arial" w:cs="Arial"/>
+                <w:noProof/>
+                <w:color w:val="000000"/>
+                <w:sz w:val="18"/>
+                <w:szCs w:val="18"/>
+              </w:rPr>
+              <w:fldChar w:fldCharType="end"/>
+            </w:r>
+          </w:p>
+        </w:tc>
+        <w:tc>
+          <w:tcPr>
+            <w:tcW w:w="1808" w:type="dxa"/>
+            <w:gridSpan w:val="2"/>
+          </w:tcPr>
+          <w:p>
+            <w:pPr>
+              <w:jc w:val="center"/>
+              <w:rPr>
+                <w:rFonts w:ascii="Arial" w:hAnsi="Arial" w:cs="Arial"/>
+                <w:sz w:val="18"/>
+                <w:szCs w:val="18"/>
+              </w:rPr>
+            </w:pPr>
+            <w:r>
+              <w:rPr>
+                <w:rFonts w:ascii="Arial" w:hAnsi="Arial" w:cs="Arial"/>
+                <w:noProof/>
+                <w:color w:val="000000"/>
+                <w:sz w:val="18"/>
+                <w:szCs w:val="18"/>
+              </w:rPr>
+              <w:fldChar w:fldCharType="begin"/>
+            </w:r>
+            <w:r>
+              <w:rPr>
+                <w:rFonts w:ascii="Arial" w:hAnsi="Arial" w:cs="Arial"/>
+                <w:noProof/>
+                <w:color w:val="000000"/>
+                <w:sz w:val="18"/>
+                <w:szCs w:val="18"/>
+              </w:rPr>
+              <w:instrText xml:space="preserve"> MERGEFIELD  =comp.equivalent  \* MERGEFORMAT </w:instrText>
+            </w:r>
+            <w:r>
+              <w:rPr>
+                <w:rFonts w:ascii="Arial" w:hAnsi="Arial" w:cs="Arial"/>
+                <w:noProof/>
+                <w:color w:val="000000"/>
+                <w:sz w:val="18"/>
+                <w:szCs w:val="18"/>
+              </w:rPr>
+              <w:fldChar w:fldCharType="separate"/>
+            </w:r>
+            <w:r>
+              <w:rPr>
+                <w:rFonts w:ascii="Arial" w:hAnsi="Arial" w:cs="Arial"/>
+                <w:noProof/>
+                <w:color w:val="000000"/>
+                <w:sz w:val="18"/>
+                <w:szCs w:val="18"/>
+              </w:rPr>
+              <w:t>«=comp.equivalent»</w:t>
+            </w:r>
+            <w:r>
+              <w:rPr>
+                <w:rFonts w:ascii="Arial" w:hAnsi="Arial" w:cs="Arial"/>
+                <w:noProof/>
+                <w:color w:val="000000"/>
+                <w:sz w:val="18"/>
+                <w:szCs w:val="18"/>
+              </w:rPr>
+              <w:fldChar w:fldCharType="end"/>
+            </w:r>
+          </w:p>
+        </w:tc>
+      </w:tr>
+      <w:tr>
+        <w:trPr>
+          <w:trHeight w:val="255"/>
+        </w:trPr>
+        <w:tc>
+          <w:tcPr>
+            <w:tcW w:w="10506" w:type="dxa"/>
+            <w:gridSpan w:val="14"/>
+          </w:tcPr>
+          <w:p>
+            <w:pPr>
+              <w:rPr>
+                <w:rFonts w:ascii="Arial" w:hAnsi="Arial" w:cs="Arial"/>
+                <w:noProof/>
+                <w:color w:val="000000"/>
+                <w:sz w:val="18"/>
+                <w:szCs w:val="18"/>
+              </w:rPr>
+            </w:pPr>
+            <w:r>
+              <w:rPr>
+                <w:rFonts w:ascii="Arial" w:hAnsi="Arial" w:cs="Arial"/>
+                <w:sz w:val="18"/>
+                <w:szCs w:val="18"/>
+              </w:rPr>
+              <w:fldChar w:fldCharType="begin"/>
+            </w:r>
+            <w:r>
+              <w:rPr>
+                <w:rFonts w:ascii="Arial" w:hAnsi="Arial" w:cs="Arial"/>
+                <w:sz w:val="18"/>
+                <w:szCs w:val="18"/>
+              </w:rPr>
+              <w:instrText xml:space="preserve"> MERGEFIELD  r.components:endEach  \* MERGEFORMAT </w:instrText>
+            </w:r>
+            <w:r>
+              <w:rPr>
+                <w:rFonts w:ascii="Arial" w:hAnsi="Arial" w:cs="Arial"/>
+                <w:sz w:val="18"/>
+                <w:szCs w:val="18"/>
+              </w:rPr>
+              <w:fldChar w:fldCharType="separate"/>
+            </w:r>
+            <w:r>
+              <w:rPr>
+                <w:rFonts w:ascii="Arial" w:hAnsi="Arial" w:cs="Arial"/>
+                <w:noProof/>
+                <w:sz w:val="18"/>
+                <w:szCs w:val="18"/>
+              </w:rPr>
+              <w:t>«r.components:endEach»</w:t>
+            </w:r>
+            <w:r>
+              <w:rPr>
+                <w:rFonts w:ascii="Arial" w:hAnsi="Arial" w:cs="Arial"/>
+                <w:sz w:val="18"/>
+                <w:szCs w:val="18"/>
+              </w:rPr>
+              <w:fldChar w:fldCharType="end"/>
+            </w:r>
+          </w:p>
+        </w:tc>
+      </w:tr>
+      <w:tr>
+        <w:trPr>
+          <w:trHeight w:val="255"/>
+        </w:trPr>
+        <w:tc>
+          <w:tcPr>
+            <w:tcW w:w="10506" w:type="dxa"/>
+            <w:gridSpan w:val="14"/>
+          </w:tcPr>
+          <w:p>
+            <w:pPr>
+              <w:rPr>
+                <w:rFonts w:ascii="Arial" w:hAnsi="Arial" w:cs="Arial"/>
+                <w:sz w:val="18"/>
+                <w:szCs w:val="18"/>
+              </w:rPr>
+            </w:pPr>
+            <w:r>
+              <w:rPr>
+                <w:rFonts w:ascii="Arial" w:hAnsi="Arial" w:cs="Arial"/>
+                <w:sz w:val="18"/>
+                <w:szCs w:val="18"/>
+              </w:rPr>
+              <w:fldChar w:fldCharType="begin"/>
+            </w:r>
+            <w:r>
+              <w:rPr>
+                <w:rFonts w:ascii="Arial" w:hAnsi="Arial" w:cs="Arial"/>
+                <w:sz w:val="18"/>
+                <w:szCs w:val="18"/>
+              </w:rPr>
+              <w:instrText xml:space="preserve"> MERGEFIELD  r.components:endIf  \* MERGEFORMAT </w:instrText>
+            </w:r>
+            <w:r>
+              <w:rPr>
+                <w:rFonts w:ascii="Arial" w:hAnsi="Arial" w:cs="Arial"/>
+                <w:sz w:val="18"/>
+                <w:szCs w:val="18"/>
+              </w:rPr>
+              <w:fldChar w:fldCharType="separate"/>
+            </w:r>
+            <w:r>
+              <w:rPr>
+                <w:rFonts w:ascii="Arial" w:hAnsi="Arial" w:cs="Arial"/>
+                <w:noProof/>
+                <w:sz w:val="18"/>
+                <w:szCs w:val="18"/>
+              </w:rPr>
+              <w:t>«r.components:endIf»</w:t>
+            </w:r>
+            <w:r>
+              <w:rPr>
+                <w:rFonts w:ascii="Arial" w:hAnsi="Arial" w:cs="Arial"/>
                 <w:sz w:val="18"/>
                 <w:szCs w:val="18"/>
               </w:rPr>
@@ -3281,6 +4914,15 @@
       <w:pPr>
         <w:rPr>
           <w:rFonts w:ascii="Arial" w:hAnsi="Arial" w:cs="Arial"/>
+          <w:sz w:val="18"/>
+          <w:szCs w:val="18"/>
+        </w:rPr>
+      </w:pPr>
+    </w:p>
+    <w:p>
+      <w:pPr>
+        <w:rPr>
+          <w:rFonts w:ascii="Arial" w:hAnsi="Arial" w:cs="Arial"/>
           <w:noProof/>
           <w:sz w:val="18"/>
           <w:szCs w:val="18"/>
@@ -3520,8 +5162,9 @@
     </w:p>
     <w:tbl>
       <w:tblPr>
-        <w:tblStyle w:val="Tabellenraster"/>
-        <w:tblW w:w="0" w:type="auto"/>
+        <w:tblStyle w:val="TableGrid"/>
+        <w:tblW w:w="10506" w:type="dxa"/>
+        <w:tblInd w:w="-108" w:type="dxa"/>
         <w:tblBorders>
           <w:top w:val="none" w:sz="0" w:space="0" w:color="auto"/>
           <w:left w:val="none" w:sz="0" w:space="0" w:color="auto"/>
@@ -3534,17 +5177,28 @@
         <w:tblLook w:val="04A0" w:firstRow="1" w:lastRow="0" w:firstColumn="1" w:lastColumn="0" w:noHBand="0" w:noVBand="1"/>
       </w:tblPr>
       <w:tblGrid>
+        <w:gridCol w:w="108"/>
         <w:gridCol w:w="338"/>
-        <w:gridCol w:w="1542"/>
+        <w:gridCol w:w="1469"/>
+        <w:gridCol w:w="73"/>
         <w:gridCol w:w="1182"/>
+        <w:gridCol w:w="552"/>
+        <w:gridCol w:w="582"/>
+        <w:gridCol w:w="1202"/>
+        <w:gridCol w:w="24"/>
+        <w:gridCol w:w="1337"/>
+        <w:gridCol w:w="470"/>
+        <w:gridCol w:w="664"/>
         <w:gridCol w:w="1134"/>
-        <w:gridCol w:w="1202"/>
+        <w:gridCol w:w="10"/>
         <w:gridCol w:w="1361"/>
-        <w:gridCol w:w="1134"/>
-        <w:gridCol w:w="1134"/>
       </w:tblGrid>
       <w:tr>
         <w:trPr>
+          <w:gridBefore w:val="1"/>
+          <w:gridAfter w:val="2"/>
+          <w:wBefore w:w="108" w:type="dxa"/>
+          <w:wAfter w:w="1371" w:type="dxa"/>
           <w:trHeight w:val="255"/>
         </w:trPr>
         <w:tc>
@@ -3569,7 +5223,6 @@
                 <w:sz w:val="18"/>
                 <w:szCs w:val="18"/>
               </w:rPr>
-              <w:lastRenderedPageBreak/>
               <w:t>P</w:t>
             </w:r>
           </w:p>
@@ -3577,6 +5230,7 @@
         <w:tc>
           <w:tcPr>
             <w:tcW w:w="1542" w:type="dxa"/>
+            <w:gridSpan w:val="2"/>
           </w:tcPr>
           <w:p>
             <w:pPr>
@@ -3709,6 +5363,7 @@
         <w:tc>
           <w:tcPr>
             <w:tcW w:w="1134" w:type="dxa"/>
+            <w:gridSpan w:val="2"/>
           </w:tcPr>
           <w:p>
             <w:pPr>
@@ -3951,6 +5606,7 @@
         <w:tc>
           <w:tcPr>
             <w:tcW w:w="1361" w:type="dxa"/>
+            <w:gridSpan w:val="2"/>
           </w:tcPr>
           <w:p>
             <w:pPr>
@@ -3997,6 +5653,122 @@
                 <w:szCs w:val="18"/>
               </w:rPr>
               <w:t>«=p.density»</w:t>
+            </w:r>
+            <w:r>
+              <w:rPr>
+                <w:rFonts w:ascii="Arial" w:hAnsi="Arial" w:cs="Arial"/>
+                <w:noProof/>
+                <w:sz w:val="18"/>
+                <w:szCs w:val="18"/>
+              </w:rPr>
+              <w:fldChar w:fldCharType="end"/>
+            </w:r>
+          </w:p>
+        </w:tc>
+        <w:tc>
+          <w:tcPr>
+            <w:tcW w:w="1134" w:type="dxa"/>
+            <w:gridSpan w:val="2"/>
+          </w:tcPr>
+          <w:p>
+            <w:pPr>
+              <w:jc w:val="center"/>
+              <w:rPr>
+                <w:rFonts w:ascii="Arial" w:hAnsi="Arial" w:cs="Arial"/>
+                <w:noProof/>
+                <w:sz w:val="18"/>
+                <w:szCs w:val="18"/>
+              </w:rPr>
+            </w:pPr>
+            <w:r>
+              <w:rPr>
+                <w:rFonts w:ascii="Arial" w:hAnsi="Arial" w:cs="Arial"/>
+                <w:noProof/>
+                <w:sz w:val="18"/>
+                <w:szCs w:val="18"/>
+              </w:rPr>
+              <w:fldChar w:fldCharType="begin"/>
+            </w:r>
+            <w:r>
+              <w:rPr>
+                <w:rFonts w:ascii="Arial" w:hAnsi="Arial" w:cs="Arial"/>
+                <w:noProof/>
+                <w:sz w:val="18"/>
+                <w:szCs w:val="18"/>
+              </w:rPr>
+              <w:instrText xml:space="preserve"> MERGEFIELD  =p.mol  \* MERGEFORMAT </w:instrText>
+            </w:r>
+            <w:r>
+              <w:rPr>
+                <w:rFonts w:ascii="Arial" w:hAnsi="Arial" w:cs="Arial"/>
+                <w:noProof/>
+                <w:sz w:val="18"/>
+                <w:szCs w:val="18"/>
+              </w:rPr>
+              <w:fldChar w:fldCharType="separate"/>
+            </w:r>
+            <w:r>
+              <w:rPr>
+                <w:rFonts w:ascii="Arial" w:hAnsi="Arial" w:cs="Arial"/>
+                <w:noProof/>
+                <w:sz w:val="18"/>
+                <w:szCs w:val="18"/>
+              </w:rPr>
+              <w:t>«=p.mol»</w:t>
+            </w:r>
+            <w:r>
+              <w:rPr>
+                <w:rFonts w:ascii="Arial" w:hAnsi="Arial" w:cs="Arial"/>
+                <w:noProof/>
+                <w:sz w:val="18"/>
+                <w:szCs w:val="18"/>
+              </w:rPr>
+              <w:fldChar w:fldCharType="end"/>
+            </w:r>
+            <w:r>
+              <w:rPr>
+                <w:rFonts w:ascii="Arial" w:hAnsi="Arial" w:cs="Arial"/>
+                <w:noProof/>
+                <w:sz w:val="18"/>
+                <w:szCs w:val="18"/>
+              </w:rPr>
+              <w:t xml:space="preserve"> </w:t>
+            </w:r>
+            <w:r>
+              <w:rPr>
+                <w:rFonts w:ascii="Arial" w:hAnsi="Arial" w:cs="Arial"/>
+                <w:noProof/>
+                <w:sz w:val="18"/>
+                <w:szCs w:val="18"/>
+              </w:rPr>
+              <w:fldChar w:fldCharType="begin"/>
+            </w:r>
+            <w:r>
+              <w:rPr>
+                <w:rFonts w:ascii="Arial" w:hAnsi="Arial" w:cs="Arial"/>
+                <w:noProof/>
+                <w:sz w:val="18"/>
+                <w:szCs w:val="18"/>
+              </w:rPr>
+              <w:instrText xml:space="preserve"> MERGEFIELD  =p.mmol_unit  \* MERGEFORMAT </w:instrText>
+            </w:r>
+            <w:r>
+              <w:rPr>
+                <w:rFonts w:ascii="Arial" w:hAnsi="Arial" w:cs="Arial"/>
+                <w:noProof/>
+                <w:sz w:val="18"/>
+                <w:szCs w:val="18"/>
+              </w:rPr>
+              <w:fldChar w:fldCharType="separate"/>
+            </w:r>
+            <w:r>
+              <w:rPr>
+                <w:rFonts w:ascii="Arial" w:hAnsi="Arial" w:cs="Arial"/>
+                <w:noProof/>
+                <w:sz w:val="18"/>
+                <w:szCs w:val="18"/>
+              </w:rPr>
+              <w:t>«=p.mmol_unit»</w:t>
             </w:r>
             <w:r>
               <w:rPr>
@@ -4027,6 +5799,7 @@
               <w:rPr>
                 <w:rFonts w:ascii="Arial" w:hAnsi="Arial" w:cs="Arial"/>
                 <w:noProof/>
+                <w:color w:val="FF0000"/>
                 <w:sz w:val="18"/>
                 <w:szCs w:val="18"/>
               </w:rPr>
@@ -4036,15 +5809,17 @@
               <w:rPr>
                 <w:rFonts w:ascii="Arial" w:hAnsi="Arial" w:cs="Arial"/>
                 <w:noProof/>
-                <w:sz w:val="18"/>
-                <w:szCs w:val="18"/>
-              </w:rPr>
-              <w:instrText xml:space="preserve"> MERGEFIELD  =p.mol  \* MERGEFORMAT </w:instrText>
-            </w:r>
-            <w:r>
-              <w:rPr>
-                <w:rFonts w:ascii="Arial" w:hAnsi="Arial" w:cs="Arial"/>
-                <w:noProof/>
+                <w:color w:val="FF0000"/>
+                <w:sz w:val="18"/>
+                <w:szCs w:val="18"/>
+              </w:rPr>
+              <w:instrText xml:space="preserve"> MERGEFIELD  =p.equiv  \* MERGEFORMAT </w:instrText>
+            </w:r>
+            <w:r>
+              <w:rPr>
+                <w:rFonts w:ascii="Arial" w:hAnsi="Arial" w:cs="Arial"/>
+                <w:noProof/>
+                <w:color w:val="FF0000"/>
                 <w:sz w:val="18"/>
                 <w:szCs w:val="18"/>
               </w:rPr>
@@ -4054,33 +5829,46 @@
               <w:rPr>
                 <w:rFonts w:ascii="Arial" w:hAnsi="Arial" w:cs="Arial"/>
                 <w:noProof/>
-                <w:sz w:val="18"/>
-                <w:szCs w:val="18"/>
-              </w:rPr>
-              <w:t>«=p.mol»</w:t>
-            </w:r>
-            <w:r>
-              <w:rPr>
-                <w:rFonts w:ascii="Arial" w:hAnsi="Arial" w:cs="Arial"/>
-                <w:noProof/>
+                <w:color w:val="FF0000"/>
+                <w:sz w:val="18"/>
+                <w:szCs w:val="18"/>
+              </w:rPr>
+              <w:t>«=p.equiv»</w:t>
+            </w:r>
+            <w:r>
+              <w:rPr>
+                <w:rFonts w:ascii="Arial" w:hAnsi="Arial" w:cs="Arial"/>
+                <w:noProof/>
+                <w:color w:val="FF0000"/>
                 <w:sz w:val="18"/>
                 <w:szCs w:val="18"/>
               </w:rPr>
               <w:fldChar w:fldCharType="end"/>
             </w:r>
-            <w:r>
-              <w:rPr>
-                <w:rFonts w:ascii="Arial" w:hAnsi="Arial" w:cs="Arial"/>
-                <w:noProof/>
-                <w:sz w:val="18"/>
-                <w:szCs w:val="18"/>
-              </w:rPr>
-              <w:t xml:space="preserve"> </w:t>
-            </w:r>
-            <w:r>
-              <w:rPr>
-                <w:rFonts w:ascii="Arial" w:hAnsi="Arial" w:cs="Arial"/>
-                <w:noProof/>
+          </w:p>
+        </w:tc>
+      </w:tr>
+      <w:tr>
+        <w:trPr>
+          <w:trHeight w:val="255"/>
+        </w:trPr>
+        <w:tc>
+          <w:tcPr>
+            <w:tcW w:w="10506" w:type="dxa"/>
+            <w:gridSpan w:val="15"/>
+          </w:tcPr>
+          <w:p>
+            <w:pPr>
+              <w:rPr>
+                <w:rFonts w:ascii="Arial" w:hAnsi="Arial" w:cs="Arial"/>
+                <w:noProof/>
+                <w:sz w:val="18"/>
+                <w:szCs w:val="18"/>
+              </w:rPr>
+            </w:pPr>
+            <w:r>
+              <w:rPr>
+                <w:rFonts w:ascii="Arial" w:hAnsi="Arial" w:cs="Arial"/>
                 <w:sz w:val="18"/>
                 <w:szCs w:val="18"/>
               </w:rPr>
@@ -4089,16 +5877,14 @@
             <w:r>
               <w:rPr>
                 <w:rFonts w:ascii="Arial" w:hAnsi="Arial" w:cs="Arial"/>
-                <w:noProof/>
-                <w:sz w:val="18"/>
-                <w:szCs w:val="18"/>
-              </w:rPr>
-              <w:instrText xml:space="preserve"> MERGEFIELD  =p.mmol_unit  \* MERGEFORMAT </w:instrText>
-            </w:r>
-            <w:r>
-              <w:rPr>
-                <w:rFonts w:ascii="Arial" w:hAnsi="Arial" w:cs="Arial"/>
-                <w:noProof/>
+                <w:sz w:val="18"/>
+                <w:szCs w:val="18"/>
+              </w:rPr>
+              <w:instrText xml:space="preserve"> MERGEFIELD  p.components:if  \* MERGEFORMAT </w:instrText>
+            </w:r>
+            <w:r>
+              <w:rPr>
+                <w:rFonts w:ascii="Arial" w:hAnsi="Arial" w:cs="Arial"/>
                 <w:sz w:val="18"/>
                 <w:szCs w:val="18"/>
               </w:rPr>
@@ -4111,29 +5897,65 @@
                 <w:sz w:val="18"/>
                 <w:szCs w:val="18"/>
               </w:rPr>
-              <w:t>«=p.mmol_unit»</w:t>
-            </w:r>
-            <w:r>
-              <w:rPr>
-                <w:rFonts w:ascii="Arial" w:hAnsi="Arial" w:cs="Arial"/>
-                <w:noProof/>
+              <w:t>«p.components:if»</w:t>
+            </w:r>
+            <w:r>
+              <w:rPr>
+                <w:rFonts w:ascii="Arial" w:hAnsi="Arial" w:cs="Arial"/>
                 <w:sz w:val="18"/>
                 <w:szCs w:val="18"/>
               </w:rPr>
               <w:fldChar w:fldCharType="end"/>
+            </w:r>
+          </w:p>
+        </w:tc>
+      </w:tr>
+      <w:tr>
+        <w:trPr>
+          <w:gridAfter w:val="1"/>
+          <w:wAfter w:w="1361" w:type="dxa"/>
+          <w:trHeight w:val="255"/>
+        </w:trPr>
+        <w:tc>
+          <w:tcPr>
+            <w:tcW w:w="1915" w:type="dxa"/>
+            <w:gridSpan w:val="3"/>
+          </w:tcPr>
+          <w:p>
+            <w:pPr>
+              <w:jc w:val="center"/>
+              <w:rPr>
+                <w:rFonts w:ascii="Arial" w:hAnsi="Arial" w:cs="Arial"/>
+                <w:b/>
+                <w:bCs/>
+                <w:sz w:val="18"/>
+                <w:szCs w:val="18"/>
+              </w:rPr>
+            </w:pPr>
+            <w:r>
+              <w:rPr>
+                <w:rFonts w:ascii="Arial" w:hAnsi="Arial" w:cs="Arial"/>
+                <w:b/>
+                <w:bCs/>
+                <w:sz w:val="18"/>
+                <w:szCs w:val="18"/>
+              </w:rPr>
+              <w:t>Component</w:t>
             </w:r>
           </w:p>
         </w:tc>
         <w:tc>
           <w:tcPr>
-            <w:tcW w:w="1134" w:type="dxa"/>
+            <w:tcW w:w="1807" w:type="dxa"/>
+            <w:gridSpan w:val="3"/>
           </w:tcPr>
           <w:p>
             <w:pPr>
               <w:jc w:val="center"/>
               <w:rPr>
                 <w:rFonts w:ascii="Arial" w:hAnsi="Arial" w:cs="Arial"/>
-                <w:noProof/>
+                <w:b/>
+                <w:bCs/>
                 <w:sz w:val="18"/>
                 <w:szCs w:val="18"/>
               </w:rPr>
@@ -4141,8 +5963,120 @@
             <w:r>
               <w:rPr>
                 <w:rFonts w:ascii="Arial" w:hAnsi="Arial" w:cs="Arial"/>
-                <w:noProof/>
-                <w:color w:val="FF0000"/>
+                <w:b/>
+                <w:bCs/>
+                <w:sz w:val="18"/>
+                <w:szCs w:val="18"/>
+              </w:rPr>
+              <w:t>Amount</w:t>
+            </w:r>
+          </w:p>
+        </w:tc>
+        <w:tc>
+          <w:tcPr>
+            <w:tcW w:w="1808" w:type="dxa"/>
+            <w:gridSpan w:val="3"/>
+          </w:tcPr>
+          <w:p>
+            <w:pPr>
+              <w:jc w:val="center"/>
+              <w:rPr>
+                <w:rFonts w:ascii="Arial" w:hAnsi="Arial" w:cs="Arial"/>
+                <w:b/>
+                <w:bCs/>
+                <w:sz w:val="18"/>
+                <w:szCs w:val="18"/>
+              </w:rPr>
+            </w:pPr>
+            <w:r>
+              <w:rPr>
+                <w:rFonts w:ascii="Arial" w:hAnsi="Arial" w:cs="Arial"/>
+                <w:b/>
+                <w:bCs/>
+                <w:sz w:val="18"/>
+                <w:szCs w:val="18"/>
+              </w:rPr>
+              <w:t>Rel. MW [g/mol]</w:t>
+            </w:r>
+          </w:p>
+        </w:tc>
+        <w:tc>
+          <w:tcPr>
+            <w:tcW w:w="1807" w:type="dxa"/>
+            <w:gridSpan w:val="2"/>
+          </w:tcPr>
+          <w:p>
+            <w:pPr>
+              <w:jc w:val="center"/>
+              <w:rPr>
+                <w:rFonts w:ascii="Arial" w:hAnsi="Arial" w:cs="Arial"/>
+                <w:b/>
+                <w:bCs/>
+                <w:sz w:val="18"/>
+                <w:szCs w:val="18"/>
+              </w:rPr>
+            </w:pPr>
+            <w:r>
+              <w:rPr>
+                <w:rFonts w:ascii="Arial" w:hAnsi="Arial" w:cs="Arial"/>
+                <w:b/>
+                <w:bCs/>
+                <w:sz w:val="18"/>
+                <w:szCs w:val="18"/>
+              </w:rPr>
+              <w:t>Conc</w:t>
+            </w:r>
+          </w:p>
+        </w:tc>
+        <w:tc>
+          <w:tcPr>
+            <w:tcW w:w="1808" w:type="dxa"/>
+            <w:gridSpan w:val="3"/>
+          </w:tcPr>
+          <w:p>
+            <w:pPr>
+              <w:jc w:val="center"/>
+              <w:rPr>
+                <w:rFonts w:ascii="Arial" w:hAnsi="Arial" w:cs="Arial"/>
+                <w:b/>
+                <w:bCs/>
+                <w:sz w:val="18"/>
+                <w:szCs w:val="18"/>
+              </w:rPr>
+            </w:pPr>
+            <w:r>
+              <w:rPr>
+                <w:rFonts w:ascii="Arial" w:hAnsi="Arial" w:cs="Arial"/>
+                <w:b/>
+                <w:bCs/>
+                <w:sz w:val="18"/>
+                <w:szCs w:val="18"/>
+              </w:rPr>
+              <w:t>Ratio</w:t>
+            </w:r>
+          </w:p>
+        </w:tc>
+      </w:tr>
+      <w:tr>
+        <w:trPr>
+          <w:trHeight w:val="255"/>
+        </w:trPr>
+        <w:tc>
+          <w:tcPr>
+            <w:tcW w:w="10506" w:type="dxa"/>
+            <w:gridSpan w:val="15"/>
+          </w:tcPr>
+          <w:p>
+            <w:pPr>
+              <w:rPr>
+                <w:rFonts w:ascii="Arial" w:hAnsi="Arial" w:cs="Arial"/>
+                <w:sz w:val="18"/>
+                <w:szCs w:val="18"/>
+              </w:rPr>
+            </w:pPr>
+            <w:r>
+              <w:rPr>
+                <w:rFonts w:ascii="Arial" w:hAnsi="Arial" w:cs="Arial"/>
                 <w:sz w:val="18"/>
                 <w:szCs w:val="18"/>
               </w:rPr>
@@ -4151,18 +6085,14 @@
             <w:r>
               <w:rPr>
                 <w:rFonts w:ascii="Arial" w:hAnsi="Arial" w:cs="Arial"/>
-                <w:noProof/>
-                <w:color w:val="FF0000"/>
-                <w:sz w:val="18"/>
-                <w:szCs w:val="18"/>
-              </w:rPr>
-              <w:instrText xml:space="preserve"> MERGEFIELD  =p.equiv  \* MERGEFORMAT </w:instrText>
-            </w:r>
-            <w:r>
-              <w:rPr>
-                <w:rFonts w:ascii="Arial" w:hAnsi="Arial" w:cs="Arial"/>
-                <w:noProof/>
-                <w:color w:val="FF0000"/>
+                <w:sz w:val="18"/>
+                <w:szCs w:val="18"/>
+              </w:rPr>
+              <w:instrText xml:space="preserve"> MERGEFIELD  p.components:each(comp)  \* MERGEFORMAT </w:instrText>
+            </w:r>
+            <w:r>
+              <w:rPr>
+                <w:rFonts w:ascii="Arial" w:hAnsi="Arial" w:cs="Arial"/>
                 <w:sz w:val="18"/>
                 <w:szCs w:val="18"/>
               </w:rPr>
@@ -4172,17 +6102,534 @@
               <w:rPr>
                 <w:rFonts w:ascii="Arial" w:hAnsi="Arial" w:cs="Arial"/>
                 <w:noProof/>
-                <w:color w:val="FF0000"/>
-                <w:sz w:val="18"/>
-                <w:szCs w:val="18"/>
-              </w:rPr>
-              <w:t>«=p.equiv»</w:t>
-            </w:r>
-            <w:r>
-              <w:rPr>
-                <w:rFonts w:ascii="Arial" w:hAnsi="Arial" w:cs="Arial"/>
-                <w:noProof/>
-                <w:color w:val="FF0000"/>
+                <w:sz w:val="18"/>
+                <w:szCs w:val="18"/>
+              </w:rPr>
+              <w:t>«p.components:each(comp)»</w:t>
+            </w:r>
+            <w:r>
+              <w:rPr>
+                <w:rFonts w:ascii="Arial" w:hAnsi="Arial" w:cs="Arial"/>
+                <w:sz w:val="18"/>
+                <w:szCs w:val="18"/>
+              </w:rPr>
+              <w:fldChar w:fldCharType="end"/>
+            </w:r>
+          </w:p>
+        </w:tc>
+      </w:tr>
+      <w:tr>
+        <w:trPr>
+          <w:gridAfter w:val="1"/>
+          <w:wAfter w:w="1361" w:type="dxa"/>
+          <w:trHeight w:val="255"/>
+        </w:trPr>
+        <w:tc>
+          <w:tcPr>
+            <w:tcW w:w="1915" w:type="dxa"/>
+            <w:gridSpan w:val="3"/>
+          </w:tcPr>
+          <w:p>
+            <w:pPr>
+              <w:rPr>
+                <w:rFonts w:ascii="Arial" w:hAnsi="Arial" w:cs="Arial"/>
+                <w:sz w:val="18"/>
+                <w:szCs w:val="18"/>
+              </w:rPr>
+            </w:pPr>
+            <w:r>
+              <w:rPr>
+                <w:rFonts w:ascii="Arial" w:hAnsi="Arial" w:cs="Arial"/>
+                <w:noProof/>
+                <w:color w:val="000000"/>
+                <w:sz w:val="18"/>
+                <w:szCs w:val="18"/>
+              </w:rPr>
+              <w:fldChar w:fldCharType="begin"/>
+            </w:r>
+            <w:r>
+              <w:rPr>
+                <w:rFonts w:ascii="Arial" w:hAnsi="Arial" w:cs="Arial"/>
+                <w:noProof/>
+                <w:color w:val="000000"/>
+                <w:sz w:val="18"/>
+                <w:szCs w:val="18"/>
+              </w:rPr>
+              <w:instrText xml:space="preserve"> MERGEFIELD  =comp.name  \* MERGEFORMAT </w:instrText>
+            </w:r>
+            <w:r>
+              <w:rPr>
+                <w:rFonts w:ascii="Arial" w:hAnsi="Arial" w:cs="Arial"/>
+                <w:noProof/>
+                <w:color w:val="000000"/>
+                <w:sz w:val="18"/>
+                <w:szCs w:val="18"/>
+              </w:rPr>
+              <w:fldChar w:fldCharType="separate"/>
+            </w:r>
+            <w:r>
+              <w:rPr>
+                <w:rFonts w:ascii="Arial" w:hAnsi="Arial" w:cs="Arial"/>
+                <w:noProof/>
+                <w:color w:val="000000"/>
+                <w:sz w:val="18"/>
+                <w:szCs w:val="18"/>
+              </w:rPr>
+              <w:t>«=comp.name»</w:t>
+            </w:r>
+            <w:r>
+              <w:rPr>
+                <w:rFonts w:ascii="Arial" w:hAnsi="Arial" w:cs="Arial"/>
+                <w:noProof/>
+                <w:color w:val="000000"/>
+                <w:sz w:val="18"/>
+                <w:szCs w:val="18"/>
+              </w:rPr>
+              <w:fldChar w:fldCharType="end"/>
+            </w:r>
+          </w:p>
+        </w:tc>
+        <w:tc>
+          <w:tcPr>
+            <w:tcW w:w="1807" w:type="dxa"/>
+            <w:gridSpan w:val="3"/>
+          </w:tcPr>
+          <w:p>
+            <w:pPr>
+              <w:jc w:val="center"/>
+              <w:rPr>
+                <w:rFonts w:ascii="Arial" w:hAnsi="Arial" w:cs="Arial"/>
+                <w:sz w:val="18"/>
+                <w:szCs w:val="18"/>
+              </w:rPr>
+            </w:pPr>
+            <w:r>
+              <w:rPr>
+                <w:rFonts w:ascii="Arial" w:hAnsi="Arial" w:cs="Arial"/>
+                <w:noProof/>
+                <w:color w:val="000000"/>
+                <w:sz w:val="18"/>
+                <w:szCs w:val="18"/>
+              </w:rPr>
+              <w:fldChar w:fldCharType="begin"/>
+            </w:r>
+            <w:r>
+              <w:rPr>
+                <w:rFonts w:ascii="Arial" w:hAnsi="Arial" w:cs="Arial"/>
+                <w:noProof/>
+                <w:color w:val="000000"/>
+                <w:sz w:val="18"/>
+                <w:szCs w:val="18"/>
+              </w:rPr>
+              <w:instrText xml:space="preserve"> MERGEFIELD  =comp.amount_mol  \* MERGEFORMAT </w:instrText>
+            </w:r>
+            <w:r>
+              <w:rPr>
+                <w:rFonts w:ascii="Arial" w:hAnsi="Arial" w:cs="Arial"/>
+                <w:noProof/>
+                <w:color w:val="000000"/>
+                <w:sz w:val="18"/>
+                <w:szCs w:val="18"/>
+              </w:rPr>
+              <w:fldChar w:fldCharType="separate"/>
+            </w:r>
+            <w:r>
+              <w:rPr>
+                <w:rFonts w:ascii="Arial" w:hAnsi="Arial" w:cs="Arial"/>
+                <w:noProof/>
+                <w:color w:val="000000"/>
+                <w:sz w:val="18"/>
+                <w:szCs w:val="18"/>
+              </w:rPr>
+              <w:t>«=comp.amount_mol»</w:t>
+            </w:r>
+            <w:r>
+              <w:rPr>
+                <w:rFonts w:ascii="Arial" w:hAnsi="Arial" w:cs="Arial"/>
+                <w:noProof/>
+                <w:color w:val="000000"/>
+                <w:sz w:val="18"/>
+                <w:szCs w:val="18"/>
+              </w:rPr>
+              <w:fldChar w:fldCharType="end"/>
+            </w:r>
+            <w:r>
+              <w:rPr>
+                <w:rFonts w:ascii="Arial" w:hAnsi="Arial" w:cs="Arial"/>
+                <w:noProof/>
+                <w:color w:val="000000"/>
+                <w:sz w:val="18"/>
+                <w:szCs w:val="18"/>
+              </w:rPr>
+              <w:t xml:space="preserve"> </w:t>
+            </w:r>
+            <w:r>
+              <w:rPr>
+                <w:rFonts w:ascii="Arial" w:hAnsi="Arial" w:cs="Arial"/>
+                <w:noProof/>
+                <w:color w:val="000000"/>
+                <w:sz w:val="18"/>
+                <w:szCs w:val="18"/>
+              </w:rPr>
+              <w:fldChar w:fldCharType="begin"/>
+            </w:r>
+            <w:r>
+              <w:rPr>
+                <w:rFonts w:ascii="Arial" w:hAnsi="Arial" w:cs="Arial"/>
+                <w:noProof/>
+                <w:color w:val="000000"/>
+                <w:sz w:val="18"/>
+                <w:szCs w:val="18"/>
+              </w:rPr>
+              <w:instrText xml:space="preserve"> MERGEFIELD  =comp.amount_mol_unit  \* MERGEFORMAT </w:instrText>
+            </w:r>
+            <w:r>
+              <w:rPr>
+                <w:rFonts w:ascii="Arial" w:hAnsi="Arial" w:cs="Arial"/>
+                <w:noProof/>
+                <w:color w:val="000000"/>
+                <w:sz w:val="18"/>
+                <w:szCs w:val="18"/>
+              </w:rPr>
+              <w:fldChar w:fldCharType="separate"/>
+            </w:r>
+            <w:r>
+              <w:rPr>
+                <w:rFonts w:ascii="Arial" w:hAnsi="Arial" w:cs="Arial"/>
+                <w:noProof/>
+                <w:color w:val="000000"/>
+                <w:sz w:val="18"/>
+                <w:szCs w:val="18"/>
+              </w:rPr>
+              <w:t>«=comp.amount_mol_unit»</w:t>
+            </w:r>
+            <w:r>
+              <w:rPr>
+                <w:rFonts w:ascii="Arial" w:hAnsi="Arial" w:cs="Arial"/>
+                <w:noProof/>
+                <w:color w:val="000000"/>
+                <w:sz w:val="18"/>
+                <w:szCs w:val="18"/>
+              </w:rPr>
+              <w:fldChar w:fldCharType="end"/>
+            </w:r>
+          </w:p>
+        </w:tc>
+        <w:tc>
+          <w:tcPr>
+            <w:tcW w:w="1808" w:type="dxa"/>
+            <w:gridSpan w:val="3"/>
+          </w:tcPr>
+          <w:p>
+            <w:pPr>
+              <w:jc w:val="center"/>
+              <w:rPr>
+                <w:rFonts w:ascii="Arial" w:hAnsi="Arial" w:cs="Arial"/>
+                <w:sz w:val="18"/>
+                <w:szCs w:val="18"/>
+              </w:rPr>
+            </w:pPr>
+            <w:r>
+              <w:rPr>
+                <w:rFonts w:ascii="Arial" w:hAnsi="Arial" w:cs="Arial"/>
+                <w:noProof/>
+                <w:color w:val="000000"/>
+                <w:sz w:val="18"/>
+                <w:szCs w:val="18"/>
+              </w:rPr>
+              <w:fldChar w:fldCharType="begin"/>
+            </w:r>
+            <w:r>
+              <w:rPr>
+                <w:rFonts w:ascii="Arial" w:hAnsi="Arial" w:cs="Arial"/>
+                <w:noProof/>
+                <w:color w:val="000000"/>
+                <w:sz w:val="18"/>
+                <w:szCs w:val="18"/>
+              </w:rPr>
+              <w:instrText xml:space="preserve"> MERGEFIELD  =comp.relative_molecular_weight  \* MERGEFORMAT </w:instrText>
+            </w:r>
+            <w:r>
+              <w:rPr>
+                <w:rFonts w:ascii="Arial" w:hAnsi="Arial" w:cs="Arial"/>
+                <w:noProof/>
+                <w:color w:val="000000"/>
+                <w:sz w:val="18"/>
+                <w:szCs w:val="18"/>
+              </w:rPr>
+              <w:fldChar w:fldCharType="separate"/>
+            </w:r>
+            <w:r>
+              <w:rPr>
+                <w:rFonts w:ascii="Arial" w:hAnsi="Arial" w:cs="Arial"/>
+                <w:noProof/>
+                <w:color w:val="000000"/>
+                <w:sz w:val="18"/>
+                <w:szCs w:val="18"/>
+              </w:rPr>
+              <w:t>«=comp.relative_molecular_weight»</w:t>
+            </w:r>
+            <w:r>
+              <w:rPr>
+                <w:rFonts w:ascii="Arial" w:hAnsi="Arial" w:cs="Arial"/>
+                <w:noProof/>
+                <w:color w:val="000000"/>
+                <w:sz w:val="18"/>
+                <w:szCs w:val="18"/>
+              </w:rPr>
+              <w:fldChar w:fldCharType="end"/>
+            </w:r>
+          </w:p>
+        </w:tc>
+        <w:tc>
+          <w:tcPr>
+            <w:tcW w:w="1807" w:type="dxa"/>
+            <w:gridSpan w:val="2"/>
+          </w:tcPr>
+          <w:p>
+            <w:pPr>
+              <w:jc w:val="center"/>
+              <w:rPr>
+                <w:rFonts w:ascii="Arial" w:hAnsi="Arial" w:cs="Arial"/>
+                <w:sz w:val="18"/>
+                <w:szCs w:val="18"/>
+              </w:rPr>
+            </w:pPr>
+            <w:r>
+              <w:rPr>
+                <w:rFonts w:ascii="Arial" w:hAnsi="Arial" w:cs="Arial"/>
+                <w:noProof/>
+                <w:color w:val="000000"/>
+                <w:sz w:val="18"/>
+                <w:szCs w:val="18"/>
+              </w:rPr>
+              <w:fldChar w:fldCharType="begin"/>
+            </w:r>
+            <w:r>
+              <w:rPr>
+                <w:rFonts w:ascii="Arial" w:hAnsi="Arial" w:cs="Arial"/>
+                <w:noProof/>
+                <w:color w:val="000000"/>
+                <w:sz w:val="18"/>
+                <w:szCs w:val="18"/>
+              </w:rPr>
+              <w:instrText xml:space="preserve"> MERGEFIELD  =comp.concn  \* MERGEFORMAT </w:instrText>
+            </w:r>
+            <w:r>
+              <w:rPr>
+                <w:rFonts w:ascii="Arial" w:hAnsi="Arial" w:cs="Arial"/>
+                <w:noProof/>
+                <w:color w:val="000000"/>
+                <w:sz w:val="18"/>
+                <w:szCs w:val="18"/>
+              </w:rPr>
+              <w:fldChar w:fldCharType="separate"/>
+            </w:r>
+            <w:r>
+              <w:rPr>
+                <w:rFonts w:ascii="Arial" w:hAnsi="Arial" w:cs="Arial"/>
+                <w:noProof/>
+                <w:color w:val="000000"/>
+                <w:sz w:val="18"/>
+                <w:szCs w:val="18"/>
+              </w:rPr>
+              <w:t>«=comp.concn»</w:t>
+            </w:r>
+            <w:r>
+              <w:rPr>
+                <w:rFonts w:ascii="Arial" w:hAnsi="Arial" w:cs="Arial"/>
+                <w:noProof/>
+                <w:color w:val="000000"/>
+                <w:sz w:val="18"/>
+                <w:szCs w:val="18"/>
+              </w:rPr>
+              <w:fldChar w:fldCharType="end"/>
+            </w:r>
+          </w:p>
+        </w:tc>
+        <w:tc>
+          <w:tcPr>
+            <w:tcW w:w="1808" w:type="dxa"/>
+            <w:gridSpan w:val="3"/>
+          </w:tcPr>
+          <w:p>
+            <w:pPr>
+              <w:jc w:val="center"/>
+              <w:rPr>
+                <w:rFonts w:ascii="Arial" w:hAnsi="Arial" w:cs="Arial"/>
+                <w:sz w:val="18"/>
+                <w:szCs w:val="18"/>
+              </w:rPr>
+            </w:pPr>
+            <w:r>
+              <w:rPr>
+                <w:rFonts w:ascii="Arial" w:hAnsi="Arial" w:cs="Arial"/>
+                <w:noProof/>
+                <w:color w:val="000000"/>
+                <w:sz w:val="18"/>
+                <w:szCs w:val="18"/>
+              </w:rPr>
+              <w:fldChar w:fldCharType="begin"/>
+            </w:r>
+            <w:r>
+              <w:rPr>
+                <w:rFonts w:ascii="Arial" w:hAnsi="Arial" w:cs="Arial"/>
+                <w:noProof/>
+                <w:color w:val="000000"/>
+                <w:sz w:val="18"/>
+                <w:szCs w:val="18"/>
+              </w:rPr>
+              <w:instrText xml:space="preserve"> MERGEFIELD  =comp.equivalent  \* MERGEFORMAT </w:instrText>
+            </w:r>
+            <w:r>
+              <w:rPr>
+                <w:rFonts w:ascii="Arial" w:hAnsi="Arial" w:cs="Arial"/>
+                <w:noProof/>
+                <w:color w:val="000000"/>
+                <w:sz w:val="18"/>
+                <w:szCs w:val="18"/>
+              </w:rPr>
+              <w:fldChar w:fldCharType="separate"/>
+            </w:r>
+            <w:r>
+              <w:rPr>
+                <w:rFonts w:ascii="Arial" w:hAnsi="Arial" w:cs="Arial"/>
+                <w:noProof/>
+                <w:color w:val="000000"/>
+                <w:sz w:val="18"/>
+                <w:szCs w:val="18"/>
+              </w:rPr>
+              <w:t>«=comp.equivalent»</w:t>
+            </w:r>
+            <w:r>
+              <w:rPr>
+                <w:rFonts w:ascii="Arial" w:hAnsi="Arial" w:cs="Arial"/>
+                <w:noProof/>
+                <w:color w:val="000000"/>
+                <w:sz w:val="18"/>
+                <w:szCs w:val="18"/>
+              </w:rPr>
+              <w:fldChar w:fldCharType="end"/>
+            </w:r>
+          </w:p>
+        </w:tc>
+      </w:tr>
+      <w:tr>
+        <w:trPr>
+          <w:trHeight w:val="255"/>
+        </w:trPr>
+        <w:tc>
+          <w:tcPr>
+            <w:tcW w:w="10506" w:type="dxa"/>
+            <w:gridSpan w:val="15"/>
+          </w:tcPr>
+          <w:p>
+            <w:pPr>
+              <w:rPr>
+                <w:rFonts w:ascii="Arial" w:hAnsi="Arial" w:cs="Arial"/>
+                <w:noProof/>
+                <w:color w:val="000000"/>
+                <w:sz w:val="18"/>
+                <w:szCs w:val="18"/>
+              </w:rPr>
+            </w:pPr>
+            <w:r>
+              <w:rPr>
+                <w:rFonts w:ascii="Arial" w:hAnsi="Arial" w:cs="Arial"/>
+                <w:sz w:val="18"/>
+                <w:szCs w:val="18"/>
+              </w:rPr>
+              <w:fldChar w:fldCharType="begin"/>
+            </w:r>
+            <w:r>
+              <w:rPr>
+                <w:rFonts w:ascii="Arial" w:hAnsi="Arial" w:cs="Arial"/>
+                <w:sz w:val="18"/>
+                <w:szCs w:val="18"/>
+              </w:rPr>
+              <w:instrText xml:space="preserve"> MERGEFIELD  p.components:endEach  \* MERGEFORMAT </w:instrText>
+            </w:r>
+            <w:r>
+              <w:rPr>
+                <w:rFonts w:ascii="Arial" w:hAnsi="Arial" w:cs="Arial"/>
+                <w:sz w:val="18"/>
+                <w:szCs w:val="18"/>
+              </w:rPr>
+              <w:fldChar w:fldCharType="separate"/>
+            </w:r>
+            <w:r>
+              <w:rPr>
+                <w:rFonts w:ascii="Arial" w:hAnsi="Arial" w:cs="Arial"/>
+                <w:noProof/>
+                <w:sz w:val="18"/>
+                <w:szCs w:val="18"/>
+              </w:rPr>
+              <w:t>«p.components:endEach»</w:t>
+            </w:r>
+            <w:r>
+              <w:rPr>
+                <w:rFonts w:ascii="Arial" w:hAnsi="Arial" w:cs="Arial"/>
+                <w:sz w:val="18"/>
+                <w:szCs w:val="18"/>
+              </w:rPr>
+              <w:fldChar w:fldCharType="end"/>
+            </w:r>
+          </w:p>
+        </w:tc>
+      </w:tr>
+      <w:tr>
+        <w:trPr>
+          <w:trHeight w:val="255"/>
+        </w:trPr>
+        <w:tc>
+          <w:tcPr>
+            <w:tcW w:w="10506" w:type="dxa"/>
+            <w:gridSpan w:val="15"/>
+          </w:tcPr>
+          <w:p>
+            <w:pPr>
+              <w:rPr>
+                <w:rFonts w:ascii="Arial" w:hAnsi="Arial" w:cs="Arial"/>
+                <w:sz w:val="18"/>
+                <w:szCs w:val="18"/>
+              </w:rPr>
+            </w:pPr>
+            <w:r>
+              <w:rPr>
+                <w:rFonts w:ascii="Arial" w:hAnsi="Arial" w:cs="Arial"/>
+                <w:sz w:val="18"/>
+                <w:szCs w:val="18"/>
+              </w:rPr>
+              <w:fldChar w:fldCharType="begin"/>
+            </w:r>
+            <w:r>
+              <w:rPr>
+                <w:rFonts w:ascii="Arial" w:hAnsi="Arial" w:cs="Arial"/>
+                <w:sz w:val="18"/>
+                <w:szCs w:val="18"/>
+              </w:rPr>
+              <w:instrText xml:space="preserve"> MERGEFIELD  p.components:endIf  \* MERGEFORMAT </w:instrText>
+            </w:r>
+            <w:r>
+              <w:rPr>
+                <w:rFonts w:ascii="Arial" w:hAnsi="Arial" w:cs="Arial"/>
+                <w:sz w:val="18"/>
+                <w:szCs w:val="18"/>
+              </w:rPr>
+              <w:fldChar w:fldCharType="separate"/>
+            </w:r>
+            <w:r>
+              <w:rPr>
+                <w:rFonts w:ascii="Arial" w:hAnsi="Arial" w:cs="Arial"/>
+                <w:noProof/>
+                <w:sz w:val="18"/>
+                <w:szCs w:val="18"/>
+              </w:rPr>
+              <w:t>«p.components:endIf»</w:t>
+            </w:r>
+            <w:r>
+              <w:rPr>
+                <w:rFonts w:ascii="Arial" w:hAnsi="Arial" w:cs="Arial"/>
                 <w:sz w:val="18"/>
                 <w:szCs w:val="18"/>
               </w:rPr>
@@ -4192,6 +6639,15 @@
         </w:tc>
       </w:tr>
     </w:tbl>
+    <w:p>
+      <w:pPr>
+        <w:rPr>
+          <w:rFonts w:ascii="Arial" w:hAnsi="Arial" w:cs="Arial"/>
+          <w:sz w:val="18"/>
+          <w:szCs w:val="18"/>
+        </w:rPr>
+      </w:pPr>
+    </w:p>
     <w:p>
       <w:pPr>
         <w:rPr>
@@ -4761,7 +7217,7 @@
     </w:p>
     <w:tbl>
       <w:tblPr>
-        <w:tblStyle w:val="Tabellenraster"/>
+        <w:tblStyle w:val="TableGrid"/>
         <w:tblW w:w="5000" w:type="pct"/>
         <w:tblBorders>
           <w:top w:val="none" w:sz="0" w:space="0" w:color="auto"/>
@@ -5026,7 +7482,7 @@
     </w:p>
     <w:tbl>
       <w:tblPr>
-        <w:tblStyle w:val="Tabellenraster"/>
+        <w:tblStyle w:val="TableGrid"/>
         <w:tblW w:w="5000" w:type="pct"/>
         <w:tblBorders>
           <w:top w:val="none" w:sz="0" w:space="0" w:color="auto"/>
@@ -6310,6 +8766,7 @@
           <w:sz w:val="20"/>
           <w:szCs w:val="20"/>
         </w:rPr>
+        <w:lastRenderedPageBreak/>
         <w:fldChar w:fldCharType="begin"/>
       </w:r>
       <w:r>
@@ -7919,7 +10376,6 @@
           <w:sz w:val="20"/>
           <w:szCs w:val="20"/>
         </w:rPr>
-        <w:lastRenderedPageBreak/>
         <w:fldChar w:fldCharType="begin"/>
       </w:r>
       <w:r>
@@ -10235,10 +12691,10 @@
           <w:noProof/>
         </w:rPr>
         <w:object w:dxaOrig="18787" w:dyaOrig="5510" w14:anchorId="4964B097">
-          <v:shape id="_x0000_i1027" type="#_x0000_t75" alt="" style="width:453.5pt;height:129pt;mso-width-percent:0;mso-height-percent:0;mso-width-percent:0;mso-height-percent:0" o:ole="">
+          <v:shape id="_x0000_i1027" type="#_x0000_t75" alt="" style="width:453.5pt;height:128.95pt;mso-width-percent:0;mso-height-percent:0;mso-width-percent:0;mso-height-percent:0" o:ole="">
             <v:imagedata r:id="rId9" o:title=""/>
           </v:shape>
-          <o:OLEObject Type="Embed" ProgID="ChemDraw.Document.6.0" ShapeID="_x0000_i1027" DrawAspect="Content" ObjectID="_1779608509" r:id="rId12"/>
+          <o:OLEObject Type="Embed" ProgID="ChemDraw.Document.6.0" ShapeID="_x0000_i1027" DrawAspect="Content" ObjectID="_1826458123" r:id="rId12"/>
         </w:object>
       </w:r>
       <w:r>
@@ -11674,7 +14130,7 @@
 </file>
 
 <file path=word/endnotes.xml><?xml version="1.0" encoding="utf-8"?>
-<w:endnotes xmlns:wpc="http://schemas.microsoft.com/office/word/2010/wordprocessingCanvas" xmlns:cx="http://schemas.microsoft.com/office/drawing/2014/chartex" xmlns:cx1="http://schemas.microsoft.com/office/drawing/2015/9/8/chartex" xmlns:cx2="http://schemas.microsoft.com/office/drawing/2015/10/21/chartex" xmlns:cx3="http://schemas.microsoft.com/office/drawing/2016/5/9/chartex" xmlns:cx4="http://schemas.microsoft.com/office/drawing/2016/5/10/chartex" xmlns:cx5="http://schemas.microsoft.com/office/drawing/2016/5/11/chartex" xmlns:cx6="http://schemas.microsoft.com/office/drawing/2016/5/12/chartex" xmlns:cx7="http://schemas.microsoft.com/office/drawing/2016/5/13/chartex" xmlns:cx8="http://schemas.microsoft.com/office/drawing/2016/5/14/chartex" xmlns:mc="http://schemas.openxmlformats.org/markup-compatibility/2006" xmlns:aink="http://schemas.microsoft.com/office/drawing/2016/ink" xmlns:am3d="http://schemas.microsoft.com/office/drawing/2017/model3d" xmlns:o="urn:schemas-microsoft-com:office:office" xmlns:oel="http://schemas.microsoft.com/office/2019/extlst" xmlns:r="http://schemas.openxmlformats.org/officeDocument/2006/relationships" xmlns:m="http://schemas.openxmlformats.org/officeDocument/2006/math" xmlns:v="urn:schemas-microsoft-com:vml" xmlns:wp14="http://schemas.microsoft.com/office/word/2010/wordprocessingDrawing" xmlns:wp="http://schemas.openxmlformats.org/drawingml/2006/wordprocessingDrawing" xmlns:w10="urn:schemas-microsoft-com:office:word" xmlns:w="http://schemas.openxmlformats.org/wordprocessingml/2006/main" xmlns:w14="http://schemas.microsoft.com/office/word/2010/wordml" xmlns:w15="http://schemas.microsoft.com/office/word/2012/wordml" xmlns:w16cex="http://schemas.microsoft.com/office/word/2018/wordml/cex" xmlns:w16cid="http://schemas.microsoft.com/office/word/2016/wordml/cid" xmlns:w16="http://schemas.microsoft.com/office/word/2018/wordml" xmlns:w16du="http://schemas.microsoft.com/office/word/2023/wordml/word16du" xmlns:w16sdtdh="http://schemas.microsoft.com/office/word/2020/wordml/sdtdatahash" xmlns:w16se="http://schemas.microsoft.com/office/word/2015/wordml/symex" xmlns:wpg="http://schemas.microsoft.com/office/word/2010/wordprocessingGroup" xmlns:wpi="http://schemas.microsoft.com/office/word/2010/wordprocessingInk" xmlns:wne="http://schemas.microsoft.com/office/word/2006/wordml" xmlns:wps="http://schemas.microsoft.com/office/word/2010/wordprocessingShape" mc:Ignorable="w14 w15 w16se w16cid w16 w16cex w16sdtdh w16du wp14">
+<w:endnotes xmlns:wpc="http://schemas.microsoft.com/office/word/2010/wordprocessingCanvas" xmlns:cx="http://schemas.microsoft.com/office/drawing/2014/chartex" xmlns:cx1="http://schemas.microsoft.com/office/drawing/2015/9/8/chartex" xmlns:cx2="http://schemas.microsoft.com/office/drawing/2015/10/21/chartex" xmlns:cx3="http://schemas.microsoft.com/office/drawing/2016/5/9/chartex" xmlns:cx4="http://schemas.microsoft.com/office/drawing/2016/5/10/chartex" xmlns:cx5="http://schemas.microsoft.com/office/drawing/2016/5/11/chartex" xmlns:cx6="http://schemas.microsoft.com/office/drawing/2016/5/12/chartex" xmlns:cx7="http://schemas.microsoft.com/office/drawing/2016/5/13/chartex" xmlns:cx8="http://schemas.microsoft.com/office/drawing/2016/5/14/chartex" xmlns:mc="http://schemas.openxmlformats.org/markup-compatibility/2006" xmlns:aink="http://schemas.microsoft.com/office/drawing/2016/ink" xmlns:am3d="http://schemas.microsoft.com/office/drawing/2017/model3d" xmlns:o="urn:schemas-microsoft-com:office:office" xmlns:oel="http://schemas.microsoft.com/office/2019/extlst" xmlns:r="http://schemas.openxmlformats.org/officeDocument/2006/relationships" xmlns:m="http://schemas.openxmlformats.org/officeDocument/2006/math" xmlns:v="urn:schemas-microsoft-com:vml" xmlns:wp14="http://schemas.microsoft.com/office/word/2010/wordprocessingDrawing" xmlns:wp="http://schemas.openxmlformats.org/drawingml/2006/wordprocessingDrawing" xmlns:w10="urn:schemas-microsoft-com:office:word" xmlns:w="http://schemas.openxmlformats.org/wordprocessingml/2006/main" xmlns:w14="http://schemas.microsoft.com/office/word/2010/wordml" xmlns:w15="http://schemas.microsoft.com/office/word/2012/wordml" xmlns:w16cex="http://schemas.microsoft.com/office/word/2018/wordml/cex" xmlns:w16cid="http://schemas.microsoft.com/office/word/2016/wordml/cid" xmlns:w16="http://schemas.microsoft.com/office/word/2018/wordml" xmlns:w16du="http://schemas.microsoft.com/office/word/2023/wordml/word16du" xmlns:w16sdtdh="http://schemas.microsoft.com/office/word/2020/wordml/sdtdatahash" xmlns:w16sdtfl="http://schemas.microsoft.com/office/word/2024/wordml/sdtformatlock" xmlns:w16se="http://schemas.microsoft.com/office/word/2015/wordml/symex" xmlns:wpg="http://schemas.microsoft.com/office/word/2010/wordprocessingGroup" xmlns:wpi="http://schemas.microsoft.com/office/word/2010/wordprocessingInk" xmlns:wne="http://schemas.microsoft.com/office/word/2006/wordml" xmlns:wps="http://schemas.microsoft.com/office/word/2010/wordprocessingShape" mc:Ignorable="w14 w15 w16se w16cid w16 w16cex w16sdtdh w16sdtfl w16du wp14">
   <w:endnote w:type="separator" w:id="-1">
     <w:p>
       <w:r>
@@ -11693,37 +14149,37 @@
 </file>
 
 <file path=word/footer1.xml><?xml version="1.0" encoding="utf-8"?>
-<w:ftr xmlns:wpc="http://schemas.microsoft.com/office/word/2010/wordprocessingCanvas" xmlns:cx="http://schemas.microsoft.com/office/drawing/2014/chartex" xmlns:cx1="http://schemas.microsoft.com/office/drawing/2015/9/8/chartex" xmlns:cx2="http://schemas.microsoft.com/office/drawing/2015/10/21/chartex" xmlns:cx3="http://schemas.microsoft.com/office/drawing/2016/5/9/chartex" xmlns:cx4="http://schemas.microsoft.com/office/drawing/2016/5/10/chartex" xmlns:cx5="http://schemas.microsoft.com/office/drawing/2016/5/11/chartex" xmlns:cx6="http://schemas.microsoft.com/office/drawing/2016/5/12/chartex" xmlns:cx7="http://schemas.microsoft.com/office/drawing/2016/5/13/chartex" xmlns:cx8="http://schemas.microsoft.com/office/drawing/2016/5/14/chartex" xmlns:mc="http://schemas.openxmlformats.org/markup-compatibility/2006" xmlns:aink="http://schemas.microsoft.com/office/drawing/2016/ink" xmlns:am3d="http://schemas.microsoft.com/office/drawing/2017/model3d" xmlns:o="urn:schemas-microsoft-com:office:office" xmlns:oel="http://schemas.microsoft.com/office/2019/extlst" xmlns:r="http://schemas.openxmlformats.org/officeDocument/2006/relationships" xmlns:m="http://schemas.openxmlformats.org/officeDocument/2006/math" xmlns:v="urn:schemas-microsoft-com:vml" xmlns:wp14="http://schemas.microsoft.com/office/word/2010/wordprocessingDrawing" xmlns:wp="http://schemas.openxmlformats.org/drawingml/2006/wordprocessingDrawing" xmlns:w10="urn:schemas-microsoft-com:office:word" xmlns:w="http://schemas.openxmlformats.org/wordprocessingml/2006/main" xmlns:w14="http://schemas.microsoft.com/office/word/2010/wordml" xmlns:w15="http://schemas.microsoft.com/office/word/2012/wordml" xmlns:w16cex="http://schemas.microsoft.com/office/word/2018/wordml/cex" xmlns:w16cid="http://schemas.microsoft.com/office/word/2016/wordml/cid" xmlns:w16="http://schemas.microsoft.com/office/word/2018/wordml" xmlns:w16du="http://schemas.microsoft.com/office/word/2023/wordml/word16du" xmlns:w16sdtdh="http://schemas.microsoft.com/office/word/2020/wordml/sdtdatahash" xmlns:w16se="http://schemas.microsoft.com/office/word/2015/wordml/symex" xmlns:wpg="http://schemas.microsoft.com/office/word/2010/wordprocessingGroup" xmlns:wpi="http://schemas.microsoft.com/office/word/2010/wordprocessingInk" xmlns:wne="http://schemas.microsoft.com/office/word/2006/wordml" xmlns:wps="http://schemas.microsoft.com/office/word/2010/wordprocessingShape" mc:Ignorable="w14 w15 w16se w16cid w16 w16cex w16sdtdh w16du wp14">
+<w:ftr xmlns:wpc="http://schemas.microsoft.com/office/word/2010/wordprocessingCanvas" xmlns:cx="http://schemas.microsoft.com/office/drawing/2014/chartex" xmlns:cx1="http://schemas.microsoft.com/office/drawing/2015/9/8/chartex" xmlns:cx2="http://schemas.microsoft.com/office/drawing/2015/10/21/chartex" xmlns:cx3="http://schemas.microsoft.com/office/drawing/2016/5/9/chartex" xmlns:cx4="http://schemas.microsoft.com/office/drawing/2016/5/10/chartex" xmlns:cx5="http://schemas.microsoft.com/office/drawing/2016/5/11/chartex" xmlns:cx6="http://schemas.microsoft.com/office/drawing/2016/5/12/chartex" xmlns:cx7="http://schemas.microsoft.com/office/drawing/2016/5/13/chartex" xmlns:cx8="http://schemas.microsoft.com/office/drawing/2016/5/14/chartex" xmlns:mc="http://schemas.openxmlformats.org/markup-compatibility/2006" xmlns:aink="http://schemas.microsoft.com/office/drawing/2016/ink" xmlns:am3d="http://schemas.microsoft.com/office/drawing/2017/model3d" xmlns:o="urn:schemas-microsoft-com:office:office" xmlns:oel="http://schemas.microsoft.com/office/2019/extlst" xmlns:r="http://schemas.openxmlformats.org/officeDocument/2006/relationships" xmlns:m="http://schemas.openxmlformats.org/officeDocument/2006/math" xmlns:v="urn:schemas-microsoft-com:vml" xmlns:wp14="http://schemas.microsoft.com/office/word/2010/wordprocessingDrawing" xmlns:wp="http://schemas.openxmlformats.org/drawingml/2006/wordprocessingDrawing" xmlns:w10="urn:schemas-microsoft-com:office:word" xmlns:w="http://schemas.openxmlformats.org/wordprocessingml/2006/main" xmlns:w14="http://schemas.microsoft.com/office/word/2010/wordml" xmlns:w15="http://schemas.microsoft.com/office/word/2012/wordml" xmlns:w16cex="http://schemas.microsoft.com/office/word/2018/wordml/cex" xmlns:w16cid="http://schemas.microsoft.com/office/word/2016/wordml/cid" xmlns:w16="http://schemas.microsoft.com/office/word/2018/wordml" xmlns:w16du="http://schemas.microsoft.com/office/word/2023/wordml/word16du" xmlns:w16sdtdh="http://schemas.microsoft.com/office/word/2020/wordml/sdtdatahash" xmlns:w16sdtfl="http://schemas.microsoft.com/office/word/2024/wordml/sdtformatlock" xmlns:w16se="http://schemas.microsoft.com/office/word/2015/wordml/symex" xmlns:wpg="http://schemas.microsoft.com/office/word/2010/wordprocessingGroup" xmlns:wpi="http://schemas.microsoft.com/office/word/2010/wordprocessingInk" xmlns:wne="http://schemas.microsoft.com/office/word/2006/wordml" xmlns:wps="http://schemas.microsoft.com/office/word/2010/wordprocessingShape" mc:Ignorable="w14 w15 w16se w16cid w16 w16cex w16sdtdh w16sdtfl w16du wp14">
   <w:p>
     <w:pPr>
-      <w:pStyle w:val="Fuzeile"/>
+      <w:pStyle w:val="Footer"/>
       <w:framePr w:wrap="none" w:vAnchor="text" w:hAnchor="margin" w:xAlign="right" w:y="1"/>
       <w:rPr>
-        <w:rStyle w:val="Seitenzahl"/>
+        <w:rStyle w:val="PageNumber"/>
       </w:rPr>
     </w:pPr>
     <w:r>
       <w:rPr>
-        <w:rStyle w:val="Seitenzahl"/>
+        <w:rStyle w:val="PageNumber"/>
       </w:rPr>
       <w:fldChar w:fldCharType="begin"/>
     </w:r>
     <w:r>
       <w:rPr>
-        <w:rStyle w:val="Seitenzahl"/>
+        <w:rStyle w:val="PageNumber"/>
       </w:rPr>
       <w:instrText xml:space="preserve">PAGE  </w:instrText>
     </w:r>
     <w:r>
       <w:rPr>
-        <w:rStyle w:val="Seitenzahl"/>
+        <w:rStyle w:val="PageNumber"/>
       </w:rPr>
       <w:fldChar w:fldCharType="end"/>
     </w:r>
   </w:p>
   <w:p>
     <w:pPr>
-      <w:pStyle w:val="Fuzeile"/>
+      <w:pStyle w:val="Footer"/>
       <w:ind w:right="360"/>
     </w:pPr>
   </w:p>
@@ -11731,7 +14187,7 @@
 </file>
 
 <file path=word/footer2.xml><?xml version="1.0" encoding="utf-8"?>
-<w:ftr xmlns:wpc="http://schemas.microsoft.com/office/word/2010/wordprocessingCanvas" xmlns:cx="http://schemas.microsoft.com/office/drawing/2014/chartex" xmlns:cx1="http://schemas.microsoft.com/office/drawing/2015/9/8/chartex" xmlns:cx2="http://schemas.microsoft.com/office/drawing/2015/10/21/chartex" xmlns:cx3="http://schemas.microsoft.com/office/drawing/2016/5/9/chartex" xmlns:cx4="http://schemas.microsoft.com/office/drawing/2016/5/10/chartex" xmlns:cx5="http://schemas.microsoft.com/office/drawing/2016/5/11/chartex" xmlns:cx6="http://schemas.microsoft.com/office/drawing/2016/5/12/chartex" xmlns:cx7="http://schemas.microsoft.com/office/drawing/2016/5/13/chartex" xmlns:cx8="http://schemas.microsoft.com/office/drawing/2016/5/14/chartex" xmlns:mc="http://schemas.openxmlformats.org/markup-compatibility/2006" xmlns:aink="http://schemas.microsoft.com/office/drawing/2016/ink" xmlns:am3d="http://schemas.microsoft.com/office/drawing/2017/model3d" xmlns:o="urn:schemas-microsoft-com:office:office" xmlns:oel="http://schemas.microsoft.com/office/2019/extlst" xmlns:r="http://schemas.openxmlformats.org/officeDocument/2006/relationships" xmlns:m="http://schemas.openxmlformats.org/officeDocument/2006/math" xmlns:v="urn:schemas-microsoft-com:vml" xmlns:wp14="http://schemas.microsoft.com/office/word/2010/wordprocessingDrawing" xmlns:wp="http://schemas.openxmlformats.org/drawingml/2006/wordprocessingDrawing" xmlns:w10="urn:schemas-microsoft-com:office:word" xmlns:w="http://schemas.openxmlformats.org/wordprocessingml/2006/main" xmlns:w14="http://schemas.microsoft.com/office/word/2010/wordml" xmlns:w15="http://schemas.microsoft.com/office/word/2012/wordml" xmlns:w16cex="http://schemas.microsoft.com/office/word/2018/wordml/cex" xmlns:w16cid="http://schemas.microsoft.com/office/word/2016/wordml/cid" xmlns:w16="http://schemas.microsoft.com/office/word/2018/wordml" xmlns:w16du="http://schemas.microsoft.com/office/word/2023/wordml/word16du" xmlns:w16sdtdh="http://schemas.microsoft.com/office/word/2020/wordml/sdtdatahash" xmlns:w16se="http://schemas.microsoft.com/office/word/2015/wordml/symex" xmlns:wpg="http://schemas.microsoft.com/office/word/2010/wordprocessingGroup" xmlns:wpi="http://schemas.microsoft.com/office/word/2010/wordprocessingInk" xmlns:wne="http://schemas.microsoft.com/office/word/2006/wordml" xmlns:wps="http://schemas.microsoft.com/office/word/2010/wordprocessingShape" mc:Ignorable="w14 w15 w16se w16cid w16 w16cex w16sdtdh w16du wp14">
+<w:ftr xmlns:wpc="http://schemas.microsoft.com/office/word/2010/wordprocessingCanvas" xmlns:cx="http://schemas.microsoft.com/office/drawing/2014/chartex" xmlns:cx1="http://schemas.microsoft.com/office/drawing/2015/9/8/chartex" xmlns:cx2="http://schemas.microsoft.com/office/drawing/2015/10/21/chartex" xmlns:cx3="http://schemas.microsoft.com/office/drawing/2016/5/9/chartex" xmlns:cx4="http://schemas.microsoft.com/office/drawing/2016/5/10/chartex" xmlns:cx5="http://schemas.microsoft.com/office/drawing/2016/5/11/chartex" xmlns:cx6="http://schemas.microsoft.com/office/drawing/2016/5/12/chartex" xmlns:cx7="http://schemas.microsoft.com/office/drawing/2016/5/13/chartex" xmlns:cx8="http://schemas.microsoft.com/office/drawing/2016/5/14/chartex" xmlns:mc="http://schemas.openxmlformats.org/markup-compatibility/2006" xmlns:aink="http://schemas.microsoft.com/office/drawing/2016/ink" xmlns:am3d="http://schemas.microsoft.com/office/drawing/2017/model3d" xmlns:o="urn:schemas-microsoft-com:office:office" xmlns:oel="http://schemas.microsoft.com/office/2019/extlst" xmlns:r="http://schemas.openxmlformats.org/officeDocument/2006/relationships" xmlns:m="http://schemas.openxmlformats.org/officeDocument/2006/math" xmlns:v="urn:schemas-microsoft-com:vml" xmlns:wp14="http://schemas.microsoft.com/office/word/2010/wordprocessingDrawing" xmlns:wp="http://schemas.openxmlformats.org/drawingml/2006/wordprocessingDrawing" xmlns:w10="urn:schemas-microsoft-com:office:word" xmlns:w="http://schemas.openxmlformats.org/wordprocessingml/2006/main" xmlns:w14="http://schemas.microsoft.com/office/word/2010/wordml" xmlns:w15="http://schemas.microsoft.com/office/word/2012/wordml" xmlns:w16cex="http://schemas.microsoft.com/office/word/2018/wordml/cex" xmlns:w16cid="http://schemas.microsoft.com/office/word/2016/wordml/cid" xmlns:w16="http://schemas.microsoft.com/office/word/2018/wordml" xmlns:w16du="http://schemas.microsoft.com/office/word/2023/wordml/word16du" xmlns:w16sdtdh="http://schemas.microsoft.com/office/word/2020/wordml/sdtdatahash" xmlns:w16sdtfl="http://schemas.microsoft.com/office/word/2024/wordml/sdtformatlock" xmlns:w16se="http://schemas.microsoft.com/office/word/2015/wordml/symex" xmlns:wpg="http://schemas.microsoft.com/office/word/2010/wordprocessingGroup" xmlns:wpi="http://schemas.microsoft.com/office/word/2010/wordprocessingInk" xmlns:wne="http://schemas.microsoft.com/office/word/2006/wordml" xmlns:wps="http://schemas.microsoft.com/office/word/2010/wordprocessingShape" mc:Ignorable="w14 w15 w16se w16cid w16 w16cex w16sdtdh w16sdtfl w16du wp14">
   <w:p>
     <w:pPr>
       <w:rPr>
@@ -11830,7 +14286,7 @@
 </file>
 
 <file path=word/footnotes.xml><?xml version="1.0" encoding="utf-8"?>
-<w:footnotes xmlns:wpc="http://schemas.microsoft.com/office/word/2010/wordprocessingCanvas" xmlns:cx="http://schemas.microsoft.com/office/drawing/2014/chartex" xmlns:cx1="http://schemas.microsoft.com/office/drawing/2015/9/8/chartex" xmlns:cx2="http://schemas.microsoft.com/office/drawing/2015/10/21/chartex" xmlns:cx3="http://schemas.microsoft.com/office/drawing/2016/5/9/chartex" xmlns:cx4="http://schemas.microsoft.com/office/drawing/2016/5/10/chartex" xmlns:cx5="http://schemas.microsoft.com/office/drawing/2016/5/11/chartex" xmlns:cx6="http://schemas.microsoft.com/office/drawing/2016/5/12/chartex" xmlns:cx7="http://schemas.microsoft.com/office/drawing/2016/5/13/chartex" xmlns:cx8="http://schemas.microsoft.com/office/drawing/2016/5/14/chartex" xmlns:mc="http://schemas.openxmlformats.org/markup-compatibility/2006" xmlns:aink="http://schemas.microsoft.com/office/drawing/2016/ink" xmlns:am3d="http://schemas.microsoft.com/office/drawing/2017/model3d" xmlns:o="urn:schemas-microsoft-com:office:office" xmlns:oel="http://schemas.microsoft.com/office/2019/extlst" xmlns:r="http://schemas.openxmlformats.org/officeDocument/2006/relationships" xmlns:m="http://schemas.openxmlformats.org/officeDocument/2006/math" xmlns:v="urn:schemas-microsoft-com:vml" xmlns:wp14="http://schemas.microsoft.com/office/word/2010/wordprocessingDrawing" xmlns:wp="http://schemas.openxmlformats.org/drawingml/2006/wordprocessingDrawing" xmlns:w10="urn:schemas-microsoft-com:office:word" xmlns:w="http://schemas.openxmlformats.org/wordprocessingml/2006/main" xmlns:w14="http://schemas.microsoft.com/office/word/2010/wordml" xmlns:w15="http://schemas.microsoft.com/office/word/2012/wordml" xmlns:w16cex="http://schemas.microsoft.com/office/word/2018/wordml/cex" xmlns:w16cid="http://schemas.microsoft.com/office/word/2016/wordml/cid" xmlns:w16="http://schemas.microsoft.com/office/word/2018/wordml" xmlns:w16du="http://schemas.microsoft.com/office/word/2023/wordml/word16du" xmlns:w16sdtdh="http://schemas.microsoft.com/office/word/2020/wordml/sdtdatahash" xmlns:w16se="http://schemas.microsoft.com/office/word/2015/wordml/symex" xmlns:wpg="http://schemas.microsoft.com/office/word/2010/wordprocessingGroup" xmlns:wpi="http://schemas.microsoft.com/office/word/2010/wordprocessingInk" xmlns:wne="http://schemas.microsoft.com/office/word/2006/wordml" xmlns:wps="http://schemas.microsoft.com/office/word/2010/wordprocessingShape" mc:Ignorable="w14 w15 w16se w16cid w16 w16cex w16sdtdh w16du wp14">
+<w:footnotes xmlns:wpc="http://schemas.microsoft.com/office/word/2010/wordprocessingCanvas" xmlns:cx="http://schemas.microsoft.com/office/drawing/2014/chartex" xmlns:cx1="http://schemas.microsoft.com/office/drawing/2015/9/8/chartex" xmlns:cx2="http://schemas.microsoft.com/office/drawing/2015/10/21/chartex" xmlns:cx3="http://schemas.microsoft.com/office/drawing/2016/5/9/chartex" xmlns:cx4="http://schemas.microsoft.com/office/drawing/2016/5/10/chartex" xmlns:cx5="http://schemas.microsoft.com/office/drawing/2016/5/11/chartex" xmlns:cx6="http://schemas.microsoft.com/office/drawing/2016/5/12/chartex" xmlns:cx7="http://schemas.microsoft.com/office/drawing/2016/5/13/chartex" xmlns:cx8="http://schemas.microsoft.com/office/drawing/2016/5/14/chartex" xmlns:mc="http://schemas.openxmlformats.org/markup-compatibility/2006" xmlns:aink="http://schemas.microsoft.com/office/drawing/2016/ink" xmlns:am3d="http://schemas.microsoft.com/office/drawing/2017/model3d" xmlns:o="urn:schemas-microsoft-com:office:office" xmlns:oel="http://schemas.microsoft.com/office/2019/extlst" xmlns:r="http://schemas.openxmlformats.org/officeDocument/2006/relationships" xmlns:m="http://schemas.openxmlformats.org/officeDocument/2006/math" xmlns:v="urn:schemas-microsoft-com:vml" xmlns:wp14="http://schemas.microsoft.com/office/word/2010/wordprocessingDrawing" xmlns:wp="http://schemas.openxmlformats.org/drawingml/2006/wordprocessingDrawing" xmlns:w10="urn:schemas-microsoft-com:office:word" xmlns:w="http://schemas.openxmlformats.org/wordprocessingml/2006/main" xmlns:w14="http://schemas.microsoft.com/office/word/2010/wordml" xmlns:w15="http://schemas.microsoft.com/office/word/2012/wordml" xmlns:w16cex="http://schemas.microsoft.com/office/word/2018/wordml/cex" xmlns:w16cid="http://schemas.microsoft.com/office/word/2016/wordml/cid" xmlns:w16="http://schemas.microsoft.com/office/word/2018/wordml" xmlns:w16du="http://schemas.microsoft.com/office/word/2023/wordml/word16du" xmlns:w16sdtdh="http://schemas.microsoft.com/office/word/2020/wordml/sdtdatahash" xmlns:w16sdtfl="http://schemas.microsoft.com/office/word/2024/wordml/sdtformatlock" xmlns:w16se="http://schemas.microsoft.com/office/word/2015/wordml/symex" xmlns:wpg="http://schemas.microsoft.com/office/word/2010/wordprocessingGroup" xmlns:wpi="http://schemas.microsoft.com/office/word/2010/wordprocessingInk" xmlns:wne="http://schemas.microsoft.com/office/word/2006/wordml" xmlns:wps="http://schemas.microsoft.com/office/word/2010/wordprocessingShape" mc:Ignorable="w14 w15 w16se w16cid w16 w16cex w16sdtdh w16sdtfl w16du wp14">
   <w:footnote w:type="separator" w:id="-1">
     <w:p>
       <w:r>
@@ -11849,7 +14305,7 @@
 </file>
 
 <file path=word/header1.xml><?xml version="1.0" encoding="utf-8"?>
-<w:hdr xmlns:wpc="http://schemas.microsoft.com/office/word/2010/wordprocessingCanvas" xmlns:cx="http://schemas.microsoft.com/office/drawing/2014/chartex" xmlns:cx1="http://schemas.microsoft.com/office/drawing/2015/9/8/chartex" xmlns:cx2="http://schemas.microsoft.com/office/drawing/2015/10/21/chartex" xmlns:cx3="http://schemas.microsoft.com/office/drawing/2016/5/9/chartex" xmlns:cx4="http://schemas.microsoft.com/office/drawing/2016/5/10/chartex" xmlns:cx5="http://schemas.microsoft.com/office/drawing/2016/5/11/chartex" xmlns:cx6="http://schemas.microsoft.com/office/drawing/2016/5/12/chartex" xmlns:cx7="http://schemas.microsoft.com/office/drawing/2016/5/13/chartex" xmlns:cx8="http://schemas.microsoft.com/office/drawing/2016/5/14/chartex" xmlns:mc="http://schemas.openxmlformats.org/markup-compatibility/2006" xmlns:aink="http://schemas.microsoft.com/office/drawing/2016/ink" xmlns:am3d="http://schemas.microsoft.com/office/drawing/2017/model3d" xmlns:o="urn:schemas-microsoft-com:office:office" xmlns:oel="http://schemas.microsoft.com/office/2019/extlst" xmlns:r="http://schemas.openxmlformats.org/officeDocument/2006/relationships" xmlns:m="http://schemas.openxmlformats.org/officeDocument/2006/math" xmlns:v="urn:schemas-microsoft-com:vml" xmlns:wp14="http://schemas.microsoft.com/office/word/2010/wordprocessingDrawing" xmlns:wp="http://schemas.openxmlformats.org/drawingml/2006/wordprocessingDrawing" xmlns:w10="urn:schemas-microsoft-com:office:word" xmlns:w="http://schemas.openxmlformats.org/wordprocessingml/2006/main" xmlns:w14="http://schemas.microsoft.com/office/word/2010/wordml" xmlns:w15="http://schemas.microsoft.com/office/word/2012/wordml" xmlns:w16cex="http://schemas.microsoft.com/office/word/2018/wordml/cex" xmlns:w16cid="http://schemas.microsoft.com/office/word/2016/wordml/cid" xmlns:w16="http://schemas.microsoft.com/office/word/2018/wordml" xmlns:w16du="http://schemas.microsoft.com/office/word/2023/wordml/word16du" xmlns:w16sdtdh="http://schemas.microsoft.com/office/word/2020/wordml/sdtdatahash" xmlns:w16se="http://schemas.microsoft.com/office/word/2015/wordml/symex" xmlns:wpg="http://schemas.microsoft.com/office/word/2010/wordprocessingGroup" xmlns:wpi="http://schemas.microsoft.com/office/word/2010/wordprocessingInk" xmlns:wne="http://schemas.microsoft.com/office/word/2006/wordml" xmlns:wps="http://schemas.microsoft.com/office/word/2010/wordprocessingShape" mc:Ignorable="w14 w15 w16se w16cid w16 w16cex w16sdtdh w16du wp14">
+<w:hdr xmlns:wpc="http://schemas.microsoft.com/office/word/2010/wordprocessingCanvas" xmlns:cx="http://schemas.microsoft.com/office/drawing/2014/chartex" xmlns:cx1="http://schemas.microsoft.com/office/drawing/2015/9/8/chartex" xmlns:cx2="http://schemas.microsoft.com/office/drawing/2015/10/21/chartex" xmlns:cx3="http://schemas.microsoft.com/office/drawing/2016/5/9/chartex" xmlns:cx4="http://schemas.microsoft.com/office/drawing/2016/5/10/chartex" xmlns:cx5="http://schemas.microsoft.com/office/drawing/2016/5/11/chartex" xmlns:cx6="http://schemas.microsoft.com/office/drawing/2016/5/12/chartex" xmlns:cx7="http://schemas.microsoft.com/office/drawing/2016/5/13/chartex" xmlns:cx8="http://schemas.microsoft.com/office/drawing/2016/5/14/chartex" xmlns:mc="http://schemas.openxmlformats.org/markup-compatibility/2006" xmlns:aink="http://schemas.microsoft.com/office/drawing/2016/ink" xmlns:am3d="http://schemas.microsoft.com/office/drawing/2017/model3d" xmlns:o="urn:schemas-microsoft-com:office:office" xmlns:oel="http://schemas.microsoft.com/office/2019/extlst" xmlns:r="http://schemas.openxmlformats.org/officeDocument/2006/relationships" xmlns:m="http://schemas.openxmlformats.org/officeDocument/2006/math" xmlns:v="urn:schemas-microsoft-com:vml" xmlns:wp14="http://schemas.microsoft.com/office/word/2010/wordprocessingDrawing" xmlns:wp="http://schemas.openxmlformats.org/drawingml/2006/wordprocessingDrawing" xmlns:w10="urn:schemas-microsoft-com:office:word" xmlns:w="http://schemas.openxmlformats.org/wordprocessingml/2006/main" xmlns:w14="http://schemas.microsoft.com/office/word/2010/wordml" xmlns:w15="http://schemas.microsoft.com/office/word/2012/wordml" xmlns:w16cex="http://schemas.microsoft.com/office/word/2018/wordml/cex" xmlns:w16cid="http://schemas.microsoft.com/office/word/2016/wordml/cid" xmlns:w16="http://schemas.microsoft.com/office/word/2018/wordml" xmlns:w16du="http://schemas.microsoft.com/office/word/2023/wordml/word16du" xmlns:w16sdtdh="http://schemas.microsoft.com/office/word/2020/wordml/sdtdatahash" xmlns:w16sdtfl="http://schemas.microsoft.com/office/word/2024/wordml/sdtformatlock" xmlns:w16se="http://schemas.microsoft.com/office/word/2015/wordml/symex" xmlns:wpg="http://schemas.microsoft.com/office/word/2010/wordprocessingGroup" xmlns:wpi="http://schemas.microsoft.com/office/word/2010/wordprocessingInk" xmlns:wne="http://schemas.microsoft.com/office/word/2006/wordml" xmlns:wps="http://schemas.microsoft.com/office/word/2010/wordprocessingShape" mc:Ignorable="w14 w15 w16se w16cid w16 w16cex w16sdtdh w16sdtfl w16du wp14">
   <w:p>
     <w:pPr>
       <w:jc w:val="right"/>
@@ -11868,14 +14324,14 @@
   </w:p>
   <w:p>
     <w:pPr>
-      <w:pStyle w:val="Kopfzeile"/>
+      <w:pStyle w:val="Header"/>
     </w:pPr>
   </w:p>
 </w:hdr>
 </file>
 
 <file path=word/numbering.xml><?xml version="1.0" encoding="utf-8"?>
-<w:numbering xmlns:wpc="http://schemas.microsoft.com/office/word/2010/wordprocessingCanvas" xmlns:cx="http://schemas.microsoft.com/office/drawing/2014/chartex" xmlns:cx1="http://schemas.microsoft.com/office/drawing/2015/9/8/chartex" xmlns:cx2="http://schemas.microsoft.com/office/drawing/2015/10/21/chartex" xmlns:cx3="http://schemas.microsoft.com/office/drawing/2016/5/9/chartex" xmlns:cx4="http://schemas.microsoft.com/office/drawing/2016/5/10/chartex" xmlns:cx5="http://schemas.microsoft.com/office/drawing/2016/5/11/chartex" xmlns:cx6="http://schemas.microsoft.com/office/drawing/2016/5/12/chartex" xmlns:cx7="http://schemas.microsoft.com/office/drawing/2016/5/13/chartex" xmlns:cx8="http://schemas.microsoft.com/office/drawing/2016/5/14/chartex" xmlns:mc="http://schemas.openxmlformats.org/markup-compatibility/2006" xmlns:aink="http://schemas.microsoft.com/office/drawing/2016/ink" xmlns:am3d="http://schemas.microsoft.com/office/drawing/2017/model3d" xmlns:o="urn:schemas-microsoft-com:office:office" xmlns:oel="http://schemas.microsoft.com/office/2019/extlst" xmlns:r="http://schemas.openxmlformats.org/officeDocument/2006/relationships" xmlns:m="http://schemas.openxmlformats.org/officeDocument/2006/math" xmlns:v="urn:schemas-microsoft-com:vml" xmlns:wp14="http://schemas.microsoft.com/office/word/2010/wordprocessingDrawing" xmlns:wp="http://schemas.openxmlformats.org/drawingml/2006/wordprocessingDrawing" xmlns:w10="urn:schemas-microsoft-com:office:word" xmlns:w="http://schemas.openxmlformats.org/wordprocessingml/2006/main" xmlns:w14="http://schemas.microsoft.com/office/word/2010/wordml" xmlns:w15="http://schemas.microsoft.com/office/word/2012/wordml" xmlns:w16cex="http://schemas.microsoft.com/office/word/2018/wordml/cex" xmlns:w16cid="http://schemas.microsoft.com/office/word/2016/wordml/cid" xmlns:w16="http://schemas.microsoft.com/office/word/2018/wordml" xmlns:w16du="http://schemas.microsoft.com/office/word/2023/wordml/word16du" xmlns:w16sdtdh="http://schemas.microsoft.com/office/word/2020/wordml/sdtdatahash" xmlns:w16se="http://schemas.microsoft.com/office/word/2015/wordml/symex" xmlns:wpg="http://schemas.microsoft.com/office/word/2010/wordprocessingGroup" xmlns:wpi="http://schemas.microsoft.com/office/word/2010/wordprocessingInk" xmlns:wne="http://schemas.microsoft.com/office/word/2006/wordml" xmlns:wps="http://schemas.microsoft.com/office/word/2010/wordprocessingShape" mc:Ignorable="w14 w15 w16se w16cid w16 w16cex w16sdtdh w16du wp14">
+<w:numbering xmlns:wpc="http://schemas.microsoft.com/office/word/2010/wordprocessingCanvas" xmlns:cx="http://schemas.microsoft.com/office/drawing/2014/chartex" xmlns:cx1="http://schemas.microsoft.com/office/drawing/2015/9/8/chartex" xmlns:cx2="http://schemas.microsoft.com/office/drawing/2015/10/21/chartex" xmlns:cx3="http://schemas.microsoft.com/office/drawing/2016/5/9/chartex" xmlns:cx4="http://schemas.microsoft.com/office/drawing/2016/5/10/chartex" xmlns:cx5="http://schemas.microsoft.com/office/drawing/2016/5/11/chartex" xmlns:cx6="http://schemas.microsoft.com/office/drawing/2016/5/12/chartex" xmlns:cx7="http://schemas.microsoft.com/office/drawing/2016/5/13/chartex" xmlns:cx8="http://schemas.microsoft.com/office/drawing/2016/5/14/chartex" xmlns:mc="http://schemas.openxmlformats.org/markup-compatibility/2006" xmlns:aink="http://schemas.microsoft.com/office/drawing/2016/ink" xmlns:am3d="http://schemas.microsoft.com/office/drawing/2017/model3d" xmlns:o="urn:schemas-microsoft-com:office:office" xmlns:oel="http://schemas.microsoft.com/office/2019/extlst" xmlns:r="http://schemas.openxmlformats.org/officeDocument/2006/relationships" xmlns:m="http://schemas.openxmlformats.org/officeDocument/2006/math" xmlns:v="urn:schemas-microsoft-com:vml" xmlns:wp14="http://schemas.microsoft.com/office/word/2010/wordprocessingDrawing" xmlns:wp="http://schemas.openxmlformats.org/drawingml/2006/wordprocessingDrawing" xmlns:w10="urn:schemas-microsoft-com:office:word" xmlns:w="http://schemas.openxmlformats.org/wordprocessingml/2006/main" xmlns:w14="http://schemas.microsoft.com/office/word/2010/wordml" xmlns:w15="http://schemas.microsoft.com/office/word/2012/wordml" xmlns:w16cex="http://schemas.microsoft.com/office/word/2018/wordml/cex" xmlns:w16cid="http://schemas.microsoft.com/office/word/2016/wordml/cid" xmlns:w16="http://schemas.microsoft.com/office/word/2018/wordml" xmlns:w16du="http://schemas.microsoft.com/office/word/2023/wordml/word16du" xmlns:w16sdtdh="http://schemas.microsoft.com/office/word/2020/wordml/sdtdatahash" xmlns:w16sdtfl="http://schemas.microsoft.com/office/word/2024/wordml/sdtformatlock" xmlns:w16se="http://schemas.microsoft.com/office/word/2015/wordml/symex" xmlns:wpg="http://schemas.microsoft.com/office/word/2010/wordprocessingGroup" xmlns:wpi="http://schemas.microsoft.com/office/word/2010/wordprocessingInk" xmlns:wne="http://schemas.microsoft.com/office/word/2006/wordml" xmlns:wps="http://schemas.microsoft.com/office/word/2010/wordprocessingShape" mc:Ignorable="w14 w15 w16se w16cid w16 w16cex w16sdtdh w16sdtfl w16du wp14">
   <w:abstractNum w:abstractNumId="0" w15:restartNumberingAfterBreak="0">
     <w:nsid w:val="1B1649E7"/>
     <w:multiLevelType w:val="hybridMultilevel"/>
@@ -12085,7 +14541,7 @@
 </file>
 
 <file path=word/styles.xml><?xml version="1.0" encoding="utf-8"?>
-<w:styles xmlns:mc="http://schemas.openxmlformats.org/markup-compatibility/2006" xmlns:r="http://schemas.openxmlformats.org/officeDocument/2006/relationships" xmlns:w="http://schemas.openxmlformats.org/wordprocessingml/2006/main" xmlns:w14="http://schemas.microsoft.com/office/word/2010/wordml" xmlns:w15="http://schemas.microsoft.com/office/word/2012/wordml" xmlns:w16cex="http://schemas.microsoft.com/office/word/2018/wordml/cex" xmlns:w16cid="http://schemas.microsoft.com/office/word/2016/wordml/cid" xmlns:w16="http://schemas.microsoft.com/office/word/2018/wordml" xmlns:w16du="http://schemas.microsoft.com/office/word/2023/wordml/word16du" xmlns:w16sdtdh="http://schemas.microsoft.com/office/word/2020/wordml/sdtdatahash" xmlns:w16se="http://schemas.microsoft.com/office/word/2015/wordml/symex" mc:Ignorable="w14 w15 w16se w16cid w16 w16cex w16sdtdh w16du">
+<w:styles xmlns:mc="http://schemas.openxmlformats.org/markup-compatibility/2006" xmlns:r="http://schemas.openxmlformats.org/officeDocument/2006/relationships" xmlns:w="http://schemas.openxmlformats.org/wordprocessingml/2006/main" xmlns:w14="http://schemas.microsoft.com/office/word/2010/wordml" xmlns:w15="http://schemas.microsoft.com/office/word/2012/wordml" xmlns:w16cex="http://schemas.microsoft.com/office/word/2018/wordml/cex" xmlns:w16cid="http://schemas.microsoft.com/office/word/2016/wordml/cid" xmlns:w16="http://schemas.microsoft.com/office/word/2018/wordml" xmlns:w16du="http://schemas.microsoft.com/office/word/2023/wordml/word16du" xmlns:w16sdtdh="http://schemas.microsoft.com/office/word/2020/wordml/sdtdatahash" xmlns:w16sdtfl="http://schemas.microsoft.com/office/word/2024/wordml/sdtformatlock" xmlns:w16se="http://schemas.microsoft.com/office/word/2015/wordml/symex" mc:Ignorable="w14 w15 w16se w16cid w16 w16cex w16sdtdh w16sdtfl w16du">
   <w:docDefaults>
     <w:rPrDefault>
       <w:rPr>
@@ -12471,18 +14927,18 @@
     <w:lsdException w:name="List Table 7 Colorful Accent 6" w:uiPriority="52"/>
     <w:lsdException w:name="Smart Link" w:semiHidden="1" w:unhideWhenUsed="1"/>
   </w:latentStyles>
-  <w:style w:type="paragraph" w:default="1" w:styleId="Standard">
+  <w:style w:type="paragraph" w:default="1" w:styleId="Normal">
     <w:name w:val="Normal"/>
     <w:qFormat/>
-    <w:rsid w:val="00461742"/>
+    <w:rsid w:val="000776F2"/>
   </w:style>
-  <w:style w:type="character" w:default="1" w:styleId="Absatz-Standardschriftart">
+  <w:style w:type="character" w:default="1" w:styleId="DefaultParagraphFont">
     <w:name w:val="Default Paragraph Font"/>
     <w:uiPriority w:val="1"/>
     <w:semiHidden/>
     <w:unhideWhenUsed/>
   </w:style>
-  <w:style w:type="table" w:default="1" w:styleId="NormaleTabelle">
+  <w:style w:type="table" w:default="1" w:styleId="TableNormal">
     <w:name w:val="Normal Table"/>
     <w:uiPriority w:val="99"/>
     <w:semiHidden/>
@@ -12497,16 +14953,16 @@
       </w:tblCellMar>
     </w:tblPr>
   </w:style>
-  <w:style w:type="numbering" w:default="1" w:styleId="KeineListe">
+  <w:style w:type="numbering" w:default="1" w:styleId="NoList">
     <w:name w:val="No List"/>
     <w:uiPriority w:val="99"/>
     <w:semiHidden/>
     <w:unhideWhenUsed/>
   </w:style>
-  <w:style w:type="paragraph" w:styleId="Kopfzeile">
+  <w:style w:type="paragraph" w:styleId="Header">
     <w:name w:val="header"/>
-    <w:basedOn w:val="Standard"/>
-    <w:link w:val="KopfzeileZchn"/>
+    <w:basedOn w:val="Normal"/>
+    <w:link w:val="HeaderChar"/>
     <w:uiPriority w:val="99"/>
     <w:unhideWhenUsed/>
     <w:rsid w:val="00581DDA"/>
@@ -12517,17 +14973,17 @@
       </w:tabs>
     </w:pPr>
   </w:style>
-  <w:style w:type="character" w:customStyle="1" w:styleId="KopfzeileZchn">
-    <w:name w:val="Kopfzeile Zchn"/>
-    <w:basedOn w:val="Absatz-Standardschriftart"/>
-    <w:link w:val="Kopfzeile"/>
+  <w:style w:type="character" w:customStyle="1" w:styleId="HeaderChar">
+    <w:name w:val="Header Char"/>
+    <w:basedOn w:val="DefaultParagraphFont"/>
+    <w:link w:val="Header"/>
     <w:uiPriority w:val="99"/>
     <w:rsid w:val="00581DDA"/>
   </w:style>
-  <w:style w:type="paragraph" w:styleId="Fuzeile">
+  <w:style w:type="paragraph" w:styleId="Footer">
     <w:name w:val="footer"/>
-    <w:basedOn w:val="Standard"/>
-    <w:link w:val="FuzeileZchn"/>
+    <w:basedOn w:val="Normal"/>
+    <w:link w:val="FooterChar"/>
     <w:uiPriority w:val="99"/>
     <w:unhideWhenUsed/>
     <w:rsid w:val="00581DDA"/>
@@ -12538,24 +14994,24 @@
       </w:tabs>
     </w:pPr>
   </w:style>
-  <w:style w:type="character" w:customStyle="1" w:styleId="FuzeileZchn">
-    <w:name w:val="Fußzeile Zchn"/>
-    <w:basedOn w:val="Absatz-Standardschriftart"/>
-    <w:link w:val="Fuzeile"/>
+  <w:style w:type="character" w:customStyle="1" w:styleId="FooterChar">
+    <w:name w:val="Footer Char"/>
+    <w:basedOn w:val="DefaultParagraphFont"/>
+    <w:link w:val="Footer"/>
     <w:uiPriority w:val="99"/>
     <w:rsid w:val="00581DDA"/>
   </w:style>
-  <w:style w:type="character" w:styleId="Seitenzahl">
+  <w:style w:type="character" w:styleId="PageNumber">
     <w:name w:val="page number"/>
-    <w:basedOn w:val="Absatz-Standardschriftart"/>
+    <w:basedOn w:val="DefaultParagraphFont"/>
     <w:uiPriority w:val="99"/>
     <w:semiHidden/>
     <w:unhideWhenUsed/>
     <w:rsid w:val="00581DDA"/>
   </w:style>
-  <w:style w:type="table" w:styleId="Tabellenraster">
+  <w:style w:type="table" w:styleId="TableGrid">
     <w:name w:val="Table Grid"/>
-    <w:basedOn w:val="NormaleTabelle"/>
+    <w:basedOn w:val="TableNormal"/>
     <w:uiPriority w:val="39"/>
     <w:rsid w:val="00BE3CA1"/>
     <w:tblPr>
@@ -12569,10 +15025,10 @@
       </w:tblBorders>
     </w:tblPr>
   </w:style>
-  <w:style w:type="paragraph" w:styleId="Dokumentstruktur">
+  <w:style w:type="paragraph" w:styleId="DocumentMap">
     <w:name w:val="Document Map"/>
-    <w:basedOn w:val="Standard"/>
-    <w:link w:val="DokumentstrukturZchn"/>
+    <w:basedOn w:val="Normal"/>
+    <w:link w:val="DocumentMapChar"/>
     <w:uiPriority w:val="99"/>
     <w:semiHidden/>
     <w:unhideWhenUsed/>
@@ -12581,10 +15037,10 @@
       <w:rFonts w:ascii="Times New Roman" w:hAnsi="Times New Roman" w:cs="Times New Roman"/>
     </w:rPr>
   </w:style>
-  <w:style w:type="character" w:customStyle="1" w:styleId="DokumentstrukturZchn">
-    <w:name w:val="Dokumentstruktur Zchn"/>
-    <w:basedOn w:val="Absatz-Standardschriftart"/>
-    <w:link w:val="Dokumentstruktur"/>
+  <w:style w:type="character" w:customStyle="1" w:styleId="DocumentMapChar">
+    <w:name w:val="Document Map Char"/>
+    <w:basedOn w:val="DefaultParagraphFont"/>
+    <w:link w:val="DocumentMap"/>
     <w:uiPriority w:val="99"/>
     <w:semiHidden/>
     <w:rsid w:val="0081088A"/>
@@ -12592,9 +15048,9 @@
       <w:rFonts w:ascii="Times New Roman" w:hAnsi="Times New Roman" w:cs="Times New Roman"/>
     </w:rPr>
   </w:style>
-  <w:style w:type="paragraph" w:styleId="Listenabsatz">
+  <w:style w:type="paragraph" w:styleId="ListParagraph">
     <w:name w:val="List Paragraph"/>
-    <w:basedOn w:val="Standard"/>
+    <w:basedOn w:val="Normal"/>
     <w:uiPriority w:val="34"/>
     <w:qFormat/>
     <w:rsid w:val="00043A4C"/>
@@ -12603,10 +15059,10 @@
       <w:contextualSpacing/>
     </w:pPr>
   </w:style>
-  <w:style w:type="paragraph" w:styleId="Sprechblasentext">
+  <w:style w:type="paragraph" w:styleId="BalloonText">
     <w:name w:val="Balloon Text"/>
-    <w:basedOn w:val="Standard"/>
-    <w:link w:val="SprechblasentextZchn"/>
+    <w:basedOn w:val="Normal"/>
+    <w:link w:val="BalloonTextChar"/>
     <w:uiPriority w:val="99"/>
     <w:semiHidden/>
     <w:unhideWhenUsed/>
@@ -12617,10 +15073,10 @@
       <w:szCs w:val="16"/>
     </w:rPr>
   </w:style>
-  <w:style w:type="character" w:customStyle="1" w:styleId="SprechblasentextZchn">
-    <w:name w:val="Sprechblasentext Zchn"/>
-    <w:basedOn w:val="Absatz-Standardschriftart"/>
-    <w:link w:val="Sprechblasentext"/>
+  <w:style w:type="character" w:customStyle="1" w:styleId="BalloonTextChar">
+    <w:name w:val="Balloon Text Char"/>
+    <w:basedOn w:val="DefaultParagraphFont"/>
+    <w:link w:val="BalloonText"/>
     <w:uiPriority w:val="99"/>
     <w:semiHidden/>
     <w:rsid w:val="002233C4"/>
@@ -12630,7 +15086,7 @@
       <w:szCs w:val="16"/>
     </w:rPr>
   </w:style>
-  <w:style w:type="paragraph" w:styleId="KeinLeerraum">
+  <w:style w:type="paragraph" w:styleId="NoSpacing">
     <w:name w:val="No Spacing"/>
     <w:uiPriority w:val="1"/>
     <w:qFormat/>

</xml_diff>

<commit_message>
refactor: improve numeric formatting, mixture handling, and component metrics
- Replaced `valid_digit` with `format_scientific` for better numeric representation.
- Enhanced molar amount computation and reference molecular weight validation.
- Improved mixture support with new calculation and processing methods.
- Streamlined component metric handling with prefix-based conversions.
- Updated `Standard.docx` to reflect changes.
</commit_message>
<xml_diff>
--- a/lib/template/Standard.docx
+++ b/lib/template/Standard.docx
@@ -1,10 +1,10 @@
 
 <file path=word/document.xml><?xml version="1.0" encoding="utf-8"?>
-<w:document xmlns:wpc="http://schemas.microsoft.com/office/word/2010/wordprocessingCanvas" xmlns:cx="http://schemas.microsoft.com/office/drawing/2014/chartex" xmlns:cx1="http://schemas.microsoft.com/office/drawing/2015/9/8/chartex" xmlns:cx2="http://schemas.microsoft.com/office/drawing/2015/10/21/chartex" xmlns:cx3="http://schemas.microsoft.com/office/drawing/2016/5/9/chartex" xmlns:cx4="http://schemas.microsoft.com/office/drawing/2016/5/10/chartex" xmlns:cx5="http://schemas.microsoft.com/office/drawing/2016/5/11/chartex" xmlns:cx6="http://schemas.microsoft.com/office/drawing/2016/5/12/chartex" xmlns:cx7="http://schemas.microsoft.com/office/drawing/2016/5/13/chartex" xmlns:cx8="http://schemas.microsoft.com/office/drawing/2016/5/14/chartex" xmlns:mc="http://schemas.openxmlformats.org/markup-compatibility/2006" xmlns:aink="http://schemas.microsoft.com/office/drawing/2016/ink" xmlns:am3d="http://schemas.microsoft.com/office/drawing/2017/model3d" xmlns:o="urn:schemas-microsoft-com:office:office" xmlns:oel="http://schemas.microsoft.com/office/2019/extlst" xmlns:r="http://schemas.openxmlformats.org/officeDocument/2006/relationships" xmlns:m="http://schemas.openxmlformats.org/officeDocument/2006/math" xmlns:v="urn:schemas-microsoft-com:vml" xmlns:wp14="http://schemas.microsoft.com/office/word/2010/wordprocessingDrawing" xmlns:wp="http://schemas.openxmlformats.org/drawingml/2006/wordprocessingDrawing" xmlns:w10="urn:schemas-microsoft-com:office:word" xmlns:w="http://schemas.openxmlformats.org/wordprocessingml/2006/main" xmlns:w14="http://schemas.microsoft.com/office/word/2010/wordml" xmlns:w15="http://schemas.microsoft.com/office/word/2012/wordml" xmlns:w16cex="http://schemas.microsoft.com/office/word/2018/wordml/cex" xmlns:w16cid="http://schemas.microsoft.com/office/word/2016/wordml/cid" xmlns:w16="http://schemas.microsoft.com/office/word/2018/wordml" xmlns:w16du="http://schemas.microsoft.com/office/word/2023/wordml/word16du" xmlns:w16sdtdh="http://schemas.microsoft.com/office/word/2020/wordml/sdtdatahash" xmlns:w16se="http://schemas.microsoft.com/office/word/2015/wordml/symex" xmlns:wpg="http://schemas.microsoft.com/office/word/2010/wordprocessingGroup" xmlns:wpi="http://schemas.microsoft.com/office/word/2010/wordprocessingInk" xmlns:wne="http://schemas.microsoft.com/office/word/2006/wordml" xmlns:wps="http://schemas.microsoft.com/office/word/2010/wordprocessingShape" mc:Ignorable="w14 w15 w16se w16cid w16 w16cex w16sdtdh w16du wp14">
+<w:document xmlns:wpc="http://schemas.microsoft.com/office/word/2010/wordprocessingCanvas" xmlns:cx="http://schemas.microsoft.com/office/drawing/2014/chartex" xmlns:cx1="http://schemas.microsoft.com/office/drawing/2015/9/8/chartex" xmlns:cx2="http://schemas.microsoft.com/office/drawing/2015/10/21/chartex" xmlns:cx3="http://schemas.microsoft.com/office/drawing/2016/5/9/chartex" xmlns:cx4="http://schemas.microsoft.com/office/drawing/2016/5/10/chartex" xmlns:cx5="http://schemas.microsoft.com/office/drawing/2016/5/11/chartex" xmlns:cx6="http://schemas.microsoft.com/office/drawing/2016/5/12/chartex" xmlns:cx7="http://schemas.microsoft.com/office/drawing/2016/5/13/chartex" xmlns:cx8="http://schemas.microsoft.com/office/drawing/2016/5/14/chartex" xmlns:mc="http://schemas.openxmlformats.org/markup-compatibility/2006" xmlns:aink="http://schemas.microsoft.com/office/drawing/2016/ink" xmlns:am3d="http://schemas.microsoft.com/office/drawing/2017/model3d" xmlns:o="urn:schemas-microsoft-com:office:office" xmlns:oel="http://schemas.microsoft.com/office/2019/extlst" xmlns:r="http://schemas.openxmlformats.org/officeDocument/2006/relationships" xmlns:m="http://schemas.openxmlformats.org/officeDocument/2006/math" xmlns:v="urn:schemas-microsoft-com:vml" xmlns:wp14="http://schemas.microsoft.com/office/word/2010/wordprocessingDrawing" xmlns:wp="http://schemas.openxmlformats.org/drawingml/2006/wordprocessingDrawing" xmlns:w10="urn:schemas-microsoft-com:office:word" xmlns:w="http://schemas.openxmlformats.org/wordprocessingml/2006/main" xmlns:w14="http://schemas.microsoft.com/office/word/2010/wordml" xmlns:w15="http://schemas.microsoft.com/office/word/2012/wordml" xmlns:w16cex="http://schemas.microsoft.com/office/word/2018/wordml/cex" xmlns:w16cid="http://schemas.microsoft.com/office/word/2016/wordml/cid" xmlns:w16="http://schemas.microsoft.com/office/word/2018/wordml" xmlns:w16du="http://schemas.microsoft.com/office/word/2023/wordml/word16du" xmlns:w16sdtdh="http://schemas.microsoft.com/office/word/2020/wordml/sdtdatahash" xmlns:w16sdtfl="http://schemas.microsoft.com/office/word/2024/wordml/sdtformatlock" xmlns:w16se="http://schemas.microsoft.com/office/word/2015/wordml/symex" xmlns:wpg="http://schemas.microsoft.com/office/word/2010/wordprocessingGroup" xmlns:wpi="http://schemas.microsoft.com/office/word/2010/wordprocessingInk" xmlns:wne="http://schemas.microsoft.com/office/word/2006/wordml" xmlns:wps="http://schemas.microsoft.com/office/word/2010/wordprocessingShape" mc:Ignorable="w14 w15 w16se w16cid w16 w16cex w16sdtdh w16sdtfl w16du wp14">
   <w:body>
     <w:p>
       <w:pPr>
-        <w:pStyle w:val="KeinLeerraum"/>
+        <w:pStyle w:val="NoSpacing"/>
       </w:pPr>
       <w:fldSimple w:instr=" MERGEFIELD  =s.mass_unit \* MERGEFORMAT ">
         <w:r>
@@ -617,10 +617,10 @@
             <v:path o:extrusionok="f" gradientshapeok="t" o:connecttype="rect"/>
             <o:lock v:ext="edit" aspectratio="t"/>
           </v:shapetype>
-          <v:shape id="_x0000_i1025" type="#_x0000_t75" alt="" style="width:453.5pt;height:129pt;mso-width-percent:0;mso-height-percent:0;mso-width-percent:0;mso-height-percent:0" o:ole="">
+          <v:shape id="_x0000_i1025" type="#_x0000_t75" alt="" style="width:453.75pt;height:129pt;mso-width-percent:0;mso-height-percent:0;mso-width-percent:0;mso-height-percent:0" o:ole="">
             <v:imagedata r:id="rId9" o:title=""/>
           </v:shape>
-          <o:OLEObject Type="Embed" ProgID="ChemDraw.Document.6.0" ShapeID="_x0000_i1025" DrawAspect="Content" ObjectID="_1779608507" r:id="rId10"/>
+          <o:OLEObject Type="Embed" ProgID="ChemDraw.Document.6.0" ShapeID="_x0000_i1025" DrawAspect="Content" ObjectID="_1827064206" r:id="rId10"/>
         </w:object>
       </w:r>
       <w:r>
@@ -784,10 +784,10 @@
           <w:noProof/>
         </w:rPr>
         <w:object w:dxaOrig="18787" w:dyaOrig="5510" w14:anchorId="40B4FE74">
-          <v:shape id="_x0000_i1026" type="#_x0000_t75" alt="" style="width:453.5pt;height:129pt;mso-width-percent:0;mso-height-percent:0;mso-width-percent:0;mso-height-percent:0" o:ole="">
+          <v:shape id="_x0000_i1026" type="#_x0000_t75" alt="" style="width:453.75pt;height:129pt;mso-width-percent:0;mso-height-percent:0;mso-width-percent:0;mso-height-percent:0" o:ole="">
             <v:imagedata r:id="rId9" o:title=""/>
           </v:shape>
-          <o:OLEObject Type="Embed" ProgID="ChemDraw.Document.6.0" ShapeID="_x0000_i1026" DrawAspect="Content" ObjectID="_1779608508" r:id="rId11"/>
+          <o:OLEObject Type="Embed" ProgID="ChemDraw.Document.6.0" ShapeID="_x0000_i1026" DrawAspect="Content" ObjectID="_1827064207" r:id="rId11"/>
         </w:object>
       </w:r>
       <w:r>
@@ -960,7 +960,7 @@
     </w:p>
     <w:tbl>
       <w:tblPr>
-        <w:tblStyle w:val="Tabellenraster"/>
+        <w:tblStyle w:val="TableGrid"/>
         <w:tblW w:w="0" w:type="auto"/>
         <w:tblBorders>
           <w:top w:val="none" w:sz="0" w:space="0" w:color="auto"/>
@@ -1522,8 +1522,8 @@
     </w:p>
     <w:tbl>
       <w:tblPr>
-        <w:tblStyle w:val="Tabellenraster"/>
-        <w:tblW w:w="0" w:type="auto"/>
+        <w:tblStyle w:val="TableGrid"/>
+        <w:tblW w:w="9037" w:type="dxa"/>
         <w:tblBorders>
           <w:top w:val="none" w:sz="0" w:space="0" w:color="auto"/>
           <w:left w:val="none" w:sz="0" w:space="0" w:color="auto"/>
@@ -1537,12 +1537,18 @@
       </w:tblPr>
       <w:tblGrid>
         <w:gridCol w:w="337"/>
-        <w:gridCol w:w="1543"/>
-        <w:gridCol w:w="1191"/>
+        <w:gridCol w:w="383"/>
+        <w:gridCol w:w="360"/>
+        <w:gridCol w:w="800"/>
+        <w:gridCol w:w="1132"/>
+        <w:gridCol w:w="59"/>
         <w:gridCol w:w="1134"/>
-        <w:gridCol w:w="1203"/>
-        <w:gridCol w:w="1361"/>
-        <w:gridCol w:w="1134"/>
+        <w:gridCol w:w="313"/>
+        <w:gridCol w:w="890"/>
+        <w:gridCol w:w="616"/>
+        <w:gridCol w:w="745"/>
+        <w:gridCol w:w="761"/>
+        <w:gridCol w:w="373"/>
         <w:gridCol w:w="1134"/>
       </w:tblGrid>
       <w:tr>
@@ -1578,6 +1584,7 @@
         <w:tc>
           <w:tcPr>
             <w:tcW w:w="1543" w:type="dxa"/>
+            <w:gridSpan w:val="3"/>
           </w:tcPr>
           <w:p>
             <w:pPr>
@@ -1653,6 +1660,7 @@
         <w:tc>
           <w:tcPr>
             <w:tcW w:w="1191" w:type="dxa"/>
+            <w:gridSpan w:val="2"/>
           </w:tcPr>
           <w:p>
             <w:pPr>
@@ -1858,6 +1866,7 @@
         <w:tc>
           <w:tcPr>
             <w:tcW w:w="1203" w:type="dxa"/>
+            <w:gridSpan w:val="2"/>
           </w:tcPr>
           <w:p>
             <w:pPr>
@@ -1981,6 +1990,7 @@
         <w:tc>
           <w:tcPr>
             <w:tcW w:w="1361" w:type="dxa"/>
+            <w:gridSpan w:val="2"/>
           </w:tcPr>
           <w:p>
             <w:pPr>
@@ -2035,6 +2045,130 @@
                 <w:szCs w:val="18"/>
               </w:rPr>
               <w:t>«=s.density»</w:t>
+            </w:r>
+            <w:r>
+              <w:rPr>
+                <w:rFonts w:ascii="Arial" w:hAnsi="Arial" w:cs="Arial"/>
+                <w:noProof/>
+                <w:sz w:val="18"/>
+                <w:szCs w:val="18"/>
+              </w:rPr>
+              <w:fldChar w:fldCharType="end"/>
+            </w:r>
+          </w:p>
+        </w:tc>
+        <w:tc>
+          <w:tcPr>
+            <w:tcW w:w="1134" w:type="dxa"/>
+            <w:gridSpan w:val="2"/>
+          </w:tcPr>
+          <w:p>
+            <w:pPr>
+              <w:jc w:val="center"/>
+              <w:rPr>
+                <w:rFonts w:ascii="Arial" w:hAnsi="Arial" w:cs="Arial"/>
+                <w:noProof/>
+                <w:sz w:val="18"/>
+                <w:szCs w:val="18"/>
+              </w:rPr>
+            </w:pPr>
+            <w:r>
+              <w:rPr>
+                <w:rFonts w:ascii="Arial" w:hAnsi="Arial" w:cs="Arial"/>
+                <w:noProof/>
+                <w:sz w:val="18"/>
+                <w:szCs w:val="18"/>
+              </w:rPr>
+              <w:fldChar w:fldCharType="begin"/>
+            </w:r>
+            <w:r>
+              <w:rPr>
+                <w:rFonts w:ascii="Arial" w:hAnsi="Arial" w:cs="Arial"/>
+                <w:noProof/>
+                <w:sz w:val="18"/>
+                <w:szCs w:val="18"/>
+              </w:rPr>
+              <w:instrText xml:space="preserve"> MERGEFIELD =s.mol </w:instrText>
+            </w:r>
+            <w:r>
+              <w:rPr>
+                <w:rFonts w:ascii="Arial" w:hAnsi="Arial" w:cs="Arial"/>
+                <w:sz w:val="18"/>
+                <w:szCs w:val="18"/>
+              </w:rPr>
+              <w:instrText xml:space="preserve">\* MERGEFORMAT </w:instrText>
+            </w:r>
+            <w:r>
+              <w:rPr>
+                <w:rFonts w:ascii="Arial" w:hAnsi="Arial" w:cs="Arial"/>
+                <w:noProof/>
+                <w:sz w:val="18"/>
+                <w:szCs w:val="18"/>
+              </w:rPr>
+              <w:fldChar w:fldCharType="separate"/>
+            </w:r>
+            <w:r>
+              <w:rPr>
+                <w:rFonts w:ascii="Arial" w:hAnsi="Arial" w:cs="Arial"/>
+                <w:noProof/>
+                <w:sz w:val="18"/>
+                <w:szCs w:val="18"/>
+              </w:rPr>
+              <w:t>«=s.mol»</w:t>
+            </w:r>
+            <w:r>
+              <w:rPr>
+                <w:rFonts w:ascii="Arial" w:hAnsi="Arial" w:cs="Arial"/>
+                <w:noProof/>
+                <w:sz w:val="18"/>
+                <w:szCs w:val="18"/>
+              </w:rPr>
+              <w:fldChar w:fldCharType="end"/>
+            </w:r>
+            <w:r>
+              <w:rPr>
+                <w:rFonts w:ascii="Arial" w:hAnsi="Arial" w:cs="Arial"/>
+                <w:noProof/>
+                <w:sz w:val="18"/>
+                <w:szCs w:val="18"/>
+              </w:rPr>
+              <w:t xml:space="preserve"> </w:t>
+            </w:r>
+            <w:r>
+              <w:rPr>
+                <w:rFonts w:ascii="Arial" w:hAnsi="Arial" w:cs="Arial"/>
+                <w:noProof/>
+                <w:sz w:val="18"/>
+                <w:szCs w:val="18"/>
+              </w:rPr>
+              <w:fldChar w:fldCharType="begin"/>
+            </w:r>
+            <w:r>
+              <w:rPr>
+                <w:rFonts w:ascii="Arial" w:hAnsi="Arial" w:cs="Arial"/>
+                <w:noProof/>
+                <w:sz w:val="18"/>
+                <w:szCs w:val="18"/>
+              </w:rPr>
+              <w:instrText xml:space="preserve"> MERGEFIELD  =s.mmol_unit  \* MERGEFORMAT </w:instrText>
+            </w:r>
+            <w:r>
+              <w:rPr>
+                <w:rFonts w:ascii="Arial" w:hAnsi="Arial" w:cs="Arial"/>
+                <w:noProof/>
+                <w:sz w:val="18"/>
+                <w:szCs w:val="18"/>
+              </w:rPr>
+              <w:fldChar w:fldCharType="separate"/>
+            </w:r>
+            <w:r>
+              <w:rPr>
+                <w:rFonts w:ascii="Arial" w:hAnsi="Arial" w:cs="Arial"/>
+                <w:noProof/>
+                <w:sz w:val="18"/>
+                <w:szCs w:val="18"/>
+              </w:rPr>
+              <w:t>«=s.mmol_unit»</w:t>
             </w:r>
             <w:r>
               <w:rPr>
@@ -2077,7 +2211,7 @@
                 <w:sz w:val="18"/>
                 <w:szCs w:val="18"/>
               </w:rPr>
-              <w:instrText xml:space="preserve"> MERGEFIELD =s.mol </w:instrText>
+              <w:instrText xml:space="preserve"> MERGEFIELD =s.equiv </w:instrText>
             </w:r>
             <w:r>
               <w:rPr>
@@ -2103,7 +2237,7 @@
                 <w:sz w:val="18"/>
                 <w:szCs w:val="18"/>
               </w:rPr>
-              <w:t>«=s.mol»</w:t>
+              <w:t>«=s.equiv»</w:t>
             </w:r>
             <w:r>
               <w:rPr>
@@ -2114,19 +2248,30 @@
               </w:rPr>
               <w:fldChar w:fldCharType="end"/>
             </w:r>
-            <w:r>
-              <w:rPr>
-                <w:rFonts w:ascii="Arial" w:hAnsi="Arial" w:cs="Arial"/>
-                <w:noProof/>
-                <w:sz w:val="18"/>
-                <w:szCs w:val="18"/>
-              </w:rPr>
-              <w:t xml:space="preserve"> </w:t>
-            </w:r>
-            <w:r>
-              <w:rPr>
-                <w:rFonts w:ascii="Arial" w:hAnsi="Arial" w:cs="Arial"/>
-                <w:noProof/>
+          </w:p>
+        </w:tc>
+      </w:tr>
+      <w:tr>
+        <w:trPr>
+          <w:trHeight w:val="255"/>
+        </w:trPr>
+        <w:tc>
+          <w:tcPr>
+            <w:tcW w:w="9037" w:type="dxa"/>
+            <w:gridSpan w:val="14"/>
+          </w:tcPr>
+          <w:p>
+            <w:pPr>
+              <w:rPr>
+                <w:rFonts w:ascii="Arial" w:hAnsi="Arial" w:cs="Arial"/>
+                <w:noProof/>
+                <w:sz w:val="18"/>
+                <w:szCs w:val="18"/>
+              </w:rPr>
+            </w:pPr>
+            <w:r>
+              <w:rPr>
+                <w:rFonts w:ascii="Arial" w:hAnsi="Arial" w:cs="Arial"/>
                 <w:sz w:val="18"/>
                 <w:szCs w:val="18"/>
               </w:rPr>
@@ -2135,16 +2280,14 @@
             <w:r>
               <w:rPr>
                 <w:rFonts w:ascii="Arial" w:hAnsi="Arial" w:cs="Arial"/>
-                <w:noProof/>
-                <w:sz w:val="18"/>
-                <w:szCs w:val="18"/>
-              </w:rPr>
-              <w:instrText xml:space="preserve"> MERGEFIELD  =s.mmol_unit  \* MERGEFORMAT </w:instrText>
-            </w:r>
-            <w:r>
-              <w:rPr>
-                <w:rFonts w:ascii="Arial" w:hAnsi="Arial" w:cs="Arial"/>
-                <w:noProof/>
+                <w:sz w:val="18"/>
+                <w:szCs w:val="18"/>
+              </w:rPr>
+              <w:instrText xml:space="preserve"> MERGEFIELD  s.components:if  \* MERGEFORMAT </w:instrText>
+            </w:r>
+            <w:r>
+              <w:rPr>
+                <w:rFonts w:ascii="Arial" w:hAnsi="Arial" w:cs="Arial"/>
                 <w:sz w:val="18"/>
                 <w:szCs w:val="18"/>
               </w:rPr>
@@ -2157,65 +2300,214 @@
                 <w:sz w:val="18"/>
                 <w:szCs w:val="18"/>
               </w:rPr>
-              <w:t>«=s.mmol_unit»</w:t>
-            </w:r>
-            <w:r>
-              <w:rPr>
-                <w:rFonts w:ascii="Arial" w:hAnsi="Arial" w:cs="Arial"/>
-                <w:noProof/>
+              <w:t>«s.components:if»</w:t>
+            </w:r>
+            <w:r>
+              <w:rPr>
+                <w:rFonts w:ascii="Arial" w:hAnsi="Arial" w:cs="Arial"/>
                 <w:sz w:val="18"/>
                 <w:szCs w:val="18"/>
               </w:rPr>
               <w:fldChar w:fldCharType="end"/>
             </w:r>
+          </w:p>
+        </w:tc>
+      </w:tr>
+      <w:tr>
+        <w:trPr>
+          <w:trHeight w:val="255"/>
+        </w:trPr>
+        <w:tc>
+          <w:tcPr>
+            <w:tcW w:w="720" w:type="dxa"/>
+            <w:gridSpan w:val="2"/>
+          </w:tcPr>
+          <w:p>
+            <w:pPr>
+              <w:rPr>
+                <w:rFonts w:ascii="Arial" w:hAnsi="Arial" w:cs="Arial"/>
+                <w:sz w:val="14"/>
+                <w:szCs w:val="14"/>
+              </w:rPr>
+            </w:pPr>
           </w:p>
         </w:tc>
         <w:tc>
           <w:tcPr>
-            <w:tcW w:w="1134" w:type="dxa"/>
+            <w:tcW w:w="2292" w:type="dxa"/>
+            <w:gridSpan w:val="3"/>
+            <w:tcBorders>
+              <w:top w:val="single" w:sz="4" w:space="0" w:color="auto"/>
+              <w:left w:val="nil"/>
+              <w:bottom w:val="single" w:sz="4" w:space="0" w:color="auto"/>
+            </w:tcBorders>
           </w:tcPr>
           <w:p>
             <w:pPr>
               <w:jc w:val="center"/>
               <w:rPr>
                 <w:rFonts w:ascii="Arial" w:hAnsi="Arial" w:cs="Arial"/>
-                <w:noProof/>
-                <w:sz w:val="18"/>
-                <w:szCs w:val="18"/>
+                <w:sz w:val="14"/>
+                <w:szCs w:val="14"/>
               </w:rPr>
             </w:pPr>
             <w:r>
               <w:rPr>
                 <w:rFonts w:ascii="Arial" w:hAnsi="Arial" w:cs="Arial"/>
-                <w:noProof/>
-                <w:sz w:val="18"/>
-                <w:szCs w:val="18"/>
+                <w:sz w:val="14"/>
+                <w:szCs w:val="14"/>
+              </w:rPr>
+              <w:t>Component</w:t>
+            </w:r>
+          </w:p>
+        </w:tc>
+        <w:tc>
+          <w:tcPr>
+            <w:tcW w:w="1506" w:type="dxa"/>
+            <w:gridSpan w:val="3"/>
+            <w:tcBorders>
+              <w:top w:val="single" w:sz="4" w:space="0" w:color="auto"/>
+              <w:bottom w:val="single" w:sz="4" w:space="0" w:color="auto"/>
+            </w:tcBorders>
+          </w:tcPr>
+          <w:p>
+            <w:pPr>
+              <w:jc w:val="center"/>
+              <w:rPr>
+                <w:rFonts w:ascii="Arial" w:hAnsi="Arial" w:cs="Arial"/>
+                <w:sz w:val="14"/>
+                <w:szCs w:val="14"/>
+              </w:rPr>
+            </w:pPr>
+            <w:r>
+              <w:rPr>
+                <w:rFonts w:ascii="Arial" w:hAnsi="Arial" w:cs="Arial"/>
+                <w:sz w:val="14"/>
+                <w:szCs w:val="14"/>
+              </w:rPr>
+              <w:t>Amount</w:t>
+            </w:r>
+          </w:p>
+        </w:tc>
+        <w:tc>
+          <w:tcPr>
+            <w:tcW w:w="1506" w:type="dxa"/>
+            <w:gridSpan w:val="2"/>
+            <w:tcBorders>
+              <w:top w:val="single" w:sz="4" w:space="0" w:color="auto"/>
+              <w:bottom w:val="single" w:sz="4" w:space="0" w:color="auto"/>
+            </w:tcBorders>
+          </w:tcPr>
+          <w:p>
+            <w:pPr>
+              <w:jc w:val="center"/>
+              <w:rPr>
+                <w:rFonts w:ascii="Arial" w:hAnsi="Arial" w:cs="Arial"/>
+                <w:sz w:val="14"/>
+                <w:szCs w:val="14"/>
+              </w:rPr>
+            </w:pPr>
+            <w:r>
+              <w:rPr>
+                <w:rFonts w:ascii="Arial" w:hAnsi="Arial" w:cs="Arial"/>
+                <w:sz w:val="14"/>
+                <w:szCs w:val="14"/>
+              </w:rPr>
+              <w:t>Rel. MW</w:t>
+            </w:r>
+          </w:p>
+        </w:tc>
+        <w:tc>
+          <w:tcPr>
+            <w:tcW w:w="1506" w:type="dxa"/>
+            <w:gridSpan w:val="2"/>
+            <w:tcBorders>
+              <w:top w:val="single" w:sz="4" w:space="0" w:color="auto"/>
+              <w:bottom w:val="single" w:sz="4" w:space="0" w:color="auto"/>
+            </w:tcBorders>
+          </w:tcPr>
+          <w:p>
+            <w:pPr>
+              <w:jc w:val="center"/>
+              <w:rPr>
+                <w:rFonts w:ascii="Arial" w:hAnsi="Arial" w:cs="Arial"/>
+                <w:sz w:val="14"/>
+                <w:szCs w:val="14"/>
+              </w:rPr>
+            </w:pPr>
+            <w:r>
+              <w:rPr>
+                <w:rFonts w:ascii="Arial" w:hAnsi="Arial" w:cs="Arial"/>
+                <w:sz w:val="14"/>
+                <w:szCs w:val="14"/>
+              </w:rPr>
+              <w:t>Conc</w:t>
+            </w:r>
+          </w:p>
+        </w:tc>
+        <w:tc>
+          <w:tcPr>
+            <w:tcW w:w="1507" w:type="dxa"/>
+            <w:gridSpan w:val="2"/>
+          </w:tcPr>
+          <w:p>
+            <w:pPr>
+              <w:jc w:val="center"/>
+              <w:rPr>
+                <w:rFonts w:ascii="Arial" w:hAnsi="Arial" w:cs="Arial"/>
+                <w:sz w:val="14"/>
+                <w:szCs w:val="14"/>
+              </w:rPr>
+            </w:pPr>
+            <w:r>
+              <w:rPr>
+                <w:rFonts w:ascii="Arial" w:hAnsi="Arial" w:cs="Arial"/>
+                <w:sz w:val="14"/>
+                <w:szCs w:val="14"/>
+              </w:rPr>
+              <w:t>Ratio</w:t>
+            </w:r>
+          </w:p>
+        </w:tc>
+      </w:tr>
+      <w:tr>
+        <w:trPr>
+          <w:trHeight w:val="255"/>
+        </w:trPr>
+        <w:tc>
+          <w:tcPr>
+            <w:tcW w:w="9037" w:type="dxa"/>
+            <w:gridSpan w:val="14"/>
+          </w:tcPr>
+          <w:p>
+            <w:pPr>
+              <w:rPr>
+                <w:rFonts w:ascii="Arial" w:hAnsi="Arial" w:cs="Arial"/>
+                <w:sz w:val="14"/>
+                <w:szCs w:val="14"/>
+              </w:rPr>
+            </w:pPr>
+            <w:r>
+              <w:rPr>
+                <w:rFonts w:ascii="Arial" w:hAnsi="Arial" w:cs="Arial"/>
+                <w:sz w:val="14"/>
+                <w:szCs w:val="14"/>
               </w:rPr>
               <w:fldChar w:fldCharType="begin"/>
             </w:r>
             <w:r>
               <w:rPr>
                 <w:rFonts w:ascii="Arial" w:hAnsi="Arial" w:cs="Arial"/>
-                <w:noProof/>
-                <w:sz w:val="18"/>
-                <w:szCs w:val="18"/>
-              </w:rPr>
-              <w:instrText xml:space="preserve"> MERGEFIELD =s.equiv </w:instrText>
-            </w:r>
-            <w:r>
-              <w:rPr>
-                <w:rFonts w:ascii="Arial" w:hAnsi="Arial" w:cs="Arial"/>
-                <w:sz w:val="18"/>
-                <w:szCs w:val="18"/>
-              </w:rPr>
-              <w:instrText xml:space="preserve">\* MERGEFORMAT </w:instrText>
-            </w:r>
-            <w:r>
-              <w:rPr>
-                <w:rFonts w:ascii="Arial" w:hAnsi="Arial" w:cs="Arial"/>
-                <w:noProof/>
-                <w:sz w:val="18"/>
-                <w:szCs w:val="18"/>
+                <w:sz w:val="14"/>
+                <w:szCs w:val="14"/>
+              </w:rPr>
+              <w:instrText xml:space="preserve"> MERGEFIELD  s.components:each(comp)  \* MERGEFORMAT </w:instrText>
+            </w:r>
+            <w:r>
+              <w:rPr>
+                <w:rFonts w:ascii="Arial" w:hAnsi="Arial" w:cs="Arial"/>
+                <w:sz w:val="14"/>
+                <w:szCs w:val="14"/>
               </w:rPr>
               <w:fldChar w:fldCharType="separate"/>
             </w:r>
@@ -2223,15 +2515,671 @@
               <w:rPr>
                 <w:rFonts w:ascii="Arial" w:hAnsi="Arial" w:cs="Arial"/>
                 <w:noProof/>
-                <w:sz w:val="18"/>
-                <w:szCs w:val="18"/>
-              </w:rPr>
-              <w:t>«=s.equiv»</w:t>
-            </w:r>
-            <w:r>
-              <w:rPr>
-                <w:rFonts w:ascii="Arial" w:hAnsi="Arial" w:cs="Arial"/>
-                <w:noProof/>
+                <w:sz w:val="14"/>
+                <w:szCs w:val="14"/>
+              </w:rPr>
+              <w:t>«s.components:each(comp)»</w:t>
+            </w:r>
+            <w:r>
+              <w:rPr>
+                <w:rFonts w:ascii="Arial" w:hAnsi="Arial" w:cs="Arial"/>
+                <w:sz w:val="14"/>
+                <w:szCs w:val="14"/>
+              </w:rPr>
+              <w:fldChar w:fldCharType="end"/>
+            </w:r>
+          </w:p>
+        </w:tc>
+      </w:tr>
+      <w:tr>
+        <w:trPr>
+          <w:trHeight w:val="255"/>
+        </w:trPr>
+        <w:tc>
+          <w:tcPr>
+            <w:tcW w:w="720" w:type="dxa"/>
+            <w:gridSpan w:val="2"/>
+          </w:tcPr>
+          <w:p>
+            <w:pPr>
+              <w:rPr>
+                <w:rFonts w:ascii="Arial" w:hAnsi="Arial" w:cs="Arial"/>
+                <w:sz w:val="14"/>
+                <w:szCs w:val="14"/>
+              </w:rPr>
+            </w:pPr>
+          </w:p>
+        </w:tc>
+        <w:tc>
+          <w:tcPr>
+            <w:tcW w:w="360" w:type="dxa"/>
+            <w:tcBorders>
+              <w:left w:val="nil"/>
+            </w:tcBorders>
+          </w:tcPr>
+          <w:p>
+            <w:pPr>
+              <w:jc w:val="center"/>
+              <w:rPr>
+                <w:rFonts w:ascii="Arial" w:hAnsi="Arial" w:cs="Arial"/>
+                <w:sz w:val="14"/>
+                <w:szCs w:val="14"/>
+              </w:rPr>
+            </w:pPr>
+            <w:r>
+              <w:rPr>
+                <w:rFonts w:ascii="Arial" w:hAnsi="Arial" w:cs="Arial"/>
+                <w:noProof/>
+                <w:color w:val="833C0B" w:themeColor="accent2" w:themeShade="80"/>
+                <w:sz w:val="14"/>
+                <w:szCs w:val="14"/>
+              </w:rPr>
+              <w:t>C</w:t>
+            </w:r>
+          </w:p>
+        </w:tc>
+        <w:tc>
+          <w:tcPr>
+            <w:tcW w:w="1932" w:type="dxa"/>
+            <w:gridSpan w:val="2"/>
+          </w:tcPr>
+          <w:p>
+            <w:pPr>
+              <w:jc w:val="center"/>
+              <w:rPr>
+                <w:rFonts w:ascii="Arial" w:hAnsi="Arial" w:cs="Arial"/>
+                <w:sz w:val="14"/>
+                <w:szCs w:val="14"/>
+              </w:rPr>
+            </w:pPr>
+            <w:r>
+              <w:rPr>
+                <w:rFonts w:ascii="Arial" w:hAnsi="Arial" w:cs="Arial"/>
+                <w:noProof/>
+                <w:color w:val="833C0B" w:themeColor="accent2" w:themeShade="80"/>
+                <w:sz w:val="14"/>
+                <w:szCs w:val="14"/>
+              </w:rPr>
+              <w:fldChar w:fldCharType="begin"/>
+            </w:r>
+            <w:r>
+              <w:rPr>
+                <w:rFonts w:ascii="Arial" w:hAnsi="Arial" w:cs="Arial"/>
+                <w:noProof/>
+                <w:color w:val="833C0B" w:themeColor="accent2" w:themeShade="80"/>
+                <w:sz w:val="14"/>
+                <w:szCs w:val="14"/>
+              </w:rPr>
+              <w:instrText xml:space="preserve"> MERGEFIELD  =comp.name  \* MERGEFORMAT </w:instrText>
+            </w:r>
+            <w:r>
+              <w:rPr>
+                <w:rFonts w:ascii="Arial" w:hAnsi="Arial" w:cs="Arial"/>
+                <w:noProof/>
+                <w:color w:val="833C0B" w:themeColor="accent2" w:themeShade="80"/>
+                <w:sz w:val="14"/>
+                <w:szCs w:val="14"/>
+              </w:rPr>
+              <w:fldChar w:fldCharType="separate"/>
+            </w:r>
+            <w:r>
+              <w:rPr>
+                <w:rFonts w:ascii="Arial" w:hAnsi="Arial" w:cs="Arial"/>
+                <w:noProof/>
+                <w:color w:val="833C0B" w:themeColor="accent2" w:themeShade="80"/>
+                <w:sz w:val="14"/>
+                <w:szCs w:val="14"/>
+              </w:rPr>
+              <w:t>«=comp.name»</w:t>
+            </w:r>
+            <w:r>
+              <w:rPr>
+                <w:rFonts w:ascii="Arial" w:hAnsi="Arial" w:cs="Arial"/>
+                <w:noProof/>
+                <w:color w:val="833C0B" w:themeColor="accent2" w:themeShade="80"/>
+                <w:sz w:val="14"/>
+                <w:szCs w:val="14"/>
+              </w:rPr>
+              <w:fldChar w:fldCharType="end"/>
+            </w:r>
+          </w:p>
+        </w:tc>
+        <w:tc>
+          <w:tcPr>
+            <w:tcW w:w="1506" w:type="dxa"/>
+            <w:gridSpan w:val="3"/>
+          </w:tcPr>
+          <w:p>
+            <w:pPr>
+              <w:jc w:val="center"/>
+              <w:rPr>
+                <w:rFonts w:ascii="Arial" w:hAnsi="Arial" w:cs="Arial"/>
+                <w:sz w:val="14"/>
+                <w:szCs w:val="14"/>
+              </w:rPr>
+            </w:pPr>
+            <w:r>
+              <w:rPr>
+                <w:rFonts w:ascii="Arial" w:hAnsi="Arial" w:cs="Arial"/>
+                <w:noProof/>
+                <w:color w:val="000000"/>
+                <w:sz w:val="14"/>
+                <w:szCs w:val="14"/>
+              </w:rPr>
+              <w:fldChar w:fldCharType="begin"/>
+            </w:r>
+            <w:r>
+              <w:rPr>
+                <w:rFonts w:ascii="Arial" w:hAnsi="Arial" w:cs="Arial"/>
+                <w:noProof/>
+                <w:color w:val="000000"/>
+                <w:sz w:val="14"/>
+                <w:szCs w:val="14"/>
+              </w:rPr>
+              <w:instrText xml:space="preserve"> MERGEFIELD  =comp.amount_mol  \* MERGEFORMAT </w:instrText>
+            </w:r>
+            <w:r>
+              <w:rPr>
+                <w:rFonts w:ascii="Arial" w:hAnsi="Arial" w:cs="Arial"/>
+                <w:noProof/>
+                <w:color w:val="000000"/>
+                <w:sz w:val="14"/>
+                <w:szCs w:val="14"/>
+              </w:rPr>
+              <w:fldChar w:fldCharType="separate"/>
+            </w:r>
+            <w:r>
+              <w:rPr>
+                <w:rFonts w:ascii="Arial" w:hAnsi="Arial" w:cs="Arial"/>
+                <w:noProof/>
+                <w:color w:val="000000"/>
+                <w:sz w:val="14"/>
+                <w:szCs w:val="14"/>
+              </w:rPr>
+              <w:t>«=comp.amount_mol»</w:t>
+            </w:r>
+            <w:r>
+              <w:rPr>
+                <w:rFonts w:ascii="Arial" w:hAnsi="Arial" w:cs="Arial"/>
+                <w:noProof/>
+                <w:color w:val="000000"/>
+                <w:sz w:val="14"/>
+                <w:szCs w:val="14"/>
+              </w:rPr>
+              <w:fldChar w:fldCharType="end"/>
+            </w:r>
+            <w:r>
+              <w:rPr>
+                <w:rFonts w:ascii="Arial" w:hAnsi="Arial" w:cs="Arial"/>
+                <w:noProof/>
+                <w:color w:val="000000"/>
+                <w:sz w:val="14"/>
+                <w:szCs w:val="14"/>
+              </w:rPr>
+              <w:t xml:space="preserve"> </w:t>
+            </w:r>
+            <w:r>
+              <w:rPr>
+                <w:rFonts w:ascii="Arial" w:hAnsi="Arial" w:cs="Arial"/>
+                <w:noProof/>
+                <w:color w:val="000000"/>
+                <w:sz w:val="14"/>
+                <w:szCs w:val="14"/>
+              </w:rPr>
+              <w:fldChar w:fldCharType="begin"/>
+            </w:r>
+            <w:r>
+              <w:rPr>
+                <w:rFonts w:ascii="Arial" w:hAnsi="Arial" w:cs="Arial"/>
+                <w:noProof/>
+                <w:color w:val="000000"/>
+                <w:sz w:val="14"/>
+                <w:szCs w:val="14"/>
+              </w:rPr>
+              <w:instrText xml:space="preserve"> MERGEFIELD  =comp.amount_mol_unit  \* MERGEFORMAT </w:instrText>
+            </w:r>
+            <w:r>
+              <w:rPr>
+                <w:rFonts w:ascii="Arial" w:hAnsi="Arial" w:cs="Arial"/>
+                <w:noProof/>
+                <w:color w:val="000000"/>
+                <w:sz w:val="14"/>
+                <w:szCs w:val="14"/>
+              </w:rPr>
+              <w:fldChar w:fldCharType="separate"/>
+            </w:r>
+            <w:r>
+              <w:rPr>
+                <w:rFonts w:ascii="Arial" w:hAnsi="Arial" w:cs="Arial"/>
+                <w:noProof/>
+                <w:color w:val="000000"/>
+                <w:sz w:val="14"/>
+                <w:szCs w:val="14"/>
+              </w:rPr>
+              <w:t>«=comp.amount_mol_unit»</w:t>
+            </w:r>
+            <w:r>
+              <w:rPr>
+                <w:rFonts w:ascii="Arial" w:hAnsi="Arial" w:cs="Arial"/>
+                <w:noProof/>
+                <w:color w:val="000000"/>
+                <w:sz w:val="14"/>
+                <w:szCs w:val="14"/>
+              </w:rPr>
+              <w:fldChar w:fldCharType="end"/>
+            </w:r>
+          </w:p>
+        </w:tc>
+        <w:tc>
+          <w:tcPr>
+            <w:tcW w:w="1506" w:type="dxa"/>
+            <w:gridSpan w:val="2"/>
+          </w:tcPr>
+          <w:p>
+            <w:pPr>
+              <w:tabs>
+                <w:tab w:val="left" w:pos="1980"/>
+              </w:tabs>
+              <w:jc w:val="center"/>
+              <w:rPr>
+                <w:rFonts w:ascii="Arial" w:hAnsi="Arial" w:cs="Arial"/>
+                <w:sz w:val="14"/>
+                <w:szCs w:val="14"/>
+              </w:rPr>
+            </w:pPr>
+            <w:r>
+              <w:rPr>
+                <w:rFonts w:ascii="Arial" w:hAnsi="Arial" w:cs="Arial"/>
+                <w:noProof/>
+                <w:color w:val="000000"/>
+                <w:sz w:val="14"/>
+                <w:szCs w:val="14"/>
+              </w:rPr>
+              <w:fldChar w:fldCharType="begin"/>
+            </w:r>
+            <w:r>
+              <w:rPr>
+                <w:rFonts w:ascii="Arial" w:hAnsi="Arial" w:cs="Arial"/>
+                <w:noProof/>
+                <w:color w:val="000000"/>
+                <w:sz w:val="14"/>
+                <w:szCs w:val="14"/>
+              </w:rPr>
+              <w:instrText xml:space="preserve"> MERGEFIELD  =comp.relative_molecular_weight  \* MERGEFORMAT </w:instrText>
+            </w:r>
+            <w:r>
+              <w:rPr>
+                <w:rFonts w:ascii="Arial" w:hAnsi="Arial" w:cs="Arial"/>
+                <w:noProof/>
+                <w:color w:val="000000"/>
+                <w:sz w:val="14"/>
+                <w:szCs w:val="14"/>
+              </w:rPr>
+              <w:fldChar w:fldCharType="separate"/>
+            </w:r>
+            <w:r>
+              <w:rPr>
+                <w:rFonts w:ascii="Arial" w:hAnsi="Arial" w:cs="Arial"/>
+                <w:noProof/>
+                <w:color w:val="000000"/>
+                <w:sz w:val="14"/>
+                <w:szCs w:val="14"/>
+              </w:rPr>
+              <w:t>«=comp.relative_molecular_weight»</w:t>
+            </w:r>
+            <w:r>
+              <w:rPr>
+                <w:rFonts w:ascii="Arial" w:hAnsi="Arial" w:cs="Arial"/>
+                <w:noProof/>
+                <w:color w:val="000000"/>
+                <w:sz w:val="14"/>
+                <w:szCs w:val="14"/>
+              </w:rPr>
+              <w:fldChar w:fldCharType="end"/>
+            </w:r>
+            <w:r>
+              <w:rPr>
+                <w:rFonts w:ascii="Arial" w:hAnsi="Arial" w:cs="Arial"/>
+                <w:noProof/>
+                <w:color w:val="000000"/>
+                <w:sz w:val="14"/>
+                <w:szCs w:val="14"/>
+              </w:rPr>
+              <w:t xml:space="preserve"> g/mol</w:t>
+            </w:r>
+          </w:p>
+        </w:tc>
+        <w:tc>
+          <w:tcPr>
+            <w:tcW w:w="1506" w:type="dxa"/>
+            <w:gridSpan w:val="2"/>
+          </w:tcPr>
+          <w:p>
+            <w:pPr>
+              <w:jc w:val="center"/>
+              <w:rPr>
+                <w:rFonts w:ascii="Arial" w:hAnsi="Arial" w:cs="Arial"/>
+                <w:sz w:val="14"/>
+                <w:szCs w:val="14"/>
+              </w:rPr>
+            </w:pPr>
+            <w:r>
+              <w:rPr>
+                <w:rFonts w:ascii="Arial" w:hAnsi="Arial" w:cs="Arial"/>
+                <w:noProof/>
+                <w:color w:val="000000"/>
+                <w:sz w:val="14"/>
+                <w:szCs w:val="14"/>
+              </w:rPr>
+              <w:fldChar w:fldCharType="begin"/>
+            </w:r>
+            <w:r>
+              <w:rPr>
+                <w:rFonts w:ascii="Arial" w:hAnsi="Arial" w:cs="Arial"/>
+                <w:noProof/>
+                <w:color w:val="000000"/>
+                <w:sz w:val="14"/>
+                <w:szCs w:val="14"/>
+              </w:rPr>
+              <w:instrText xml:space="preserve"> MERGEFIELD  =comp.concn  \* MERGEFORMAT </w:instrText>
+            </w:r>
+            <w:r>
+              <w:rPr>
+                <w:rFonts w:ascii="Arial" w:hAnsi="Arial" w:cs="Arial"/>
+                <w:noProof/>
+                <w:color w:val="000000"/>
+                <w:sz w:val="14"/>
+                <w:szCs w:val="14"/>
+              </w:rPr>
+              <w:fldChar w:fldCharType="separate"/>
+            </w:r>
+            <w:r>
+              <w:rPr>
+                <w:rFonts w:ascii="Arial" w:hAnsi="Arial" w:cs="Arial"/>
+                <w:noProof/>
+                <w:color w:val="000000"/>
+                <w:sz w:val="14"/>
+                <w:szCs w:val="14"/>
+              </w:rPr>
+              <w:t>«=comp.concn»</w:t>
+            </w:r>
+            <w:r>
+              <w:rPr>
+                <w:rFonts w:ascii="Arial" w:hAnsi="Arial" w:cs="Arial"/>
+                <w:noProof/>
+                <w:color w:val="000000"/>
+                <w:sz w:val="14"/>
+                <w:szCs w:val="14"/>
+              </w:rPr>
+              <w:fldChar w:fldCharType="end"/>
+            </w:r>
+            <w:r>
+              <w:rPr>
+                <w:rFonts w:ascii="Arial" w:hAnsi="Arial" w:cs="Arial"/>
+                <w:noProof/>
+                <w:color w:val="000000"/>
+                <w:sz w:val="14"/>
+                <w:szCs w:val="14"/>
+              </w:rPr>
+              <w:t xml:space="preserve"> </w:t>
+            </w:r>
+            <w:r>
+              <w:rPr>
+                <w:rFonts w:ascii="Arial" w:hAnsi="Arial" w:cs="Arial"/>
+                <w:noProof/>
+                <w:color w:val="000000"/>
+                <w:sz w:val="14"/>
+                <w:szCs w:val="14"/>
+              </w:rPr>
+              <w:fldChar w:fldCharType="begin"/>
+            </w:r>
+            <w:r>
+              <w:rPr>
+                <w:rFonts w:ascii="Arial" w:hAnsi="Arial" w:cs="Arial"/>
+                <w:noProof/>
+                <w:color w:val="000000"/>
+                <w:sz w:val="14"/>
+                <w:szCs w:val="14"/>
+              </w:rPr>
+              <w:instrText xml:space="preserve"> MERGEFIELD  =comp.concn_unit  \* MERGEFORMAT </w:instrText>
+            </w:r>
+            <w:r>
+              <w:rPr>
+                <w:rFonts w:ascii="Arial" w:hAnsi="Arial" w:cs="Arial"/>
+                <w:noProof/>
+                <w:color w:val="000000"/>
+                <w:sz w:val="14"/>
+                <w:szCs w:val="14"/>
+              </w:rPr>
+              <w:fldChar w:fldCharType="separate"/>
+            </w:r>
+            <w:r>
+              <w:rPr>
+                <w:rFonts w:ascii="Arial" w:hAnsi="Arial" w:cs="Arial"/>
+                <w:noProof/>
+                <w:color w:val="000000"/>
+                <w:sz w:val="14"/>
+                <w:szCs w:val="14"/>
+              </w:rPr>
+              <w:t>«=comp.concn_unit»</w:t>
+            </w:r>
+            <w:r>
+              <w:rPr>
+                <w:rFonts w:ascii="Arial" w:hAnsi="Arial" w:cs="Arial"/>
+                <w:noProof/>
+                <w:color w:val="000000"/>
+                <w:sz w:val="14"/>
+                <w:szCs w:val="14"/>
+              </w:rPr>
+              <w:fldChar w:fldCharType="end"/>
+            </w:r>
+          </w:p>
+        </w:tc>
+        <w:tc>
+          <w:tcPr>
+            <w:tcW w:w="1507" w:type="dxa"/>
+            <w:gridSpan w:val="2"/>
+          </w:tcPr>
+          <w:p>
+            <w:pPr>
+              <w:jc w:val="center"/>
+              <w:rPr>
+                <w:rFonts w:ascii="Arial" w:hAnsi="Arial" w:cs="Arial"/>
+                <w:sz w:val="14"/>
+                <w:szCs w:val="14"/>
+              </w:rPr>
+            </w:pPr>
+            <w:r>
+              <w:rPr>
+                <w:rFonts w:ascii="Arial" w:hAnsi="Arial" w:cs="Arial"/>
+                <w:noProof/>
+                <w:color w:val="000000"/>
+                <w:sz w:val="14"/>
+                <w:szCs w:val="14"/>
+              </w:rPr>
+              <w:fldChar w:fldCharType="begin"/>
+            </w:r>
+            <w:r>
+              <w:rPr>
+                <w:rFonts w:ascii="Arial" w:hAnsi="Arial" w:cs="Arial"/>
+                <w:noProof/>
+                <w:color w:val="000000"/>
+                <w:sz w:val="14"/>
+                <w:szCs w:val="14"/>
+              </w:rPr>
+              <w:instrText xml:space="preserve"> MERGEFIELD  =comp.equivalent  \* MERGEFORMAT </w:instrText>
+            </w:r>
+            <w:r>
+              <w:rPr>
+                <w:rFonts w:ascii="Arial" w:hAnsi="Arial" w:cs="Arial"/>
+                <w:noProof/>
+                <w:color w:val="000000"/>
+                <w:sz w:val="14"/>
+                <w:szCs w:val="14"/>
+              </w:rPr>
+              <w:fldChar w:fldCharType="separate"/>
+            </w:r>
+            <w:r>
+              <w:rPr>
+                <w:rFonts w:ascii="Arial" w:hAnsi="Arial" w:cs="Arial"/>
+                <w:noProof/>
+                <w:color w:val="000000"/>
+                <w:sz w:val="14"/>
+                <w:szCs w:val="14"/>
+              </w:rPr>
+              <w:t>«=comp.equivalent»</w:t>
+            </w:r>
+            <w:r>
+              <w:rPr>
+                <w:rFonts w:ascii="Arial" w:hAnsi="Arial" w:cs="Arial"/>
+                <w:noProof/>
+                <w:color w:val="000000"/>
+                <w:sz w:val="14"/>
+                <w:szCs w:val="14"/>
+              </w:rPr>
+              <w:fldChar w:fldCharType="end"/>
+            </w:r>
+          </w:p>
+          <w:p>
+            <w:pPr>
+              <w:jc w:val="center"/>
+              <w:rPr>
+                <w:rFonts w:ascii="Arial" w:hAnsi="Arial" w:cs="Arial"/>
+                <w:sz w:val="14"/>
+                <w:szCs w:val="14"/>
+              </w:rPr>
+            </w:pPr>
+          </w:p>
+        </w:tc>
+      </w:tr>
+      <w:tr>
+        <w:trPr>
+          <w:trHeight w:val="255"/>
+        </w:trPr>
+        <w:tc>
+          <w:tcPr>
+            <w:tcW w:w="9037" w:type="dxa"/>
+            <w:gridSpan w:val="14"/>
+          </w:tcPr>
+          <w:p>
+            <w:pPr>
+              <w:rPr>
+                <w:rFonts w:ascii="Arial" w:hAnsi="Arial" w:cs="Arial"/>
+                <w:noProof/>
+                <w:color w:val="000000"/>
+                <w:sz w:val="14"/>
+                <w:szCs w:val="14"/>
+              </w:rPr>
+            </w:pPr>
+            <w:r>
+              <w:rPr>
+                <w:rFonts w:ascii="Arial" w:hAnsi="Arial" w:cs="Arial"/>
+                <w:sz w:val="18"/>
+                <w:szCs w:val="18"/>
+              </w:rPr>
+              <w:fldChar w:fldCharType="begin"/>
+            </w:r>
+            <w:r>
+              <w:rPr>
+                <w:rFonts w:ascii="Arial" w:hAnsi="Arial" w:cs="Arial"/>
+                <w:sz w:val="18"/>
+                <w:szCs w:val="18"/>
+              </w:rPr>
+              <w:instrText xml:space="preserve"> MERGEFIELD  s.components:endEach  \* MERGEFORMAT </w:instrText>
+            </w:r>
+            <w:r>
+              <w:rPr>
+                <w:rFonts w:ascii="Arial" w:hAnsi="Arial" w:cs="Arial"/>
+                <w:sz w:val="18"/>
+                <w:szCs w:val="18"/>
+              </w:rPr>
+              <w:fldChar w:fldCharType="separate"/>
+            </w:r>
+            <w:r>
+              <w:rPr>
+                <w:rFonts w:ascii="Arial" w:hAnsi="Arial" w:cs="Arial"/>
+                <w:noProof/>
+                <w:sz w:val="18"/>
+                <w:szCs w:val="18"/>
+              </w:rPr>
+              <w:t>«s.components:endEach»</w:t>
+            </w:r>
+            <w:r>
+              <w:rPr>
+                <w:rFonts w:ascii="Arial" w:hAnsi="Arial" w:cs="Arial"/>
+                <w:sz w:val="18"/>
+                <w:szCs w:val="18"/>
+              </w:rPr>
+              <w:fldChar w:fldCharType="end"/>
+            </w:r>
+            <w:r>
+              <w:rPr>
+                <w:rFonts w:ascii="Arial" w:hAnsi="Arial" w:cs="Arial"/>
+                <w:noProof/>
+                <w:color w:val="000000"/>
+                <w:sz w:val="18"/>
+                <w:szCs w:val="18"/>
+              </w:rPr>
+              <w:tab/>
+            </w:r>
+          </w:p>
+        </w:tc>
+      </w:tr>
+      <w:tr>
+        <w:trPr>
+          <w:trHeight w:val="255"/>
+        </w:trPr>
+        <w:tc>
+          <w:tcPr>
+            <w:tcW w:w="9037" w:type="dxa"/>
+            <w:gridSpan w:val="14"/>
+          </w:tcPr>
+          <w:p>
+            <w:pPr>
+              <w:rPr>
+                <w:rFonts w:ascii="Arial" w:hAnsi="Arial" w:cs="Arial"/>
+                <w:noProof/>
+                <w:color w:val="000000"/>
+                <w:sz w:val="14"/>
+                <w:szCs w:val="14"/>
+              </w:rPr>
+            </w:pPr>
+            <w:r>
+              <w:rPr>
+                <w:rFonts w:ascii="Arial" w:hAnsi="Arial" w:cs="Arial"/>
+                <w:sz w:val="18"/>
+                <w:szCs w:val="18"/>
+              </w:rPr>
+              <w:fldChar w:fldCharType="begin"/>
+            </w:r>
+            <w:r>
+              <w:rPr>
+                <w:rFonts w:ascii="Arial" w:hAnsi="Arial" w:cs="Arial"/>
+                <w:sz w:val="18"/>
+                <w:szCs w:val="18"/>
+              </w:rPr>
+              <w:instrText xml:space="preserve"> MERGEFIELD  s.components:endIf  \* MERGEFORMAT </w:instrText>
+            </w:r>
+            <w:r>
+              <w:rPr>
+                <w:rFonts w:ascii="Arial" w:hAnsi="Arial" w:cs="Arial"/>
+                <w:sz w:val="18"/>
+                <w:szCs w:val="18"/>
+              </w:rPr>
+              <w:fldChar w:fldCharType="separate"/>
+            </w:r>
+            <w:r>
+              <w:rPr>
+                <w:rFonts w:ascii="Arial" w:hAnsi="Arial" w:cs="Arial"/>
+                <w:noProof/>
+                <w:sz w:val="18"/>
+                <w:szCs w:val="18"/>
+              </w:rPr>
+              <w:t>«s.components:endIf»</w:t>
+            </w:r>
+            <w:r>
+              <w:rPr>
+                <w:rFonts w:ascii="Arial" w:hAnsi="Arial" w:cs="Arial"/>
                 <w:sz w:val="18"/>
                 <w:szCs w:val="18"/>
               </w:rPr>
@@ -2357,6 +3305,7 @@
           <w:rFonts w:ascii="Arial" w:hAnsi="Arial" w:cs="Arial"/>
           <w:noProof/>
         </w:rPr>
+        <w:lastRenderedPageBreak/>
         <w:t xml:space="preserve">  </w:t>
       </w:r>
       <w:r>
@@ -2540,8 +3489,9 @@
     </w:p>
     <w:tbl>
       <w:tblPr>
-        <w:tblStyle w:val="Tabellenraster"/>
-        <w:tblW w:w="0" w:type="auto"/>
+        <w:tblStyle w:val="TableGrid"/>
+        <w:tblW w:w="9148" w:type="dxa"/>
+        <w:tblInd w:w="-108" w:type="dxa"/>
         <w:tblBorders>
           <w:top w:val="none" w:sz="0" w:space="0" w:color="auto"/>
           <w:left w:val="none" w:sz="0" w:space="0" w:color="auto"/>
@@ -2554,17 +3504,26 @@
         <w:tblLook w:val="04A0" w:firstRow="1" w:lastRow="0" w:firstColumn="1" w:lastColumn="0" w:noHBand="0" w:noVBand="1"/>
       </w:tblPr>
       <w:tblGrid>
+        <w:gridCol w:w="108"/>
         <w:gridCol w:w="346"/>
-        <w:gridCol w:w="1524"/>
-        <w:gridCol w:w="1191"/>
+        <w:gridCol w:w="374"/>
+        <w:gridCol w:w="360"/>
+        <w:gridCol w:w="790"/>
+        <w:gridCol w:w="1142"/>
+        <w:gridCol w:w="49"/>
         <w:gridCol w:w="1134"/>
-        <w:gridCol w:w="1216"/>
-        <w:gridCol w:w="1361"/>
-        <w:gridCol w:w="1134"/>
+        <w:gridCol w:w="323"/>
+        <w:gridCol w:w="893"/>
+        <w:gridCol w:w="613"/>
+        <w:gridCol w:w="748"/>
+        <w:gridCol w:w="758"/>
+        <w:gridCol w:w="376"/>
         <w:gridCol w:w="1134"/>
       </w:tblGrid>
       <w:tr>
         <w:trPr>
+          <w:gridBefore w:val="1"/>
+          <w:wBefore w:w="108" w:type="dxa"/>
           <w:trHeight w:val="255"/>
         </w:trPr>
         <w:tc>
@@ -2596,6 +3555,7 @@
         <w:tc>
           <w:tcPr>
             <w:tcW w:w="1524" w:type="dxa"/>
+            <w:gridSpan w:val="3"/>
           </w:tcPr>
           <w:p>
             <w:pPr>
@@ -2671,6 +3631,7 @@
         <w:tc>
           <w:tcPr>
             <w:tcW w:w="1191" w:type="dxa"/>
+            <w:gridSpan w:val="2"/>
           </w:tcPr>
           <w:p>
             <w:pPr>
@@ -2885,6 +3846,7 @@
         <w:tc>
           <w:tcPr>
             <w:tcW w:w="1216" w:type="dxa"/>
+            <w:gridSpan w:val="2"/>
           </w:tcPr>
           <w:p>
             <w:pPr>
@@ -3017,6 +3979,7 @@
         <w:tc>
           <w:tcPr>
             <w:tcW w:w="1361" w:type="dxa"/>
+            <w:gridSpan w:val="2"/>
           </w:tcPr>
           <w:p>
             <w:pPr>
@@ -3071,6 +4034,130 @@
                 <w:szCs w:val="18"/>
               </w:rPr>
               <w:t>«=r.density»</w:t>
+            </w:r>
+            <w:r>
+              <w:rPr>
+                <w:rFonts w:ascii="Arial" w:hAnsi="Arial" w:cs="Arial"/>
+                <w:noProof/>
+                <w:sz w:val="18"/>
+                <w:szCs w:val="18"/>
+              </w:rPr>
+              <w:fldChar w:fldCharType="end"/>
+            </w:r>
+          </w:p>
+        </w:tc>
+        <w:tc>
+          <w:tcPr>
+            <w:tcW w:w="1134" w:type="dxa"/>
+            <w:gridSpan w:val="2"/>
+          </w:tcPr>
+          <w:p>
+            <w:pPr>
+              <w:jc w:val="center"/>
+              <w:rPr>
+                <w:rFonts w:ascii="Arial" w:hAnsi="Arial" w:cs="Arial"/>
+                <w:noProof/>
+                <w:sz w:val="18"/>
+                <w:szCs w:val="18"/>
+              </w:rPr>
+            </w:pPr>
+            <w:r>
+              <w:rPr>
+                <w:rFonts w:ascii="Arial" w:hAnsi="Arial" w:cs="Arial"/>
+                <w:noProof/>
+                <w:sz w:val="18"/>
+                <w:szCs w:val="18"/>
+              </w:rPr>
+              <w:fldChar w:fldCharType="begin"/>
+            </w:r>
+            <w:r>
+              <w:rPr>
+                <w:rFonts w:ascii="Arial" w:hAnsi="Arial" w:cs="Arial"/>
+                <w:noProof/>
+                <w:sz w:val="18"/>
+                <w:szCs w:val="18"/>
+              </w:rPr>
+              <w:instrText xml:space="preserve"> MERGEFIELD =r.mol </w:instrText>
+            </w:r>
+            <w:r>
+              <w:rPr>
+                <w:rFonts w:ascii="Arial" w:hAnsi="Arial" w:cs="Arial"/>
+                <w:sz w:val="18"/>
+                <w:szCs w:val="18"/>
+              </w:rPr>
+              <w:instrText xml:space="preserve">\* MERGEFORMAT </w:instrText>
+            </w:r>
+            <w:r>
+              <w:rPr>
+                <w:rFonts w:ascii="Arial" w:hAnsi="Arial" w:cs="Arial"/>
+                <w:noProof/>
+                <w:sz w:val="18"/>
+                <w:szCs w:val="18"/>
+              </w:rPr>
+              <w:fldChar w:fldCharType="separate"/>
+            </w:r>
+            <w:r>
+              <w:rPr>
+                <w:rFonts w:ascii="Arial" w:hAnsi="Arial" w:cs="Arial"/>
+                <w:noProof/>
+                <w:sz w:val="18"/>
+                <w:szCs w:val="18"/>
+              </w:rPr>
+              <w:t>«=r.mol»</w:t>
+            </w:r>
+            <w:r>
+              <w:rPr>
+                <w:rFonts w:ascii="Arial" w:hAnsi="Arial" w:cs="Arial"/>
+                <w:noProof/>
+                <w:sz w:val="18"/>
+                <w:szCs w:val="18"/>
+              </w:rPr>
+              <w:fldChar w:fldCharType="end"/>
+            </w:r>
+            <w:r>
+              <w:rPr>
+                <w:rFonts w:ascii="Arial" w:hAnsi="Arial" w:cs="Arial"/>
+                <w:noProof/>
+                <w:sz w:val="18"/>
+                <w:szCs w:val="18"/>
+              </w:rPr>
+              <w:t xml:space="preserve"> </w:t>
+            </w:r>
+            <w:r>
+              <w:rPr>
+                <w:rFonts w:ascii="Arial" w:hAnsi="Arial" w:cs="Arial"/>
+                <w:noProof/>
+                <w:sz w:val="18"/>
+                <w:szCs w:val="18"/>
+              </w:rPr>
+              <w:fldChar w:fldCharType="begin"/>
+            </w:r>
+            <w:r>
+              <w:rPr>
+                <w:rFonts w:ascii="Arial" w:hAnsi="Arial" w:cs="Arial"/>
+                <w:noProof/>
+                <w:sz w:val="18"/>
+                <w:szCs w:val="18"/>
+              </w:rPr>
+              <w:instrText xml:space="preserve"> MERGEFIELD  =r.mmol_unit  \* MERGEFORMAT </w:instrText>
+            </w:r>
+            <w:r>
+              <w:rPr>
+                <w:rFonts w:ascii="Arial" w:hAnsi="Arial" w:cs="Arial"/>
+                <w:noProof/>
+                <w:sz w:val="18"/>
+                <w:szCs w:val="18"/>
+              </w:rPr>
+              <w:fldChar w:fldCharType="separate"/>
+            </w:r>
+            <w:r>
+              <w:rPr>
+                <w:rFonts w:ascii="Arial" w:hAnsi="Arial" w:cs="Arial"/>
+                <w:noProof/>
+                <w:sz w:val="18"/>
+                <w:szCs w:val="18"/>
+              </w:rPr>
+              <w:t>«=r.mmol_unit»</w:t>
             </w:r>
             <w:r>
               <w:rPr>
@@ -3113,7 +4200,7 @@
                 <w:sz w:val="18"/>
                 <w:szCs w:val="18"/>
               </w:rPr>
-              <w:instrText xml:space="preserve"> MERGEFIELD =r.mol </w:instrText>
+              <w:instrText xml:space="preserve"> MERGEFIELD =r.equiv </w:instrText>
             </w:r>
             <w:r>
               <w:rPr>
@@ -3139,7 +4226,7 @@
                 <w:sz w:val="18"/>
                 <w:szCs w:val="18"/>
               </w:rPr>
-              <w:t>«=r.mol»</w:t>
+              <w:t>«=r.equiv»</w:t>
             </w:r>
             <w:r>
               <w:rPr>
@@ -3150,19 +4237,30 @@
               </w:rPr>
               <w:fldChar w:fldCharType="end"/>
             </w:r>
-            <w:r>
-              <w:rPr>
-                <w:rFonts w:ascii="Arial" w:hAnsi="Arial" w:cs="Arial"/>
-                <w:noProof/>
-                <w:sz w:val="18"/>
-                <w:szCs w:val="18"/>
-              </w:rPr>
-              <w:t xml:space="preserve"> </w:t>
-            </w:r>
-            <w:r>
-              <w:rPr>
-                <w:rFonts w:ascii="Arial" w:hAnsi="Arial" w:cs="Arial"/>
-                <w:noProof/>
+          </w:p>
+        </w:tc>
+      </w:tr>
+      <w:tr>
+        <w:trPr>
+          <w:trHeight w:val="255"/>
+        </w:trPr>
+        <w:tc>
+          <w:tcPr>
+            <w:tcW w:w="9145" w:type="dxa"/>
+            <w:gridSpan w:val="15"/>
+          </w:tcPr>
+          <w:p>
+            <w:pPr>
+              <w:rPr>
+                <w:rFonts w:ascii="Arial" w:hAnsi="Arial" w:cs="Arial"/>
+                <w:noProof/>
+                <w:sz w:val="18"/>
+                <w:szCs w:val="18"/>
+              </w:rPr>
+            </w:pPr>
+            <w:r>
+              <w:rPr>
+                <w:rFonts w:ascii="Arial" w:hAnsi="Arial" w:cs="Arial"/>
                 <w:sz w:val="18"/>
                 <w:szCs w:val="18"/>
               </w:rPr>
@@ -3171,16 +4269,14 @@
             <w:r>
               <w:rPr>
                 <w:rFonts w:ascii="Arial" w:hAnsi="Arial" w:cs="Arial"/>
-                <w:noProof/>
-                <w:sz w:val="18"/>
-                <w:szCs w:val="18"/>
-              </w:rPr>
-              <w:instrText xml:space="preserve"> MERGEFIELD  =r.mmol_unit  \* MERGEFORMAT </w:instrText>
-            </w:r>
-            <w:r>
-              <w:rPr>
-                <w:rFonts w:ascii="Arial" w:hAnsi="Arial" w:cs="Arial"/>
-                <w:noProof/>
+                <w:sz w:val="18"/>
+                <w:szCs w:val="18"/>
+              </w:rPr>
+              <w:instrText xml:space="preserve"> MERGEFIELD  r.components:if  \* MERGEFORMAT </w:instrText>
+            </w:r>
+            <w:r>
+              <w:rPr>
+                <w:rFonts w:ascii="Arial" w:hAnsi="Arial" w:cs="Arial"/>
                 <w:sz w:val="18"/>
                 <w:szCs w:val="18"/>
               </w:rPr>
@@ -3193,65 +4289,214 @@
                 <w:sz w:val="18"/>
                 <w:szCs w:val="18"/>
               </w:rPr>
-              <w:t>«=r.mmol_unit»</w:t>
-            </w:r>
-            <w:r>
-              <w:rPr>
-                <w:rFonts w:ascii="Arial" w:hAnsi="Arial" w:cs="Arial"/>
-                <w:noProof/>
+              <w:t>«r.components:if»</w:t>
+            </w:r>
+            <w:r>
+              <w:rPr>
+                <w:rFonts w:ascii="Arial" w:hAnsi="Arial" w:cs="Arial"/>
                 <w:sz w:val="18"/>
                 <w:szCs w:val="18"/>
               </w:rPr>
               <w:fldChar w:fldCharType="end"/>
             </w:r>
+          </w:p>
+        </w:tc>
+      </w:tr>
+      <w:tr>
+        <w:trPr>
+          <w:trHeight w:val="255"/>
+        </w:trPr>
+        <w:tc>
+          <w:tcPr>
+            <w:tcW w:w="828" w:type="dxa"/>
+            <w:gridSpan w:val="3"/>
+          </w:tcPr>
+          <w:p>
+            <w:pPr>
+              <w:rPr>
+                <w:rFonts w:ascii="Arial" w:hAnsi="Arial" w:cs="Arial"/>
+                <w:sz w:val="14"/>
+                <w:szCs w:val="14"/>
+              </w:rPr>
+            </w:pPr>
           </w:p>
         </w:tc>
         <w:tc>
           <w:tcPr>
-            <w:tcW w:w="1134" w:type="dxa"/>
+            <w:tcW w:w="2292" w:type="dxa"/>
+            <w:gridSpan w:val="3"/>
+            <w:tcBorders>
+              <w:top w:val="single" w:sz="4" w:space="0" w:color="auto"/>
+              <w:left w:val="nil"/>
+              <w:bottom w:val="single" w:sz="4" w:space="0" w:color="auto"/>
+            </w:tcBorders>
           </w:tcPr>
           <w:p>
             <w:pPr>
               <w:jc w:val="center"/>
               <w:rPr>
                 <w:rFonts w:ascii="Arial" w:hAnsi="Arial" w:cs="Arial"/>
-                <w:noProof/>
-                <w:sz w:val="18"/>
-                <w:szCs w:val="18"/>
+                <w:sz w:val="14"/>
+                <w:szCs w:val="14"/>
               </w:rPr>
             </w:pPr>
             <w:r>
               <w:rPr>
                 <w:rFonts w:ascii="Arial" w:hAnsi="Arial" w:cs="Arial"/>
-                <w:noProof/>
-                <w:sz w:val="18"/>
-                <w:szCs w:val="18"/>
+                <w:sz w:val="14"/>
+                <w:szCs w:val="14"/>
+              </w:rPr>
+              <w:t>Component</w:t>
+            </w:r>
+          </w:p>
+        </w:tc>
+        <w:tc>
+          <w:tcPr>
+            <w:tcW w:w="1506" w:type="dxa"/>
+            <w:gridSpan w:val="3"/>
+            <w:tcBorders>
+              <w:top w:val="single" w:sz="4" w:space="0" w:color="auto"/>
+              <w:bottom w:val="single" w:sz="4" w:space="0" w:color="auto"/>
+            </w:tcBorders>
+          </w:tcPr>
+          <w:p>
+            <w:pPr>
+              <w:jc w:val="center"/>
+              <w:rPr>
+                <w:rFonts w:ascii="Arial" w:hAnsi="Arial" w:cs="Arial"/>
+                <w:sz w:val="14"/>
+                <w:szCs w:val="14"/>
+              </w:rPr>
+            </w:pPr>
+            <w:r>
+              <w:rPr>
+                <w:rFonts w:ascii="Arial" w:hAnsi="Arial" w:cs="Arial"/>
+                <w:sz w:val="14"/>
+                <w:szCs w:val="14"/>
+              </w:rPr>
+              <w:t>Amount</w:t>
+            </w:r>
+          </w:p>
+        </w:tc>
+        <w:tc>
+          <w:tcPr>
+            <w:tcW w:w="1506" w:type="dxa"/>
+            <w:gridSpan w:val="2"/>
+            <w:tcBorders>
+              <w:top w:val="single" w:sz="4" w:space="0" w:color="auto"/>
+              <w:bottom w:val="single" w:sz="4" w:space="0" w:color="auto"/>
+            </w:tcBorders>
+          </w:tcPr>
+          <w:p>
+            <w:pPr>
+              <w:jc w:val="center"/>
+              <w:rPr>
+                <w:rFonts w:ascii="Arial" w:hAnsi="Arial" w:cs="Arial"/>
+                <w:sz w:val="14"/>
+                <w:szCs w:val="14"/>
+              </w:rPr>
+            </w:pPr>
+            <w:r>
+              <w:rPr>
+                <w:rFonts w:ascii="Arial" w:hAnsi="Arial" w:cs="Arial"/>
+                <w:sz w:val="14"/>
+                <w:szCs w:val="14"/>
+              </w:rPr>
+              <w:t>Rel. MW</w:t>
+            </w:r>
+          </w:p>
+        </w:tc>
+        <w:tc>
+          <w:tcPr>
+            <w:tcW w:w="1506" w:type="dxa"/>
+            <w:gridSpan w:val="2"/>
+            <w:tcBorders>
+              <w:top w:val="single" w:sz="4" w:space="0" w:color="auto"/>
+              <w:bottom w:val="single" w:sz="4" w:space="0" w:color="auto"/>
+            </w:tcBorders>
+          </w:tcPr>
+          <w:p>
+            <w:pPr>
+              <w:jc w:val="center"/>
+              <w:rPr>
+                <w:rFonts w:ascii="Arial" w:hAnsi="Arial" w:cs="Arial"/>
+                <w:sz w:val="14"/>
+                <w:szCs w:val="14"/>
+              </w:rPr>
+            </w:pPr>
+            <w:r>
+              <w:rPr>
+                <w:rFonts w:ascii="Arial" w:hAnsi="Arial" w:cs="Arial"/>
+                <w:sz w:val="14"/>
+                <w:szCs w:val="14"/>
+              </w:rPr>
+              <w:t>Conc</w:t>
+            </w:r>
+          </w:p>
+        </w:tc>
+        <w:tc>
+          <w:tcPr>
+            <w:tcW w:w="1507" w:type="dxa"/>
+            <w:gridSpan w:val="2"/>
+          </w:tcPr>
+          <w:p>
+            <w:pPr>
+              <w:jc w:val="center"/>
+              <w:rPr>
+                <w:rFonts w:ascii="Arial" w:hAnsi="Arial" w:cs="Arial"/>
+                <w:sz w:val="14"/>
+                <w:szCs w:val="14"/>
+              </w:rPr>
+            </w:pPr>
+            <w:r>
+              <w:rPr>
+                <w:rFonts w:ascii="Arial" w:hAnsi="Arial" w:cs="Arial"/>
+                <w:sz w:val="14"/>
+                <w:szCs w:val="14"/>
+              </w:rPr>
+              <w:t>Ratio</w:t>
+            </w:r>
+          </w:p>
+        </w:tc>
+      </w:tr>
+      <w:tr>
+        <w:trPr>
+          <w:trHeight w:val="255"/>
+        </w:trPr>
+        <w:tc>
+          <w:tcPr>
+            <w:tcW w:w="9145" w:type="dxa"/>
+            <w:gridSpan w:val="15"/>
+          </w:tcPr>
+          <w:p>
+            <w:pPr>
+              <w:rPr>
+                <w:rFonts w:ascii="Arial" w:hAnsi="Arial" w:cs="Arial"/>
+                <w:sz w:val="14"/>
+                <w:szCs w:val="14"/>
+              </w:rPr>
+            </w:pPr>
+            <w:r>
+              <w:rPr>
+                <w:rFonts w:ascii="Arial" w:hAnsi="Arial" w:cs="Arial"/>
+                <w:sz w:val="14"/>
+                <w:szCs w:val="14"/>
               </w:rPr>
               <w:fldChar w:fldCharType="begin"/>
             </w:r>
             <w:r>
               <w:rPr>
                 <w:rFonts w:ascii="Arial" w:hAnsi="Arial" w:cs="Arial"/>
-                <w:noProof/>
-                <w:sz w:val="18"/>
-                <w:szCs w:val="18"/>
-              </w:rPr>
-              <w:instrText xml:space="preserve"> MERGEFIELD =r.equiv </w:instrText>
-            </w:r>
-            <w:r>
-              <w:rPr>
-                <w:rFonts w:ascii="Arial" w:hAnsi="Arial" w:cs="Arial"/>
-                <w:sz w:val="18"/>
-                <w:szCs w:val="18"/>
-              </w:rPr>
-              <w:instrText xml:space="preserve">\* MERGEFORMAT </w:instrText>
-            </w:r>
-            <w:r>
-              <w:rPr>
-                <w:rFonts w:ascii="Arial" w:hAnsi="Arial" w:cs="Arial"/>
-                <w:noProof/>
-                <w:sz w:val="18"/>
-                <w:szCs w:val="18"/>
+                <w:sz w:val="14"/>
+                <w:szCs w:val="14"/>
+              </w:rPr>
+              <w:instrText xml:space="preserve"> MERGEFIELD  r.components:each(comp)  \* MERGEFORMAT </w:instrText>
+            </w:r>
+            <w:r>
+              <w:rPr>
+                <w:rFonts w:ascii="Arial" w:hAnsi="Arial" w:cs="Arial"/>
+                <w:sz w:val="14"/>
+                <w:szCs w:val="14"/>
               </w:rPr>
               <w:fldChar w:fldCharType="separate"/>
             </w:r>
@@ -3259,15 +4504,671 @@
               <w:rPr>
                 <w:rFonts w:ascii="Arial" w:hAnsi="Arial" w:cs="Arial"/>
                 <w:noProof/>
-                <w:sz w:val="18"/>
-                <w:szCs w:val="18"/>
-              </w:rPr>
-              <w:t>«=r.equiv»</w:t>
-            </w:r>
-            <w:r>
-              <w:rPr>
-                <w:rFonts w:ascii="Arial" w:hAnsi="Arial" w:cs="Arial"/>
-                <w:noProof/>
+                <w:sz w:val="14"/>
+                <w:szCs w:val="14"/>
+              </w:rPr>
+              <w:t>«r.components:each(comp)»</w:t>
+            </w:r>
+            <w:r>
+              <w:rPr>
+                <w:rFonts w:ascii="Arial" w:hAnsi="Arial" w:cs="Arial"/>
+                <w:sz w:val="14"/>
+                <w:szCs w:val="14"/>
+              </w:rPr>
+              <w:fldChar w:fldCharType="end"/>
+            </w:r>
+          </w:p>
+        </w:tc>
+      </w:tr>
+      <w:tr>
+        <w:trPr>
+          <w:trHeight w:val="255"/>
+        </w:trPr>
+        <w:tc>
+          <w:tcPr>
+            <w:tcW w:w="828" w:type="dxa"/>
+            <w:gridSpan w:val="3"/>
+          </w:tcPr>
+          <w:p>
+            <w:pPr>
+              <w:rPr>
+                <w:rFonts w:ascii="Arial" w:hAnsi="Arial" w:cs="Arial"/>
+                <w:sz w:val="14"/>
+                <w:szCs w:val="14"/>
+              </w:rPr>
+            </w:pPr>
+          </w:p>
+        </w:tc>
+        <w:tc>
+          <w:tcPr>
+            <w:tcW w:w="360" w:type="dxa"/>
+            <w:tcBorders>
+              <w:left w:val="nil"/>
+            </w:tcBorders>
+          </w:tcPr>
+          <w:p>
+            <w:pPr>
+              <w:jc w:val="center"/>
+              <w:rPr>
+                <w:rFonts w:ascii="Arial" w:hAnsi="Arial" w:cs="Arial"/>
+                <w:sz w:val="14"/>
+                <w:szCs w:val="14"/>
+              </w:rPr>
+            </w:pPr>
+            <w:r>
+              <w:rPr>
+                <w:rFonts w:ascii="Arial" w:hAnsi="Arial" w:cs="Arial"/>
+                <w:noProof/>
+                <w:color w:val="833C0B" w:themeColor="accent2" w:themeShade="80"/>
+                <w:sz w:val="14"/>
+                <w:szCs w:val="14"/>
+              </w:rPr>
+              <w:t>C</w:t>
+            </w:r>
+          </w:p>
+        </w:tc>
+        <w:tc>
+          <w:tcPr>
+            <w:tcW w:w="1932" w:type="dxa"/>
+            <w:gridSpan w:val="2"/>
+          </w:tcPr>
+          <w:p>
+            <w:pPr>
+              <w:jc w:val="center"/>
+              <w:rPr>
+                <w:rFonts w:ascii="Arial" w:hAnsi="Arial" w:cs="Arial"/>
+                <w:sz w:val="14"/>
+                <w:szCs w:val="14"/>
+              </w:rPr>
+            </w:pPr>
+            <w:r>
+              <w:rPr>
+                <w:rFonts w:ascii="Arial" w:hAnsi="Arial" w:cs="Arial"/>
+                <w:noProof/>
+                <w:color w:val="833C0B" w:themeColor="accent2" w:themeShade="80"/>
+                <w:sz w:val="14"/>
+                <w:szCs w:val="14"/>
+              </w:rPr>
+              <w:fldChar w:fldCharType="begin"/>
+            </w:r>
+            <w:r>
+              <w:rPr>
+                <w:rFonts w:ascii="Arial" w:hAnsi="Arial" w:cs="Arial"/>
+                <w:noProof/>
+                <w:color w:val="833C0B" w:themeColor="accent2" w:themeShade="80"/>
+                <w:sz w:val="14"/>
+                <w:szCs w:val="14"/>
+              </w:rPr>
+              <w:instrText xml:space="preserve"> MERGEFIELD  =comp.name  \* MERGEFORMAT </w:instrText>
+            </w:r>
+            <w:r>
+              <w:rPr>
+                <w:rFonts w:ascii="Arial" w:hAnsi="Arial" w:cs="Arial"/>
+                <w:noProof/>
+                <w:color w:val="833C0B" w:themeColor="accent2" w:themeShade="80"/>
+                <w:sz w:val="14"/>
+                <w:szCs w:val="14"/>
+              </w:rPr>
+              <w:fldChar w:fldCharType="separate"/>
+            </w:r>
+            <w:r>
+              <w:rPr>
+                <w:rFonts w:ascii="Arial" w:hAnsi="Arial" w:cs="Arial"/>
+                <w:noProof/>
+                <w:color w:val="833C0B" w:themeColor="accent2" w:themeShade="80"/>
+                <w:sz w:val="14"/>
+                <w:szCs w:val="14"/>
+              </w:rPr>
+              <w:t>«=comp.name»</w:t>
+            </w:r>
+            <w:r>
+              <w:rPr>
+                <w:rFonts w:ascii="Arial" w:hAnsi="Arial" w:cs="Arial"/>
+                <w:noProof/>
+                <w:color w:val="833C0B" w:themeColor="accent2" w:themeShade="80"/>
+                <w:sz w:val="14"/>
+                <w:szCs w:val="14"/>
+              </w:rPr>
+              <w:fldChar w:fldCharType="end"/>
+            </w:r>
+          </w:p>
+        </w:tc>
+        <w:tc>
+          <w:tcPr>
+            <w:tcW w:w="1506" w:type="dxa"/>
+            <w:gridSpan w:val="3"/>
+          </w:tcPr>
+          <w:p>
+            <w:pPr>
+              <w:jc w:val="center"/>
+              <w:rPr>
+                <w:rFonts w:ascii="Arial" w:hAnsi="Arial" w:cs="Arial"/>
+                <w:sz w:val="14"/>
+                <w:szCs w:val="14"/>
+              </w:rPr>
+            </w:pPr>
+            <w:r>
+              <w:rPr>
+                <w:rFonts w:ascii="Arial" w:hAnsi="Arial" w:cs="Arial"/>
+                <w:noProof/>
+                <w:color w:val="000000"/>
+                <w:sz w:val="14"/>
+                <w:szCs w:val="14"/>
+              </w:rPr>
+              <w:fldChar w:fldCharType="begin"/>
+            </w:r>
+            <w:r>
+              <w:rPr>
+                <w:rFonts w:ascii="Arial" w:hAnsi="Arial" w:cs="Arial"/>
+                <w:noProof/>
+                <w:color w:val="000000"/>
+                <w:sz w:val="14"/>
+                <w:szCs w:val="14"/>
+              </w:rPr>
+              <w:instrText xml:space="preserve"> MERGEFIELD  =comp.amount_mol  \* MERGEFORMAT </w:instrText>
+            </w:r>
+            <w:r>
+              <w:rPr>
+                <w:rFonts w:ascii="Arial" w:hAnsi="Arial" w:cs="Arial"/>
+                <w:noProof/>
+                <w:color w:val="000000"/>
+                <w:sz w:val="14"/>
+                <w:szCs w:val="14"/>
+              </w:rPr>
+              <w:fldChar w:fldCharType="separate"/>
+            </w:r>
+            <w:r>
+              <w:rPr>
+                <w:rFonts w:ascii="Arial" w:hAnsi="Arial" w:cs="Arial"/>
+                <w:noProof/>
+                <w:color w:val="000000"/>
+                <w:sz w:val="14"/>
+                <w:szCs w:val="14"/>
+              </w:rPr>
+              <w:t>«=comp.amount_mol»</w:t>
+            </w:r>
+            <w:r>
+              <w:rPr>
+                <w:rFonts w:ascii="Arial" w:hAnsi="Arial" w:cs="Arial"/>
+                <w:noProof/>
+                <w:color w:val="000000"/>
+                <w:sz w:val="14"/>
+                <w:szCs w:val="14"/>
+              </w:rPr>
+              <w:fldChar w:fldCharType="end"/>
+            </w:r>
+            <w:r>
+              <w:rPr>
+                <w:rFonts w:ascii="Arial" w:hAnsi="Arial" w:cs="Arial"/>
+                <w:noProof/>
+                <w:color w:val="000000"/>
+                <w:sz w:val="14"/>
+                <w:szCs w:val="14"/>
+              </w:rPr>
+              <w:t xml:space="preserve"> </w:t>
+            </w:r>
+            <w:r>
+              <w:rPr>
+                <w:rFonts w:ascii="Arial" w:hAnsi="Arial" w:cs="Arial"/>
+                <w:noProof/>
+                <w:color w:val="000000"/>
+                <w:sz w:val="14"/>
+                <w:szCs w:val="14"/>
+              </w:rPr>
+              <w:fldChar w:fldCharType="begin"/>
+            </w:r>
+            <w:r>
+              <w:rPr>
+                <w:rFonts w:ascii="Arial" w:hAnsi="Arial" w:cs="Arial"/>
+                <w:noProof/>
+                <w:color w:val="000000"/>
+                <w:sz w:val="14"/>
+                <w:szCs w:val="14"/>
+              </w:rPr>
+              <w:instrText xml:space="preserve"> MERGEFIELD  =comp.amount_mol_unit  \* MERGEFORMAT </w:instrText>
+            </w:r>
+            <w:r>
+              <w:rPr>
+                <w:rFonts w:ascii="Arial" w:hAnsi="Arial" w:cs="Arial"/>
+                <w:noProof/>
+                <w:color w:val="000000"/>
+                <w:sz w:val="14"/>
+                <w:szCs w:val="14"/>
+              </w:rPr>
+              <w:fldChar w:fldCharType="separate"/>
+            </w:r>
+            <w:r>
+              <w:rPr>
+                <w:rFonts w:ascii="Arial" w:hAnsi="Arial" w:cs="Arial"/>
+                <w:noProof/>
+                <w:color w:val="000000"/>
+                <w:sz w:val="14"/>
+                <w:szCs w:val="14"/>
+              </w:rPr>
+              <w:t>«=comp.amount_mol_unit»</w:t>
+            </w:r>
+            <w:r>
+              <w:rPr>
+                <w:rFonts w:ascii="Arial" w:hAnsi="Arial" w:cs="Arial"/>
+                <w:noProof/>
+                <w:color w:val="000000"/>
+                <w:sz w:val="14"/>
+                <w:szCs w:val="14"/>
+              </w:rPr>
+              <w:fldChar w:fldCharType="end"/>
+            </w:r>
+          </w:p>
+        </w:tc>
+        <w:tc>
+          <w:tcPr>
+            <w:tcW w:w="1506" w:type="dxa"/>
+            <w:gridSpan w:val="2"/>
+          </w:tcPr>
+          <w:p>
+            <w:pPr>
+              <w:tabs>
+                <w:tab w:val="left" w:pos="1980"/>
+              </w:tabs>
+              <w:jc w:val="center"/>
+              <w:rPr>
+                <w:rFonts w:ascii="Arial" w:hAnsi="Arial" w:cs="Arial"/>
+                <w:sz w:val="14"/>
+                <w:szCs w:val="14"/>
+              </w:rPr>
+            </w:pPr>
+            <w:r>
+              <w:rPr>
+                <w:rFonts w:ascii="Arial" w:hAnsi="Arial" w:cs="Arial"/>
+                <w:noProof/>
+                <w:color w:val="000000"/>
+                <w:sz w:val="14"/>
+                <w:szCs w:val="14"/>
+              </w:rPr>
+              <w:fldChar w:fldCharType="begin"/>
+            </w:r>
+            <w:r>
+              <w:rPr>
+                <w:rFonts w:ascii="Arial" w:hAnsi="Arial" w:cs="Arial"/>
+                <w:noProof/>
+                <w:color w:val="000000"/>
+                <w:sz w:val="14"/>
+                <w:szCs w:val="14"/>
+              </w:rPr>
+              <w:instrText xml:space="preserve"> MERGEFIELD  =comp.relative_molecular_weight  \* MERGEFORMAT </w:instrText>
+            </w:r>
+            <w:r>
+              <w:rPr>
+                <w:rFonts w:ascii="Arial" w:hAnsi="Arial" w:cs="Arial"/>
+                <w:noProof/>
+                <w:color w:val="000000"/>
+                <w:sz w:val="14"/>
+                <w:szCs w:val="14"/>
+              </w:rPr>
+              <w:fldChar w:fldCharType="separate"/>
+            </w:r>
+            <w:r>
+              <w:rPr>
+                <w:rFonts w:ascii="Arial" w:hAnsi="Arial" w:cs="Arial"/>
+                <w:noProof/>
+                <w:color w:val="000000"/>
+                <w:sz w:val="14"/>
+                <w:szCs w:val="14"/>
+              </w:rPr>
+              <w:t>«=comp.relative_molecular_weight»</w:t>
+            </w:r>
+            <w:r>
+              <w:rPr>
+                <w:rFonts w:ascii="Arial" w:hAnsi="Arial" w:cs="Arial"/>
+                <w:noProof/>
+                <w:color w:val="000000"/>
+                <w:sz w:val="14"/>
+                <w:szCs w:val="14"/>
+              </w:rPr>
+              <w:fldChar w:fldCharType="end"/>
+            </w:r>
+            <w:r>
+              <w:rPr>
+                <w:rFonts w:ascii="Arial" w:hAnsi="Arial" w:cs="Arial"/>
+                <w:noProof/>
+                <w:color w:val="000000"/>
+                <w:sz w:val="14"/>
+                <w:szCs w:val="14"/>
+              </w:rPr>
+              <w:t xml:space="preserve"> g/mol</w:t>
+            </w:r>
+          </w:p>
+        </w:tc>
+        <w:tc>
+          <w:tcPr>
+            <w:tcW w:w="1506" w:type="dxa"/>
+            <w:gridSpan w:val="2"/>
+          </w:tcPr>
+          <w:p>
+            <w:pPr>
+              <w:jc w:val="center"/>
+              <w:rPr>
+                <w:rFonts w:ascii="Arial" w:hAnsi="Arial" w:cs="Arial"/>
+                <w:sz w:val="14"/>
+                <w:szCs w:val="14"/>
+              </w:rPr>
+            </w:pPr>
+            <w:r>
+              <w:rPr>
+                <w:rFonts w:ascii="Arial" w:hAnsi="Arial" w:cs="Arial"/>
+                <w:noProof/>
+                <w:color w:val="000000"/>
+                <w:sz w:val="14"/>
+                <w:szCs w:val="14"/>
+              </w:rPr>
+              <w:fldChar w:fldCharType="begin"/>
+            </w:r>
+            <w:r>
+              <w:rPr>
+                <w:rFonts w:ascii="Arial" w:hAnsi="Arial" w:cs="Arial"/>
+                <w:noProof/>
+                <w:color w:val="000000"/>
+                <w:sz w:val="14"/>
+                <w:szCs w:val="14"/>
+              </w:rPr>
+              <w:instrText xml:space="preserve"> MERGEFIELD  =comp.concn  \* MERGEFORMAT </w:instrText>
+            </w:r>
+            <w:r>
+              <w:rPr>
+                <w:rFonts w:ascii="Arial" w:hAnsi="Arial" w:cs="Arial"/>
+                <w:noProof/>
+                <w:color w:val="000000"/>
+                <w:sz w:val="14"/>
+                <w:szCs w:val="14"/>
+              </w:rPr>
+              <w:fldChar w:fldCharType="separate"/>
+            </w:r>
+            <w:r>
+              <w:rPr>
+                <w:rFonts w:ascii="Arial" w:hAnsi="Arial" w:cs="Arial"/>
+                <w:noProof/>
+                <w:color w:val="000000"/>
+                <w:sz w:val="14"/>
+                <w:szCs w:val="14"/>
+              </w:rPr>
+              <w:t>«=comp.concn»</w:t>
+            </w:r>
+            <w:r>
+              <w:rPr>
+                <w:rFonts w:ascii="Arial" w:hAnsi="Arial" w:cs="Arial"/>
+                <w:noProof/>
+                <w:color w:val="000000"/>
+                <w:sz w:val="14"/>
+                <w:szCs w:val="14"/>
+              </w:rPr>
+              <w:fldChar w:fldCharType="end"/>
+            </w:r>
+            <w:r>
+              <w:rPr>
+                <w:rFonts w:ascii="Arial" w:hAnsi="Arial" w:cs="Arial"/>
+                <w:noProof/>
+                <w:color w:val="000000"/>
+                <w:sz w:val="14"/>
+                <w:szCs w:val="14"/>
+              </w:rPr>
+              <w:t xml:space="preserve"> </w:t>
+            </w:r>
+            <w:r>
+              <w:rPr>
+                <w:rFonts w:ascii="Arial" w:hAnsi="Arial" w:cs="Arial"/>
+                <w:noProof/>
+                <w:color w:val="000000"/>
+                <w:sz w:val="14"/>
+                <w:szCs w:val="14"/>
+              </w:rPr>
+              <w:fldChar w:fldCharType="begin"/>
+            </w:r>
+            <w:r>
+              <w:rPr>
+                <w:rFonts w:ascii="Arial" w:hAnsi="Arial" w:cs="Arial"/>
+                <w:noProof/>
+                <w:color w:val="000000"/>
+                <w:sz w:val="14"/>
+                <w:szCs w:val="14"/>
+              </w:rPr>
+              <w:instrText xml:space="preserve"> MERGEFIELD  =comp.concn_unit  \* MERGEFORMAT </w:instrText>
+            </w:r>
+            <w:r>
+              <w:rPr>
+                <w:rFonts w:ascii="Arial" w:hAnsi="Arial" w:cs="Arial"/>
+                <w:noProof/>
+                <w:color w:val="000000"/>
+                <w:sz w:val="14"/>
+                <w:szCs w:val="14"/>
+              </w:rPr>
+              <w:fldChar w:fldCharType="separate"/>
+            </w:r>
+            <w:r>
+              <w:rPr>
+                <w:rFonts w:ascii="Arial" w:hAnsi="Arial" w:cs="Arial"/>
+                <w:noProof/>
+                <w:color w:val="000000"/>
+                <w:sz w:val="14"/>
+                <w:szCs w:val="14"/>
+              </w:rPr>
+              <w:t>«=comp.concn_unit»</w:t>
+            </w:r>
+            <w:r>
+              <w:rPr>
+                <w:rFonts w:ascii="Arial" w:hAnsi="Arial" w:cs="Arial"/>
+                <w:noProof/>
+                <w:color w:val="000000"/>
+                <w:sz w:val="14"/>
+                <w:szCs w:val="14"/>
+              </w:rPr>
+              <w:fldChar w:fldCharType="end"/>
+            </w:r>
+          </w:p>
+        </w:tc>
+        <w:tc>
+          <w:tcPr>
+            <w:tcW w:w="1507" w:type="dxa"/>
+            <w:gridSpan w:val="2"/>
+          </w:tcPr>
+          <w:p>
+            <w:pPr>
+              <w:jc w:val="center"/>
+              <w:rPr>
+                <w:rFonts w:ascii="Arial" w:hAnsi="Arial" w:cs="Arial"/>
+                <w:sz w:val="14"/>
+                <w:szCs w:val="14"/>
+              </w:rPr>
+            </w:pPr>
+            <w:r>
+              <w:rPr>
+                <w:rFonts w:ascii="Arial" w:hAnsi="Arial" w:cs="Arial"/>
+                <w:noProof/>
+                <w:color w:val="000000"/>
+                <w:sz w:val="14"/>
+                <w:szCs w:val="14"/>
+              </w:rPr>
+              <w:fldChar w:fldCharType="begin"/>
+            </w:r>
+            <w:r>
+              <w:rPr>
+                <w:rFonts w:ascii="Arial" w:hAnsi="Arial" w:cs="Arial"/>
+                <w:noProof/>
+                <w:color w:val="000000"/>
+                <w:sz w:val="14"/>
+                <w:szCs w:val="14"/>
+              </w:rPr>
+              <w:instrText xml:space="preserve"> MERGEFIELD  =comp.equivalent  \* MERGEFORMAT </w:instrText>
+            </w:r>
+            <w:r>
+              <w:rPr>
+                <w:rFonts w:ascii="Arial" w:hAnsi="Arial" w:cs="Arial"/>
+                <w:noProof/>
+                <w:color w:val="000000"/>
+                <w:sz w:val="14"/>
+                <w:szCs w:val="14"/>
+              </w:rPr>
+              <w:fldChar w:fldCharType="separate"/>
+            </w:r>
+            <w:r>
+              <w:rPr>
+                <w:rFonts w:ascii="Arial" w:hAnsi="Arial" w:cs="Arial"/>
+                <w:noProof/>
+                <w:color w:val="000000"/>
+                <w:sz w:val="14"/>
+                <w:szCs w:val="14"/>
+              </w:rPr>
+              <w:t>«=comp.equivalent»</w:t>
+            </w:r>
+            <w:r>
+              <w:rPr>
+                <w:rFonts w:ascii="Arial" w:hAnsi="Arial" w:cs="Arial"/>
+                <w:noProof/>
+                <w:color w:val="000000"/>
+                <w:sz w:val="14"/>
+                <w:szCs w:val="14"/>
+              </w:rPr>
+              <w:fldChar w:fldCharType="end"/>
+            </w:r>
+          </w:p>
+          <w:p>
+            <w:pPr>
+              <w:jc w:val="center"/>
+              <w:rPr>
+                <w:rFonts w:ascii="Arial" w:hAnsi="Arial" w:cs="Arial"/>
+                <w:sz w:val="14"/>
+                <w:szCs w:val="14"/>
+              </w:rPr>
+            </w:pPr>
+          </w:p>
+        </w:tc>
+      </w:tr>
+      <w:tr>
+        <w:trPr>
+          <w:trHeight w:val="255"/>
+        </w:trPr>
+        <w:tc>
+          <w:tcPr>
+            <w:tcW w:w="9145" w:type="dxa"/>
+            <w:gridSpan w:val="15"/>
+          </w:tcPr>
+          <w:p>
+            <w:pPr>
+              <w:rPr>
+                <w:rFonts w:ascii="Arial" w:hAnsi="Arial" w:cs="Arial"/>
+                <w:noProof/>
+                <w:color w:val="000000"/>
+                <w:sz w:val="14"/>
+                <w:szCs w:val="14"/>
+              </w:rPr>
+            </w:pPr>
+            <w:r>
+              <w:rPr>
+                <w:rFonts w:ascii="Arial" w:hAnsi="Arial" w:cs="Arial"/>
+                <w:sz w:val="18"/>
+                <w:szCs w:val="18"/>
+              </w:rPr>
+              <w:fldChar w:fldCharType="begin"/>
+            </w:r>
+            <w:r>
+              <w:rPr>
+                <w:rFonts w:ascii="Arial" w:hAnsi="Arial" w:cs="Arial"/>
+                <w:sz w:val="18"/>
+                <w:szCs w:val="18"/>
+              </w:rPr>
+              <w:instrText xml:space="preserve"> MERGEFIELD  r.components:endEach  \* MERGEFORMAT </w:instrText>
+            </w:r>
+            <w:r>
+              <w:rPr>
+                <w:rFonts w:ascii="Arial" w:hAnsi="Arial" w:cs="Arial"/>
+                <w:sz w:val="18"/>
+                <w:szCs w:val="18"/>
+              </w:rPr>
+              <w:fldChar w:fldCharType="separate"/>
+            </w:r>
+            <w:r>
+              <w:rPr>
+                <w:rFonts w:ascii="Arial" w:hAnsi="Arial" w:cs="Arial"/>
+                <w:noProof/>
+                <w:sz w:val="18"/>
+                <w:szCs w:val="18"/>
+              </w:rPr>
+              <w:t>«r.components:endEach»</w:t>
+            </w:r>
+            <w:r>
+              <w:rPr>
+                <w:rFonts w:ascii="Arial" w:hAnsi="Arial" w:cs="Arial"/>
+                <w:sz w:val="18"/>
+                <w:szCs w:val="18"/>
+              </w:rPr>
+              <w:fldChar w:fldCharType="end"/>
+            </w:r>
+            <w:r>
+              <w:rPr>
+                <w:rFonts w:ascii="Arial" w:hAnsi="Arial" w:cs="Arial"/>
+                <w:noProof/>
+                <w:color w:val="000000"/>
+                <w:sz w:val="18"/>
+                <w:szCs w:val="18"/>
+              </w:rPr>
+              <w:tab/>
+            </w:r>
+          </w:p>
+        </w:tc>
+      </w:tr>
+      <w:tr>
+        <w:trPr>
+          <w:trHeight w:val="255"/>
+        </w:trPr>
+        <w:tc>
+          <w:tcPr>
+            <w:tcW w:w="9145" w:type="dxa"/>
+            <w:gridSpan w:val="15"/>
+          </w:tcPr>
+          <w:p>
+            <w:pPr>
+              <w:rPr>
+                <w:rFonts w:ascii="Arial" w:hAnsi="Arial" w:cs="Arial"/>
+                <w:noProof/>
+                <w:color w:val="000000"/>
+                <w:sz w:val="14"/>
+                <w:szCs w:val="14"/>
+              </w:rPr>
+            </w:pPr>
+            <w:r>
+              <w:rPr>
+                <w:rFonts w:ascii="Arial" w:hAnsi="Arial" w:cs="Arial"/>
+                <w:sz w:val="18"/>
+                <w:szCs w:val="18"/>
+              </w:rPr>
+              <w:fldChar w:fldCharType="begin"/>
+            </w:r>
+            <w:r>
+              <w:rPr>
+                <w:rFonts w:ascii="Arial" w:hAnsi="Arial" w:cs="Arial"/>
+                <w:sz w:val="18"/>
+                <w:szCs w:val="18"/>
+              </w:rPr>
+              <w:instrText xml:space="preserve"> MERGEFIELD  r.components:endIf  \* MERGEFORMAT </w:instrText>
+            </w:r>
+            <w:r>
+              <w:rPr>
+                <w:rFonts w:ascii="Arial" w:hAnsi="Arial" w:cs="Arial"/>
+                <w:sz w:val="18"/>
+                <w:szCs w:val="18"/>
+              </w:rPr>
+              <w:fldChar w:fldCharType="separate"/>
+            </w:r>
+            <w:r>
+              <w:rPr>
+                <w:rFonts w:ascii="Arial" w:hAnsi="Arial" w:cs="Arial"/>
+                <w:noProof/>
+                <w:sz w:val="18"/>
+                <w:szCs w:val="18"/>
+              </w:rPr>
+              <w:t>«r.components:endIf»</w:t>
+            </w:r>
+            <w:r>
+              <w:rPr>
+                <w:rFonts w:ascii="Arial" w:hAnsi="Arial" w:cs="Arial"/>
                 <w:sz w:val="18"/>
                 <w:szCs w:val="18"/>
               </w:rPr>
@@ -3520,8 +5421,9 @@
     </w:p>
     <w:tbl>
       <w:tblPr>
-        <w:tblStyle w:val="Tabellenraster"/>
-        <w:tblW w:w="0" w:type="auto"/>
+        <w:tblStyle w:val="TableGrid"/>
+        <w:tblW w:w="9145" w:type="dxa"/>
+        <w:tblInd w:w="-108" w:type="dxa"/>
         <w:tblBorders>
           <w:top w:val="none" w:sz="0" w:space="0" w:color="auto"/>
           <w:left w:val="none" w:sz="0" w:space="0" w:color="auto"/>
@@ -3534,17 +5436,29 @@
         <w:tblLook w:val="04A0" w:firstRow="1" w:lastRow="0" w:firstColumn="1" w:lastColumn="0" w:noHBand="0" w:noVBand="1"/>
       </w:tblPr>
       <w:tblGrid>
+        <w:gridCol w:w="108"/>
         <w:gridCol w:w="338"/>
-        <w:gridCol w:w="1542"/>
-        <w:gridCol w:w="1182"/>
+        <w:gridCol w:w="382"/>
+        <w:gridCol w:w="360"/>
+        <w:gridCol w:w="800"/>
+        <w:gridCol w:w="1132"/>
+        <w:gridCol w:w="50"/>
         <w:gridCol w:w="1134"/>
-        <w:gridCol w:w="1202"/>
-        <w:gridCol w:w="1361"/>
+        <w:gridCol w:w="322"/>
+        <w:gridCol w:w="880"/>
+        <w:gridCol w:w="626"/>
+        <w:gridCol w:w="735"/>
+        <w:gridCol w:w="771"/>
+        <w:gridCol w:w="363"/>
         <w:gridCol w:w="1134"/>
-        <w:gridCol w:w="1134"/>
+        <w:gridCol w:w="10"/>
       </w:tblGrid>
       <w:tr>
         <w:trPr>
+          <w:gridBefore w:val="1"/>
+          <w:gridAfter w:val="1"/>
+          <w:wBefore w:w="108" w:type="dxa"/>
+          <w:wAfter w:w="10" w:type="dxa"/>
           <w:trHeight w:val="255"/>
         </w:trPr>
         <w:tc>
@@ -3569,7 +5483,6 @@
                 <w:sz w:val="18"/>
                 <w:szCs w:val="18"/>
               </w:rPr>
-              <w:lastRenderedPageBreak/>
               <w:t>P</w:t>
             </w:r>
           </w:p>
@@ -3577,6 +5490,7 @@
         <w:tc>
           <w:tcPr>
             <w:tcW w:w="1542" w:type="dxa"/>
+            <w:gridSpan w:val="3"/>
           </w:tcPr>
           <w:p>
             <w:pPr>
@@ -3648,6 +5562,7 @@
         <w:tc>
           <w:tcPr>
             <w:tcW w:w="1182" w:type="dxa"/>
+            <w:gridSpan w:val="2"/>
           </w:tcPr>
           <w:p>
             <w:pPr>
@@ -3836,6 +5751,7 @@
         <w:tc>
           <w:tcPr>
             <w:tcW w:w="1202" w:type="dxa"/>
+            <w:gridSpan w:val="2"/>
           </w:tcPr>
           <w:p>
             <w:pPr>
@@ -3951,6 +5867,7 @@
         <w:tc>
           <w:tcPr>
             <w:tcW w:w="1361" w:type="dxa"/>
+            <w:gridSpan w:val="2"/>
           </w:tcPr>
           <w:p>
             <w:pPr>
@@ -3997,6 +5914,122 @@
                 <w:szCs w:val="18"/>
               </w:rPr>
               <w:t>«=p.density»</w:t>
+            </w:r>
+            <w:r>
+              <w:rPr>
+                <w:rFonts w:ascii="Arial" w:hAnsi="Arial" w:cs="Arial"/>
+                <w:noProof/>
+                <w:sz w:val="18"/>
+                <w:szCs w:val="18"/>
+              </w:rPr>
+              <w:fldChar w:fldCharType="end"/>
+            </w:r>
+          </w:p>
+        </w:tc>
+        <w:tc>
+          <w:tcPr>
+            <w:tcW w:w="1134" w:type="dxa"/>
+            <w:gridSpan w:val="2"/>
+          </w:tcPr>
+          <w:p>
+            <w:pPr>
+              <w:jc w:val="center"/>
+              <w:rPr>
+                <w:rFonts w:ascii="Arial" w:hAnsi="Arial" w:cs="Arial"/>
+                <w:noProof/>
+                <w:sz w:val="18"/>
+                <w:szCs w:val="18"/>
+              </w:rPr>
+            </w:pPr>
+            <w:r>
+              <w:rPr>
+                <w:rFonts w:ascii="Arial" w:hAnsi="Arial" w:cs="Arial"/>
+                <w:noProof/>
+                <w:sz w:val="18"/>
+                <w:szCs w:val="18"/>
+              </w:rPr>
+              <w:fldChar w:fldCharType="begin"/>
+            </w:r>
+            <w:r>
+              <w:rPr>
+                <w:rFonts w:ascii="Arial" w:hAnsi="Arial" w:cs="Arial"/>
+                <w:noProof/>
+                <w:sz w:val="18"/>
+                <w:szCs w:val="18"/>
+              </w:rPr>
+              <w:instrText xml:space="preserve"> MERGEFIELD  =p.mol  \* MERGEFORMAT </w:instrText>
+            </w:r>
+            <w:r>
+              <w:rPr>
+                <w:rFonts w:ascii="Arial" w:hAnsi="Arial" w:cs="Arial"/>
+                <w:noProof/>
+                <w:sz w:val="18"/>
+                <w:szCs w:val="18"/>
+              </w:rPr>
+              <w:fldChar w:fldCharType="separate"/>
+            </w:r>
+            <w:r>
+              <w:rPr>
+                <w:rFonts w:ascii="Arial" w:hAnsi="Arial" w:cs="Arial"/>
+                <w:noProof/>
+                <w:sz w:val="18"/>
+                <w:szCs w:val="18"/>
+              </w:rPr>
+              <w:t>«=p.mol»</w:t>
+            </w:r>
+            <w:r>
+              <w:rPr>
+                <w:rFonts w:ascii="Arial" w:hAnsi="Arial" w:cs="Arial"/>
+                <w:noProof/>
+                <w:sz w:val="18"/>
+                <w:szCs w:val="18"/>
+              </w:rPr>
+              <w:fldChar w:fldCharType="end"/>
+            </w:r>
+            <w:r>
+              <w:rPr>
+                <w:rFonts w:ascii="Arial" w:hAnsi="Arial" w:cs="Arial"/>
+                <w:noProof/>
+                <w:sz w:val="18"/>
+                <w:szCs w:val="18"/>
+              </w:rPr>
+              <w:t xml:space="preserve"> </w:t>
+            </w:r>
+            <w:r>
+              <w:rPr>
+                <w:rFonts w:ascii="Arial" w:hAnsi="Arial" w:cs="Arial"/>
+                <w:noProof/>
+                <w:sz w:val="18"/>
+                <w:szCs w:val="18"/>
+              </w:rPr>
+              <w:fldChar w:fldCharType="begin"/>
+            </w:r>
+            <w:r>
+              <w:rPr>
+                <w:rFonts w:ascii="Arial" w:hAnsi="Arial" w:cs="Arial"/>
+                <w:noProof/>
+                <w:sz w:val="18"/>
+                <w:szCs w:val="18"/>
+              </w:rPr>
+              <w:instrText xml:space="preserve"> MERGEFIELD  =p.mmol_unit  \* MERGEFORMAT </w:instrText>
+            </w:r>
+            <w:r>
+              <w:rPr>
+                <w:rFonts w:ascii="Arial" w:hAnsi="Arial" w:cs="Arial"/>
+                <w:noProof/>
+                <w:sz w:val="18"/>
+                <w:szCs w:val="18"/>
+              </w:rPr>
+              <w:fldChar w:fldCharType="separate"/>
+            </w:r>
+            <w:r>
+              <w:rPr>
+                <w:rFonts w:ascii="Arial" w:hAnsi="Arial" w:cs="Arial"/>
+                <w:noProof/>
+                <w:sz w:val="18"/>
+                <w:szCs w:val="18"/>
+              </w:rPr>
+              <w:t>«=p.mmol_unit»</w:t>
             </w:r>
             <w:r>
               <w:rPr>
@@ -4027,6 +6060,7 @@
               <w:rPr>
                 <w:rFonts w:ascii="Arial" w:hAnsi="Arial" w:cs="Arial"/>
                 <w:noProof/>
+                <w:color w:val="FF0000"/>
                 <w:sz w:val="18"/>
                 <w:szCs w:val="18"/>
               </w:rPr>
@@ -4036,15 +6070,17 @@
               <w:rPr>
                 <w:rFonts w:ascii="Arial" w:hAnsi="Arial" w:cs="Arial"/>
                 <w:noProof/>
-                <w:sz w:val="18"/>
-                <w:szCs w:val="18"/>
-              </w:rPr>
-              <w:instrText xml:space="preserve"> MERGEFIELD  =p.mol  \* MERGEFORMAT </w:instrText>
-            </w:r>
-            <w:r>
-              <w:rPr>
-                <w:rFonts w:ascii="Arial" w:hAnsi="Arial" w:cs="Arial"/>
-                <w:noProof/>
+                <w:color w:val="FF0000"/>
+                <w:sz w:val="18"/>
+                <w:szCs w:val="18"/>
+              </w:rPr>
+              <w:instrText xml:space="preserve"> MERGEFIELD  =p.equiv  \* MERGEFORMAT </w:instrText>
+            </w:r>
+            <w:r>
+              <w:rPr>
+                <w:rFonts w:ascii="Arial" w:hAnsi="Arial" w:cs="Arial"/>
+                <w:noProof/>
+                <w:color w:val="FF0000"/>
                 <w:sz w:val="18"/>
                 <w:szCs w:val="18"/>
               </w:rPr>
@@ -4054,33 +6090,46 @@
               <w:rPr>
                 <w:rFonts w:ascii="Arial" w:hAnsi="Arial" w:cs="Arial"/>
                 <w:noProof/>
-                <w:sz w:val="18"/>
-                <w:szCs w:val="18"/>
-              </w:rPr>
-              <w:t>«=p.mol»</w:t>
-            </w:r>
-            <w:r>
-              <w:rPr>
-                <w:rFonts w:ascii="Arial" w:hAnsi="Arial" w:cs="Arial"/>
-                <w:noProof/>
+                <w:color w:val="FF0000"/>
+                <w:sz w:val="18"/>
+                <w:szCs w:val="18"/>
+              </w:rPr>
+              <w:t>«=p.equiv»</w:t>
+            </w:r>
+            <w:r>
+              <w:rPr>
+                <w:rFonts w:ascii="Arial" w:hAnsi="Arial" w:cs="Arial"/>
+                <w:noProof/>
+                <w:color w:val="FF0000"/>
                 <w:sz w:val="18"/>
                 <w:szCs w:val="18"/>
               </w:rPr>
               <w:fldChar w:fldCharType="end"/>
             </w:r>
-            <w:r>
-              <w:rPr>
-                <w:rFonts w:ascii="Arial" w:hAnsi="Arial" w:cs="Arial"/>
-                <w:noProof/>
-                <w:sz w:val="18"/>
-                <w:szCs w:val="18"/>
-              </w:rPr>
-              <w:t xml:space="preserve"> </w:t>
-            </w:r>
-            <w:r>
-              <w:rPr>
-                <w:rFonts w:ascii="Arial" w:hAnsi="Arial" w:cs="Arial"/>
-                <w:noProof/>
+          </w:p>
+        </w:tc>
+      </w:tr>
+      <w:tr>
+        <w:trPr>
+          <w:trHeight w:val="255"/>
+        </w:trPr>
+        <w:tc>
+          <w:tcPr>
+            <w:tcW w:w="9145" w:type="dxa"/>
+            <w:gridSpan w:val="16"/>
+          </w:tcPr>
+          <w:p>
+            <w:pPr>
+              <w:rPr>
+                <w:rFonts w:ascii="Arial" w:hAnsi="Arial" w:cs="Arial"/>
+                <w:noProof/>
+                <w:sz w:val="18"/>
+                <w:szCs w:val="18"/>
+              </w:rPr>
+            </w:pPr>
+            <w:r>
+              <w:rPr>
+                <w:rFonts w:ascii="Arial" w:hAnsi="Arial" w:cs="Arial"/>
                 <w:sz w:val="18"/>
                 <w:szCs w:val="18"/>
               </w:rPr>
@@ -4089,16 +6138,14 @@
             <w:r>
               <w:rPr>
                 <w:rFonts w:ascii="Arial" w:hAnsi="Arial" w:cs="Arial"/>
-                <w:noProof/>
-                <w:sz w:val="18"/>
-                <w:szCs w:val="18"/>
-              </w:rPr>
-              <w:instrText xml:space="preserve"> MERGEFIELD  =p.mmol_unit  \* MERGEFORMAT </w:instrText>
-            </w:r>
-            <w:r>
-              <w:rPr>
-                <w:rFonts w:ascii="Arial" w:hAnsi="Arial" w:cs="Arial"/>
-                <w:noProof/>
+                <w:sz w:val="18"/>
+                <w:szCs w:val="18"/>
+              </w:rPr>
+              <w:instrText xml:space="preserve"> MERGEFIELD  p.components:if  \* MERGEFORMAT </w:instrText>
+            </w:r>
+            <w:r>
+              <w:rPr>
+                <w:rFonts w:ascii="Arial" w:hAnsi="Arial" w:cs="Arial"/>
                 <w:sz w:val="18"/>
                 <w:szCs w:val="18"/>
               </w:rPr>
@@ -4111,60 +6158,214 @@
                 <w:sz w:val="18"/>
                 <w:szCs w:val="18"/>
               </w:rPr>
-              <w:t>«=p.mmol_unit»</w:t>
-            </w:r>
-            <w:r>
-              <w:rPr>
-                <w:rFonts w:ascii="Arial" w:hAnsi="Arial" w:cs="Arial"/>
-                <w:noProof/>
+              <w:t>«p.components:if»</w:t>
+            </w:r>
+            <w:r>
+              <w:rPr>
+                <w:rFonts w:ascii="Arial" w:hAnsi="Arial" w:cs="Arial"/>
                 <w:sz w:val="18"/>
                 <w:szCs w:val="18"/>
               </w:rPr>
               <w:fldChar w:fldCharType="end"/>
             </w:r>
+          </w:p>
+        </w:tc>
+      </w:tr>
+      <w:tr>
+        <w:trPr>
+          <w:trHeight w:val="255"/>
+        </w:trPr>
+        <w:tc>
+          <w:tcPr>
+            <w:tcW w:w="828" w:type="dxa"/>
+            <w:gridSpan w:val="3"/>
+          </w:tcPr>
+          <w:p>
+            <w:pPr>
+              <w:rPr>
+                <w:rFonts w:ascii="Arial" w:hAnsi="Arial" w:cs="Arial"/>
+                <w:sz w:val="14"/>
+                <w:szCs w:val="14"/>
+              </w:rPr>
+            </w:pPr>
           </w:p>
         </w:tc>
         <w:tc>
           <w:tcPr>
-            <w:tcW w:w="1134" w:type="dxa"/>
+            <w:tcW w:w="2292" w:type="dxa"/>
+            <w:gridSpan w:val="3"/>
+            <w:tcBorders>
+              <w:top w:val="single" w:sz="4" w:space="0" w:color="auto"/>
+              <w:left w:val="nil"/>
+              <w:bottom w:val="single" w:sz="4" w:space="0" w:color="auto"/>
+            </w:tcBorders>
           </w:tcPr>
           <w:p>
             <w:pPr>
               <w:jc w:val="center"/>
               <w:rPr>
                 <w:rFonts w:ascii="Arial" w:hAnsi="Arial" w:cs="Arial"/>
-                <w:noProof/>
-                <w:sz w:val="18"/>
-                <w:szCs w:val="18"/>
+                <w:sz w:val="14"/>
+                <w:szCs w:val="14"/>
               </w:rPr>
             </w:pPr>
             <w:r>
               <w:rPr>
                 <w:rFonts w:ascii="Arial" w:hAnsi="Arial" w:cs="Arial"/>
-                <w:noProof/>
-                <w:color w:val="FF0000"/>
-                <w:sz w:val="18"/>
-                <w:szCs w:val="18"/>
+                <w:sz w:val="14"/>
+                <w:szCs w:val="14"/>
+              </w:rPr>
+              <w:t>Component</w:t>
+            </w:r>
+          </w:p>
+        </w:tc>
+        <w:tc>
+          <w:tcPr>
+            <w:tcW w:w="1506" w:type="dxa"/>
+            <w:gridSpan w:val="3"/>
+            <w:tcBorders>
+              <w:top w:val="single" w:sz="4" w:space="0" w:color="auto"/>
+              <w:bottom w:val="single" w:sz="4" w:space="0" w:color="auto"/>
+            </w:tcBorders>
+          </w:tcPr>
+          <w:p>
+            <w:pPr>
+              <w:jc w:val="center"/>
+              <w:rPr>
+                <w:rFonts w:ascii="Arial" w:hAnsi="Arial" w:cs="Arial"/>
+                <w:sz w:val="14"/>
+                <w:szCs w:val="14"/>
+              </w:rPr>
+            </w:pPr>
+            <w:r>
+              <w:rPr>
+                <w:rFonts w:ascii="Arial" w:hAnsi="Arial" w:cs="Arial"/>
+                <w:sz w:val="14"/>
+                <w:szCs w:val="14"/>
+              </w:rPr>
+              <w:t>Amount</w:t>
+            </w:r>
+          </w:p>
+        </w:tc>
+        <w:tc>
+          <w:tcPr>
+            <w:tcW w:w="1506" w:type="dxa"/>
+            <w:gridSpan w:val="2"/>
+            <w:tcBorders>
+              <w:top w:val="single" w:sz="4" w:space="0" w:color="auto"/>
+              <w:bottom w:val="single" w:sz="4" w:space="0" w:color="auto"/>
+            </w:tcBorders>
+          </w:tcPr>
+          <w:p>
+            <w:pPr>
+              <w:jc w:val="center"/>
+              <w:rPr>
+                <w:rFonts w:ascii="Arial" w:hAnsi="Arial" w:cs="Arial"/>
+                <w:sz w:val="14"/>
+                <w:szCs w:val="14"/>
+              </w:rPr>
+            </w:pPr>
+            <w:r>
+              <w:rPr>
+                <w:rFonts w:ascii="Arial" w:hAnsi="Arial" w:cs="Arial"/>
+                <w:sz w:val="14"/>
+                <w:szCs w:val="14"/>
+              </w:rPr>
+              <w:t>Rel. MW</w:t>
+            </w:r>
+          </w:p>
+        </w:tc>
+        <w:tc>
+          <w:tcPr>
+            <w:tcW w:w="1506" w:type="dxa"/>
+            <w:gridSpan w:val="2"/>
+            <w:tcBorders>
+              <w:top w:val="single" w:sz="4" w:space="0" w:color="auto"/>
+              <w:bottom w:val="single" w:sz="4" w:space="0" w:color="auto"/>
+            </w:tcBorders>
+          </w:tcPr>
+          <w:p>
+            <w:pPr>
+              <w:jc w:val="center"/>
+              <w:rPr>
+                <w:rFonts w:ascii="Arial" w:hAnsi="Arial" w:cs="Arial"/>
+                <w:sz w:val="14"/>
+                <w:szCs w:val="14"/>
+              </w:rPr>
+            </w:pPr>
+            <w:r>
+              <w:rPr>
+                <w:rFonts w:ascii="Arial" w:hAnsi="Arial" w:cs="Arial"/>
+                <w:sz w:val="14"/>
+                <w:szCs w:val="14"/>
+              </w:rPr>
+              <w:t>Conc</w:t>
+            </w:r>
+          </w:p>
+        </w:tc>
+        <w:tc>
+          <w:tcPr>
+            <w:tcW w:w="1507" w:type="dxa"/>
+            <w:gridSpan w:val="3"/>
+          </w:tcPr>
+          <w:p>
+            <w:pPr>
+              <w:jc w:val="center"/>
+              <w:rPr>
+                <w:rFonts w:ascii="Arial" w:hAnsi="Arial" w:cs="Arial"/>
+                <w:sz w:val="14"/>
+                <w:szCs w:val="14"/>
+              </w:rPr>
+            </w:pPr>
+            <w:r>
+              <w:rPr>
+                <w:rFonts w:ascii="Arial" w:hAnsi="Arial" w:cs="Arial"/>
+                <w:sz w:val="14"/>
+                <w:szCs w:val="14"/>
+              </w:rPr>
+              <w:t>Ratio</w:t>
+            </w:r>
+          </w:p>
+        </w:tc>
+      </w:tr>
+      <w:tr>
+        <w:trPr>
+          <w:trHeight w:val="255"/>
+        </w:trPr>
+        <w:tc>
+          <w:tcPr>
+            <w:tcW w:w="9145" w:type="dxa"/>
+            <w:gridSpan w:val="16"/>
+          </w:tcPr>
+          <w:p>
+            <w:pPr>
+              <w:rPr>
+                <w:rFonts w:ascii="Arial" w:hAnsi="Arial" w:cs="Arial"/>
+                <w:sz w:val="14"/>
+                <w:szCs w:val="14"/>
+              </w:rPr>
+            </w:pPr>
+            <w:r>
+              <w:rPr>
+                <w:rFonts w:ascii="Arial" w:hAnsi="Arial" w:cs="Arial"/>
+                <w:sz w:val="14"/>
+                <w:szCs w:val="14"/>
               </w:rPr>
               <w:fldChar w:fldCharType="begin"/>
             </w:r>
             <w:r>
               <w:rPr>
                 <w:rFonts w:ascii="Arial" w:hAnsi="Arial" w:cs="Arial"/>
-                <w:noProof/>
-                <w:color w:val="FF0000"/>
-                <w:sz w:val="18"/>
-                <w:szCs w:val="18"/>
-              </w:rPr>
-              <w:instrText xml:space="preserve"> MERGEFIELD  =p.equiv  \* MERGEFORMAT </w:instrText>
-            </w:r>
-            <w:r>
-              <w:rPr>
-                <w:rFonts w:ascii="Arial" w:hAnsi="Arial" w:cs="Arial"/>
-                <w:noProof/>
-                <w:color w:val="FF0000"/>
-                <w:sz w:val="18"/>
-                <w:szCs w:val="18"/>
+                <w:sz w:val="14"/>
+                <w:szCs w:val="14"/>
+              </w:rPr>
+              <w:instrText xml:space="preserve"> MERGEFIELD  p.components:each(comp)  \* MERGEFORMAT </w:instrText>
+            </w:r>
+            <w:r>
+              <w:rPr>
+                <w:rFonts w:ascii="Arial" w:hAnsi="Arial" w:cs="Arial"/>
+                <w:sz w:val="14"/>
+                <w:szCs w:val="14"/>
               </w:rPr>
               <w:fldChar w:fldCharType="separate"/>
             </w:r>
@@ -4172,17 +6373,671 @@
               <w:rPr>
                 <w:rFonts w:ascii="Arial" w:hAnsi="Arial" w:cs="Arial"/>
                 <w:noProof/>
-                <w:color w:val="FF0000"/>
-                <w:sz w:val="18"/>
-                <w:szCs w:val="18"/>
-              </w:rPr>
-              <w:t>«=p.equiv»</w:t>
-            </w:r>
-            <w:r>
-              <w:rPr>
-                <w:rFonts w:ascii="Arial" w:hAnsi="Arial" w:cs="Arial"/>
-                <w:noProof/>
-                <w:color w:val="FF0000"/>
+                <w:sz w:val="14"/>
+                <w:szCs w:val="14"/>
+              </w:rPr>
+              <w:t>«p.components:each(comp)»</w:t>
+            </w:r>
+            <w:r>
+              <w:rPr>
+                <w:rFonts w:ascii="Arial" w:hAnsi="Arial" w:cs="Arial"/>
+                <w:sz w:val="14"/>
+                <w:szCs w:val="14"/>
+              </w:rPr>
+              <w:fldChar w:fldCharType="end"/>
+            </w:r>
+          </w:p>
+        </w:tc>
+      </w:tr>
+      <w:tr>
+        <w:trPr>
+          <w:trHeight w:val="255"/>
+        </w:trPr>
+        <w:tc>
+          <w:tcPr>
+            <w:tcW w:w="828" w:type="dxa"/>
+            <w:gridSpan w:val="3"/>
+          </w:tcPr>
+          <w:p>
+            <w:pPr>
+              <w:rPr>
+                <w:rFonts w:ascii="Arial" w:hAnsi="Arial" w:cs="Arial"/>
+                <w:sz w:val="14"/>
+                <w:szCs w:val="14"/>
+              </w:rPr>
+            </w:pPr>
+          </w:p>
+        </w:tc>
+        <w:tc>
+          <w:tcPr>
+            <w:tcW w:w="360" w:type="dxa"/>
+            <w:tcBorders>
+              <w:left w:val="nil"/>
+            </w:tcBorders>
+          </w:tcPr>
+          <w:p>
+            <w:pPr>
+              <w:jc w:val="center"/>
+              <w:rPr>
+                <w:rFonts w:ascii="Arial" w:hAnsi="Arial" w:cs="Arial"/>
+                <w:sz w:val="14"/>
+                <w:szCs w:val="14"/>
+              </w:rPr>
+            </w:pPr>
+            <w:r>
+              <w:rPr>
+                <w:rFonts w:ascii="Arial" w:hAnsi="Arial" w:cs="Arial"/>
+                <w:noProof/>
+                <w:color w:val="833C0B" w:themeColor="accent2" w:themeShade="80"/>
+                <w:sz w:val="14"/>
+                <w:szCs w:val="14"/>
+              </w:rPr>
+              <w:t>C</w:t>
+            </w:r>
+          </w:p>
+        </w:tc>
+        <w:tc>
+          <w:tcPr>
+            <w:tcW w:w="1932" w:type="dxa"/>
+            <w:gridSpan w:val="2"/>
+          </w:tcPr>
+          <w:p>
+            <w:pPr>
+              <w:jc w:val="center"/>
+              <w:rPr>
+                <w:rFonts w:ascii="Arial" w:hAnsi="Arial" w:cs="Arial"/>
+                <w:sz w:val="14"/>
+                <w:szCs w:val="14"/>
+              </w:rPr>
+            </w:pPr>
+            <w:r>
+              <w:rPr>
+                <w:rFonts w:ascii="Arial" w:hAnsi="Arial" w:cs="Arial"/>
+                <w:noProof/>
+                <w:color w:val="833C0B" w:themeColor="accent2" w:themeShade="80"/>
+                <w:sz w:val="14"/>
+                <w:szCs w:val="14"/>
+              </w:rPr>
+              <w:fldChar w:fldCharType="begin"/>
+            </w:r>
+            <w:r>
+              <w:rPr>
+                <w:rFonts w:ascii="Arial" w:hAnsi="Arial" w:cs="Arial"/>
+                <w:noProof/>
+                <w:color w:val="833C0B" w:themeColor="accent2" w:themeShade="80"/>
+                <w:sz w:val="14"/>
+                <w:szCs w:val="14"/>
+              </w:rPr>
+              <w:instrText xml:space="preserve"> MERGEFIELD  =comp.name  \* MERGEFORMAT </w:instrText>
+            </w:r>
+            <w:r>
+              <w:rPr>
+                <w:rFonts w:ascii="Arial" w:hAnsi="Arial" w:cs="Arial"/>
+                <w:noProof/>
+                <w:color w:val="833C0B" w:themeColor="accent2" w:themeShade="80"/>
+                <w:sz w:val="14"/>
+                <w:szCs w:val="14"/>
+              </w:rPr>
+              <w:fldChar w:fldCharType="separate"/>
+            </w:r>
+            <w:r>
+              <w:rPr>
+                <w:rFonts w:ascii="Arial" w:hAnsi="Arial" w:cs="Arial"/>
+                <w:noProof/>
+                <w:color w:val="833C0B" w:themeColor="accent2" w:themeShade="80"/>
+                <w:sz w:val="14"/>
+                <w:szCs w:val="14"/>
+              </w:rPr>
+              <w:t>«=comp.name»</w:t>
+            </w:r>
+            <w:r>
+              <w:rPr>
+                <w:rFonts w:ascii="Arial" w:hAnsi="Arial" w:cs="Arial"/>
+                <w:noProof/>
+                <w:color w:val="833C0B" w:themeColor="accent2" w:themeShade="80"/>
+                <w:sz w:val="14"/>
+                <w:szCs w:val="14"/>
+              </w:rPr>
+              <w:fldChar w:fldCharType="end"/>
+            </w:r>
+          </w:p>
+        </w:tc>
+        <w:tc>
+          <w:tcPr>
+            <w:tcW w:w="1506" w:type="dxa"/>
+            <w:gridSpan w:val="3"/>
+          </w:tcPr>
+          <w:p>
+            <w:pPr>
+              <w:jc w:val="center"/>
+              <w:rPr>
+                <w:rFonts w:ascii="Arial" w:hAnsi="Arial" w:cs="Arial"/>
+                <w:sz w:val="14"/>
+                <w:szCs w:val="14"/>
+              </w:rPr>
+            </w:pPr>
+            <w:r>
+              <w:rPr>
+                <w:rFonts w:ascii="Arial" w:hAnsi="Arial" w:cs="Arial"/>
+                <w:noProof/>
+                <w:color w:val="000000"/>
+                <w:sz w:val="14"/>
+                <w:szCs w:val="14"/>
+              </w:rPr>
+              <w:fldChar w:fldCharType="begin"/>
+            </w:r>
+            <w:r>
+              <w:rPr>
+                <w:rFonts w:ascii="Arial" w:hAnsi="Arial" w:cs="Arial"/>
+                <w:noProof/>
+                <w:color w:val="000000"/>
+                <w:sz w:val="14"/>
+                <w:szCs w:val="14"/>
+              </w:rPr>
+              <w:instrText xml:space="preserve"> MERGEFIELD  =comp.amount_mol  \* MERGEFORMAT </w:instrText>
+            </w:r>
+            <w:r>
+              <w:rPr>
+                <w:rFonts w:ascii="Arial" w:hAnsi="Arial" w:cs="Arial"/>
+                <w:noProof/>
+                <w:color w:val="000000"/>
+                <w:sz w:val="14"/>
+                <w:szCs w:val="14"/>
+              </w:rPr>
+              <w:fldChar w:fldCharType="separate"/>
+            </w:r>
+            <w:r>
+              <w:rPr>
+                <w:rFonts w:ascii="Arial" w:hAnsi="Arial" w:cs="Arial"/>
+                <w:noProof/>
+                <w:color w:val="000000"/>
+                <w:sz w:val="14"/>
+                <w:szCs w:val="14"/>
+              </w:rPr>
+              <w:t>«=comp.amount_mol»</w:t>
+            </w:r>
+            <w:r>
+              <w:rPr>
+                <w:rFonts w:ascii="Arial" w:hAnsi="Arial" w:cs="Arial"/>
+                <w:noProof/>
+                <w:color w:val="000000"/>
+                <w:sz w:val="14"/>
+                <w:szCs w:val="14"/>
+              </w:rPr>
+              <w:fldChar w:fldCharType="end"/>
+            </w:r>
+            <w:r>
+              <w:rPr>
+                <w:rFonts w:ascii="Arial" w:hAnsi="Arial" w:cs="Arial"/>
+                <w:noProof/>
+                <w:color w:val="000000"/>
+                <w:sz w:val="14"/>
+                <w:szCs w:val="14"/>
+              </w:rPr>
+              <w:t xml:space="preserve"> </w:t>
+            </w:r>
+            <w:r>
+              <w:rPr>
+                <w:rFonts w:ascii="Arial" w:hAnsi="Arial" w:cs="Arial"/>
+                <w:noProof/>
+                <w:color w:val="000000"/>
+                <w:sz w:val="14"/>
+                <w:szCs w:val="14"/>
+              </w:rPr>
+              <w:fldChar w:fldCharType="begin"/>
+            </w:r>
+            <w:r>
+              <w:rPr>
+                <w:rFonts w:ascii="Arial" w:hAnsi="Arial" w:cs="Arial"/>
+                <w:noProof/>
+                <w:color w:val="000000"/>
+                <w:sz w:val="14"/>
+                <w:szCs w:val="14"/>
+              </w:rPr>
+              <w:instrText xml:space="preserve"> MERGEFIELD  =comp.amount_mol_unit  \* MERGEFORMAT </w:instrText>
+            </w:r>
+            <w:r>
+              <w:rPr>
+                <w:rFonts w:ascii="Arial" w:hAnsi="Arial" w:cs="Arial"/>
+                <w:noProof/>
+                <w:color w:val="000000"/>
+                <w:sz w:val="14"/>
+                <w:szCs w:val="14"/>
+              </w:rPr>
+              <w:fldChar w:fldCharType="separate"/>
+            </w:r>
+            <w:r>
+              <w:rPr>
+                <w:rFonts w:ascii="Arial" w:hAnsi="Arial" w:cs="Arial"/>
+                <w:noProof/>
+                <w:color w:val="000000"/>
+                <w:sz w:val="14"/>
+                <w:szCs w:val="14"/>
+              </w:rPr>
+              <w:t>«=comp.amount_mol_unit»</w:t>
+            </w:r>
+            <w:r>
+              <w:rPr>
+                <w:rFonts w:ascii="Arial" w:hAnsi="Arial" w:cs="Arial"/>
+                <w:noProof/>
+                <w:color w:val="000000"/>
+                <w:sz w:val="14"/>
+                <w:szCs w:val="14"/>
+              </w:rPr>
+              <w:fldChar w:fldCharType="end"/>
+            </w:r>
+          </w:p>
+        </w:tc>
+        <w:tc>
+          <w:tcPr>
+            <w:tcW w:w="1506" w:type="dxa"/>
+            <w:gridSpan w:val="2"/>
+          </w:tcPr>
+          <w:p>
+            <w:pPr>
+              <w:tabs>
+                <w:tab w:val="left" w:pos="1980"/>
+              </w:tabs>
+              <w:jc w:val="center"/>
+              <w:rPr>
+                <w:rFonts w:ascii="Arial" w:hAnsi="Arial" w:cs="Arial"/>
+                <w:sz w:val="14"/>
+                <w:szCs w:val="14"/>
+              </w:rPr>
+            </w:pPr>
+            <w:r>
+              <w:rPr>
+                <w:rFonts w:ascii="Arial" w:hAnsi="Arial" w:cs="Arial"/>
+                <w:noProof/>
+                <w:color w:val="000000"/>
+                <w:sz w:val="14"/>
+                <w:szCs w:val="14"/>
+              </w:rPr>
+              <w:fldChar w:fldCharType="begin"/>
+            </w:r>
+            <w:r>
+              <w:rPr>
+                <w:rFonts w:ascii="Arial" w:hAnsi="Arial" w:cs="Arial"/>
+                <w:noProof/>
+                <w:color w:val="000000"/>
+                <w:sz w:val="14"/>
+                <w:szCs w:val="14"/>
+              </w:rPr>
+              <w:instrText xml:space="preserve"> MERGEFIELD  =comp.relative_molecular_weight  \* MERGEFORMAT </w:instrText>
+            </w:r>
+            <w:r>
+              <w:rPr>
+                <w:rFonts w:ascii="Arial" w:hAnsi="Arial" w:cs="Arial"/>
+                <w:noProof/>
+                <w:color w:val="000000"/>
+                <w:sz w:val="14"/>
+                <w:szCs w:val="14"/>
+              </w:rPr>
+              <w:fldChar w:fldCharType="separate"/>
+            </w:r>
+            <w:r>
+              <w:rPr>
+                <w:rFonts w:ascii="Arial" w:hAnsi="Arial" w:cs="Arial"/>
+                <w:noProof/>
+                <w:color w:val="000000"/>
+                <w:sz w:val="14"/>
+                <w:szCs w:val="14"/>
+              </w:rPr>
+              <w:t>«=comp.relative_molecular_weight»</w:t>
+            </w:r>
+            <w:r>
+              <w:rPr>
+                <w:rFonts w:ascii="Arial" w:hAnsi="Arial" w:cs="Arial"/>
+                <w:noProof/>
+                <w:color w:val="000000"/>
+                <w:sz w:val="14"/>
+                <w:szCs w:val="14"/>
+              </w:rPr>
+              <w:fldChar w:fldCharType="end"/>
+            </w:r>
+            <w:r>
+              <w:rPr>
+                <w:rFonts w:ascii="Arial" w:hAnsi="Arial" w:cs="Arial"/>
+                <w:noProof/>
+                <w:color w:val="000000"/>
+                <w:sz w:val="14"/>
+                <w:szCs w:val="14"/>
+              </w:rPr>
+              <w:t xml:space="preserve"> g/mol</w:t>
+            </w:r>
+          </w:p>
+        </w:tc>
+        <w:tc>
+          <w:tcPr>
+            <w:tcW w:w="1506" w:type="dxa"/>
+            <w:gridSpan w:val="2"/>
+          </w:tcPr>
+          <w:p>
+            <w:pPr>
+              <w:jc w:val="center"/>
+              <w:rPr>
+                <w:rFonts w:ascii="Arial" w:hAnsi="Arial" w:cs="Arial"/>
+                <w:sz w:val="14"/>
+                <w:szCs w:val="14"/>
+              </w:rPr>
+            </w:pPr>
+            <w:r>
+              <w:rPr>
+                <w:rFonts w:ascii="Arial" w:hAnsi="Arial" w:cs="Arial"/>
+                <w:noProof/>
+                <w:color w:val="000000"/>
+                <w:sz w:val="14"/>
+                <w:szCs w:val="14"/>
+              </w:rPr>
+              <w:fldChar w:fldCharType="begin"/>
+            </w:r>
+            <w:r>
+              <w:rPr>
+                <w:rFonts w:ascii="Arial" w:hAnsi="Arial" w:cs="Arial"/>
+                <w:noProof/>
+                <w:color w:val="000000"/>
+                <w:sz w:val="14"/>
+                <w:szCs w:val="14"/>
+              </w:rPr>
+              <w:instrText xml:space="preserve"> MERGEFIELD  =comp.concn  \* MERGEFORMAT </w:instrText>
+            </w:r>
+            <w:r>
+              <w:rPr>
+                <w:rFonts w:ascii="Arial" w:hAnsi="Arial" w:cs="Arial"/>
+                <w:noProof/>
+                <w:color w:val="000000"/>
+                <w:sz w:val="14"/>
+                <w:szCs w:val="14"/>
+              </w:rPr>
+              <w:fldChar w:fldCharType="separate"/>
+            </w:r>
+            <w:r>
+              <w:rPr>
+                <w:rFonts w:ascii="Arial" w:hAnsi="Arial" w:cs="Arial"/>
+                <w:noProof/>
+                <w:color w:val="000000"/>
+                <w:sz w:val="14"/>
+                <w:szCs w:val="14"/>
+              </w:rPr>
+              <w:t>«=comp.concn»</w:t>
+            </w:r>
+            <w:r>
+              <w:rPr>
+                <w:rFonts w:ascii="Arial" w:hAnsi="Arial" w:cs="Arial"/>
+                <w:noProof/>
+                <w:color w:val="000000"/>
+                <w:sz w:val="14"/>
+                <w:szCs w:val="14"/>
+              </w:rPr>
+              <w:fldChar w:fldCharType="end"/>
+            </w:r>
+            <w:r>
+              <w:rPr>
+                <w:rFonts w:ascii="Arial" w:hAnsi="Arial" w:cs="Arial"/>
+                <w:noProof/>
+                <w:color w:val="000000"/>
+                <w:sz w:val="14"/>
+                <w:szCs w:val="14"/>
+              </w:rPr>
+              <w:t xml:space="preserve"> </w:t>
+            </w:r>
+            <w:r>
+              <w:rPr>
+                <w:rFonts w:ascii="Arial" w:hAnsi="Arial" w:cs="Arial"/>
+                <w:noProof/>
+                <w:color w:val="000000"/>
+                <w:sz w:val="14"/>
+                <w:szCs w:val="14"/>
+              </w:rPr>
+              <w:fldChar w:fldCharType="begin"/>
+            </w:r>
+            <w:r>
+              <w:rPr>
+                <w:rFonts w:ascii="Arial" w:hAnsi="Arial" w:cs="Arial"/>
+                <w:noProof/>
+                <w:color w:val="000000"/>
+                <w:sz w:val="14"/>
+                <w:szCs w:val="14"/>
+              </w:rPr>
+              <w:instrText xml:space="preserve"> MERGEFIELD  =comp.concn_unit  \* MERGEFORMAT </w:instrText>
+            </w:r>
+            <w:r>
+              <w:rPr>
+                <w:rFonts w:ascii="Arial" w:hAnsi="Arial" w:cs="Arial"/>
+                <w:noProof/>
+                <w:color w:val="000000"/>
+                <w:sz w:val="14"/>
+                <w:szCs w:val="14"/>
+              </w:rPr>
+              <w:fldChar w:fldCharType="separate"/>
+            </w:r>
+            <w:r>
+              <w:rPr>
+                <w:rFonts w:ascii="Arial" w:hAnsi="Arial" w:cs="Arial"/>
+                <w:noProof/>
+                <w:color w:val="000000"/>
+                <w:sz w:val="14"/>
+                <w:szCs w:val="14"/>
+              </w:rPr>
+              <w:t>«=comp.concn_unit»</w:t>
+            </w:r>
+            <w:r>
+              <w:rPr>
+                <w:rFonts w:ascii="Arial" w:hAnsi="Arial" w:cs="Arial"/>
+                <w:noProof/>
+                <w:color w:val="000000"/>
+                <w:sz w:val="14"/>
+                <w:szCs w:val="14"/>
+              </w:rPr>
+              <w:fldChar w:fldCharType="end"/>
+            </w:r>
+          </w:p>
+        </w:tc>
+        <w:tc>
+          <w:tcPr>
+            <w:tcW w:w="1507" w:type="dxa"/>
+            <w:gridSpan w:val="3"/>
+          </w:tcPr>
+          <w:p>
+            <w:pPr>
+              <w:jc w:val="center"/>
+              <w:rPr>
+                <w:rFonts w:ascii="Arial" w:hAnsi="Arial" w:cs="Arial"/>
+                <w:sz w:val="14"/>
+                <w:szCs w:val="14"/>
+              </w:rPr>
+            </w:pPr>
+            <w:r>
+              <w:rPr>
+                <w:rFonts w:ascii="Arial" w:hAnsi="Arial" w:cs="Arial"/>
+                <w:noProof/>
+                <w:color w:val="000000"/>
+                <w:sz w:val="14"/>
+                <w:szCs w:val="14"/>
+              </w:rPr>
+              <w:fldChar w:fldCharType="begin"/>
+            </w:r>
+            <w:r>
+              <w:rPr>
+                <w:rFonts w:ascii="Arial" w:hAnsi="Arial" w:cs="Arial"/>
+                <w:noProof/>
+                <w:color w:val="000000"/>
+                <w:sz w:val="14"/>
+                <w:szCs w:val="14"/>
+              </w:rPr>
+              <w:instrText xml:space="preserve"> MERGEFIELD  =comp.equivalent  \* MERGEFORMAT </w:instrText>
+            </w:r>
+            <w:r>
+              <w:rPr>
+                <w:rFonts w:ascii="Arial" w:hAnsi="Arial" w:cs="Arial"/>
+                <w:noProof/>
+                <w:color w:val="000000"/>
+                <w:sz w:val="14"/>
+                <w:szCs w:val="14"/>
+              </w:rPr>
+              <w:fldChar w:fldCharType="separate"/>
+            </w:r>
+            <w:r>
+              <w:rPr>
+                <w:rFonts w:ascii="Arial" w:hAnsi="Arial" w:cs="Arial"/>
+                <w:noProof/>
+                <w:color w:val="000000"/>
+                <w:sz w:val="14"/>
+                <w:szCs w:val="14"/>
+              </w:rPr>
+              <w:t>«=comp.equivalent»</w:t>
+            </w:r>
+            <w:r>
+              <w:rPr>
+                <w:rFonts w:ascii="Arial" w:hAnsi="Arial" w:cs="Arial"/>
+                <w:noProof/>
+                <w:color w:val="000000"/>
+                <w:sz w:val="14"/>
+                <w:szCs w:val="14"/>
+              </w:rPr>
+              <w:fldChar w:fldCharType="end"/>
+            </w:r>
+          </w:p>
+          <w:p>
+            <w:pPr>
+              <w:jc w:val="center"/>
+              <w:rPr>
+                <w:rFonts w:ascii="Arial" w:hAnsi="Arial" w:cs="Arial"/>
+                <w:sz w:val="14"/>
+                <w:szCs w:val="14"/>
+              </w:rPr>
+            </w:pPr>
+          </w:p>
+        </w:tc>
+      </w:tr>
+      <w:tr>
+        <w:trPr>
+          <w:trHeight w:val="255"/>
+        </w:trPr>
+        <w:tc>
+          <w:tcPr>
+            <w:tcW w:w="9145" w:type="dxa"/>
+            <w:gridSpan w:val="16"/>
+          </w:tcPr>
+          <w:p>
+            <w:pPr>
+              <w:rPr>
+                <w:rFonts w:ascii="Arial" w:hAnsi="Arial" w:cs="Arial"/>
+                <w:noProof/>
+                <w:color w:val="000000"/>
+                <w:sz w:val="14"/>
+                <w:szCs w:val="14"/>
+              </w:rPr>
+            </w:pPr>
+            <w:r>
+              <w:rPr>
+                <w:rFonts w:ascii="Arial" w:hAnsi="Arial" w:cs="Arial"/>
+                <w:sz w:val="18"/>
+                <w:szCs w:val="18"/>
+              </w:rPr>
+              <w:fldChar w:fldCharType="begin"/>
+            </w:r>
+            <w:r>
+              <w:rPr>
+                <w:rFonts w:ascii="Arial" w:hAnsi="Arial" w:cs="Arial"/>
+                <w:sz w:val="18"/>
+                <w:szCs w:val="18"/>
+              </w:rPr>
+              <w:instrText xml:space="preserve"> MERGEFIELD  p.components:endEach  \* MERGEFORMAT </w:instrText>
+            </w:r>
+            <w:r>
+              <w:rPr>
+                <w:rFonts w:ascii="Arial" w:hAnsi="Arial" w:cs="Arial"/>
+                <w:sz w:val="18"/>
+                <w:szCs w:val="18"/>
+              </w:rPr>
+              <w:fldChar w:fldCharType="separate"/>
+            </w:r>
+            <w:r>
+              <w:rPr>
+                <w:rFonts w:ascii="Arial" w:hAnsi="Arial" w:cs="Arial"/>
+                <w:noProof/>
+                <w:sz w:val="18"/>
+                <w:szCs w:val="18"/>
+              </w:rPr>
+              <w:t>«p.components:endEach»</w:t>
+            </w:r>
+            <w:r>
+              <w:rPr>
+                <w:rFonts w:ascii="Arial" w:hAnsi="Arial" w:cs="Arial"/>
+                <w:sz w:val="18"/>
+                <w:szCs w:val="18"/>
+              </w:rPr>
+              <w:fldChar w:fldCharType="end"/>
+            </w:r>
+            <w:r>
+              <w:rPr>
+                <w:rFonts w:ascii="Arial" w:hAnsi="Arial" w:cs="Arial"/>
+                <w:noProof/>
+                <w:color w:val="000000"/>
+                <w:sz w:val="18"/>
+                <w:szCs w:val="18"/>
+              </w:rPr>
+              <w:tab/>
+            </w:r>
+          </w:p>
+        </w:tc>
+      </w:tr>
+      <w:tr>
+        <w:trPr>
+          <w:trHeight w:val="255"/>
+        </w:trPr>
+        <w:tc>
+          <w:tcPr>
+            <w:tcW w:w="9145" w:type="dxa"/>
+            <w:gridSpan w:val="16"/>
+          </w:tcPr>
+          <w:p>
+            <w:pPr>
+              <w:rPr>
+                <w:rFonts w:ascii="Arial" w:hAnsi="Arial" w:cs="Arial"/>
+                <w:noProof/>
+                <w:color w:val="000000"/>
+                <w:sz w:val="14"/>
+                <w:szCs w:val="14"/>
+              </w:rPr>
+            </w:pPr>
+            <w:r>
+              <w:rPr>
+                <w:rFonts w:ascii="Arial" w:hAnsi="Arial" w:cs="Arial"/>
+                <w:sz w:val="18"/>
+                <w:szCs w:val="18"/>
+              </w:rPr>
+              <w:fldChar w:fldCharType="begin"/>
+            </w:r>
+            <w:r>
+              <w:rPr>
+                <w:rFonts w:ascii="Arial" w:hAnsi="Arial" w:cs="Arial"/>
+                <w:sz w:val="18"/>
+                <w:szCs w:val="18"/>
+              </w:rPr>
+              <w:instrText xml:space="preserve"> MERGEFIELD  p.components:endIf  \* MERGEFORMAT </w:instrText>
+            </w:r>
+            <w:r>
+              <w:rPr>
+                <w:rFonts w:ascii="Arial" w:hAnsi="Arial" w:cs="Arial"/>
+                <w:sz w:val="18"/>
+                <w:szCs w:val="18"/>
+              </w:rPr>
+              <w:fldChar w:fldCharType="separate"/>
+            </w:r>
+            <w:r>
+              <w:rPr>
+                <w:rFonts w:ascii="Arial" w:hAnsi="Arial" w:cs="Arial"/>
+                <w:noProof/>
+                <w:sz w:val="18"/>
+                <w:szCs w:val="18"/>
+              </w:rPr>
+              <w:t>«p.components:endIf»</w:t>
+            </w:r>
+            <w:r>
+              <w:rPr>
+                <w:rFonts w:ascii="Arial" w:hAnsi="Arial" w:cs="Arial"/>
                 <w:sz w:val="18"/>
                 <w:szCs w:val="18"/>
               </w:rPr>
@@ -4761,7 +7616,7 @@
     </w:p>
     <w:tbl>
       <w:tblPr>
-        <w:tblStyle w:val="Tabellenraster"/>
+        <w:tblStyle w:val="TableGrid"/>
         <w:tblW w:w="5000" w:type="pct"/>
         <w:tblBorders>
           <w:top w:val="none" w:sz="0" w:space="0" w:color="auto"/>
@@ -5026,7 +7881,7 @@
     </w:p>
     <w:tbl>
       <w:tblPr>
-        <w:tblStyle w:val="Tabellenraster"/>
+        <w:tblStyle w:val="TableGrid"/>
         <w:tblW w:w="5000" w:type="pct"/>
         <w:tblBorders>
           <w:top w:val="none" w:sz="0" w:space="0" w:color="auto"/>
@@ -6458,6 +9313,7 @@
           <w:sz w:val="20"/>
           <w:szCs w:val="20"/>
         </w:rPr>
+        <w:lastRenderedPageBreak/>
         <w:fldChar w:fldCharType="begin"/>
       </w:r>
       <w:r>
@@ -7919,7 +10775,6 @@
           <w:sz w:val="20"/>
           <w:szCs w:val="20"/>
         </w:rPr>
-        <w:lastRenderedPageBreak/>
         <w:fldChar w:fldCharType="begin"/>
       </w:r>
       <w:r>
@@ -10235,10 +13090,10 @@
           <w:noProof/>
         </w:rPr>
         <w:object w:dxaOrig="18787" w:dyaOrig="5510" w14:anchorId="4964B097">
-          <v:shape id="_x0000_i1027" type="#_x0000_t75" alt="" style="width:453.5pt;height:129pt;mso-width-percent:0;mso-height-percent:0;mso-width-percent:0;mso-height-percent:0" o:ole="">
+          <v:shape id="_x0000_i1027" type="#_x0000_t75" alt="" style="width:453.75pt;height:129pt;mso-width-percent:0;mso-height-percent:0;mso-width-percent:0;mso-height-percent:0" o:ole="">
             <v:imagedata r:id="rId9" o:title=""/>
           </v:shape>
-          <o:OLEObject Type="Embed" ProgID="ChemDraw.Document.6.0" ShapeID="_x0000_i1027" DrawAspect="Content" ObjectID="_1779608509" r:id="rId12"/>
+          <o:OLEObject Type="Embed" ProgID="ChemDraw.Document.6.0" ShapeID="_x0000_i1027" DrawAspect="Content" ObjectID="_1827064208" r:id="rId12"/>
         </w:object>
       </w:r>
       <w:r>
@@ -11674,7 +14529,7 @@
 </file>
 
 <file path=word/endnotes.xml><?xml version="1.0" encoding="utf-8"?>
-<w:endnotes xmlns:wpc="http://schemas.microsoft.com/office/word/2010/wordprocessingCanvas" xmlns:cx="http://schemas.microsoft.com/office/drawing/2014/chartex" xmlns:cx1="http://schemas.microsoft.com/office/drawing/2015/9/8/chartex" xmlns:cx2="http://schemas.microsoft.com/office/drawing/2015/10/21/chartex" xmlns:cx3="http://schemas.microsoft.com/office/drawing/2016/5/9/chartex" xmlns:cx4="http://schemas.microsoft.com/office/drawing/2016/5/10/chartex" xmlns:cx5="http://schemas.microsoft.com/office/drawing/2016/5/11/chartex" xmlns:cx6="http://schemas.microsoft.com/office/drawing/2016/5/12/chartex" xmlns:cx7="http://schemas.microsoft.com/office/drawing/2016/5/13/chartex" xmlns:cx8="http://schemas.microsoft.com/office/drawing/2016/5/14/chartex" xmlns:mc="http://schemas.openxmlformats.org/markup-compatibility/2006" xmlns:aink="http://schemas.microsoft.com/office/drawing/2016/ink" xmlns:am3d="http://schemas.microsoft.com/office/drawing/2017/model3d" xmlns:o="urn:schemas-microsoft-com:office:office" xmlns:oel="http://schemas.microsoft.com/office/2019/extlst" xmlns:r="http://schemas.openxmlformats.org/officeDocument/2006/relationships" xmlns:m="http://schemas.openxmlformats.org/officeDocument/2006/math" xmlns:v="urn:schemas-microsoft-com:vml" xmlns:wp14="http://schemas.microsoft.com/office/word/2010/wordprocessingDrawing" xmlns:wp="http://schemas.openxmlformats.org/drawingml/2006/wordprocessingDrawing" xmlns:w10="urn:schemas-microsoft-com:office:word" xmlns:w="http://schemas.openxmlformats.org/wordprocessingml/2006/main" xmlns:w14="http://schemas.microsoft.com/office/word/2010/wordml" xmlns:w15="http://schemas.microsoft.com/office/word/2012/wordml" xmlns:w16cex="http://schemas.microsoft.com/office/word/2018/wordml/cex" xmlns:w16cid="http://schemas.microsoft.com/office/word/2016/wordml/cid" xmlns:w16="http://schemas.microsoft.com/office/word/2018/wordml" xmlns:w16du="http://schemas.microsoft.com/office/word/2023/wordml/word16du" xmlns:w16sdtdh="http://schemas.microsoft.com/office/word/2020/wordml/sdtdatahash" xmlns:w16se="http://schemas.microsoft.com/office/word/2015/wordml/symex" xmlns:wpg="http://schemas.microsoft.com/office/word/2010/wordprocessingGroup" xmlns:wpi="http://schemas.microsoft.com/office/word/2010/wordprocessingInk" xmlns:wne="http://schemas.microsoft.com/office/word/2006/wordml" xmlns:wps="http://schemas.microsoft.com/office/word/2010/wordprocessingShape" mc:Ignorable="w14 w15 w16se w16cid w16 w16cex w16sdtdh w16du wp14">
+<w:endnotes xmlns:wpc="http://schemas.microsoft.com/office/word/2010/wordprocessingCanvas" xmlns:cx="http://schemas.microsoft.com/office/drawing/2014/chartex" xmlns:cx1="http://schemas.microsoft.com/office/drawing/2015/9/8/chartex" xmlns:cx2="http://schemas.microsoft.com/office/drawing/2015/10/21/chartex" xmlns:cx3="http://schemas.microsoft.com/office/drawing/2016/5/9/chartex" xmlns:cx4="http://schemas.microsoft.com/office/drawing/2016/5/10/chartex" xmlns:cx5="http://schemas.microsoft.com/office/drawing/2016/5/11/chartex" xmlns:cx6="http://schemas.microsoft.com/office/drawing/2016/5/12/chartex" xmlns:cx7="http://schemas.microsoft.com/office/drawing/2016/5/13/chartex" xmlns:cx8="http://schemas.microsoft.com/office/drawing/2016/5/14/chartex" xmlns:mc="http://schemas.openxmlformats.org/markup-compatibility/2006" xmlns:aink="http://schemas.microsoft.com/office/drawing/2016/ink" xmlns:am3d="http://schemas.microsoft.com/office/drawing/2017/model3d" xmlns:o="urn:schemas-microsoft-com:office:office" xmlns:oel="http://schemas.microsoft.com/office/2019/extlst" xmlns:r="http://schemas.openxmlformats.org/officeDocument/2006/relationships" xmlns:m="http://schemas.openxmlformats.org/officeDocument/2006/math" xmlns:v="urn:schemas-microsoft-com:vml" xmlns:wp14="http://schemas.microsoft.com/office/word/2010/wordprocessingDrawing" xmlns:wp="http://schemas.openxmlformats.org/drawingml/2006/wordprocessingDrawing" xmlns:w10="urn:schemas-microsoft-com:office:word" xmlns:w="http://schemas.openxmlformats.org/wordprocessingml/2006/main" xmlns:w14="http://schemas.microsoft.com/office/word/2010/wordml" xmlns:w15="http://schemas.microsoft.com/office/word/2012/wordml" xmlns:w16cex="http://schemas.microsoft.com/office/word/2018/wordml/cex" xmlns:w16cid="http://schemas.microsoft.com/office/word/2016/wordml/cid" xmlns:w16="http://schemas.microsoft.com/office/word/2018/wordml" xmlns:w16du="http://schemas.microsoft.com/office/word/2023/wordml/word16du" xmlns:w16sdtdh="http://schemas.microsoft.com/office/word/2020/wordml/sdtdatahash" xmlns:w16sdtfl="http://schemas.microsoft.com/office/word/2024/wordml/sdtformatlock" xmlns:w16se="http://schemas.microsoft.com/office/word/2015/wordml/symex" xmlns:wpg="http://schemas.microsoft.com/office/word/2010/wordprocessingGroup" xmlns:wpi="http://schemas.microsoft.com/office/word/2010/wordprocessingInk" xmlns:wne="http://schemas.microsoft.com/office/word/2006/wordml" xmlns:wps="http://schemas.microsoft.com/office/word/2010/wordprocessingShape" mc:Ignorable="w14 w15 w16se w16cid w16 w16cex w16sdtdh w16sdtfl w16du wp14">
   <w:endnote w:type="separator" w:id="-1">
     <w:p>
       <w:r>
@@ -11693,37 +14548,37 @@
 </file>
 
 <file path=word/footer1.xml><?xml version="1.0" encoding="utf-8"?>
-<w:ftr xmlns:wpc="http://schemas.microsoft.com/office/word/2010/wordprocessingCanvas" xmlns:cx="http://schemas.microsoft.com/office/drawing/2014/chartex" xmlns:cx1="http://schemas.microsoft.com/office/drawing/2015/9/8/chartex" xmlns:cx2="http://schemas.microsoft.com/office/drawing/2015/10/21/chartex" xmlns:cx3="http://schemas.microsoft.com/office/drawing/2016/5/9/chartex" xmlns:cx4="http://schemas.microsoft.com/office/drawing/2016/5/10/chartex" xmlns:cx5="http://schemas.microsoft.com/office/drawing/2016/5/11/chartex" xmlns:cx6="http://schemas.microsoft.com/office/drawing/2016/5/12/chartex" xmlns:cx7="http://schemas.microsoft.com/office/drawing/2016/5/13/chartex" xmlns:cx8="http://schemas.microsoft.com/office/drawing/2016/5/14/chartex" xmlns:mc="http://schemas.openxmlformats.org/markup-compatibility/2006" xmlns:aink="http://schemas.microsoft.com/office/drawing/2016/ink" xmlns:am3d="http://schemas.microsoft.com/office/drawing/2017/model3d" xmlns:o="urn:schemas-microsoft-com:office:office" xmlns:oel="http://schemas.microsoft.com/office/2019/extlst" xmlns:r="http://schemas.openxmlformats.org/officeDocument/2006/relationships" xmlns:m="http://schemas.openxmlformats.org/officeDocument/2006/math" xmlns:v="urn:schemas-microsoft-com:vml" xmlns:wp14="http://schemas.microsoft.com/office/word/2010/wordprocessingDrawing" xmlns:wp="http://schemas.openxmlformats.org/drawingml/2006/wordprocessingDrawing" xmlns:w10="urn:schemas-microsoft-com:office:word" xmlns:w="http://schemas.openxmlformats.org/wordprocessingml/2006/main" xmlns:w14="http://schemas.microsoft.com/office/word/2010/wordml" xmlns:w15="http://schemas.microsoft.com/office/word/2012/wordml" xmlns:w16cex="http://schemas.microsoft.com/office/word/2018/wordml/cex" xmlns:w16cid="http://schemas.microsoft.com/office/word/2016/wordml/cid" xmlns:w16="http://schemas.microsoft.com/office/word/2018/wordml" xmlns:w16du="http://schemas.microsoft.com/office/word/2023/wordml/word16du" xmlns:w16sdtdh="http://schemas.microsoft.com/office/word/2020/wordml/sdtdatahash" xmlns:w16se="http://schemas.microsoft.com/office/word/2015/wordml/symex" xmlns:wpg="http://schemas.microsoft.com/office/word/2010/wordprocessingGroup" xmlns:wpi="http://schemas.microsoft.com/office/word/2010/wordprocessingInk" xmlns:wne="http://schemas.microsoft.com/office/word/2006/wordml" xmlns:wps="http://schemas.microsoft.com/office/word/2010/wordprocessingShape" mc:Ignorable="w14 w15 w16se w16cid w16 w16cex w16sdtdh w16du wp14">
+<w:ftr xmlns:wpc="http://schemas.microsoft.com/office/word/2010/wordprocessingCanvas" xmlns:cx="http://schemas.microsoft.com/office/drawing/2014/chartex" xmlns:cx1="http://schemas.microsoft.com/office/drawing/2015/9/8/chartex" xmlns:cx2="http://schemas.microsoft.com/office/drawing/2015/10/21/chartex" xmlns:cx3="http://schemas.microsoft.com/office/drawing/2016/5/9/chartex" xmlns:cx4="http://schemas.microsoft.com/office/drawing/2016/5/10/chartex" xmlns:cx5="http://schemas.microsoft.com/office/drawing/2016/5/11/chartex" xmlns:cx6="http://schemas.microsoft.com/office/drawing/2016/5/12/chartex" xmlns:cx7="http://schemas.microsoft.com/office/drawing/2016/5/13/chartex" xmlns:cx8="http://schemas.microsoft.com/office/drawing/2016/5/14/chartex" xmlns:mc="http://schemas.openxmlformats.org/markup-compatibility/2006" xmlns:aink="http://schemas.microsoft.com/office/drawing/2016/ink" xmlns:am3d="http://schemas.microsoft.com/office/drawing/2017/model3d" xmlns:o="urn:schemas-microsoft-com:office:office" xmlns:oel="http://schemas.microsoft.com/office/2019/extlst" xmlns:r="http://schemas.openxmlformats.org/officeDocument/2006/relationships" xmlns:m="http://schemas.openxmlformats.org/officeDocument/2006/math" xmlns:v="urn:schemas-microsoft-com:vml" xmlns:wp14="http://schemas.microsoft.com/office/word/2010/wordprocessingDrawing" xmlns:wp="http://schemas.openxmlformats.org/drawingml/2006/wordprocessingDrawing" xmlns:w10="urn:schemas-microsoft-com:office:word" xmlns:w="http://schemas.openxmlformats.org/wordprocessingml/2006/main" xmlns:w14="http://schemas.microsoft.com/office/word/2010/wordml" xmlns:w15="http://schemas.microsoft.com/office/word/2012/wordml" xmlns:w16cex="http://schemas.microsoft.com/office/word/2018/wordml/cex" xmlns:w16cid="http://schemas.microsoft.com/office/word/2016/wordml/cid" xmlns:w16="http://schemas.microsoft.com/office/word/2018/wordml" xmlns:w16du="http://schemas.microsoft.com/office/word/2023/wordml/word16du" xmlns:w16sdtdh="http://schemas.microsoft.com/office/word/2020/wordml/sdtdatahash" xmlns:w16sdtfl="http://schemas.microsoft.com/office/word/2024/wordml/sdtformatlock" xmlns:w16se="http://schemas.microsoft.com/office/word/2015/wordml/symex" xmlns:wpg="http://schemas.microsoft.com/office/word/2010/wordprocessingGroup" xmlns:wpi="http://schemas.microsoft.com/office/word/2010/wordprocessingInk" xmlns:wne="http://schemas.microsoft.com/office/word/2006/wordml" xmlns:wps="http://schemas.microsoft.com/office/word/2010/wordprocessingShape" mc:Ignorable="w14 w15 w16se w16cid w16 w16cex w16sdtdh w16sdtfl w16du wp14">
   <w:p>
     <w:pPr>
-      <w:pStyle w:val="Fuzeile"/>
+      <w:pStyle w:val="Footer"/>
       <w:framePr w:wrap="none" w:vAnchor="text" w:hAnchor="margin" w:xAlign="right" w:y="1"/>
       <w:rPr>
-        <w:rStyle w:val="Seitenzahl"/>
+        <w:rStyle w:val="PageNumber"/>
       </w:rPr>
     </w:pPr>
     <w:r>
       <w:rPr>
-        <w:rStyle w:val="Seitenzahl"/>
+        <w:rStyle w:val="PageNumber"/>
       </w:rPr>
       <w:fldChar w:fldCharType="begin"/>
     </w:r>
     <w:r>
       <w:rPr>
-        <w:rStyle w:val="Seitenzahl"/>
+        <w:rStyle w:val="PageNumber"/>
       </w:rPr>
       <w:instrText xml:space="preserve">PAGE  </w:instrText>
     </w:r>
     <w:r>
       <w:rPr>
-        <w:rStyle w:val="Seitenzahl"/>
+        <w:rStyle w:val="PageNumber"/>
       </w:rPr>
       <w:fldChar w:fldCharType="end"/>
     </w:r>
   </w:p>
   <w:p>
     <w:pPr>
-      <w:pStyle w:val="Fuzeile"/>
+      <w:pStyle w:val="Footer"/>
       <w:ind w:right="360"/>
     </w:pPr>
   </w:p>
@@ -11731,7 +14586,7 @@
 </file>
 
 <file path=word/footer2.xml><?xml version="1.0" encoding="utf-8"?>
-<w:ftr xmlns:wpc="http://schemas.microsoft.com/office/word/2010/wordprocessingCanvas" xmlns:cx="http://schemas.microsoft.com/office/drawing/2014/chartex" xmlns:cx1="http://schemas.microsoft.com/office/drawing/2015/9/8/chartex" xmlns:cx2="http://schemas.microsoft.com/office/drawing/2015/10/21/chartex" xmlns:cx3="http://schemas.microsoft.com/office/drawing/2016/5/9/chartex" xmlns:cx4="http://schemas.microsoft.com/office/drawing/2016/5/10/chartex" xmlns:cx5="http://schemas.microsoft.com/office/drawing/2016/5/11/chartex" xmlns:cx6="http://schemas.microsoft.com/office/drawing/2016/5/12/chartex" xmlns:cx7="http://schemas.microsoft.com/office/drawing/2016/5/13/chartex" xmlns:cx8="http://schemas.microsoft.com/office/drawing/2016/5/14/chartex" xmlns:mc="http://schemas.openxmlformats.org/markup-compatibility/2006" xmlns:aink="http://schemas.microsoft.com/office/drawing/2016/ink" xmlns:am3d="http://schemas.microsoft.com/office/drawing/2017/model3d" xmlns:o="urn:schemas-microsoft-com:office:office" xmlns:oel="http://schemas.microsoft.com/office/2019/extlst" xmlns:r="http://schemas.openxmlformats.org/officeDocument/2006/relationships" xmlns:m="http://schemas.openxmlformats.org/officeDocument/2006/math" xmlns:v="urn:schemas-microsoft-com:vml" xmlns:wp14="http://schemas.microsoft.com/office/word/2010/wordprocessingDrawing" xmlns:wp="http://schemas.openxmlformats.org/drawingml/2006/wordprocessingDrawing" xmlns:w10="urn:schemas-microsoft-com:office:word" xmlns:w="http://schemas.openxmlformats.org/wordprocessingml/2006/main" xmlns:w14="http://schemas.microsoft.com/office/word/2010/wordml" xmlns:w15="http://schemas.microsoft.com/office/word/2012/wordml" xmlns:w16cex="http://schemas.microsoft.com/office/word/2018/wordml/cex" xmlns:w16cid="http://schemas.microsoft.com/office/word/2016/wordml/cid" xmlns:w16="http://schemas.microsoft.com/office/word/2018/wordml" xmlns:w16du="http://schemas.microsoft.com/office/word/2023/wordml/word16du" xmlns:w16sdtdh="http://schemas.microsoft.com/office/word/2020/wordml/sdtdatahash" xmlns:w16se="http://schemas.microsoft.com/office/word/2015/wordml/symex" xmlns:wpg="http://schemas.microsoft.com/office/word/2010/wordprocessingGroup" xmlns:wpi="http://schemas.microsoft.com/office/word/2010/wordprocessingInk" xmlns:wne="http://schemas.microsoft.com/office/word/2006/wordml" xmlns:wps="http://schemas.microsoft.com/office/word/2010/wordprocessingShape" mc:Ignorable="w14 w15 w16se w16cid w16 w16cex w16sdtdh w16du wp14">
+<w:ftr xmlns:wpc="http://schemas.microsoft.com/office/word/2010/wordprocessingCanvas" xmlns:cx="http://schemas.microsoft.com/office/drawing/2014/chartex" xmlns:cx1="http://schemas.microsoft.com/office/drawing/2015/9/8/chartex" xmlns:cx2="http://schemas.microsoft.com/office/drawing/2015/10/21/chartex" xmlns:cx3="http://schemas.microsoft.com/office/drawing/2016/5/9/chartex" xmlns:cx4="http://schemas.microsoft.com/office/drawing/2016/5/10/chartex" xmlns:cx5="http://schemas.microsoft.com/office/drawing/2016/5/11/chartex" xmlns:cx6="http://schemas.microsoft.com/office/drawing/2016/5/12/chartex" xmlns:cx7="http://schemas.microsoft.com/office/drawing/2016/5/13/chartex" xmlns:cx8="http://schemas.microsoft.com/office/drawing/2016/5/14/chartex" xmlns:mc="http://schemas.openxmlformats.org/markup-compatibility/2006" xmlns:aink="http://schemas.microsoft.com/office/drawing/2016/ink" xmlns:am3d="http://schemas.microsoft.com/office/drawing/2017/model3d" xmlns:o="urn:schemas-microsoft-com:office:office" xmlns:oel="http://schemas.microsoft.com/office/2019/extlst" xmlns:r="http://schemas.openxmlformats.org/officeDocument/2006/relationships" xmlns:m="http://schemas.openxmlformats.org/officeDocument/2006/math" xmlns:v="urn:schemas-microsoft-com:vml" xmlns:wp14="http://schemas.microsoft.com/office/word/2010/wordprocessingDrawing" xmlns:wp="http://schemas.openxmlformats.org/drawingml/2006/wordprocessingDrawing" xmlns:w10="urn:schemas-microsoft-com:office:word" xmlns:w="http://schemas.openxmlformats.org/wordprocessingml/2006/main" xmlns:w14="http://schemas.microsoft.com/office/word/2010/wordml" xmlns:w15="http://schemas.microsoft.com/office/word/2012/wordml" xmlns:w16cex="http://schemas.microsoft.com/office/word/2018/wordml/cex" xmlns:w16cid="http://schemas.microsoft.com/office/word/2016/wordml/cid" xmlns:w16="http://schemas.microsoft.com/office/word/2018/wordml" xmlns:w16du="http://schemas.microsoft.com/office/word/2023/wordml/word16du" xmlns:w16sdtdh="http://schemas.microsoft.com/office/word/2020/wordml/sdtdatahash" xmlns:w16sdtfl="http://schemas.microsoft.com/office/word/2024/wordml/sdtformatlock" xmlns:w16se="http://schemas.microsoft.com/office/word/2015/wordml/symex" xmlns:wpg="http://schemas.microsoft.com/office/word/2010/wordprocessingGroup" xmlns:wpi="http://schemas.microsoft.com/office/word/2010/wordprocessingInk" xmlns:wne="http://schemas.microsoft.com/office/word/2006/wordml" xmlns:wps="http://schemas.microsoft.com/office/word/2010/wordprocessingShape" mc:Ignorable="w14 w15 w16se w16cid w16 w16cex w16sdtdh w16sdtfl w16du wp14">
   <w:p>
     <w:pPr>
       <w:rPr>
@@ -11830,7 +14685,7 @@
 </file>
 
 <file path=word/footnotes.xml><?xml version="1.0" encoding="utf-8"?>
-<w:footnotes xmlns:wpc="http://schemas.microsoft.com/office/word/2010/wordprocessingCanvas" xmlns:cx="http://schemas.microsoft.com/office/drawing/2014/chartex" xmlns:cx1="http://schemas.microsoft.com/office/drawing/2015/9/8/chartex" xmlns:cx2="http://schemas.microsoft.com/office/drawing/2015/10/21/chartex" xmlns:cx3="http://schemas.microsoft.com/office/drawing/2016/5/9/chartex" xmlns:cx4="http://schemas.microsoft.com/office/drawing/2016/5/10/chartex" xmlns:cx5="http://schemas.microsoft.com/office/drawing/2016/5/11/chartex" xmlns:cx6="http://schemas.microsoft.com/office/drawing/2016/5/12/chartex" xmlns:cx7="http://schemas.microsoft.com/office/drawing/2016/5/13/chartex" xmlns:cx8="http://schemas.microsoft.com/office/drawing/2016/5/14/chartex" xmlns:mc="http://schemas.openxmlformats.org/markup-compatibility/2006" xmlns:aink="http://schemas.microsoft.com/office/drawing/2016/ink" xmlns:am3d="http://schemas.microsoft.com/office/drawing/2017/model3d" xmlns:o="urn:schemas-microsoft-com:office:office" xmlns:oel="http://schemas.microsoft.com/office/2019/extlst" xmlns:r="http://schemas.openxmlformats.org/officeDocument/2006/relationships" xmlns:m="http://schemas.openxmlformats.org/officeDocument/2006/math" xmlns:v="urn:schemas-microsoft-com:vml" xmlns:wp14="http://schemas.microsoft.com/office/word/2010/wordprocessingDrawing" xmlns:wp="http://schemas.openxmlformats.org/drawingml/2006/wordprocessingDrawing" xmlns:w10="urn:schemas-microsoft-com:office:word" xmlns:w="http://schemas.openxmlformats.org/wordprocessingml/2006/main" xmlns:w14="http://schemas.microsoft.com/office/word/2010/wordml" xmlns:w15="http://schemas.microsoft.com/office/word/2012/wordml" xmlns:w16cex="http://schemas.microsoft.com/office/word/2018/wordml/cex" xmlns:w16cid="http://schemas.microsoft.com/office/word/2016/wordml/cid" xmlns:w16="http://schemas.microsoft.com/office/word/2018/wordml" xmlns:w16du="http://schemas.microsoft.com/office/word/2023/wordml/word16du" xmlns:w16sdtdh="http://schemas.microsoft.com/office/word/2020/wordml/sdtdatahash" xmlns:w16se="http://schemas.microsoft.com/office/word/2015/wordml/symex" xmlns:wpg="http://schemas.microsoft.com/office/word/2010/wordprocessingGroup" xmlns:wpi="http://schemas.microsoft.com/office/word/2010/wordprocessingInk" xmlns:wne="http://schemas.microsoft.com/office/word/2006/wordml" xmlns:wps="http://schemas.microsoft.com/office/word/2010/wordprocessingShape" mc:Ignorable="w14 w15 w16se w16cid w16 w16cex w16sdtdh w16du wp14">
+<w:footnotes xmlns:wpc="http://schemas.microsoft.com/office/word/2010/wordprocessingCanvas" xmlns:cx="http://schemas.microsoft.com/office/drawing/2014/chartex" xmlns:cx1="http://schemas.microsoft.com/office/drawing/2015/9/8/chartex" xmlns:cx2="http://schemas.microsoft.com/office/drawing/2015/10/21/chartex" xmlns:cx3="http://schemas.microsoft.com/office/drawing/2016/5/9/chartex" xmlns:cx4="http://schemas.microsoft.com/office/drawing/2016/5/10/chartex" xmlns:cx5="http://schemas.microsoft.com/office/drawing/2016/5/11/chartex" xmlns:cx6="http://schemas.microsoft.com/office/drawing/2016/5/12/chartex" xmlns:cx7="http://schemas.microsoft.com/office/drawing/2016/5/13/chartex" xmlns:cx8="http://schemas.microsoft.com/office/drawing/2016/5/14/chartex" xmlns:mc="http://schemas.openxmlformats.org/markup-compatibility/2006" xmlns:aink="http://schemas.microsoft.com/office/drawing/2016/ink" xmlns:am3d="http://schemas.microsoft.com/office/drawing/2017/model3d" xmlns:o="urn:schemas-microsoft-com:office:office" xmlns:oel="http://schemas.microsoft.com/office/2019/extlst" xmlns:r="http://schemas.openxmlformats.org/officeDocument/2006/relationships" xmlns:m="http://schemas.openxmlformats.org/officeDocument/2006/math" xmlns:v="urn:schemas-microsoft-com:vml" xmlns:wp14="http://schemas.microsoft.com/office/word/2010/wordprocessingDrawing" xmlns:wp="http://schemas.openxmlformats.org/drawingml/2006/wordprocessingDrawing" xmlns:w10="urn:schemas-microsoft-com:office:word" xmlns:w="http://schemas.openxmlformats.org/wordprocessingml/2006/main" xmlns:w14="http://schemas.microsoft.com/office/word/2010/wordml" xmlns:w15="http://schemas.microsoft.com/office/word/2012/wordml" xmlns:w16cex="http://schemas.microsoft.com/office/word/2018/wordml/cex" xmlns:w16cid="http://schemas.microsoft.com/office/word/2016/wordml/cid" xmlns:w16="http://schemas.microsoft.com/office/word/2018/wordml" xmlns:w16du="http://schemas.microsoft.com/office/word/2023/wordml/word16du" xmlns:w16sdtdh="http://schemas.microsoft.com/office/word/2020/wordml/sdtdatahash" xmlns:w16sdtfl="http://schemas.microsoft.com/office/word/2024/wordml/sdtformatlock" xmlns:w16se="http://schemas.microsoft.com/office/word/2015/wordml/symex" xmlns:wpg="http://schemas.microsoft.com/office/word/2010/wordprocessingGroup" xmlns:wpi="http://schemas.microsoft.com/office/word/2010/wordprocessingInk" xmlns:wne="http://schemas.microsoft.com/office/word/2006/wordml" xmlns:wps="http://schemas.microsoft.com/office/word/2010/wordprocessingShape" mc:Ignorable="w14 w15 w16se w16cid w16 w16cex w16sdtdh w16sdtfl w16du wp14">
   <w:footnote w:type="separator" w:id="-1">
     <w:p>
       <w:r>
@@ -11849,7 +14704,7 @@
 </file>
 
 <file path=word/header1.xml><?xml version="1.0" encoding="utf-8"?>
-<w:hdr xmlns:wpc="http://schemas.microsoft.com/office/word/2010/wordprocessingCanvas" xmlns:cx="http://schemas.microsoft.com/office/drawing/2014/chartex" xmlns:cx1="http://schemas.microsoft.com/office/drawing/2015/9/8/chartex" xmlns:cx2="http://schemas.microsoft.com/office/drawing/2015/10/21/chartex" xmlns:cx3="http://schemas.microsoft.com/office/drawing/2016/5/9/chartex" xmlns:cx4="http://schemas.microsoft.com/office/drawing/2016/5/10/chartex" xmlns:cx5="http://schemas.microsoft.com/office/drawing/2016/5/11/chartex" xmlns:cx6="http://schemas.microsoft.com/office/drawing/2016/5/12/chartex" xmlns:cx7="http://schemas.microsoft.com/office/drawing/2016/5/13/chartex" xmlns:cx8="http://schemas.microsoft.com/office/drawing/2016/5/14/chartex" xmlns:mc="http://schemas.openxmlformats.org/markup-compatibility/2006" xmlns:aink="http://schemas.microsoft.com/office/drawing/2016/ink" xmlns:am3d="http://schemas.microsoft.com/office/drawing/2017/model3d" xmlns:o="urn:schemas-microsoft-com:office:office" xmlns:oel="http://schemas.microsoft.com/office/2019/extlst" xmlns:r="http://schemas.openxmlformats.org/officeDocument/2006/relationships" xmlns:m="http://schemas.openxmlformats.org/officeDocument/2006/math" xmlns:v="urn:schemas-microsoft-com:vml" xmlns:wp14="http://schemas.microsoft.com/office/word/2010/wordprocessingDrawing" xmlns:wp="http://schemas.openxmlformats.org/drawingml/2006/wordprocessingDrawing" xmlns:w10="urn:schemas-microsoft-com:office:word" xmlns:w="http://schemas.openxmlformats.org/wordprocessingml/2006/main" xmlns:w14="http://schemas.microsoft.com/office/word/2010/wordml" xmlns:w15="http://schemas.microsoft.com/office/word/2012/wordml" xmlns:w16cex="http://schemas.microsoft.com/office/word/2018/wordml/cex" xmlns:w16cid="http://schemas.microsoft.com/office/word/2016/wordml/cid" xmlns:w16="http://schemas.microsoft.com/office/word/2018/wordml" xmlns:w16du="http://schemas.microsoft.com/office/word/2023/wordml/word16du" xmlns:w16sdtdh="http://schemas.microsoft.com/office/word/2020/wordml/sdtdatahash" xmlns:w16se="http://schemas.microsoft.com/office/word/2015/wordml/symex" xmlns:wpg="http://schemas.microsoft.com/office/word/2010/wordprocessingGroup" xmlns:wpi="http://schemas.microsoft.com/office/word/2010/wordprocessingInk" xmlns:wne="http://schemas.microsoft.com/office/word/2006/wordml" xmlns:wps="http://schemas.microsoft.com/office/word/2010/wordprocessingShape" mc:Ignorable="w14 w15 w16se w16cid w16 w16cex w16sdtdh w16du wp14">
+<w:hdr xmlns:wpc="http://schemas.microsoft.com/office/word/2010/wordprocessingCanvas" xmlns:cx="http://schemas.microsoft.com/office/drawing/2014/chartex" xmlns:cx1="http://schemas.microsoft.com/office/drawing/2015/9/8/chartex" xmlns:cx2="http://schemas.microsoft.com/office/drawing/2015/10/21/chartex" xmlns:cx3="http://schemas.microsoft.com/office/drawing/2016/5/9/chartex" xmlns:cx4="http://schemas.microsoft.com/office/drawing/2016/5/10/chartex" xmlns:cx5="http://schemas.microsoft.com/office/drawing/2016/5/11/chartex" xmlns:cx6="http://schemas.microsoft.com/office/drawing/2016/5/12/chartex" xmlns:cx7="http://schemas.microsoft.com/office/drawing/2016/5/13/chartex" xmlns:cx8="http://schemas.microsoft.com/office/drawing/2016/5/14/chartex" xmlns:mc="http://schemas.openxmlformats.org/markup-compatibility/2006" xmlns:aink="http://schemas.microsoft.com/office/drawing/2016/ink" xmlns:am3d="http://schemas.microsoft.com/office/drawing/2017/model3d" xmlns:o="urn:schemas-microsoft-com:office:office" xmlns:oel="http://schemas.microsoft.com/office/2019/extlst" xmlns:r="http://schemas.openxmlformats.org/officeDocument/2006/relationships" xmlns:m="http://schemas.openxmlformats.org/officeDocument/2006/math" xmlns:v="urn:schemas-microsoft-com:vml" xmlns:wp14="http://schemas.microsoft.com/office/word/2010/wordprocessingDrawing" xmlns:wp="http://schemas.openxmlformats.org/drawingml/2006/wordprocessingDrawing" xmlns:w10="urn:schemas-microsoft-com:office:word" xmlns:w="http://schemas.openxmlformats.org/wordprocessingml/2006/main" xmlns:w14="http://schemas.microsoft.com/office/word/2010/wordml" xmlns:w15="http://schemas.microsoft.com/office/word/2012/wordml" xmlns:w16cex="http://schemas.microsoft.com/office/word/2018/wordml/cex" xmlns:w16cid="http://schemas.microsoft.com/office/word/2016/wordml/cid" xmlns:w16="http://schemas.microsoft.com/office/word/2018/wordml" xmlns:w16du="http://schemas.microsoft.com/office/word/2023/wordml/word16du" xmlns:w16sdtdh="http://schemas.microsoft.com/office/word/2020/wordml/sdtdatahash" xmlns:w16sdtfl="http://schemas.microsoft.com/office/word/2024/wordml/sdtformatlock" xmlns:w16se="http://schemas.microsoft.com/office/word/2015/wordml/symex" xmlns:wpg="http://schemas.microsoft.com/office/word/2010/wordprocessingGroup" xmlns:wpi="http://schemas.microsoft.com/office/word/2010/wordprocessingInk" xmlns:wne="http://schemas.microsoft.com/office/word/2006/wordml" xmlns:wps="http://schemas.microsoft.com/office/word/2010/wordprocessingShape" mc:Ignorable="w14 w15 w16se w16cid w16 w16cex w16sdtdh w16sdtfl w16du wp14">
   <w:p>
     <w:pPr>
       <w:jc w:val="right"/>
@@ -11868,14 +14723,14 @@
   </w:p>
   <w:p>
     <w:pPr>
-      <w:pStyle w:val="Kopfzeile"/>
+      <w:pStyle w:val="Header"/>
     </w:pPr>
   </w:p>
 </w:hdr>
 </file>
 
 <file path=word/numbering.xml><?xml version="1.0" encoding="utf-8"?>
-<w:numbering xmlns:wpc="http://schemas.microsoft.com/office/word/2010/wordprocessingCanvas" xmlns:cx="http://schemas.microsoft.com/office/drawing/2014/chartex" xmlns:cx1="http://schemas.microsoft.com/office/drawing/2015/9/8/chartex" xmlns:cx2="http://schemas.microsoft.com/office/drawing/2015/10/21/chartex" xmlns:cx3="http://schemas.microsoft.com/office/drawing/2016/5/9/chartex" xmlns:cx4="http://schemas.microsoft.com/office/drawing/2016/5/10/chartex" xmlns:cx5="http://schemas.microsoft.com/office/drawing/2016/5/11/chartex" xmlns:cx6="http://schemas.microsoft.com/office/drawing/2016/5/12/chartex" xmlns:cx7="http://schemas.microsoft.com/office/drawing/2016/5/13/chartex" xmlns:cx8="http://schemas.microsoft.com/office/drawing/2016/5/14/chartex" xmlns:mc="http://schemas.openxmlformats.org/markup-compatibility/2006" xmlns:aink="http://schemas.microsoft.com/office/drawing/2016/ink" xmlns:am3d="http://schemas.microsoft.com/office/drawing/2017/model3d" xmlns:o="urn:schemas-microsoft-com:office:office" xmlns:oel="http://schemas.microsoft.com/office/2019/extlst" xmlns:r="http://schemas.openxmlformats.org/officeDocument/2006/relationships" xmlns:m="http://schemas.openxmlformats.org/officeDocument/2006/math" xmlns:v="urn:schemas-microsoft-com:vml" xmlns:wp14="http://schemas.microsoft.com/office/word/2010/wordprocessingDrawing" xmlns:wp="http://schemas.openxmlformats.org/drawingml/2006/wordprocessingDrawing" xmlns:w10="urn:schemas-microsoft-com:office:word" xmlns:w="http://schemas.openxmlformats.org/wordprocessingml/2006/main" xmlns:w14="http://schemas.microsoft.com/office/word/2010/wordml" xmlns:w15="http://schemas.microsoft.com/office/word/2012/wordml" xmlns:w16cex="http://schemas.microsoft.com/office/word/2018/wordml/cex" xmlns:w16cid="http://schemas.microsoft.com/office/word/2016/wordml/cid" xmlns:w16="http://schemas.microsoft.com/office/word/2018/wordml" xmlns:w16du="http://schemas.microsoft.com/office/word/2023/wordml/word16du" xmlns:w16sdtdh="http://schemas.microsoft.com/office/word/2020/wordml/sdtdatahash" xmlns:w16se="http://schemas.microsoft.com/office/word/2015/wordml/symex" xmlns:wpg="http://schemas.microsoft.com/office/word/2010/wordprocessingGroup" xmlns:wpi="http://schemas.microsoft.com/office/word/2010/wordprocessingInk" xmlns:wne="http://schemas.microsoft.com/office/word/2006/wordml" xmlns:wps="http://schemas.microsoft.com/office/word/2010/wordprocessingShape" mc:Ignorable="w14 w15 w16se w16cid w16 w16cex w16sdtdh w16du wp14">
+<w:numbering xmlns:wpc="http://schemas.microsoft.com/office/word/2010/wordprocessingCanvas" xmlns:cx="http://schemas.microsoft.com/office/drawing/2014/chartex" xmlns:cx1="http://schemas.microsoft.com/office/drawing/2015/9/8/chartex" xmlns:cx2="http://schemas.microsoft.com/office/drawing/2015/10/21/chartex" xmlns:cx3="http://schemas.microsoft.com/office/drawing/2016/5/9/chartex" xmlns:cx4="http://schemas.microsoft.com/office/drawing/2016/5/10/chartex" xmlns:cx5="http://schemas.microsoft.com/office/drawing/2016/5/11/chartex" xmlns:cx6="http://schemas.microsoft.com/office/drawing/2016/5/12/chartex" xmlns:cx7="http://schemas.microsoft.com/office/drawing/2016/5/13/chartex" xmlns:cx8="http://schemas.microsoft.com/office/drawing/2016/5/14/chartex" xmlns:mc="http://schemas.openxmlformats.org/markup-compatibility/2006" xmlns:aink="http://schemas.microsoft.com/office/drawing/2016/ink" xmlns:am3d="http://schemas.microsoft.com/office/drawing/2017/model3d" xmlns:o="urn:schemas-microsoft-com:office:office" xmlns:oel="http://schemas.microsoft.com/office/2019/extlst" xmlns:r="http://schemas.openxmlformats.org/officeDocument/2006/relationships" xmlns:m="http://schemas.openxmlformats.org/officeDocument/2006/math" xmlns:v="urn:schemas-microsoft-com:vml" xmlns:wp14="http://schemas.microsoft.com/office/word/2010/wordprocessingDrawing" xmlns:wp="http://schemas.openxmlformats.org/drawingml/2006/wordprocessingDrawing" xmlns:w10="urn:schemas-microsoft-com:office:word" xmlns:w="http://schemas.openxmlformats.org/wordprocessingml/2006/main" xmlns:w14="http://schemas.microsoft.com/office/word/2010/wordml" xmlns:w15="http://schemas.microsoft.com/office/word/2012/wordml" xmlns:w16cex="http://schemas.microsoft.com/office/word/2018/wordml/cex" xmlns:w16cid="http://schemas.microsoft.com/office/word/2016/wordml/cid" xmlns:w16="http://schemas.microsoft.com/office/word/2018/wordml" xmlns:w16du="http://schemas.microsoft.com/office/word/2023/wordml/word16du" xmlns:w16sdtdh="http://schemas.microsoft.com/office/word/2020/wordml/sdtdatahash" xmlns:w16sdtfl="http://schemas.microsoft.com/office/word/2024/wordml/sdtformatlock" xmlns:w16se="http://schemas.microsoft.com/office/word/2015/wordml/symex" xmlns:wpg="http://schemas.microsoft.com/office/word/2010/wordprocessingGroup" xmlns:wpi="http://schemas.microsoft.com/office/word/2010/wordprocessingInk" xmlns:wne="http://schemas.microsoft.com/office/word/2006/wordml" xmlns:wps="http://schemas.microsoft.com/office/word/2010/wordprocessingShape" mc:Ignorable="w14 w15 w16se w16cid w16 w16cex w16sdtdh w16sdtfl w16du wp14">
   <w:abstractNum w:abstractNumId="0" w15:restartNumberingAfterBreak="0">
     <w:nsid w:val="1B1649E7"/>
     <w:multiLevelType w:val="hybridMultilevel"/>
@@ -12085,7 +14940,7 @@
 </file>
 
 <file path=word/styles.xml><?xml version="1.0" encoding="utf-8"?>
-<w:styles xmlns:mc="http://schemas.openxmlformats.org/markup-compatibility/2006" xmlns:r="http://schemas.openxmlformats.org/officeDocument/2006/relationships" xmlns:w="http://schemas.openxmlformats.org/wordprocessingml/2006/main" xmlns:w14="http://schemas.microsoft.com/office/word/2010/wordml" xmlns:w15="http://schemas.microsoft.com/office/word/2012/wordml" xmlns:w16cex="http://schemas.microsoft.com/office/word/2018/wordml/cex" xmlns:w16cid="http://schemas.microsoft.com/office/word/2016/wordml/cid" xmlns:w16="http://schemas.microsoft.com/office/word/2018/wordml" xmlns:w16du="http://schemas.microsoft.com/office/word/2023/wordml/word16du" xmlns:w16sdtdh="http://schemas.microsoft.com/office/word/2020/wordml/sdtdatahash" xmlns:w16se="http://schemas.microsoft.com/office/word/2015/wordml/symex" mc:Ignorable="w14 w15 w16se w16cid w16 w16cex w16sdtdh w16du">
+<w:styles xmlns:mc="http://schemas.openxmlformats.org/markup-compatibility/2006" xmlns:r="http://schemas.openxmlformats.org/officeDocument/2006/relationships" xmlns:w="http://schemas.openxmlformats.org/wordprocessingml/2006/main" xmlns:w14="http://schemas.microsoft.com/office/word/2010/wordml" xmlns:w15="http://schemas.microsoft.com/office/word/2012/wordml" xmlns:w16cex="http://schemas.microsoft.com/office/word/2018/wordml/cex" xmlns:w16cid="http://schemas.microsoft.com/office/word/2016/wordml/cid" xmlns:w16="http://schemas.microsoft.com/office/word/2018/wordml" xmlns:w16du="http://schemas.microsoft.com/office/word/2023/wordml/word16du" xmlns:w16sdtdh="http://schemas.microsoft.com/office/word/2020/wordml/sdtdatahash" xmlns:w16sdtfl="http://schemas.microsoft.com/office/word/2024/wordml/sdtformatlock" xmlns:w16se="http://schemas.microsoft.com/office/word/2015/wordml/symex" mc:Ignorable="w14 w15 w16se w16cid w16 w16cex w16sdtdh w16sdtfl w16du">
   <w:docDefaults>
     <w:rPrDefault>
       <w:rPr>
@@ -12471,18 +15326,18 @@
     <w:lsdException w:name="List Table 7 Colorful Accent 6" w:uiPriority="52"/>
     <w:lsdException w:name="Smart Link" w:semiHidden="1" w:unhideWhenUsed="1"/>
   </w:latentStyles>
-  <w:style w:type="paragraph" w:default="1" w:styleId="Standard">
+  <w:style w:type="paragraph" w:default="1" w:styleId="Normal">
     <w:name w:val="Normal"/>
     <w:qFormat/>
-    <w:rsid w:val="00461742"/>
+    <w:rsid w:val="00EA5DA0"/>
   </w:style>
-  <w:style w:type="character" w:default="1" w:styleId="Absatz-Standardschriftart">
+  <w:style w:type="character" w:default="1" w:styleId="DefaultParagraphFont">
     <w:name w:val="Default Paragraph Font"/>
     <w:uiPriority w:val="1"/>
     <w:semiHidden/>
     <w:unhideWhenUsed/>
   </w:style>
-  <w:style w:type="table" w:default="1" w:styleId="NormaleTabelle">
+  <w:style w:type="table" w:default="1" w:styleId="TableNormal">
     <w:name w:val="Normal Table"/>
     <w:uiPriority w:val="99"/>
     <w:semiHidden/>
@@ -12497,16 +15352,16 @@
       </w:tblCellMar>
     </w:tblPr>
   </w:style>
-  <w:style w:type="numbering" w:default="1" w:styleId="KeineListe">
+  <w:style w:type="numbering" w:default="1" w:styleId="NoList">
     <w:name w:val="No List"/>
     <w:uiPriority w:val="99"/>
     <w:semiHidden/>
     <w:unhideWhenUsed/>
   </w:style>
-  <w:style w:type="paragraph" w:styleId="Kopfzeile">
+  <w:style w:type="paragraph" w:styleId="Header">
     <w:name w:val="header"/>
-    <w:basedOn w:val="Standard"/>
-    <w:link w:val="KopfzeileZchn"/>
+    <w:basedOn w:val="Normal"/>
+    <w:link w:val="HeaderChar"/>
     <w:uiPriority w:val="99"/>
     <w:unhideWhenUsed/>
     <w:rsid w:val="00581DDA"/>
@@ -12517,17 +15372,17 @@
       </w:tabs>
     </w:pPr>
   </w:style>
-  <w:style w:type="character" w:customStyle="1" w:styleId="KopfzeileZchn">
-    <w:name w:val="Kopfzeile Zchn"/>
-    <w:basedOn w:val="Absatz-Standardschriftart"/>
-    <w:link w:val="Kopfzeile"/>
+  <w:style w:type="character" w:customStyle="1" w:styleId="HeaderChar">
+    <w:name w:val="Header Char"/>
+    <w:basedOn w:val="DefaultParagraphFont"/>
+    <w:link w:val="Header"/>
     <w:uiPriority w:val="99"/>
     <w:rsid w:val="00581DDA"/>
   </w:style>
-  <w:style w:type="paragraph" w:styleId="Fuzeile">
+  <w:style w:type="paragraph" w:styleId="Footer">
     <w:name w:val="footer"/>
-    <w:basedOn w:val="Standard"/>
-    <w:link w:val="FuzeileZchn"/>
+    <w:basedOn w:val="Normal"/>
+    <w:link w:val="FooterChar"/>
     <w:uiPriority w:val="99"/>
     <w:unhideWhenUsed/>
     <w:rsid w:val="00581DDA"/>
@@ -12538,24 +15393,24 @@
       </w:tabs>
     </w:pPr>
   </w:style>
-  <w:style w:type="character" w:customStyle="1" w:styleId="FuzeileZchn">
-    <w:name w:val="Fußzeile Zchn"/>
-    <w:basedOn w:val="Absatz-Standardschriftart"/>
-    <w:link w:val="Fuzeile"/>
+  <w:style w:type="character" w:customStyle="1" w:styleId="FooterChar">
+    <w:name w:val="Footer Char"/>
+    <w:basedOn w:val="DefaultParagraphFont"/>
+    <w:link w:val="Footer"/>
     <w:uiPriority w:val="99"/>
     <w:rsid w:val="00581DDA"/>
   </w:style>
-  <w:style w:type="character" w:styleId="Seitenzahl">
+  <w:style w:type="character" w:styleId="PageNumber">
     <w:name w:val="page number"/>
-    <w:basedOn w:val="Absatz-Standardschriftart"/>
+    <w:basedOn w:val="DefaultParagraphFont"/>
     <w:uiPriority w:val="99"/>
     <w:semiHidden/>
     <w:unhideWhenUsed/>
     <w:rsid w:val="00581DDA"/>
   </w:style>
-  <w:style w:type="table" w:styleId="Tabellenraster">
+  <w:style w:type="table" w:styleId="TableGrid">
     <w:name w:val="Table Grid"/>
-    <w:basedOn w:val="NormaleTabelle"/>
+    <w:basedOn w:val="TableNormal"/>
     <w:uiPriority w:val="39"/>
     <w:rsid w:val="00BE3CA1"/>
     <w:tblPr>
@@ -12569,10 +15424,10 @@
       </w:tblBorders>
     </w:tblPr>
   </w:style>
-  <w:style w:type="paragraph" w:styleId="Dokumentstruktur">
+  <w:style w:type="paragraph" w:styleId="DocumentMap">
     <w:name w:val="Document Map"/>
-    <w:basedOn w:val="Standard"/>
-    <w:link w:val="DokumentstrukturZchn"/>
+    <w:basedOn w:val="Normal"/>
+    <w:link w:val="DocumentMapChar"/>
     <w:uiPriority w:val="99"/>
     <w:semiHidden/>
     <w:unhideWhenUsed/>
@@ -12581,10 +15436,10 @@
       <w:rFonts w:ascii="Times New Roman" w:hAnsi="Times New Roman" w:cs="Times New Roman"/>
     </w:rPr>
   </w:style>
-  <w:style w:type="character" w:customStyle="1" w:styleId="DokumentstrukturZchn">
-    <w:name w:val="Dokumentstruktur Zchn"/>
-    <w:basedOn w:val="Absatz-Standardschriftart"/>
-    <w:link w:val="Dokumentstruktur"/>
+  <w:style w:type="character" w:customStyle="1" w:styleId="DocumentMapChar">
+    <w:name w:val="Document Map Char"/>
+    <w:basedOn w:val="DefaultParagraphFont"/>
+    <w:link w:val="DocumentMap"/>
     <w:uiPriority w:val="99"/>
     <w:semiHidden/>
     <w:rsid w:val="0081088A"/>
@@ -12592,9 +15447,9 @@
       <w:rFonts w:ascii="Times New Roman" w:hAnsi="Times New Roman" w:cs="Times New Roman"/>
     </w:rPr>
   </w:style>
-  <w:style w:type="paragraph" w:styleId="Listenabsatz">
+  <w:style w:type="paragraph" w:styleId="ListParagraph">
     <w:name w:val="List Paragraph"/>
-    <w:basedOn w:val="Standard"/>
+    <w:basedOn w:val="Normal"/>
     <w:uiPriority w:val="34"/>
     <w:qFormat/>
     <w:rsid w:val="00043A4C"/>
@@ -12603,10 +15458,10 @@
       <w:contextualSpacing/>
     </w:pPr>
   </w:style>
-  <w:style w:type="paragraph" w:styleId="Sprechblasentext">
+  <w:style w:type="paragraph" w:styleId="BalloonText">
     <w:name w:val="Balloon Text"/>
-    <w:basedOn w:val="Standard"/>
-    <w:link w:val="SprechblasentextZchn"/>
+    <w:basedOn w:val="Normal"/>
+    <w:link w:val="BalloonTextChar"/>
     <w:uiPriority w:val="99"/>
     <w:semiHidden/>
     <w:unhideWhenUsed/>
@@ -12617,10 +15472,10 @@
       <w:szCs w:val="16"/>
     </w:rPr>
   </w:style>
-  <w:style w:type="character" w:customStyle="1" w:styleId="SprechblasentextZchn">
-    <w:name w:val="Sprechblasentext Zchn"/>
-    <w:basedOn w:val="Absatz-Standardschriftart"/>
-    <w:link w:val="Sprechblasentext"/>
+  <w:style w:type="character" w:customStyle="1" w:styleId="BalloonTextChar">
+    <w:name w:val="Balloon Text Char"/>
+    <w:basedOn w:val="DefaultParagraphFont"/>
+    <w:link w:val="BalloonText"/>
     <w:uiPriority w:val="99"/>
     <w:semiHidden/>
     <w:rsid w:val="002233C4"/>
@@ -12630,7 +15485,7 @@
       <w:szCs w:val="16"/>
     </w:rPr>
   </w:style>
-  <w:style w:type="paragraph" w:styleId="KeinLeerraum">
+  <w:style w:type="paragraph" w:styleId="NoSpacing">
     <w:name w:val="No Spacing"/>
     <w:uiPriority w:val="1"/>
     <w:qFormat/>

</xml_diff>